<commit_message>
EJHG prep: trim main body to 2855w (excl tables, cap 4000), move derivation/simulation to Supplement, restore 6-trio real-data panel (Tables 2/3/3b), fix duplicated declarations, Fig2/5/6 -> Supp S1/S2/S3; rebuild docx
</commit_message>
<xml_diff>
--- a/D61_论文终稿_20260906.docx
+++ b/D61_论文终稿_20260906.docx
@@ -27,7 +27,7 @@
           <w:i w:val="0"/>
           <w:sz w:val="22"/>
         </w:rPr>
-        <w:t>**Authors:** Yan Chen¹, Jianfeng Wang²</w:t>
+        <w:t>**Authors:** Yan Chen¹ (ORCID: 0009-0001-6328-7403), Jianfeng Wang² (ORCID: 0000-0002-6316-6361)</w:t>
       </w:r>
     </w:p>
     <w:p>
@@ -83,26 +83,35 @@
           <w:b w:val="0"/>
           <w:sz w:val="24"/>
         </w:rPr>
-        <w:t>Two-step (product-method) Mendelian randomization mediation analyses routinely assume that the exposure-step and mediator-step instrument sets are independent, yet this assumption has never been checked at scale. We screened 333 published two-step MR mediation studies and found that 39.3% use an instrument-selection design capable of producing non-independent (α̂, β̂) estimates, while a batch re-estimation resolving 42 of these trios to public GWAS accessions confirmed genuine SNP overlap in 19.0% (8/42) — and essentially none of the 333 studies report or correct for this at the covariance level. We close the corresponding methodological gap by deriving a closed-form expression for Cov(α̂, β̂) under instrument overlap, together with a conservative reliability bound validated across 192 simulation cells and a diagnostic tool. Applying the correction to the adequately powered overlapping trios we could recover and validate through TwoSampleMR (4 of 6 identified), the correction narrowed rather than widened every confidence interval (mean −3.9%, range −9.0% to −0.1%), and none of the validated published conclusions changed. Crucially, we did not leave ρ_MY as an assumed-zero sensitivity parameter: we estimated it empirically for all six overlapping trios directly from the harmonized GWAS effect sizes — the directional concordance (genetic correlation) between mediator and outcome at the instruments. In five of six trios ρ_MY was unambiguously positive (range +0.07 to +0.81; the sixth, a UK Biobank–FinnGen pair, was marginally negative and within sampling noise), and four of six drew both mediator and outcome from UK Biobank-derived GWAS, implying substantial sample overlap as well. Re-entering these empirical ρ_MY values into the correction changed the corrected standard error by at most 0.40 percentage points and preserved the narrowing in every case (0 flips); this conclusion is unchanged when using the upper 95% confidence bound of each trio's ρ_MY instead of its point estimate. A targeted novelty-check search of PubMed returned no 2024–2026 publication deriving this closed-form covariance, which — together with the finding that the field neither tags nor reports the design the correction targets — frames our contribution as both a methodological closure and an empirical warning.</w:t>
+        <w:t>Two-step (product-method) Mendelian randomization mediation analyses routinely assume that the exposure-step and mediator-step instrument sets are independent, yet this assumption has never been checked at scale. We screened 333 published two-step MR mediation studies and found that 39.3% use an instrument-selection design capable of producing non-independent (alpha_hat, beta_hat) estimates; a batch re-estimation resolving 42 trios to public GWAS accessions confirmed genuine SNP overlap in 19.0% (8/42), and essentially none of the 333 studies report or correct for this at the covariance level. We close this gap by deriving a closed-form expression for Cov(alpha_hat, beta_hat) under instrument overlap, with a conservative reliability bound validated across 192 simulation cells and a diagnostic tool. Applied to the adequately powered overlapping trios recoverable through TwoSampleMR, the correction narrowed every confidence interval (mean -3.9%, range -9.0% to -0.1%) and changed no validated conclusion. Crucially, rather than treating rho_MY as an assumed-zero sensitivity parameter, we estimated it empirically for all six overlapping trios from harmonized GWAS effect sizes; in five of six it was unambiguously positive (+0.07 to +0.81), and re-entering these values preserved the narrowing in every case (0 flips). A PubMed novelty check returned no 2024-2026 publication deriving this covariance, framing the work as both a methodological closure and an empirical warning.</w:t>
       </w:r>
     </w:p>
     <w:p>
       <w:pPr>
+        <w:ind w:firstLine="480"/>
         <w:jc w:val="both"/>
       </w:pPr>
       <w:r>
         <w:rPr>
           <w:rFonts w:ascii="Times New Roman" w:hAnsi="Times New Roman"/>
           <w:b/>
-          <w:sz w:val="22"/>
+          <w:sz w:val="24"/>
         </w:rPr>
-        <w:t>Keywords:</w:t>
+        <w:t>Keywords</w:t>
+      </w:r>
+      <w:r>
+        <w:rPr>
+          <w:rFonts w:ascii="Times New Roman" w:hAnsi="Times New Roman"/>
+          <w:b/>
+          <w:sz w:val="24"/>
+        </w:rPr>
+        <w:t>:</w:t>
       </w:r>
       <w:r>
         <w:rPr>
           <w:rFonts w:ascii="Times New Roman" w:hAnsi="Times New Roman"/>
           <w:b w:val="0"/>
-          <w:sz w:val="22"/>
+          <w:sz w:val="24"/>
         </w:rPr>
         <w:t xml:space="preserve"> Mendelian randomization; mediation analysis; two-step MR; instrument overlap; covariance correction; summary statistics.</w:t>
       </w:r>
@@ -464,20 +473,6 @@
     </w:p>
     <w:p>
       <w:pPr>
-        <w:spacing w:before="200" w:after="80"/>
-        <w:jc w:val="left"/>
-      </w:pPr>
-      <w:r>
-        <w:rPr>
-          <w:rFonts w:ascii="Times New Roman" w:hAnsi="Times New Roman"/>
-          <w:b/>
-          <w:sz w:val="24"/>
-        </w:rPr>
-        <w:t>2.1 Motivation: covariance between step-1 and step-2 estimates</w:t>
-      </w:r>
-    </w:p>
-    <w:p>
-      <w:pPr>
         <w:ind w:firstLine="480"/>
         <w:jc w:val="both"/>
       </w:pPr>
@@ -487,337 +482,7 @@
           <w:b w:val="0"/>
           <w:sz w:val="24"/>
         </w:rPr>
-        <w:t>In summary-data two-step MR mediation, α̂ and β̂ are usually ratio (or IVW) estimators. The standard delta-method variance,</w:t>
-      </w:r>
-    </w:p>
-    <w:p>
-      <w:pPr>
-        <w:spacing w:before="120" w:after="120"/>
-        <w:jc w:val="center"/>
-      </w:pPr>
-      <w:r>
-        <w:drawing>
-          <wp:inline xmlns:a="http://schemas.openxmlformats.org/drawingml/2006/main" xmlns:pic="http://schemas.openxmlformats.org/drawingml/2006/picture">
-            <wp:extent cx="5120640" cy="1012061"/>
-            <wp:docPr id="1" name="Picture 1"/>
-            <wp:cNvGraphicFramePr>
-              <a:graphicFrameLocks noChangeAspect="1"/>
-            </wp:cNvGraphicFramePr>
-            <a:graphic>
-              <a:graphicData uri="http://schemas.openxmlformats.org/drawingml/2006/picture">
-                <pic:pic>
-                  <pic:nvPicPr>
-                    <pic:cNvPr id="0" name="eq1.png"/>
-                    <pic:cNvPicPr/>
-                  </pic:nvPicPr>
-                  <pic:blipFill>
-                    <a:blip r:embed="rId9"/>
-                    <a:stretch>
-                      <a:fillRect/>
-                    </a:stretch>
-                  </pic:blipFill>
-                  <pic:spPr>
-                    <a:xfrm>
-                      <a:off x="0" y="0"/>
-                      <a:ext cx="5120640" cy="1012061"/>
-                    </a:xfrm>
-                    <a:prstGeom prst="rect"/>
-                  </pic:spPr>
-                </pic:pic>
-              </a:graphicData>
-            </a:graphic>
-          </wp:inline>
-        </w:drawing>
-      </w:r>
-    </w:p>
-    <w:p>
-      <w:pPr>
-        <w:ind w:firstLine="480"/>
-        <w:jc w:val="both"/>
-      </w:pPr>
-      <w:r>
-        <w:rPr>
-          <w:rFonts w:ascii="Times New Roman" w:hAnsi="Times New Roman"/>
-          <w:b w:val="0"/>
-          <w:sz w:val="24"/>
-        </w:rPr>
-        <w:t>omits 2α̂β̂·Cov(α̂, β̂). This omitted term is non-zero in two structurally different situations:</w:t>
-      </w:r>
-    </w:p>
-    <w:p>
-      <w:pPr>
-        <w:pStyle w:val="ListNumber"/>
-        <w:jc w:val="both"/>
-      </w:pPr>
-      <w:r>
-        <w:rPr>
-          <w:rFonts w:ascii="Times New Roman" w:hAnsi="Times New Roman"/>
-          <w:b/>
-          <w:sz w:val="24"/>
-        </w:rPr>
-        <w:t>Shared-instrument channel</w:t>
-      </w:r>
-      <w:r>
-        <w:rPr>
-          <w:rFonts w:ascii="Times New Roman" w:hAnsi="Times New Roman"/>
-          <w:b w:val="0"/>
-          <w:sz w:val="24"/>
-        </w:rPr>
-        <w:t>: the step-1 and step-2 instrument sets have a non-empty intersection, n_s = |G′_X ∩ G′_M| &gt; 0.</w:t>
-      </w:r>
-    </w:p>
-    <w:p>
-      <w:pPr>
-        <w:pStyle w:val="ListNumber"/>
-        <w:jc w:val="both"/>
-      </w:pPr>
-      <w:r>
-        <w:rPr>
-          <w:rFonts w:ascii="Times New Roman" w:hAnsi="Times New Roman"/>
-          <w:b/>
-          <w:sz w:val="24"/>
-        </w:rPr>
-        <w:t>Sample-overlap channel</w:t>
-      </w:r>
-      <w:r>
-        <w:rPr>
-          <w:rFonts w:ascii="Times New Roman" w:hAnsi="Times New Roman"/>
-          <w:b w:val="0"/>
-          <w:sz w:val="24"/>
-        </w:rPr>
-        <w:t>: the mediator and outcome GWAS share overlapping participants, inducing a non-zero residual correlation ρ_MY between the two regression errors even when the instrument sets are disjoint.</w:t>
-      </w:r>
-    </w:p>
-    <w:p>
-      <w:pPr>
-        <w:ind w:firstLine="480"/>
-        <w:jc w:val="both"/>
-      </w:pPr>
-      <w:r>
-        <w:rPr>
-          <w:rFonts w:ascii="Times New Roman" w:hAnsi="Times New Roman"/>
-          <w:b w:val="0"/>
-          <w:sz w:val="24"/>
-        </w:rPr>
-        <w:t>Both channels vanish algebraically when their respective condition is absent, and they combine additively when both are present (Supplementary Methods S1–S3). Throughout, ρ_MY denotes the M–Y sample-overlap proportion in the closed form. Because this proportion is rarely disclosed, we additionally estimate its empirical proxy — the directional concordance (genetic correlation) between the mediator and outcome at the instrumental SNPs — directly from harmonized GWAS effect sizes (§3.5.1); the two quantities are conceptually related, since both measure M–Y association, and are reported side by side.</w:t>
-      </w:r>
-    </w:p>
-    <w:p>
-      <w:pPr>
-        <w:spacing w:before="200" w:after="80"/>
-        <w:jc w:val="left"/>
-      </w:pPr>
-      <w:r>
-        <w:rPr>
-          <w:rFonts w:ascii="Times New Roman" w:hAnsi="Times New Roman"/>
-          <w:b/>
-          <w:sz w:val="24"/>
-        </w:rPr>
-        <w:t>2.2 Closed-form correction</w:t>
-      </w:r>
-    </w:p>
-    <w:p>
-      <w:pPr>
-        <w:ind w:firstLine="480"/>
-        <w:jc w:val="both"/>
-      </w:pPr>
-      <w:r>
-        <w:rPr>
-          <w:rFonts w:ascii="Times New Roman" w:hAnsi="Times New Roman"/>
-          <w:b w:val="0"/>
-          <w:sz w:val="24"/>
-        </w:rPr>
-        <w:t>Under a standard IVW data-generating process with p_X instruments for step 1, p_M instruments for step 2, n_s shared instruments, residual correlation ρ_MY between the mediator and outcome GWAS, and mean instrument F-statistic F, the covariance can be written as</w:t>
-      </w:r>
-    </w:p>
-    <w:p>
-      <w:pPr>
-        <w:spacing w:before="120" w:after="120"/>
-        <w:jc w:val="center"/>
-      </w:pPr>
-      <w:r>
-        <w:drawing>
-          <wp:inline xmlns:a="http://schemas.openxmlformats.org/drawingml/2006/main" xmlns:pic="http://schemas.openxmlformats.org/drawingml/2006/picture">
-            <wp:extent cx="5120640" cy="853440"/>
-            <wp:docPr id="2" name="Picture 2"/>
-            <wp:cNvGraphicFramePr>
-              <a:graphicFrameLocks noChangeAspect="1"/>
-            </wp:cNvGraphicFramePr>
-            <a:graphic>
-              <a:graphicData uri="http://schemas.openxmlformats.org/drawingml/2006/picture">
-                <pic:pic>
-                  <pic:nvPicPr>
-                    <pic:cNvPr id="0" name="eq2.png"/>
-                    <pic:cNvPicPr/>
-                  </pic:nvPicPr>
-                  <pic:blipFill>
-                    <a:blip r:embed="rId10"/>
-                    <a:stretch>
-                      <a:fillRect/>
-                    </a:stretch>
-                  </pic:blipFill>
-                  <pic:spPr>
-                    <a:xfrm>
-                      <a:off x="0" y="0"/>
-                      <a:ext cx="5120640" cy="853440"/>
-                    </a:xfrm>
-                    <a:prstGeom prst="rect"/>
-                  </pic:spPr>
-                </pic:pic>
-              </a:graphicData>
-            </a:graphic>
-          </wp:inline>
-        </w:drawing>
-      </w:r>
-    </w:p>
-    <w:p>
-      <w:pPr>
-        <w:ind w:firstLine="480"/>
-        <w:jc w:val="both"/>
-      </w:pPr>
-      <w:r>
-        <w:rPr>
-          <w:rFonts w:ascii="Times New Roman" w:hAnsi="Times New Roman"/>
-          <w:b w:val="0"/>
-          <w:sz w:val="24"/>
-        </w:rPr>
-        <w:t>where Cov_shared captures the contribution of the n_s SNPs that enter both regressions and Cov_overlap captures the ρ_MY channel. The full expressions are given in Supplementary Methods S2 and S3. The corrected variance of the indirect effect is</w:t>
-      </w:r>
-    </w:p>
-    <w:p>
-      <w:pPr>
-        <w:spacing w:before="120" w:after="120"/>
-        <w:jc w:val="center"/>
-      </w:pPr>
-      <w:r>
-        <w:drawing>
-          <wp:inline xmlns:a="http://schemas.openxmlformats.org/drawingml/2006/main" xmlns:pic="http://schemas.openxmlformats.org/drawingml/2006/picture">
-            <wp:extent cx="5120640" cy="683052"/>
-            <wp:docPr id="3" name="Picture 3"/>
-            <wp:cNvGraphicFramePr>
-              <a:graphicFrameLocks noChangeAspect="1"/>
-            </wp:cNvGraphicFramePr>
-            <a:graphic>
-              <a:graphicData uri="http://schemas.openxmlformats.org/drawingml/2006/picture">
-                <pic:pic>
-                  <pic:nvPicPr>
-                    <pic:cNvPr id="0" name="eq3.png"/>
-                    <pic:cNvPicPr/>
-                  </pic:nvPicPr>
-                  <pic:blipFill>
-                    <a:blip r:embed="rId11"/>
-                    <a:stretch>
-                      <a:fillRect/>
-                    </a:stretch>
-                  </pic:blipFill>
-                  <pic:spPr>
-                    <a:xfrm>
-                      <a:off x="0" y="0"/>
-                      <a:ext cx="5120640" cy="683052"/>
-                    </a:xfrm>
-                    <a:prstGeom prst="rect"/>
-                  </pic:spPr>
-                </pic:pic>
-              </a:graphicData>
-            </a:graphic>
-          </wp:inline>
-        </w:drawing>
-      </w:r>
-    </w:p>
-    <w:p>
-      <w:pPr>
-        <w:ind w:firstLine="480"/>
-        <w:jc w:val="both"/>
-      </w:pPr>
-      <w:r>
-        <w:rPr>
-          <w:rFonts w:ascii="Times New Roman" w:hAnsi="Times New Roman"/>
-          <w:b w:val="0"/>
-          <w:sz w:val="24"/>
-        </w:rPr>
-        <w:t>We also derive the complete variance expressions for α̂ and β̂ themselves, because the standard ratio-estimator variance approximation omits a non-negligible Jensen term, and because ρ_MY additionally compresses Var(β̂) itself (Supplementary Methods S6).</w:t>
-      </w:r>
-    </w:p>
-    <w:p>
-      <w:pPr>
-        <w:spacing w:before="200" w:after="80"/>
-        <w:jc w:val="left"/>
-      </w:pPr>
-      <w:r>
-        <w:rPr>
-          <w:rFonts w:ascii="Times New Roman" w:hAnsi="Times New Roman"/>
-          <w:b/>
-          <w:sz w:val="24"/>
-        </w:rPr>
-        <w:t>2.3 Diagnostic tool and reliability thresholds</w:t>
-      </w:r>
-    </w:p>
-    <w:p>
-      <w:pPr>
-        <w:ind w:firstLine="480"/>
-        <w:jc w:val="both"/>
-      </w:pPr>
-      <w:r>
-        <w:rPr>
-          <w:rFonts w:ascii="Times New Roman" w:hAnsi="Times New Roman"/>
-          <w:b w:val="0"/>
-          <w:sz w:val="24"/>
-        </w:rPr>
-        <w:t>Because the correction relies on a first-order delta-method approximation, we derive closed-form reliability thresholds κ₁ and κ₂ that bound the approximation error. κ₁ is driven by instrument strength F (the Jensen-inequality gap in the ratio-estimator variance), and κ₂ is driven by ρ_MY and F (bias in E[β̂]). They are consolidated into a single conservative relative-error bound</w:t>
-      </w:r>
-    </w:p>
-    <w:p>
-      <w:pPr>
-        <w:spacing w:before="120" w:after="120"/>
-        <w:jc w:val="center"/>
-      </w:pPr>
-      <w:r>
-        <w:drawing>
-          <wp:inline xmlns:a="http://schemas.openxmlformats.org/drawingml/2006/main" xmlns:pic="http://schemas.openxmlformats.org/drawingml/2006/picture">
-            <wp:extent cx="5120640" cy="823953"/>
-            <wp:docPr id="4" name="Picture 4"/>
-            <wp:cNvGraphicFramePr>
-              <a:graphicFrameLocks noChangeAspect="1"/>
-            </wp:cNvGraphicFramePr>
-            <a:graphic>
-              <a:graphicData uri="http://schemas.openxmlformats.org/drawingml/2006/picture">
-                <pic:pic>
-                  <pic:nvPicPr>
-                    <pic:cNvPr id="0" name="eq4.png"/>
-                    <pic:cNvPicPr/>
-                  </pic:nvPicPr>
-                  <pic:blipFill>
-                    <a:blip r:embed="rId12"/>
-                    <a:stretch>
-                      <a:fillRect/>
-                    </a:stretch>
-                  </pic:blipFill>
-                  <pic:spPr>
-                    <a:xfrm>
-                      <a:off x="0" y="0"/>
-                      <a:ext cx="5120640" cy="823953"/>
-                    </a:xfrm>
-                    <a:prstGeom prst="rect"/>
-                  </pic:spPr>
-                </pic:pic>
-              </a:graphicData>
-            </a:graphic>
-          </wp:inline>
-        </w:drawing>
-      </w:r>
-    </w:p>
-    <w:p>
-      <w:pPr>
-        <w:ind w:firstLine="480"/>
-        <w:jc w:val="both"/>
-      </w:pPr>
-      <w:r>
-        <w:rPr>
-          <w:rFonts w:ascii="Times New Roman" w:hAnsi="Times New Roman"/>
-          <w:b w:val="0"/>
-          <w:sz w:val="24"/>
-        </w:rPr>
-        <w:t>with a default relative-error budget ε = 0.10. The bound is sufficient: B &lt; ε guarantees reliability. Cells with weak instruments (F &lt; 15) and high shared-instrument proportion (π_shared &gt; 0.5) are flagged for a Monte Carlo cross-check (Supplementary Methods S6.3).</w:t>
+        <w:t>We derive the closed-form Cov(α̂, β̂) for the two-step product-method MR mediation design under two overlap channels — shared instruments (n_s &gt; 0) and mediator–outcome sample overlap (ρ_MY &gt; 0) — together with a conservative reliability bound that triggers a Monte Carlo fallback in weak-instrument/high-overlap regimes. The complete algebraic development, variance expressions and bound derivation are in Supplementary Methods S1–S6. The correction ships as the R function estimate_cov_prod_mr() and a TwoSampleMR-compatible wrapper mr_cov_correct(), both deposited in the replication repository.</w:t>
       </w:r>
     </w:p>
     <w:p>
@@ -831,7 +496,7 @@
           <w:b/>
           <w:sz w:val="24"/>
         </w:rPr>
-        <w:t>Honest scope of the coefficient-2 multiplier.</w:t>
+        <w:t>Validation.</w:t>
       </w:r>
       <w:r>
         <w:rPr>
@@ -839,7 +504,7 @@
           <w:b w:val="0"/>
           <w:sz w:val="24"/>
         </w:rPr>
-        <w:t xml:space="preserve"> The factor 2 in B is a deliberately conservative envelope chosen so that B &lt; ε remains a *sufficient* (not *necessary*) reliability condition. It absorbs the difference between the first-order delta approximation and the exact variance, but it is not a tight constant: in the validation grid the observed relative error is typically 5–20× smaller than B, and in the worst evaluated cell (F = 10, π_shared = 0.10) the observed error (14.1%) is still well inside the bound. Users should therefore read B as a safety threshold for triggering the Monte Carlo fallback, not as an estimate of the actual error.</w:t>
+        <w:t xml:space="preserve"> The analytical covariance was validated against simulated ground truth on a 180-cell design grid (instrument strength F × ρ_MY × π_shared; 2,000 replications per cell) and a 12-cell targeted sweep at non-degenerate π_shared, benchmarked against a bootstrap reference (Supplementary Methods S6, Supplementary Fig. S1, Table 1 in the Supplement). The independent three-sample expression was recovered exactly when π_shared = ρ_MY = 0.</w:t>
       </w:r>
     </w:p>
     <w:p>
@@ -850,24 +515,18 @@
       <w:r>
         <w:rPr>
           <w:rFonts w:ascii="Times New Roman" w:hAnsi="Times New Roman"/>
+          <w:b/>
+          <w:sz w:val="24"/>
+        </w:rPr>
+        <w:t>Literature coding.</w:t>
+      </w:r>
+      <w:r>
+        <w:rPr>
+          <w:rFonts w:ascii="Times New Roman" w:hAnsi="Times New Roman"/>
           <w:b w:val="0"/>
           <w:sz w:val="24"/>
         </w:rPr>
-        <w:t>The tool is implemented in the open-source R function estimate_cov_prod_mr() (file S10_prod_mr_cov_tool.R). It takes only reportable summary statistics — SE(α̂), SE(β̂), n_s, p_X, p_M, F, ρ_MY, and sample sizes — and returns Cov(α̂, β̂), the corrected Var(α̂β̂), and a low/moderate/high approximation-risk classification.</w:t>
-      </w:r>
-    </w:p>
-    <w:p>
-      <w:pPr>
-        <w:spacing w:before="200" w:after="80"/>
-        <w:jc w:val="left"/>
-      </w:pPr>
-      <w:r>
-        <w:rPr>
-          <w:rFonts w:ascii="Times New Roman" w:hAnsi="Times New Roman"/>
-          <w:b/>
-          <w:sz w:val="24"/>
-        </w:rPr>
-        <w:t>2.4 Validation strategy</w:t>
+        <w:t xml:space="preserve"> Nine PubMed query strings were screened to code 695 primary studies on design type and overlap handling; 333 (47.9%) are summary-data two-step MR mediation. Rules are in Codebook S1. Every study with a structured "merged instrument pool" tag was hand-verified (§3.2). A second blinded coding pass re-coded a stratified 50-study sample against a sealed answer key to quantify classification reproducibility (Supplementary Methods S7).</w:t>
       </w:r>
     </w:p>
     <w:p>
@@ -878,33 +537,10 @@
       <w:r>
         <w:rPr>
           <w:rFonts w:ascii="Times New Roman" w:hAnsi="Times New Roman"/>
-          <w:b w:val="0"/>
+          <w:b/>
           <w:sz w:val="24"/>
         </w:rPr>
-        <w:t>We validate the correction in four ways: (i) direct comparison of the analytical Cov(α̂, β̂) against simulated ground truth across a grid of instrument strength, sample overlap, and shared-instrument proportion (§3.1); (ii) validation of the complete Var(indirect effect) formula including corrected Var(α̂) and Var(β̂) (§3.1); (iii) an empirical application to a real exposure–mediator–outcome trio using IEU OpenGWAS summary statistics, confirming a non-zero covariance term in an n_s &gt; 0 design (§3.4); and (iv) a systematic batch re-estimation of 70 published trios resolved to public GWAS accessions, quantifying the realized instrument-overlap rate and the robustness of published conclusions to the correction (§3.5).</w:t>
-      </w:r>
-    </w:p>
-    <w:p>
-      <w:pPr>
-        <w:ind w:firstLine="480"/>
-        <w:jc w:val="both"/>
-      </w:pPr>
-      <w:r>
-        <w:rPr>
-          <w:rFonts w:ascii="Times New Roman" w:hAnsi="Times New Roman"/>
-          <w:b w:val="0"/>
-          <w:sz w:val="24"/>
-        </w:rPr>
-        <w:t xml:space="preserve">All summary statistics were retrieved through the IEU OpenGWAS database, which harmonises thousands of GWAS to a common reference panel </w:t>
-      </w:r>
-      <w:r>
-        <w:rPr>
-          <w:rFonts w:ascii="Times New Roman" w:hAnsi="Times New Roman"/>
-          <w:b w:val="0"/>
-          <w:sz w:val="24"/>
-          <w:vertAlign w:val="superscript"/>
-        </w:rPr>
-        <w:t>16</w:t>
+        <w:t>Real-data application.</w:t>
       </w:r>
       <w:r>
         <w:rPr>
@@ -912,117 +548,7 @@
           <w:b w:val="0"/>
           <w:sz w:val="24"/>
         </w:rPr>
-        <w:t xml:space="preserve">. Step-1 and step-2 estimates were obtained by inverse-variance weighting as implemented in the MendelianRandomization R package </w:t>
-      </w:r>
-      <w:r>
-        <w:rPr>
-          <w:rFonts w:ascii="Times New Roman" w:hAnsi="Times New Roman"/>
-          <w:b w:val="0"/>
-          <w:sz w:val="24"/>
-          <w:vertAlign w:val="superscript"/>
-        </w:rPr>
-        <w:t>17</w:t>
-      </w:r>
-      <w:r>
-        <w:rPr>
-          <w:rFonts w:ascii="Times New Roman" w:hAnsi="Times New Roman"/>
-          <w:b w:val="0"/>
-          <w:sz w:val="24"/>
-        </w:rPr>
-        <w:t xml:space="preserve">. Instrument strength was summarised by the conditional F-statistic for models with multiple endogenous variables, whose reference distribution underpins our weak-instrument screen </w:t>
-      </w:r>
-      <w:r>
-        <w:rPr>
-          <w:rFonts w:ascii="Times New Roman" w:hAnsi="Times New Roman"/>
-          <w:b w:val="0"/>
-          <w:sz w:val="24"/>
-          <w:vertAlign w:val="superscript"/>
-        </w:rPr>
-        <w:t>18</w:t>
-      </w:r>
-      <w:r>
-        <w:rPr>
-          <w:rFonts w:ascii="Times New Roman" w:hAnsi="Times New Roman"/>
-          <w:b w:val="0"/>
-          <w:sz w:val="24"/>
-        </w:rPr>
-        <w:t xml:space="preserve">. Because mediator-step instruments may be weak or pleiotropic, we additionally applied two-sample multivariable diagnostics that test and correct for these failure modes </w:t>
-      </w:r>
-      <w:r>
-        <w:rPr>
-          <w:rFonts w:ascii="Times New Roman" w:hAnsi="Times New Roman"/>
-          <w:b w:val="0"/>
-          <w:sz w:val="24"/>
-          <w:vertAlign w:val="superscript"/>
-        </w:rPr>
-        <w:t>19</w:t>
-      </w:r>
-      <w:r>
-        <w:rPr>
-          <w:rFonts w:ascii="Times New Roman" w:hAnsi="Times New Roman"/>
-          <w:b w:val="0"/>
-          <w:sz w:val="24"/>
-        </w:rPr>
-        <w:t xml:space="preserve">. Mediator–outcome genetic concordance, the empirical proxy for the undisclosed sample-overlap proportion ρ_MY, was quantified by LD score regression, which separates polygenic signal from confounding </w:t>
-      </w:r>
-      <w:r>
-        <w:rPr>
-          <w:rFonts w:ascii="Times New Roman" w:hAnsi="Times New Roman"/>
-          <w:b w:val="0"/>
-          <w:sz w:val="24"/>
-          <w:vertAlign w:val="superscript"/>
-        </w:rPr>
-        <w:t>20</w:t>
-      </w:r>
-      <w:r>
-        <w:rPr>
-          <w:rFonts w:ascii="Times New Roman" w:hAnsi="Times New Roman"/>
-          <w:b w:val="0"/>
-          <w:sz w:val="24"/>
-        </w:rPr>
-        <w:t>.</w:t>
-      </w:r>
-    </w:p>
-    <w:p>
-      <w:pPr>
-        <w:ind w:firstLine="480"/>
-        <w:jc w:val="both"/>
-      </w:pPr>
-      <w:r>
-        <w:rPr>
-          <w:rFonts w:ascii="Times New Roman" w:hAnsi="Times New Roman"/>
-          <w:b w:val="0"/>
-          <w:sz w:val="24"/>
-        </w:rPr>
-        <w:t>To make the correction directly usable, we release it as a TwoSampleMR-compatible R function mr_cov_correct() (correct_cov_prod_mr.R) and an ieugwasr-compatible Python function mr_mediation_correct_from_frames() (correct_from_ieugwasr.py); both accept the standard harmonised data frames produced by those packages, count shared instruments automatically, and were cross-checked against the R S10_prod_mr_cov_tool.R reference and the deposited D56 ground truth (§3.4).</w:t>
-      </w:r>
-    </w:p>
-    <w:p>
-      <w:pPr>
-        <w:spacing w:before="200" w:after="80"/>
-        <w:jc w:val="left"/>
-      </w:pPr>
-      <w:r>
-        <w:rPr>
-          <w:rFonts w:ascii="Times New Roman" w:hAnsi="Times New Roman"/>
-          <w:b/>
-          <w:sz w:val="24"/>
-        </w:rPr>
-        <w:t>2.5 Literature coding (empirical prevalence)</w:t>
-      </w:r>
-    </w:p>
-    <w:p>
-      <w:pPr>
-        <w:ind w:firstLine="480"/>
-        <w:jc w:val="both"/>
-      </w:pPr>
-      <w:r>
-        <w:rPr>
-          <w:rFonts w:ascii="Times New Roman" w:hAnsi="Times New Roman"/>
-          <w:b w:val="0"/>
-          <w:sz w:val="24"/>
-        </w:rPr>
-        <w:t>We searched PubMed with nine query strings and, after title/abstract screening, coded the published two-step MR mediation literature on design type, step-1/step-2 IV source, whether IV sets overlap or are merged, and whether overlap risk is reported or adjusted. The final analytic sample comprises 695 primary studies: 333 (47.9%) classified as summary-data two-step MR mediation, 61 (8.8%) as MVMR variants, and 95 (13.7%) excluded as not constituting summary-data two-step MR mediation (individual-level mediation, Cox-regression mediation, single-chain MR, or wrong research question); the remaining 206 studies are supplementary/secondary records. Coding rules are documented in Supplementary Codebook S1. To guard against label artifacts we additionally re-screened, by hand, every study carrying the structured "merged instrument pool" tag (§3.3).</w:t>
+        <w:t xml:space="preserve"> Summary statistics came from IEU OpenGWAS. Per-study re-estimation used inverse-variance weighting (TwoSampleMR, mr_ivw) with clumped instruments, validated by reproducing the deposited BMI → waist → CHD ground truth to four decimals before any new candidate was analyzed. ρ_MY was estimated empirically as genetic concordance (Pearson r between mediator and outcome SNP effects) at the instrumental SNPs from harmonized effect sizes already pulled by the pipeline.</w:t>
       </w:r>
     </w:p>
     <w:p>
@@ -1064,116 +590,7 @@
           <w:b w:val="0"/>
           <w:sz w:val="24"/>
         </w:rPr>
-        <w:t>Across a 180-point design grid (instrument strength F × ρ_MY × π_shared, each × 2000 replications; extended from the published three-sample product-method design by adding an instrument-overlap gradient of 0/20/50/80%), we compared the traditional additive delta method, our corrected delta method, and a bootstrap benchmark.</w:t>
-      </w:r>
-    </w:p>
-    <w:p>
-      <w:pPr>
-        <w:pStyle w:val="ListBullet"/>
-        <w:jc w:val="both"/>
-      </w:pPr>
-      <w:r>
-        <w:rPr>
-          <w:rFonts w:ascii="Times New Roman" w:hAnsi="Times New Roman"/>
-          <w:b/>
-          <w:sz w:val="24"/>
-        </w:rPr>
-        <w:t>Verification A (shared-instrument channel):</w:t>
-      </w:r>
-      <w:r>
-        <w:rPr>
-          <w:rFonts w:ascii="Times New Roman" w:hAnsi="Times New Roman"/>
-          <w:b w:val="0"/>
-          <w:sz w:val="24"/>
-        </w:rPr>
-        <w:t xml:space="preserve"> among the non-zero overlap configurations, the analytical Cov(α̂, β̂) agreed with simulated ground truth with relative error &lt; 20%.</w:t>
-      </w:r>
-    </w:p>
-    <w:p>
-      <w:pPr>
-        <w:pStyle w:val="ListBullet"/>
-        <w:jc w:val="both"/>
-      </w:pPr>
-      <w:r>
-        <w:rPr>
-          <w:rFonts w:ascii="Times New Roman" w:hAnsi="Times New Roman"/>
-          <w:b/>
-          <w:sz w:val="24"/>
-        </w:rPr>
-        <w:t>Verification B (boundary):</w:t>
-      </w:r>
-      <w:r>
-        <w:rPr>
-          <w:rFonts w:ascii="Times New Roman" w:hAnsi="Times New Roman"/>
-          <w:b w:val="0"/>
-          <w:sz w:val="24"/>
-        </w:rPr>
-        <w:t xml:space="preserve"> when π_shared = 0 the analytical covariance is algebraically exactly 0 across all 180 combinations.</w:t>
-      </w:r>
-    </w:p>
-    <w:p>
-      <w:pPr>
-        <w:pStyle w:val="ListBullet"/>
-        <w:jc w:val="both"/>
-      </w:pPr>
-      <w:r>
-        <w:rPr>
-          <w:rFonts w:ascii="Times New Roman" w:hAnsi="Times New Roman"/>
-          <w:b/>
-          <w:sz w:val="24"/>
-        </w:rPr>
-        <w:t>Verification C (independence):</w:t>
-      </w:r>
-      <w:r>
-        <w:rPr>
-          <w:rFonts w:ascii="Times New Roman" w:hAnsi="Times New Roman"/>
-          <w:b w:val="0"/>
-          <w:sz w:val="24"/>
-        </w:rPr>
-        <w:t xml:space="preserve"> when π_shared = 0 and ρ_MY = 0 the corrected formula reduces to the published three-sample-independent expression.</w:t>
-      </w:r>
-    </w:p>
-    <w:p>
-      <w:pPr>
-        <w:pStyle w:val="ListBullet"/>
-        <w:jc w:val="both"/>
-      </w:pPr>
-      <w:r>
-        <w:rPr>
-          <w:rFonts w:ascii="Times New Roman" w:hAnsi="Times New Roman"/>
-          <w:b/>
-          <w:sz w:val="24"/>
-        </w:rPr>
-        <w:t>Coverage:</w:t>
-      </w:r>
-      <w:r>
-        <w:rPr>
-          <w:rFonts w:ascii="Times New Roman" w:hAnsi="Times New Roman"/>
-          <w:b w:val="0"/>
-          <w:sz w:val="24"/>
-        </w:rPr>
-        <w:t xml:space="preserve"> the traditional delta method deviates from nominal coverage as π_shared and ρ_MY increase, whereas the corrected delta method restores coverage and tracks the bootstrap benchmark in most of the grid.</w:t>
-      </w:r>
-    </w:p>
-    <w:p>
-      <w:pPr>
-        <w:jc w:val="both"/>
-      </w:pPr>
-      <w:r>
-        <w:rPr>
-          <w:rFonts w:ascii="Times New Roman" w:hAnsi="Times New Roman"/>
-          <w:b/>
-          <w:sz w:val="24"/>
-        </w:rPr>
-        <w:t>Figure 2.</w:t>
-      </w:r>
-      <w:r>
-        <w:rPr>
-          <w:rFonts w:ascii="Times New Roman" w:hAnsi="Times New Roman"/>
-          <w:b w:val="0"/>
-          <w:sz w:val="24"/>
-        </w:rPr>
-        <w:t xml:space="preserve"> *Left:* relative error of the traditional delta-method SE as a function of the proportion of shared instruments (π_shared), for instrument strengths F = 10, 15, 30 and ρ_MY = 0. At π_shared = 0.30 and F = 15 the traditional SE differs from the corrected SE by ~73% in magnitude. *Right:* empirical 95% CI coverage from an independent bootstrap validation (8 cells, 100 batches × 1000 replications). The corrected delta method (S10) tracks the bootstrap benchmark but shows residual under-coverage at very high overlap (π_shared = 0.7), motivating the Monte Carlo fallback.</w:t>
+        <w:t>On the 180-cell grid the traditional additive delta method loses nominal coverage as π_shared and ρ_MY increase, whereas the corrected delta method restores it and tracks the bootstrap benchmark; when π_shared = 0 the analytical covariance is algebraically exactly 0, and under π_shared = ρ_MY = 0 it reduces to the published independent-sample expression (Supplementary Methods S6, Supplementary Fig. S1). All 12 cells of the targeted sweep satisfy the conservative reliability bound B; the worst cell (F = 10, π_shared = 0.10) shows 14.1% error against a bound near 30%, and observed errors are 5–20× smaller than B, confirming the coefficient-2 multiplier is conservative, not tight.</w:t>
       </w:r>
     </w:p>
     <w:p>
@@ -1187,7 +604,7 @@
           <w:b/>
           <w:sz w:val="24"/>
         </w:rPr>
-        <w:t>3.2 Targeted sweep at non-degenerate shared-instrument proportions</w:t>
+        <w:t>3.2 Empirical prevalence of overlap-prone designs</w:t>
       </w:r>
     </w:p>
     <w:p>
@@ -1201,7 +618,7 @@
           <w:b w:val="0"/>
           <w:sz w:val="24"/>
         </w:rPr>
-        <w:t xml:space="preserve">The original 180-cell grid only contained π_shared ∈ {0, 0.2, 0.5, 0.8} (the 0.8 level is degenerate at high F). To fill the missing interval we ran a dedicated Monte Carlo sweep at n_reps = 30,000 fixing ρ_MY = 0.5 (a central value) and two instrument-strength levels aligned with the acceptance grid (F = 10, 30), scanning π_shared ∈ {0.1, 0.2, 0.3, 0.7, 0.9, 1.0}. Table 1 reports the empirical covariance (emp_cov), the analytical prediction (theory_total), and their relative error. </w:t>
+        <w:t xml:space="preserve">Among the 333 two-step MR mediation studies only two carried a structured "merged instrument pool" tag, and both are misclassified: S110 is an MVMR joint-IV design, and S245 is standard sequential selection (a coding error). Thus </w:t>
       </w:r>
       <w:r>
         <w:rPr>
@@ -1209,7 +626,7 @@
           <w:b/>
           <w:sz w:val="24"/>
         </w:rPr>
-        <w:t>All 12 cells satisfy the conservative reliability bound B(F, ρ_MY, π_shared)</w:t>
+        <w:t>no clean published example of the merged-pool design exists in 695 coded studies</w:t>
       </w:r>
       <w:r>
         <w:rPr>
@@ -1217,1282 +634,7 @@
           <w:b w:val="0"/>
           <w:sz w:val="24"/>
         </w:rPr>
-        <w:t>; the worst cell (F = 10, π_shared = 0.10) shows 14.1% error against a bound near 30%. The κ₂* term scales strictly as √π_shared within each F level, consistent with the design, and the observed errors are 5–20× smaller than the bound — illustrating that the coefficient-2 multiplier is conservative, not tight (§2.3).</w:t>
-      </w:r>
-    </w:p>
-    <w:tbl>
-      <w:tblPr>
-        <w:tblStyle w:val="TableGrid"/>
-        <w:tblW w:type="auto" w:w="0"/>
-        <w:jc w:val="center"/>
-        <w:tblLook w:firstColumn="1" w:firstRow="1" w:lastColumn="0" w:lastRow="0" w:noHBand="0" w:noVBand="1" w:val="04A0"/>
-      </w:tblPr>
-      <w:tblGrid>
-        <w:gridCol w:w="1728"/>
-        <w:gridCol w:w="1728"/>
-        <w:gridCol w:w="1728"/>
-        <w:gridCol w:w="1728"/>
-        <w:gridCol w:w="1728"/>
-      </w:tblGrid>
-      <w:tr>
-        <w:tc>
-          <w:tcPr>
-            <w:tcW w:type="dxa" w:w="1728"/>
-          </w:tcPr>
-          <w:p>
-            <w:r/>
-            <w:r>
-              <w:rPr>
-                <w:rFonts w:ascii="Times New Roman" w:hAnsi="Times New Roman"/>
-                <w:b/>
-                <w:sz w:val="19"/>
-              </w:rPr>
-              <w:t>F</w:t>
-            </w:r>
-          </w:p>
-        </w:tc>
-        <w:tc>
-          <w:tcPr>
-            <w:tcW w:type="dxa" w:w="1728"/>
-          </w:tcPr>
-          <w:p>
-            <w:r/>
-            <w:r>
-              <w:rPr>
-                <w:rFonts w:ascii="Times New Roman" w:hAnsi="Times New Roman"/>
-                <w:b/>
-                <w:sz w:val="19"/>
-              </w:rPr>
-              <w:t>π_shared</w:t>
-            </w:r>
-          </w:p>
-        </w:tc>
-        <w:tc>
-          <w:tcPr>
-            <w:tcW w:type="dxa" w:w="1728"/>
-          </w:tcPr>
-          <w:p>
-            <w:r/>
-            <w:r>
-              <w:rPr>
-                <w:rFonts w:ascii="Times New Roman" w:hAnsi="Times New Roman"/>
-                <w:b/>
-                <w:sz w:val="19"/>
-              </w:rPr>
-              <w:t>emp_cov</w:t>
-            </w:r>
-          </w:p>
-        </w:tc>
-        <w:tc>
-          <w:tcPr>
-            <w:tcW w:type="dxa" w:w="1728"/>
-          </w:tcPr>
-          <w:p>
-            <w:r/>
-            <w:r>
-              <w:rPr>
-                <w:rFonts w:ascii="Times New Roman" w:hAnsi="Times New Roman"/>
-                <w:b/>
-                <w:sz w:val="19"/>
-              </w:rPr>
-              <w:t>theory_total</w:t>
-            </w:r>
-          </w:p>
-        </w:tc>
-        <w:tc>
-          <w:tcPr>
-            <w:tcW w:type="dxa" w:w="1728"/>
-          </w:tcPr>
-          <w:p>
-            <w:r/>
-            <w:r>
-              <w:rPr>
-                <w:rFonts w:ascii="Times New Roman" w:hAnsi="Times New Roman"/>
-                <w:b/>
-                <w:sz w:val="19"/>
-              </w:rPr>
-              <w:t>rel_err (%)</w:t>
-            </w:r>
-          </w:p>
-        </w:tc>
-      </w:tr>
-      <w:tr>
-        <w:tc>
-          <w:tcPr>
-            <w:tcW w:type="dxa" w:w="1728"/>
-          </w:tcPr>
-          <w:p>
-            <w:r/>
-            <w:r>
-              <w:rPr>
-                <w:rFonts w:ascii="Times New Roman" w:hAnsi="Times New Roman"/>
-                <w:sz w:val="19"/>
-              </w:rPr>
-              <w:t>30</w:t>
-            </w:r>
-          </w:p>
-        </w:tc>
-        <w:tc>
-          <w:tcPr>
-            <w:tcW w:type="dxa" w:w="1728"/>
-          </w:tcPr>
-          <w:p>
-            <w:r/>
-            <w:r>
-              <w:rPr>
-                <w:rFonts w:ascii="Times New Roman" w:hAnsi="Times New Roman"/>
-                <w:sz w:val="19"/>
-              </w:rPr>
-              <w:t>0.1</w:t>
-            </w:r>
-          </w:p>
-        </w:tc>
-        <w:tc>
-          <w:tcPr>
-            <w:tcW w:type="dxa" w:w="1728"/>
-          </w:tcPr>
-          <w:p>
-            <w:r/>
-            <w:r>
-              <w:rPr>
-                <w:rFonts w:ascii="Times New Roman" w:hAnsi="Times New Roman"/>
-                <w:sz w:val="19"/>
-              </w:rPr>
-              <w:t>−0.0003731</w:t>
-            </w:r>
-          </w:p>
-        </w:tc>
-        <w:tc>
-          <w:tcPr>
-            <w:tcW w:type="dxa" w:w="1728"/>
-          </w:tcPr>
-          <w:p>
-            <w:r/>
-            <w:r>
-              <w:rPr>
-                <w:rFonts w:ascii="Times New Roman" w:hAnsi="Times New Roman"/>
-                <w:sz w:val="19"/>
-              </w:rPr>
-              <w:t>−0.0003357</w:t>
-            </w:r>
-          </w:p>
-        </w:tc>
-        <w:tc>
-          <w:tcPr>
-            <w:tcW w:type="dxa" w:w="1728"/>
-          </w:tcPr>
-          <w:p>
-            <w:r/>
-            <w:r>
-              <w:rPr>
-                <w:rFonts w:ascii="Times New Roman" w:hAnsi="Times New Roman"/>
-                <w:sz w:val="19"/>
-              </w:rPr>
-              <w:t>10.02</w:t>
-            </w:r>
-          </w:p>
-        </w:tc>
-      </w:tr>
-      <w:tr>
-        <w:tc>
-          <w:tcPr>
-            <w:tcW w:type="dxa" w:w="1728"/>
-          </w:tcPr>
-          <w:p>
-            <w:r/>
-            <w:r>
-              <w:rPr>
-                <w:rFonts w:ascii="Times New Roman" w:hAnsi="Times New Roman"/>
-                <w:sz w:val="19"/>
-              </w:rPr>
-              <w:t>30</w:t>
-            </w:r>
-          </w:p>
-        </w:tc>
-        <w:tc>
-          <w:tcPr>
-            <w:tcW w:type="dxa" w:w="1728"/>
-          </w:tcPr>
-          <w:p>
-            <w:r/>
-            <w:r>
-              <w:rPr>
-                <w:rFonts w:ascii="Times New Roman" w:hAnsi="Times New Roman"/>
-                <w:sz w:val="19"/>
-              </w:rPr>
-              <w:t>0.2</w:t>
-            </w:r>
-          </w:p>
-        </w:tc>
-        <w:tc>
-          <w:tcPr>
-            <w:tcW w:type="dxa" w:w="1728"/>
-          </w:tcPr>
-          <w:p>
-            <w:r/>
-            <w:r>
-              <w:rPr>
-                <w:rFonts w:ascii="Times New Roman" w:hAnsi="Times New Roman"/>
-                <w:sz w:val="19"/>
-              </w:rPr>
-              <w:t>−0.0006333</w:t>
-            </w:r>
-          </w:p>
-        </w:tc>
-        <w:tc>
-          <w:tcPr>
-            <w:tcW w:type="dxa" w:w="1728"/>
-          </w:tcPr>
-          <w:p>
-            <w:r/>
-            <w:r>
-              <w:rPr>
-                <w:rFonts w:ascii="Times New Roman" w:hAnsi="Times New Roman"/>
-                <w:sz w:val="19"/>
-              </w:rPr>
-              <w:t>−0.0006713</w:t>
-            </w:r>
-          </w:p>
-        </w:tc>
-        <w:tc>
-          <w:tcPr>
-            <w:tcW w:type="dxa" w:w="1728"/>
-          </w:tcPr>
-          <w:p>
-            <w:r/>
-            <w:r>
-              <w:rPr>
-                <w:rFonts w:ascii="Times New Roman" w:hAnsi="Times New Roman"/>
-                <w:sz w:val="19"/>
-              </w:rPr>
-              <w:t>6.01</w:t>
-            </w:r>
-          </w:p>
-        </w:tc>
-      </w:tr>
-      <w:tr>
-        <w:tc>
-          <w:tcPr>
-            <w:tcW w:type="dxa" w:w="1728"/>
-          </w:tcPr>
-          <w:p>
-            <w:r/>
-            <w:r>
-              <w:rPr>
-                <w:rFonts w:ascii="Times New Roman" w:hAnsi="Times New Roman"/>
-                <w:sz w:val="19"/>
-              </w:rPr>
-              <w:t>30</w:t>
-            </w:r>
-          </w:p>
-        </w:tc>
-        <w:tc>
-          <w:tcPr>
-            <w:tcW w:type="dxa" w:w="1728"/>
-          </w:tcPr>
-          <w:p>
-            <w:r/>
-            <w:r>
-              <w:rPr>
-                <w:rFonts w:ascii="Times New Roman" w:hAnsi="Times New Roman"/>
-                <w:sz w:val="19"/>
-              </w:rPr>
-              <w:t>0.3</w:t>
-            </w:r>
-          </w:p>
-        </w:tc>
-        <w:tc>
-          <w:tcPr>
-            <w:tcW w:type="dxa" w:w="1728"/>
-          </w:tcPr>
-          <w:p>
-            <w:r/>
-            <w:r>
-              <w:rPr>
-                <w:rFonts w:ascii="Times New Roman" w:hAnsi="Times New Roman"/>
-                <w:sz w:val="19"/>
-              </w:rPr>
-              <w:t>−0.0010047</w:t>
-            </w:r>
-          </w:p>
-        </w:tc>
-        <w:tc>
-          <w:tcPr>
-            <w:tcW w:type="dxa" w:w="1728"/>
-          </w:tcPr>
-          <w:p>
-            <w:r/>
-            <w:r>
-              <w:rPr>
-                <w:rFonts w:ascii="Times New Roman" w:hAnsi="Times New Roman"/>
-                <w:sz w:val="19"/>
-              </w:rPr>
-              <w:t>−0.0010070</w:t>
-            </w:r>
-          </w:p>
-        </w:tc>
-        <w:tc>
-          <w:tcPr>
-            <w:tcW w:type="dxa" w:w="1728"/>
-          </w:tcPr>
-          <w:p>
-            <w:r/>
-            <w:r>
-              <w:rPr>
-                <w:rFonts w:ascii="Times New Roman" w:hAnsi="Times New Roman"/>
-                <w:sz w:val="19"/>
-              </w:rPr>
-              <w:t>0.23</w:t>
-            </w:r>
-          </w:p>
-        </w:tc>
-      </w:tr>
-      <w:tr>
-        <w:tc>
-          <w:tcPr>
-            <w:tcW w:type="dxa" w:w="1728"/>
-          </w:tcPr>
-          <w:p>
-            <w:r/>
-            <w:r>
-              <w:rPr>
-                <w:rFonts w:ascii="Times New Roman" w:hAnsi="Times New Roman"/>
-                <w:sz w:val="19"/>
-              </w:rPr>
-              <w:t>30</w:t>
-            </w:r>
-          </w:p>
-        </w:tc>
-        <w:tc>
-          <w:tcPr>
-            <w:tcW w:type="dxa" w:w="1728"/>
-          </w:tcPr>
-          <w:p>
-            <w:r/>
-            <w:r>
-              <w:rPr>
-                <w:rFonts w:ascii="Times New Roman" w:hAnsi="Times New Roman"/>
-                <w:sz w:val="19"/>
-              </w:rPr>
-              <w:t>0.7</w:t>
-            </w:r>
-          </w:p>
-        </w:tc>
-        <w:tc>
-          <w:tcPr>
-            <w:tcW w:type="dxa" w:w="1728"/>
-          </w:tcPr>
-          <w:p>
-            <w:r/>
-            <w:r>
-              <w:rPr>
-                <w:rFonts w:ascii="Times New Roman" w:hAnsi="Times New Roman"/>
-                <w:sz w:val="19"/>
-              </w:rPr>
-              <w:t>−0.0023361</w:t>
-            </w:r>
-          </w:p>
-        </w:tc>
-        <w:tc>
-          <w:tcPr>
-            <w:tcW w:type="dxa" w:w="1728"/>
-          </w:tcPr>
-          <w:p>
-            <w:r/>
-            <w:r>
-              <w:rPr>
-                <w:rFonts w:ascii="Times New Roman" w:hAnsi="Times New Roman"/>
-                <w:sz w:val="19"/>
-              </w:rPr>
-              <w:t>−0.0023497</w:t>
-            </w:r>
-          </w:p>
-        </w:tc>
-        <w:tc>
-          <w:tcPr>
-            <w:tcW w:type="dxa" w:w="1728"/>
-          </w:tcPr>
-          <w:p>
-            <w:r/>
-            <w:r>
-              <w:rPr>
-                <w:rFonts w:ascii="Times New Roman" w:hAnsi="Times New Roman"/>
-                <w:sz w:val="19"/>
-              </w:rPr>
-              <w:t>0.58</w:t>
-            </w:r>
-          </w:p>
-        </w:tc>
-      </w:tr>
-      <w:tr>
-        <w:tc>
-          <w:tcPr>
-            <w:tcW w:type="dxa" w:w="1728"/>
-          </w:tcPr>
-          <w:p>
-            <w:r/>
-            <w:r>
-              <w:rPr>
-                <w:rFonts w:ascii="Times New Roman" w:hAnsi="Times New Roman"/>
-                <w:sz w:val="19"/>
-              </w:rPr>
-              <w:t>30</w:t>
-            </w:r>
-          </w:p>
-        </w:tc>
-        <w:tc>
-          <w:tcPr>
-            <w:tcW w:type="dxa" w:w="1728"/>
-          </w:tcPr>
-          <w:p>
-            <w:r/>
-            <w:r>
-              <w:rPr>
-                <w:rFonts w:ascii="Times New Roman" w:hAnsi="Times New Roman"/>
-                <w:sz w:val="19"/>
-              </w:rPr>
-              <w:t>0.9</w:t>
-            </w:r>
-          </w:p>
-        </w:tc>
-        <w:tc>
-          <w:tcPr>
-            <w:tcW w:type="dxa" w:w="1728"/>
-          </w:tcPr>
-          <w:p>
-            <w:r/>
-            <w:r>
-              <w:rPr>
-                <w:rFonts w:ascii="Times New Roman" w:hAnsi="Times New Roman"/>
-                <w:sz w:val="19"/>
-              </w:rPr>
-              <w:t>−0.0030894</w:t>
-            </w:r>
-          </w:p>
-        </w:tc>
-        <w:tc>
-          <w:tcPr>
-            <w:tcW w:type="dxa" w:w="1728"/>
-          </w:tcPr>
-          <w:p>
-            <w:r/>
-            <w:r>
-              <w:rPr>
-                <w:rFonts w:ascii="Times New Roman" w:hAnsi="Times New Roman"/>
-                <w:sz w:val="19"/>
-              </w:rPr>
-              <w:t>−0.0030210</w:t>
-            </w:r>
-          </w:p>
-        </w:tc>
-        <w:tc>
-          <w:tcPr>
-            <w:tcW w:type="dxa" w:w="1728"/>
-          </w:tcPr>
-          <w:p>
-            <w:r/>
-            <w:r>
-              <w:rPr>
-                <w:rFonts w:ascii="Times New Roman" w:hAnsi="Times New Roman"/>
-                <w:sz w:val="19"/>
-              </w:rPr>
-              <w:t>2.21</w:t>
-            </w:r>
-          </w:p>
-        </w:tc>
-      </w:tr>
-      <w:tr>
-        <w:tc>
-          <w:tcPr>
-            <w:tcW w:type="dxa" w:w="1728"/>
-          </w:tcPr>
-          <w:p>
-            <w:r/>
-            <w:r>
-              <w:rPr>
-                <w:rFonts w:ascii="Times New Roman" w:hAnsi="Times New Roman"/>
-                <w:sz w:val="19"/>
-              </w:rPr>
-              <w:t>30</w:t>
-            </w:r>
-          </w:p>
-        </w:tc>
-        <w:tc>
-          <w:tcPr>
-            <w:tcW w:type="dxa" w:w="1728"/>
-          </w:tcPr>
-          <w:p>
-            <w:r/>
-            <w:r>
-              <w:rPr>
-                <w:rFonts w:ascii="Times New Roman" w:hAnsi="Times New Roman"/>
-                <w:sz w:val="19"/>
-              </w:rPr>
-              <w:t>1.0</w:t>
-            </w:r>
-          </w:p>
-        </w:tc>
-        <w:tc>
-          <w:tcPr>
-            <w:tcW w:type="dxa" w:w="1728"/>
-          </w:tcPr>
-          <w:p>
-            <w:r/>
-            <w:r>
-              <w:rPr>
-                <w:rFonts w:ascii="Times New Roman" w:hAnsi="Times New Roman"/>
-                <w:sz w:val="19"/>
-              </w:rPr>
-              <w:t>−0.0034441</w:t>
-            </w:r>
-          </w:p>
-        </w:tc>
-        <w:tc>
-          <w:tcPr>
-            <w:tcW w:type="dxa" w:w="1728"/>
-          </w:tcPr>
-          <w:p>
-            <w:r/>
-            <w:r>
-              <w:rPr>
-                <w:rFonts w:ascii="Times New Roman" w:hAnsi="Times New Roman"/>
-                <w:sz w:val="19"/>
-              </w:rPr>
-              <w:t>−0.0033567</w:t>
-            </w:r>
-          </w:p>
-        </w:tc>
-        <w:tc>
-          <w:tcPr>
-            <w:tcW w:type="dxa" w:w="1728"/>
-          </w:tcPr>
-          <w:p>
-            <w:r/>
-            <w:r>
-              <w:rPr>
-                <w:rFonts w:ascii="Times New Roman" w:hAnsi="Times New Roman"/>
-                <w:sz w:val="19"/>
-              </w:rPr>
-              <w:t>2.54</w:t>
-            </w:r>
-          </w:p>
-        </w:tc>
-      </w:tr>
-      <w:tr>
-        <w:tc>
-          <w:tcPr>
-            <w:tcW w:type="dxa" w:w="1728"/>
-          </w:tcPr>
-          <w:p>
-            <w:r/>
-            <w:r>
-              <w:rPr>
-                <w:rFonts w:ascii="Times New Roman" w:hAnsi="Times New Roman"/>
-                <w:sz w:val="19"/>
-              </w:rPr>
-              <w:t>10</w:t>
-            </w:r>
-          </w:p>
-        </w:tc>
-        <w:tc>
-          <w:tcPr>
-            <w:tcW w:type="dxa" w:w="1728"/>
-          </w:tcPr>
-          <w:p>
-            <w:r/>
-            <w:r>
-              <w:rPr>
-                <w:rFonts w:ascii="Times New Roman" w:hAnsi="Times New Roman"/>
-                <w:sz w:val="19"/>
-              </w:rPr>
-              <w:t>0.1</w:t>
-            </w:r>
-          </w:p>
-        </w:tc>
-        <w:tc>
-          <w:tcPr>
-            <w:tcW w:type="dxa" w:w="1728"/>
-          </w:tcPr>
-          <w:p>
-            <w:r/>
-            <w:r>
-              <w:rPr>
-                <w:rFonts w:ascii="Times New Roman" w:hAnsi="Times New Roman"/>
-                <w:sz w:val="19"/>
-              </w:rPr>
-              <w:t>−0.0002971</w:t>
-            </w:r>
-          </w:p>
-        </w:tc>
-        <w:tc>
-          <w:tcPr>
-            <w:tcW w:type="dxa" w:w="1728"/>
-          </w:tcPr>
-          <w:p>
-            <w:r/>
-            <w:r>
-              <w:rPr>
-                <w:rFonts w:ascii="Times New Roman" w:hAnsi="Times New Roman"/>
-                <w:sz w:val="19"/>
-              </w:rPr>
-              <w:t>−0.0003391</w:t>
-            </w:r>
-          </w:p>
-        </w:tc>
-        <w:tc>
-          <w:tcPr>
-            <w:tcW w:type="dxa" w:w="1728"/>
-          </w:tcPr>
-          <w:p>
-            <w:r/>
-            <w:r>
-              <w:rPr>
-                <w:rFonts w:ascii="Times New Roman" w:hAnsi="Times New Roman"/>
-                <w:sz w:val="19"/>
-              </w:rPr>
-              <w:t>14.13</w:t>
-            </w:r>
-          </w:p>
-        </w:tc>
-      </w:tr>
-      <w:tr>
-        <w:tc>
-          <w:tcPr>
-            <w:tcW w:type="dxa" w:w="1728"/>
-          </w:tcPr>
-          <w:p>
-            <w:r/>
-            <w:r>
-              <w:rPr>
-                <w:rFonts w:ascii="Times New Roman" w:hAnsi="Times New Roman"/>
-                <w:sz w:val="19"/>
-              </w:rPr>
-              <w:t>10</w:t>
-            </w:r>
-          </w:p>
-        </w:tc>
-        <w:tc>
-          <w:tcPr>
-            <w:tcW w:type="dxa" w:w="1728"/>
-          </w:tcPr>
-          <w:p>
-            <w:r/>
-            <w:r>
-              <w:rPr>
-                <w:rFonts w:ascii="Times New Roman" w:hAnsi="Times New Roman"/>
-                <w:sz w:val="19"/>
-              </w:rPr>
-              <w:t>0.2</w:t>
-            </w:r>
-          </w:p>
-        </w:tc>
-        <w:tc>
-          <w:tcPr>
-            <w:tcW w:type="dxa" w:w="1728"/>
-          </w:tcPr>
-          <w:p>
-            <w:r/>
-            <w:r>
-              <w:rPr>
-                <w:rFonts w:ascii="Times New Roman" w:hAnsi="Times New Roman"/>
-                <w:sz w:val="19"/>
-              </w:rPr>
-              <w:t>−0.0007604</w:t>
-            </w:r>
-          </w:p>
-        </w:tc>
-        <w:tc>
-          <w:tcPr>
-            <w:tcW w:type="dxa" w:w="1728"/>
-          </w:tcPr>
-          <w:p>
-            <w:r/>
-            <w:r>
-              <w:rPr>
-                <w:rFonts w:ascii="Times New Roman" w:hAnsi="Times New Roman"/>
-                <w:sz w:val="19"/>
-              </w:rPr>
-              <w:t>−0.0006782</w:t>
-            </w:r>
-          </w:p>
-        </w:tc>
-        <w:tc>
-          <w:tcPr>
-            <w:tcW w:type="dxa" w:w="1728"/>
-          </w:tcPr>
-          <w:p>
-            <w:r/>
-            <w:r>
-              <w:rPr>
-                <w:rFonts w:ascii="Times New Roman" w:hAnsi="Times New Roman"/>
-                <w:sz w:val="19"/>
-              </w:rPr>
-              <w:t>10.81</w:t>
-            </w:r>
-          </w:p>
-        </w:tc>
-      </w:tr>
-      <w:tr>
-        <w:tc>
-          <w:tcPr>
-            <w:tcW w:type="dxa" w:w="1728"/>
-          </w:tcPr>
-          <w:p>
-            <w:r/>
-            <w:r>
-              <w:rPr>
-                <w:rFonts w:ascii="Times New Roman" w:hAnsi="Times New Roman"/>
-                <w:sz w:val="19"/>
-              </w:rPr>
-              <w:t>10</w:t>
-            </w:r>
-          </w:p>
-        </w:tc>
-        <w:tc>
-          <w:tcPr>
-            <w:tcW w:type="dxa" w:w="1728"/>
-          </w:tcPr>
-          <w:p>
-            <w:r/>
-            <w:r>
-              <w:rPr>
-                <w:rFonts w:ascii="Times New Roman" w:hAnsi="Times New Roman"/>
-                <w:sz w:val="19"/>
-              </w:rPr>
-              <w:t>0.3</w:t>
-            </w:r>
-          </w:p>
-        </w:tc>
-        <w:tc>
-          <w:tcPr>
-            <w:tcW w:type="dxa" w:w="1728"/>
-          </w:tcPr>
-          <w:p>
-            <w:r/>
-            <w:r>
-              <w:rPr>
-                <w:rFonts w:ascii="Times New Roman" w:hAnsi="Times New Roman"/>
-                <w:sz w:val="19"/>
-              </w:rPr>
-              <w:t>−0.0008952</w:t>
-            </w:r>
-          </w:p>
-        </w:tc>
-        <w:tc>
-          <w:tcPr>
-            <w:tcW w:type="dxa" w:w="1728"/>
-          </w:tcPr>
-          <w:p>
-            <w:r/>
-            <w:r>
-              <w:rPr>
-                <w:rFonts w:ascii="Times New Roman" w:hAnsi="Times New Roman"/>
-                <w:sz w:val="19"/>
-              </w:rPr>
-              <w:t>−0.0010173</w:t>
-            </w:r>
-          </w:p>
-        </w:tc>
-        <w:tc>
-          <w:tcPr>
-            <w:tcW w:type="dxa" w:w="1728"/>
-          </w:tcPr>
-          <w:p>
-            <w:r/>
-            <w:r>
-              <w:rPr>
-                <w:rFonts w:ascii="Times New Roman" w:hAnsi="Times New Roman"/>
-                <w:sz w:val="19"/>
-              </w:rPr>
-              <w:t>13.64</w:t>
-            </w:r>
-          </w:p>
-        </w:tc>
-      </w:tr>
-      <w:tr>
-        <w:tc>
-          <w:tcPr>
-            <w:tcW w:type="dxa" w:w="1728"/>
-          </w:tcPr>
-          <w:p>
-            <w:r/>
-            <w:r>
-              <w:rPr>
-                <w:rFonts w:ascii="Times New Roman" w:hAnsi="Times New Roman"/>
-                <w:sz w:val="19"/>
-              </w:rPr>
-              <w:t>10</w:t>
-            </w:r>
-          </w:p>
-        </w:tc>
-        <w:tc>
-          <w:tcPr>
-            <w:tcW w:type="dxa" w:w="1728"/>
-          </w:tcPr>
-          <w:p>
-            <w:r/>
-            <w:r>
-              <w:rPr>
-                <w:rFonts w:ascii="Times New Roman" w:hAnsi="Times New Roman"/>
-                <w:sz w:val="19"/>
-              </w:rPr>
-              <w:t>0.7</w:t>
-            </w:r>
-          </w:p>
-        </w:tc>
-        <w:tc>
-          <w:tcPr>
-            <w:tcW w:type="dxa" w:w="1728"/>
-          </w:tcPr>
-          <w:p>
-            <w:r/>
-            <w:r>
-              <w:rPr>
-                <w:rFonts w:ascii="Times New Roman" w:hAnsi="Times New Roman"/>
-                <w:sz w:val="19"/>
-              </w:rPr>
-              <w:t>−0.0022428</w:t>
-            </w:r>
-          </w:p>
-        </w:tc>
-        <w:tc>
-          <w:tcPr>
-            <w:tcW w:type="dxa" w:w="1728"/>
-          </w:tcPr>
-          <w:p>
-            <w:r/>
-            <w:r>
-              <w:rPr>
-                <w:rFonts w:ascii="Times New Roman" w:hAnsi="Times New Roman"/>
-                <w:sz w:val="19"/>
-              </w:rPr>
-              <w:t>−0.0023736</w:t>
-            </w:r>
-          </w:p>
-        </w:tc>
-        <w:tc>
-          <w:tcPr>
-            <w:tcW w:type="dxa" w:w="1728"/>
-          </w:tcPr>
-          <w:p>
-            <w:r/>
-            <w:r>
-              <w:rPr>
-                <w:rFonts w:ascii="Times New Roman" w:hAnsi="Times New Roman"/>
-                <w:sz w:val="19"/>
-              </w:rPr>
-              <w:t>5.83</w:t>
-            </w:r>
-          </w:p>
-        </w:tc>
-      </w:tr>
-      <w:tr>
-        <w:tc>
-          <w:tcPr>
-            <w:tcW w:type="dxa" w:w="1728"/>
-          </w:tcPr>
-          <w:p>
-            <w:r/>
-            <w:r>
-              <w:rPr>
-                <w:rFonts w:ascii="Times New Roman" w:hAnsi="Times New Roman"/>
-                <w:sz w:val="19"/>
-              </w:rPr>
-              <w:t>10</w:t>
-            </w:r>
-          </w:p>
-        </w:tc>
-        <w:tc>
-          <w:tcPr>
-            <w:tcW w:type="dxa" w:w="1728"/>
-          </w:tcPr>
-          <w:p>
-            <w:r/>
-            <w:r>
-              <w:rPr>
-                <w:rFonts w:ascii="Times New Roman" w:hAnsi="Times New Roman"/>
-                <w:sz w:val="19"/>
-              </w:rPr>
-              <w:t>0.9</w:t>
-            </w:r>
-          </w:p>
-        </w:tc>
-        <w:tc>
-          <w:tcPr>
-            <w:tcW w:type="dxa" w:w="1728"/>
-          </w:tcPr>
-          <w:p>
-            <w:r/>
-            <w:r>
-              <w:rPr>
-                <w:rFonts w:ascii="Times New Roman" w:hAnsi="Times New Roman"/>
-                <w:sz w:val="19"/>
-              </w:rPr>
-              <w:t>−0.0031135</w:t>
-            </w:r>
-          </w:p>
-        </w:tc>
-        <w:tc>
-          <w:tcPr>
-            <w:tcW w:type="dxa" w:w="1728"/>
-          </w:tcPr>
-          <w:p>
-            <w:r/>
-            <w:r>
-              <w:rPr>
-                <w:rFonts w:ascii="Times New Roman" w:hAnsi="Times New Roman"/>
-                <w:sz w:val="19"/>
-              </w:rPr>
-              <w:t>−0.0030518</w:t>
-            </w:r>
-          </w:p>
-        </w:tc>
-        <w:tc>
-          <w:tcPr>
-            <w:tcW w:type="dxa" w:w="1728"/>
-          </w:tcPr>
-          <w:p>
-            <w:r/>
-            <w:r>
-              <w:rPr>
-                <w:rFonts w:ascii="Times New Roman" w:hAnsi="Times New Roman"/>
-                <w:sz w:val="19"/>
-              </w:rPr>
-              <w:t>1.98</w:t>
-            </w:r>
-          </w:p>
-        </w:tc>
-      </w:tr>
-      <w:tr>
-        <w:tc>
-          <w:tcPr>
-            <w:tcW w:type="dxa" w:w="1728"/>
-          </w:tcPr>
-          <w:p>
-            <w:r/>
-            <w:r>
-              <w:rPr>
-                <w:rFonts w:ascii="Times New Roman" w:hAnsi="Times New Roman"/>
-                <w:sz w:val="19"/>
-              </w:rPr>
-              <w:t>10</w:t>
-            </w:r>
-          </w:p>
-        </w:tc>
-        <w:tc>
-          <w:tcPr>
-            <w:tcW w:type="dxa" w:w="1728"/>
-          </w:tcPr>
-          <w:p>
-            <w:r/>
-            <w:r>
-              <w:rPr>
-                <w:rFonts w:ascii="Times New Roman" w:hAnsi="Times New Roman"/>
-                <w:sz w:val="19"/>
-              </w:rPr>
-              <w:t>1.0</w:t>
-            </w:r>
-          </w:p>
-        </w:tc>
-        <w:tc>
-          <w:tcPr>
-            <w:tcW w:type="dxa" w:w="1728"/>
-          </w:tcPr>
-          <w:p>
-            <w:r/>
-            <w:r>
-              <w:rPr>
-                <w:rFonts w:ascii="Times New Roman" w:hAnsi="Times New Roman"/>
-                <w:sz w:val="19"/>
-              </w:rPr>
-              <w:t>−0.0035006</w:t>
-            </w:r>
-          </w:p>
-        </w:tc>
-        <w:tc>
-          <w:tcPr>
-            <w:tcW w:type="dxa" w:w="1728"/>
-          </w:tcPr>
-          <w:p>
-            <w:r/>
-            <w:r>
-              <w:rPr>
-                <w:rFonts w:ascii="Times New Roman" w:hAnsi="Times New Roman"/>
-                <w:sz w:val="19"/>
-              </w:rPr>
-              <w:t>−0.0033909</w:t>
-            </w:r>
-          </w:p>
-        </w:tc>
-        <w:tc>
-          <w:tcPr>
-            <w:tcW w:type="dxa" w:w="1728"/>
-          </w:tcPr>
-          <w:p>
-            <w:r/>
-            <w:r>
-              <w:rPr>
-                <w:rFonts w:ascii="Times New Roman" w:hAnsi="Times New Roman"/>
-                <w:sz w:val="19"/>
-              </w:rPr>
-              <w:t>3.14</w:t>
-            </w:r>
-          </w:p>
-        </w:tc>
-      </w:tr>
-    </w:tbl>
-    <w:p>
-      <w:pPr>
-        <w:jc w:val="left"/>
-      </w:pPr>
-      <w:r>
-        <w:rPr>
-          <w:rFonts w:ascii="Times New Roman" w:hAnsi="Times New Roman"/>
-          <w:b/>
-          <w:i/>
-          <w:sz w:val="20"/>
-        </w:rPr>
-        <w:t>Table 1.</w:t>
-      </w:r>
-      <w:r>
-        <w:rPr>
-          <w:rFonts w:ascii="Times New Roman" w:hAnsi="Times New Roman"/>
-          <w:b w:val="0"/>
-          <w:sz w:val="20"/>
-        </w:rPr>
-        <w:t xml:space="preserve"> Targeted sweep at ρ_MY = 0.5, n_reps = 30,000. emp_cov and theory_total are the empirical and analytical Cov(α̂, β̂); rel_err is their relative difference (%). All cells satisfy the conservative bound B.</w:t>
-      </w:r>
-    </w:p>
-    <w:p>
-      <w:pPr>
-        <w:jc w:val="both"/>
-      </w:pPr>
-      <w:r>
-        <w:rPr>
-          <w:rFonts w:ascii="Times New Roman" w:hAnsi="Times New Roman"/>
-          <w:b/>
-          <w:sz w:val="24"/>
-        </w:rPr>
-        <w:t>Figure 5.</w:t>
-      </w:r>
-      <w:r>
-        <w:rPr>
-          <w:rFonts w:ascii="Times New Roman" w:hAnsi="Times New Roman"/>
-          <w:b w:val="0"/>
-          <w:sz w:val="24"/>
-        </w:rPr>
-        <w:t xml:space="preserve"> Targeted validation sweep at non-degenerate shared-instrument proportions (ρ_MY = 0.5, n_reps = 30,000). *Left:* empirical Cov(α̂, β̂) (points) versus the closed-form analytical prediction (lines) across π_shared, for F = 10 and F = 30; the two coincide. *Right:* relative error of the analytical covariance versus the conservative reliability bound B(F, ρ_MY, π_shared) for all 12 cells; all points fall below the bound, with the worst cell at 14.1%.</w:t>
-      </w:r>
-    </w:p>
-    <w:p>
-      <w:pPr>
-        <w:spacing w:before="200" w:after="80"/>
-        <w:jc w:val="left"/>
-      </w:pPr>
-      <w:r>
-        <w:rPr>
-          <w:rFonts w:ascii="Times New Roman" w:hAnsi="Times New Roman"/>
-          <w:b/>
-          <w:sz w:val="24"/>
-        </w:rPr>
-        <w:t>3.3 Empirical prevalence of overlap-prone designs</w:t>
-      </w:r>
-    </w:p>
-    <w:p>
-      <w:pPr>
-        <w:ind w:firstLine="480"/>
-        <w:jc w:val="both"/>
-      </w:pPr>
-      <w:r>
-        <w:rPr>
-          <w:rFonts w:ascii="Times New Roman" w:hAnsi="Times New Roman"/>
-          <w:b w:val="0"/>
-          <w:sz w:val="24"/>
-        </w:rPr>
-        <w:t>Among the 333 two-step MR mediation studies, instrument selection was "separate IV" in 106 (31.8%) and "MVMR joint estimation" in 30 (9.0%), while a structured "merged IV pool" tag was recorded for only a handful of studies — yet 8–9 studies carried a free-text risk flag for merged pools or high overlap (for example S053, S080 and S159, which actively quantify sample overlap). The structured field therefore under-counts overlap-prone designs.</w:t>
-      </w:r>
-    </w:p>
-    <w:p>
-      <w:pPr>
-        <w:ind w:firstLine="480"/>
-        <w:jc w:val="both"/>
-      </w:pPr>
-      <w:r>
-        <w:rPr>
-          <w:rFonts w:ascii="Times New Roman" w:hAnsi="Times New Roman"/>
-          <w:b/>
-          <w:sz w:val="24"/>
-        </w:rPr>
-        <w:t>Manual re-screen of the "merged IV pool" tag.</w:t>
-      </w:r>
-      <w:r>
-        <w:rPr>
-          <w:rFonts w:ascii="Times New Roman" w:hAnsi="Times New Roman"/>
-          <w:b w:val="0"/>
-          <w:sz w:val="24"/>
-        </w:rPr>
-        <w:t xml:space="preserve"> Because the merged-pool design is exactly the configuration our correction matters most for, we hand-verified every study carrying that structured tag in the full 695-study table. Only </w:t>
-      </w:r>
-      <w:r>
-        <w:rPr>
-          <w:rFonts w:ascii="Times New Roman" w:hAnsi="Times New Roman"/>
-          <w:b/>
-          <w:sz w:val="24"/>
-        </w:rPr>
-        <w:t>two</w:t>
-      </w:r>
-      <w:r>
-        <w:rPr>
-          <w:rFonts w:ascii="Times New Roman" w:hAnsi="Times New Roman"/>
-          <w:b w:val="0"/>
-          <w:sz w:val="24"/>
-        </w:rPr>
-        <w:t xml:space="preserve"> studies were so tagged:</w:t>
-      </w:r>
-    </w:p>
-    <w:p>
-      <w:pPr>
-        <w:pStyle w:val="ListBullet"/>
-        <w:jc w:val="both"/>
-      </w:pPr>
-      <w:r>
-        <w:rPr>
-          <w:rFonts w:ascii="Times New Roman" w:hAnsi="Times New Roman"/>
-          <w:b/>
-          <w:sz w:val="24"/>
-        </w:rPr>
-        <w:t>S110</w:t>
-      </w:r>
-      <w:r>
-        <w:rPr>
-          <w:rFonts w:ascii="Times New Roman" w:hAnsi="Times New Roman"/>
-          <w:b w:val="0"/>
-          <w:sz w:val="24"/>
-        </w:rPr>
-        <w:t xml:space="preserve"> (Thom *et al.*, 2020; smoking/BMI → type 2 diabetes/CAD): an *MVMR-variant* design using "a combined instrument with 1410 SNPs significant for smoking or BMI." This is a multivariable joint-IV framework, not the sequential product method our covariance addresses.</w:t>
-      </w:r>
-    </w:p>
-    <w:p>
-      <w:pPr>
-        <w:pStyle w:val="ListBullet"/>
-        <w:jc w:val="both"/>
-      </w:pPr>
-      <w:r>
-        <w:rPr>
-          <w:rFonts w:ascii="Times New Roman" w:hAnsi="Times New Roman"/>
-          <w:b/>
-          <w:sz w:val="24"/>
-        </w:rPr>
-        <w:t>S245</w:t>
-      </w:r>
-      <w:r>
-        <w:rPr>
-          <w:rFonts w:ascii="Times New Roman" w:hAnsi="Times New Roman"/>
-          <w:b w:val="0"/>
-          <w:sz w:val="24"/>
-        </w:rPr>
-        <w:t xml:space="preserve"> (Zhu *et al.*, 2024; triglycerides → blood metabolites/proteins → multiple myeloma): tagged "merged IV pool", but its Methods describes standard independent IV selection for each step (P &lt; 5×10⁻⁸, clumping at 10 Mb, F &gt; 10) with no statement of shared or merged instruments; a full-text keyword audit found zero occurrences of "shared", "pool", "reuse" or "the same IV" in the instrument-selection sections. The tag is therefore a coding error, not a true merged-pool example.</w:t>
-      </w:r>
-    </w:p>
-    <w:p>
-      <w:pPr>
-        <w:ind w:firstLine="480"/>
-        <w:jc w:val="both"/>
-      </w:pPr>
-      <w:r>
-        <w:rPr>
-          <w:rFonts w:ascii="Times New Roman" w:hAnsi="Times New Roman"/>
-          <w:b w:val="0"/>
-          <w:sz w:val="24"/>
-        </w:rPr>
-        <w:t xml:space="preserve">The practical implication is striking: </w:t>
-      </w:r>
-      <w:r>
-        <w:rPr>
-          <w:rFonts w:ascii="Times New Roman" w:hAnsi="Times New Roman"/>
-          <w:b/>
-          <w:sz w:val="24"/>
-        </w:rPr>
-        <w:t>in 695 coded studies we found no clean published example of the sequential product-method "merged IV pool" design.</w:t>
-      </w:r>
-      <w:r>
-        <w:rPr>
-          <w:rFonts w:ascii="Times New Roman" w:hAnsi="Times New Roman"/>
-          <w:b w:val="0"/>
-          <w:sz w:val="24"/>
-        </w:rPr>
-        <w:t xml:space="preserve"> This does not mean the design is absent from the literature — only that it is neither labelled nor reported in the coded corpus — and it strengthens, rather than weakens, the motivation: the field does not even structurally track the overlap our method corrects.</w:t>
-      </w:r>
-    </w:p>
-    <w:p>
-      <w:pPr>
-        <w:ind w:firstLine="480"/>
-        <w:jc w:val="both"/>
-      </w:pPr>
-      <w:r>
-        <w:rPr>
-          <w:rFonts w:ascii="Times New Roman" w:hAnsi="Times New Roman"/>
-          <w:b w:val="0"/>
-          <w:sz w:val="24"/>
-        </w:rPr>
-        <w:t>Overlap-risk disclosure was assessable for 54/333 studies; of these, only 19 (35.2%) reported or adjusted for overlap, 28 (51.9%) did not, and 1 partially did. This is a conservative lower bound on non-disclosure because the disclosure field was not populated for all 333 studies.</w:t>
-      </w:r>
-    </w:p>
-    <w:p>
-      <w:pPr>
-        <w:ind w:firstLine="480"/>
-        <w:jc w:val="both"/>
-      </w:pPr>
-      <w:r>
-        <w:rPr>
-          <w:rFonts w:ascii="Times New Roman" w:hAnsi="Times New Roman"/>
-          <w:b/>
-          <w:sz w:val="24"/>
-        </w:rPr>
-        <w:t>Inter-coder reliability (blind re-coding).</w:t>
-      </w:r>
-      <w:r>
-        <w:rPr>
-          <w:rFonts w:ascii="Times New Roman" w:hAnsi="Times New Roman"/>
-          <w:b w:val="0"/>
-          <w:sz w:val="24"/>
-        </w:rPr>
-        <w:t xml:space="preserve"> To quantify the reproducibility of the design classification, a second blinded coding pass re-coded a stratified random sample of 50 studies (drawn from the three prevalence tiers in proportions 31/100/202, matching Figure 4; random seed 2026) from the paper text only, against a sealed answer key. Observed agreement on design_type was 94.0% (47/50; 95% CI 83.8–97.9%); the corresponding prevalence-and-bias-adjusted kappa (PABAK) is 0.88. The raw Cohen's κ collapses to 0.00 as a *statistical artifact* (the answer key contained zero "exclude" instances, so expected agreement Pe → 1.0), not evidence of disagreement — the three discrepancies (S097, S044, S423) are genuine edge cases in which network or individual-level mediation was conflated with the two-step product method. We therefore report observed agreement and PABAK as the primary reliability metrics and relegate the raw κ, with its artifact, to Supplementary Methods S7.3, where the mechanism is explained in full (the κ statistics were computed with `compute_kappa_2nd.py` from the blind re-code against the sealed answer key; the full per-field report is in `code/kappa_2nd_report.csv`). On IV_selection_strategy (n = 35 after excluding 15 blank answer-key entries) observed agreement was 74.3% (26/35) and κ = 0.50 (moderate); most disagreements were studies the original key had tagged "MVMR joint estimation" that the second coder classified as separate-IV two-step mediation with an MVMR sensitivity check (S168, S235, S236, S230, S351, S406). On reports_overlap_risk only n = 8 entries were populated (42/50 blank), giving κ = 0.50 but too few comparisons for a stable estimate; we do not cite this field as reliability evidence in the text. The exercise also exposed a coding-completeness limitation: in this 50-study subset the authoritative table left IV_selection_strategy blank for 15 studies and reports_overlap_risk blank for 42, and the merged-pool tag was stored as free text rather than a structured field, so the prevalence counts in §3.3 are lower bounds conditional on the information the original authors reported (see Supplementary Methods S7).</w:t>
-      </w:r>
-    </w:p>
-    <w:p>
-      <w:pPr>
-        <w:ind w:firstLine="480"/>
-        <w:jc w:val="both"/>
-      </w:pPr>
-      <w:r>
-        <w:rPr>
-          <w:rFonts w:ascii="Times New Roman" w:hAnsi="Times New Roman"/>
-          <w:b w:val="0"/>
-          <w:sz w:val="24"/>
-        </w:rPr>
-        <w:t>Publication volume rose from 2 two-step MR mediation studies in 2021 to 130 in 2025, concentrated in general and specialist open-access journals (198 distinct titles; top: *Medicine (Baltimore)* 42, *Sci Rep* 18, *Front Immunol* 16). The growing denominator makes unaddressed overlap bias an increasingly consequential problem.</w:t>
-      </w:r>
-    </w:p>
-    <w:p>
-      <w:pPr>
-        <w:jc w:val="both"/>
-      </w:pPr>
-      <w:r>
-        <w:rPr>
-          <w:rFonts w:ascii="Times New Roman" w:hAnsi="Times New Roman"/>
-          <w:b/>
-          <w:sz w:val="24"/>
-        </w:rPr>
-        <w:t>Figure 4.</w:t>
-      </w:r>
-      <w:r>
-        <w:rPr>
-          <w:rFonts w:ascii="Times New Roman" w:hAnsi="Times New Roman"/>
-          <w:b w:val="0"/>
-          <w:sz w:val="24"/>
-        </w:rPr>
-        <w:t xml:space="preserve"> Percentage of 333 two-step MR mediation studies at risk of non-zero Cov(α̂, β̂) under three classification assumptions. *Conservative* counts only merged-IV-pool and MVMR-joint designs (9.3%). *Typical* additionally counts separate-IV designs that do not report overlap handling, yielding the headline estimate of </w:t>
+        <w:t xml:space="preserve"> — the field does not structurally track the overlap our method corrects. Overlap handling was assessable for 54/333 studies; only 19 (35.2%) reported or adjusted for it. Under the typical classification, </w:t>
       </w:r>
       <w:r>
         <w:rPr>
@@ -2508,7 +650,29 @@
           <w:b w:val="0"/>
           <w:sz w:val="24"/>
         </w:rPr>
-        <w:t>. *Structural* counts all separate-IV designs as capable of overlap (41.1%).</w:t>
+        <w:t xml:space="preserve"> of the 333 studies draw instruments from overlapping GWAS pools without disclosing overlap handling and are therefore capable of non-zero Cov(α̂, β̂) (conservative 9.3%, structural 41.1%; Fig. 4).</w:t>
+      </w:r>
+    </w:p>
+    <w:p>
+      <w:pPr>
+        <w:ind w:firstLine="480"/>
+        <w:jc w:val="both"/>
+      </w:pPr>
+      <w:r>
+        <w:rPr>
+          <w:rFonts w:ascii="Times New Roman" w:hAnsi="Times New Roman"/>
+          <w:b/>
+          <w:sz w:val="24"/>
+        </w:rPr>
+        <w:t>Reproducibility.</w:t>
+      </w:r>
+      <w:r>
+        <w:rPr>
+          <w:rFonts w:ascii="Times New Roman" w:hAnsi="Times New Roman"/>
+          <w:b w:val="0"/>
+          <w:sz w:val="24"/>
+        </w:rPr>
+        <w:t xml:space="preserve"> A second blinded coding pass on 50 studies gave 94.0% observed agreement on design_type (PABAK 0.88); raw Cohen's κ collapses to 0.00 as a statistical artifact (zero "exclude" instances in the key, so expected agreement → 1). On IV_selection_strategy agreement was 74.3% (κ = 0.50); on reports_overlap_risk only n = 8 entries were populated (κ = 0.50, unstable). Full details in Supplementary Methods S7.</w:t>
       </w:r>
     </w:p>
     <w:p>
@@ -2522,7 +686,7 @@
           <w:b/>
           <w:sz w:val="24"/>
         </w:rPr>
-        <w:t>3.4 Real-data illustration: BMI → waist circumference → coronary heart disease</w:t>
+        <w:t>3.3 Real-data illustration: BMI → waist → CHD</w:t>
       </w:r>
     </w:p>
     <w:p>
@@ -2536,69 +700,7 @@
           <w:b w:val="0"/>
           <w:sz w:val="24"/>
         </w:rPr>
-        <w:t xml:space="preserve">We applied the framework to the BMI → waist circumference → coronary heart disease (CHD) pathway using IEU OpenGWAS summary statistics (trait IDs ieu-a-2, ieu-a-61, ieu-a-7; sample sizes ≈ 339k, 339k and 184k). Step 1 (BMI → waist) yielded α̂ = 0.863 (SE 0.0174, F = 66.3, p_X = 77 SNPs). Step 2 (waist → CHD) yielded β̂ = 0.477 (SE 0.0884, p_M = 41 SNPs). The natural intersection of the two IV sets contained </w:t>
-      </w:r>
-      <w:r>
-        <w:rPr>
-          <w:rFonts w:ascii="Times New Roman" w:hAnsi="Times New Roman"/>
-          <w:b/>
-          <w:sz w:val="24"/>
-        </w:rPr>
-        <w:t>n_s = 13 SNPs</w:t>
-      </w:r>
-      <w:r>
-        <w:rPr>
-          <w:rFonts w:ascii="Times New Roman" w:hAnsi="Times New Roman"/>
-          <w:b w:val="0"/>
-          <w:sz w:val="24"/>
-        </w:rPr>
-        <w:t xml:space="preserve"> (π_shared = 0.317), providing a genuine non-zero-overlap case.</w:t>
-      </w:r>
-    </w:p>
-    <w:p>
-      <w:pPr>
-        <w:ind w:firstLine="480"/>
-        <w:jc w:val="both"/>
-      </w:pPr>
-      <w:r>
-        <w:rPr>
-          <w:rFonts w:ascii="Times New Roman" w:hAnsi="Times New Roman"/>
-          <w:b w:val="0"/>
-          <w:sz w:val="24"/>
-        </w:rPr>
-        <w:t>After S10 covariance correction, the indirect-effect SE changed from 0.0767 to 0.0745 (</w:t>
-      </w:r>
-      <w:r>
-        <w:rPr>
-          <w:rFonts w:ascii="Times New Roman" w:hAnsi="Times New Roman"/>
-          <w:b/>
-          <w:sz w:val="24"/>
-        </w:rPr>
-        <w:t>−2.8%</w:t>
-      </w:r>
-      <w:r>
-        <w:rPr>
-          <w:rFonts w:ascii="Times New Roman" w:hAnsi="Times New Roman"/>
-          <w:b w:val="0"/>
-          <w:sz w:val="24"/>
-        </w:rPr>
-        <w:t>). To illustrate the more commonly feared shared-IV design, we also re-ran step 2 using the same 78 BMI instruments as step 1 (n_s = 78, π_shared = 1.0); the SE changed from 0.0563 to 0.0476 (</w:t>
-      </w:r>
-      <w:r>
-        <w:rPr>
-          <w:rFonts w:ascii="Times New Roman" w:hAnsi="Times New Roman"/>
-          <w:b/>
-          <w:sz w:val="24"/>
-        </w:rPr>
-        <w:t>−15.5%</w:t>
-      </w:r>
-      <w:r>
-        <w:rPr>
-          <w:rFonts w:ascii="Times New Roman" w:hAnsi="Times New Roman"/>
-          <w:b w:val="0"/>
-          <w:sz w:val="24"/>
-        </w:rPr>
-        <w:t>). Table 2 reports the full result, including sensitivity to mediator–outcome sample overlap (ρ_MY = 0, 0.2, 0.4, 0.6, 0.8), which leaves the corrected SE within ±0.5 points of the ρ_MY = 0 value.</w:t>
+        <w:t>Applied to BMI → waist circumference → CHD (IEU IDs ieu-a-2, ieu-a-61, ieu-a-7) the natural instrument intersection was n_s = 13 SNPs (π_shared = 0.317). After correction the indirect-effect SE narrowed by 2.8%; reusing the 78 BMI instruments in both steps (π_shared = 1.0) narrowed it by 15.5% (Table 2, Fig. 3). The corrected SE is smaller because the shared-instrument covariance is negative, so the naive method is conservative, not anti-conservative; the direction depends on sign(α̂β̂·Cov) and is prior-unknown. A second trio (triglycerides → metabolite/protein → multiple myeloma, S245) showed π_shared = 0 because both mediators carried only 2 instruments each, so it cannot demonstrate non-zero overlap — confirming overlap is negligible precisely when mediators lack independent instrument strength.</w:t>
       </w:r>
     </w:p>
     <w:tbl>
@@ -4155,7 +2257,21 @@
           <w:b w:val="0"/>
           <w:sz w:val="20"/>
         </w:rPr>
-        <w:t xml:space="preserve"> BMI → waist → CHD real-data application. "natural" uses the empirical IV intersection (n_s = 13); "shared-IV" reuses the 78 BMI instruments in both steps (n_s = 78). widen_pct is the percentage change in the indirect-effect SE after S10 correction (negative = narrower).</w:t>
+        <w:t xml:space="preserve"> BMI → waist → CHD real-data application. "natural" uses the empirical IV intersection (n_s = 13); "shared-IV" reuses the 78 BMI instruments in both steps (n_s = 78). widen_% is the percentage change in the indirect-effect SE after S10 correction (negative = narrower).</w:t>
+      </w:r>
+    </w:p>
+    <w:p>
+      <w:pPr>
+        <w:spacing w:before="200" w:after="80"/>
+        <w:jc w:val="left"/>
+      </w:pPr>
+      <w:r>
+        <w:rPr>
+          <w:rFonts w:ascii="Times New Roman" w:hAnsi="Times New Roman"/>
+          <w:b/>
+          <w:sz w:val="24"/>
+        </w:rPr>
+        <w:t>3.4 Empirical batch re-estimation</w:t>
       </w:r>
     </w:p>
     <w:p>
@@ -4169,170 +2285,7 @@
           <w:b w:val="0"/>
           <w:sz w:val="24"/>
         </w:rPr>
-        <w:t>A key finding is that, in this adiposity–cardiometabolic example, the corrected SE is *smaller* than the naive SE because the shared-instrument covariance is negative. The naive method is therefore conservative (too wide), not anti-conservative. The direction of the bias depends on the sign of α̂β̂·Cov(α̂, β̂), which is prior-unknown. This reinforces that the traditional delta method is biased in general and should be corrected regardless of whether the bias is expected to inflate or deflate Type-I error.</w:t>
-      </w:r>
-    </w:p>
-    <w:p>
-      <w:pPr>
-        <w:ind w:firstLine="480"/>
-        <w:jc w:val="both"/>
-      </w:pPr>
-      <w:r>
-        <w:rPr>
-          <w:rFonts w:ascii="Times New Roman" w:hAnsi="Times New Roman"/>
-          <w:b/>
-          <w:sz w:val="24"/>
-        </w:rPr>
-        <w:t>§3.4.1 Second examined pathway: triglycerides → blood metabolite/protein → multiple myeloma (S245).</w:t>
-      </w:r>
-      <w:r>
-        <w:rPr>
-          <w:rFonts w:ascii="Times New Roman" w:hAnsi="Times New Roman"/>
-          <w:b w:val="0"/>
-          <w:sz w:val="24"/>
-        </w:rPr>
-        <w:t xml:space="preserve"> To test generalizability beyond the adiposity–cardiometabolic domain, we examined the published trio of Zhu *et al.* (2024; PMID 39285309): triglycerides (GLGC ieu-a-302, n = 177,861; 56 genome-wide-significant instruments at P &lt; 5×10⁻⁸) → either the metabolite X-11,423-O-sulfo-L-tyrosine (met-a-509, n = 7,765) or the protein neuropilin-2 (prot-a-2100, n = 3,301) → multiple myeloma (FinnGen R9 finn-b-CD2_MULTIPLE_MYELOMA_PLASMA_CELL). Resolving the exact IEU OpenGWAS accessions from the study's Supplementary Table S1 and the OpenGWAS catalog, we extracted each trait's significant instruments via the OpenGWAS /tophits endpoint (P &lt; 5×10⁻⁸, no clumping). Both mediators were severely underpowered: each yielded only </w:t>
-      </w:r>
-      <w:r>
-        <w:rPr>
-          <w:rFonts w:ascii="Times New Roman" w:hAnsi="Times New Roman"/>
-          <w:b/>
-          <w:sz w:val="24"/>
-        </w:rPr>
-        <w:t>2</w:t>
-      </w:r>
-      <w:r>
-        <w:rPr>
-          <w:rFonts w:ascii="Times New Roman" w:hAnsi="Times New Roman"/>
-          <w:b w:val="0"/>
-          <w:sz w:val="24"/>
-        </w:rPr>
-        <w:t xml:space="preserve"> genome-wide-significant instruments, and the multiple-myeloma outcome yielded </w:t>
-      </w:r>
-      <w:r>
-        <w:rPr>
-          <w:rFonts w:ascii="Times New Roman" w:hAnsi="Times New Roman"/>
-          <w:b/>
-          <w:sz w:val="24"/>
-        </w:rPr>
-        <w:t>0</w:t>
-      </w:r>
-      <w:r>
-        <w:rPr>
-          <w:rFonts w:ascii="Times New Roman" w:hAnsi="Times New Roman"/>
-          <w:b w:val="0"/>
-          <w:sz w:val="24"/>
-        </w:rPr>
-        <w:t>. Consequently the exposure–mediator instrument intersection was empty for both mediators (TG ∩ metabolite: n_shared = 0, π_shared = 0%; TG ∩ protein: n_shared = 0, π_shared = 0%). This trio therefore cannot illustrate a non-zero-overlap correction: it is, like the natural-overlap BMI → waist case, a zero-overlap configuration, but for the opposite reason — its mediators are too weakly instrumented to share any SNPs with the exposure. The result is informative: it shows the omitted-covariance term is negligible precisely when mediators lack independent instrument strength, and that extending real-data validation to richer-overlap trios requires adequately powered mediator GWAS. §3.5 extends the empirical evidence from these two hand-picked pathways to a systematic batch re-estimation of the published literature.</w:t>
-      </w:r>
-    </w:p>
-    <w:p>
-      <w:pPr>
-        <w:jc w:val="both"/>
-      </w:pPr>
-      <w:r>
-        <w:rPr>
-          <w:rFonts w:ascii="Times New Roman" w:hAnsi="Times New Roman"/>
-          <w:b/>
-          <w:sz w:val="24"/>
-        </w:rPr>
-        <w:t>Figure 3.</w:t>
-      </w:r>
-      <w:r>
-        <w:rPr>
-          <w:rFonts w:ascii="Times New Roman" w:hAnsi="Times New Roman"/>
-          <w:b w:val="0"/>
-          <w:sz w:val="24"/>
-        </w:rPr>
-        <w:t xml:space="preserve"> Indirect effect (α̂β̂) and 95% confidence intervals for the BMI → waist → CHD pathway. Red segments show the naive (traditional delta) CI; blue segments show the S10-corrected CI. *Top:* shared-IV design (n_s = 78), where the corrected SE is 15.5% smaller. *Bottom:* natural overlap (n_s = 13), where the corrected SE is 2.8% smaller.</w:t>
-      </w:r>
-    </w:p>
-    <w:p>
-      <w:pPr>
-        <w:spacing w:before="200" w:after="80"/>
-        <w:jc w:val="left"/>
-      </w:pPr>
-      <w:r>
-        <w:rPr>
-          <w:rFonts w:ascii="Times New Roman" w:hAnsi="Times New Roman"/>
-          <w:b/>
-          <w:sz w:val="24"/>
-        </w:rPr>
-        <w:t>3.5 Empirical batch re-estimation of published two-step MR mediation studies</w:t>
-      </w:r>
-    </w:p>
-    <w:p>
-      <w:pPr>
-        <w:ind w:firstLine="480"/>
-        <w:jc w:val="both"/>
-      </w:pPr>
-      <w:r>
-        <w:rPr>
-          <w:rFonts w:ascii="Times New Roman" w:hAnsi="Times New Roman"/>
-          <w:b w:val="0"/>
-          <w:sz w:val="24"/>
-        </w:rPr>
-        <w:t xml:space="preserve">We next asked whether the covariance correction materially changes any *published* two-step MR mediation conclusion. Per-study re-estimation is hard because most papers do not report F-statistics or the exact number of shared instruments. We therefore (i) mechanically screened the 333-study sample for studies whose exposure, mediator and outcome each resolve to a public GWAS accession with adequate mediator instrument strength, then (ii) re-estimated α̂, β̂ and the S10-corrected indirect-effect CI for every candidate with the standard </w:t>
-      </w:r>
-      <w:r>
-        <w:rPr>
-          <w:rFonts w:ascii="Times New Roman" w:hAnsi="Times New Roman"/>
-          <w:b/>
-          <w:sz w:val="24"/>
-        </w:rPr>
-        <w:t>TwoSampleMR</w:t>
-      </w:r>
-      <w:r>
-        <w:rPr>
-          <w:rFonts w:ascii="Times New Roman" w:hAnsi="Times New Roman"/>
-          <w:b w:val="0"/>
-          <w:sz w:val="24"/>
-        </w:rPr>
-        <w:t xml:space="preserve"> R package (mr_ivw; clumped instruments via extract_instruments, harmonized effects via extract_outcome_data / harmonise_data), subject to a hard validation gate: the pipeline first had to reproduce the D56 BMI → waist → CHD results to 2–3 decimals (the step-2 estimate matched the deposited TwoSampleMR value to four decimal places) before touching any new candidate.</w:t>
-      </w:r>
-    </w:p>
-    <w:p>
-      <w:pPr>
-        <w:ind w:firstLine="480"/>
-        <w:jc w:val="both"/>
-      </w:pPr>
-      <w:r>
-        <w:rPr>
-          <w:rFonts w:ascii="Times New Roman" w:hAnsi="Times New Roman"/>
-          <w:b/>
-          <w:sz w:val="24"/>
-        </w:rPr>
-        <w:t>Phase A — candidate identification.</w:t>
-      </w:r>
-      <w:r>
-        <w:rPr>
-          <w:rFonts w:ascii="Times New Roman" w:hAnsi="Times New Roman"/>
-          <w:b w:val="0"/>
-          <w:sz w:val="24"/>
-        </w:rPr>
-        <w:t xml:space="preserve"> Of the 333 two-step MR mediation studies, 70 had all three traits resolvable to an OpenGWAS or FinnGen accession with mediator GWAS sample size N_M ≥ 20,000 (the threshold that prevents the S245 failure mode of mediators with only 2 instruments).</w:t>
-      </w:r>
-    </w:p>
-    <w:p>
-      <w:pPr>
-        <w:ind w:firstLine="480"/>
-        <w:jc w:val="both"/>
-      </w:pPr>
-      <w:r>
-        <w:rPr>
-          <w:rFonts w:ascii="Times New Roman" w:hAnsi="Times New Roman"/>
-          <w:b/>
-          <w:sz w:val="24"/>
-        </w:rPr>
-        <w:t>Phase B — instrument overlap and re-estimation.</w:t>
-      </w:r>
-      <w:r>
-        <w:rPr>
-          <w:rFonts w:ascii="Times New Roman" w:hAnsi="Times New Roman"/>
-          <w:b w:val="0"/>
-          <w:sz w:val="24"/>
-        </w:rPr>
-        <w:t xml:space="preserve"> For these 70 we extracted clumped exposure and mediator instruments and computed π_shared = |G_X ∩ G_M| / min(|G_X|, |G_M|). Forty-two studies had usable instruments for *both* exposure and mediator (the remaining 28 returned no EUR-clumped instruments, predominantly non-European or specialized protein/QTL traits). Among the 42 analyzable studies, </w:t>
+        <w:t xml:space="preserve">Of 333 studies, 70 resolved to public GWAS accessions with mediator N_M ≥ 20,000; 42 had usable instruments for both steps. </w:t>
       </w:r>
       <w:r>
         <w:rPr>
@@ -4348,21 +2301,7 @@
           <w:b w:val="0"/>
           <w:sz w:val="24"/>
         </w:rPr>
-        <w:t>, while the other 34 used effectively disjoint instrument sets. The 8 overlapping studies comprised 6 adequately powered (≥ 9 instruments in both steps, F &gt; 15) and 2 underpowered (2 instruments each, excluded from re-estimation).</w:t>
-      </w:r>
-    </w:p>
-    <w:p>
-      <w:pPr>
-        <w:ind w:firstLine="480"/>
-        <w:jc w:val="both"/>
-      </w:pPr>
-      <w:r>
-        <w:rPr>
-          <w:rFonts w:ascii="Times New Roman" w:hAnsi="Times New Roman"/>
-          <w:b w:val="0"/>
-          <w:sz w:val="24"/>
-        </w:rPr>
-        <w:t xml:space="preserve">For the adequately powered overlapping studies (4 of 6 could be resolved to TwoSampleMR-validated estimates; the 2 FinnGen-outcome trios were not allele-harmonisable) we re-estimated α̂ (step 1, X → M) and β̂ (step 2, M → Y) and applied the S10 correction (ρ_MY = 0, the only value supportable without sample-overlap disclosure). Table 3 reports the results. In every case the corrected indirect-effect SE was *smaller* than the naive SE (mean −3.9%, median −3.3%, range −9.0% to −0.1%), and </w:t>
+        <w:t xml:space="preserve">; 6 were adequately powered (≥ 9 instruments/step, F &gt; 15) and 2 underpowered. Among the 6, 4 were resolved to TwoSampleMR-validated estimates (2 FinnGen-outcome trios were not allele-harmonisable). In all 4 the corrected SE was smaller than the naive SE (mean −3.9%, range −9.0% to −0.1%) and </w:t>
       </w:r>
       <w:r>
         <w:rPr>
@@ -4370,7 +2309,7 @@
           <w:b/>
           <w:sz w:val="24"/>
         </w:rPr>
-        <w:t>no study changed significance status (0/4 flips)</w:t>
+        <w:t>no study changed significance (0/4 flips)</w:t>
       </w:r>
       <w:r>
         <w:rPr>
@@ -4378,7 +2317,7 @@
           <w:b w:val="0"/>
           <w:sz w:val="24"/>
         </w:rPr>
-        <w:t>.</w:t>
+        <w:t xml:space="preserve"> (Table 3).</w:t>
       </w:r>
     </w:p>
     <w:tbl>
@@ -5575,23 +3514,7 @@
           <w:b w:val="0"/>
           <w:sz w:val="20"/>
         </w:rPr>
-        <w:t xml:space="preserve"> Batch re-estimation of the 4 adequately powered published two-step MR mediation studies with genuine instrument overlap that could be resolved to public GWAS accessions (of 6 identified; 2 not estimable, see note). π_shared and n_s are exact (computed from extracted clumped instrument sets); α̂, β̂ and their SEs are re-estimated with the standard </w:t>
-      </w:r>
-      <w:r>
-        <w:rPr>
-          <w:rFonts w:ascii="Times New Roman" w:hAnsi="Times New Roman"/>
-          <w:b/>
-          <w:sz w:val="20"/>
-        </w:rPr>
-        <w:t>TwoSampleMR</w:t>
-      </w:r>
-      <w:r>
-        <w:rPr>
-          <w:rFonts w:ascii="Times New Roman" w:hAnsi="Times New Roman"/>
-          <w:b w:val="0"/>
-          <w:sz w:val="20"/>
-        </w:rPr>
-        <w:t xml:space="preserve"> R package (mr_ivw) and cross-validated against the deposited D56 ground truth. widen_% is the percentage change in the indirect-effect SE after the S10 correction (ρ_MY = 0); negative = narrower. Significance is two-sided at α = 0.05.</w:t>
+        <w:t xml:space="preserve"> Batch re-estimation of the 4 adequately powered published two-step MR mediation studies with genuine instrument overlap resolved to public GWAS accessions (of 6 identified; 2 not estimable, see note). π_shared and n_s are exact (computed from extracted clumped instrument sets); α̂, β̂ and their SEs are re-estimated with TwoSampleMR (mr_ivw) and cross-validated against the deposited D56 ground truth. widen_% is the S10 correction at ρ_MY = 0; negative = narrower. Significance two-sided at α = 0.05.</w:t>
       </w:r>
     </w:p>
     <w:p>
@@ -5605,28 +3528,7 @@
           <w:b w:val="0"/>
           <w:sz w:val="24"/>
         </w:rPr>
-        <w:t>*Note:* S255 (immune cells → serum metabolites → lymphoid leukemia) and S267 (vitamin D → lipids → ocular disorders) could not be re-estimated through TwoSampleMR: the package returned a non-finite/ambiguous estimate during allele harmonisation of their FinnGen outcome GWASs (error: "missing value where TRUE/FALSE needed"). These two trios are reported as not estimable through the gold-standard pipeline and are excluded from the validated flip count; the overlap-rate and zero-flip conclusions rest on the 4 validated trios plus the structural argument in §3.5.</w:t>
-      </w:r>
-    </w:p>
-    <w:p>
-      <w:pPr>
-        <w:jc w:val="both"/>
-      </w:pPr>
-      <w:r>
-        <w:rPr>
-          <w:rFonts w:ascii="Times New Roman" w:hAnsi="Times New Roman"/>
-          <w:b/>
-          <w:sz w:val="24"/>
-        </w:rPr>
-        <w:t>Figure 6.</w:t>
-      </w:r>
-      <w:r>
-        <w:rPr>
-          <w:rFonts w:ascii="Times New Roman" w:hAnsi="Times New Roman"/>
-          <w:b w:val="0"/>
-          <w:sz w:val="24"/>
-        </w:rPr>
-        <w:t xml:space="preserve"> Relative change in the indirect-effect standard error after the S10 correction, for the adequately powered published two-step MR mediation studies with genuine instrument overlap (batch re-estimation, Table 3). Every value is negative, i.e. the corrected SE is smaller and the CI narrows. Bars are TwoSampleMR-calibrated (cross-validated against the deposited D56 ground truth); the negative direction and the zero-flip conclusion are therefore fully validated, not screening-level.</w:t>
+        <w:t>*Note:* S255 (immune cells → serum metabolites → lymphoid leukemia) and S267 (vitamin D → lipids → ocular disorders) could not be re-estimated through TwoSampleMR: the package returned a non-finite estimate during allele harmonisation of their FinnGen outcome GWASs. These two trios are reported as not estimable through the gold-standard pipeline and are excluded from the validated flip count; the overlap-rate and zero-flip conclusions rest on the 4 validated trios plus the structural argument in §3.4.</w:t>
       </w:r>
     </w:p>
     <w:p>
@@ -5640,7 +3542,7 @@
           <w:b/>
           <w:sz w:val="24"/>
         </w:rPr>
-        <w:t>3.5.1 Empirical estimation of ρ_MY in the overlapping studies</w:t>
+        <w:t>3.5 Empirical ρ_MY in the overlapping trios</w:t>
       </w:r>
     </w:p>
     <w:p>
@@ -5654,7 +3556,7 @@
           <w:b w:val="0"/>
           <w:sz w:val="24"/>
         </w:rPr>
-        <w:t xml:space="preserve">The batch re-estimation above treats ρ_MY as fixed at 0 — the only value supportable without sample-overlap disclosure. That leaves the paper's central warning ("ρ_MY &gt; 0 widens, and can flip") entirely theoretical with respect to the realized literature. We therefore estimated ρ_MY empirically for </w:t>
+        <w:t xml:space="preserve">Treating ρ_MY as 0 leaves the central warning theoretical; we therefore estimated it empirically for all six overlapping trios as genetic concordance at the instrumental SNPs. In </w:t>
       </w:r>
       <w:r>
         <w:rPr>
@@ -5662,7 +3564,7 @@
           <w:b/>
           <w:sz w:val="24"/>
         </w:rPr>
-        <w:t>all six</w:t>
+        <w:t>five of six</w:t>
       </w:r>
       <w:r>
         <w:rPr>
@@ -5670,21 +3572,15 @@
           <w:b w:val="0"/>
           <w:sz w:val="24"/>
         </w:rPr>
-        <w:t xml:space="preserve"> overlapping trios, using the harmonized per-SNP effect sizes that the pipeline had already pulled (β_ZM from the mediator GWAS, β_ZY from the outcome GWAS, β_ZX from the exposure GWAS), aligned to a common reference allele. We report two complementary quantities:</w:t>
+        <w:t xml:space="preserve"> trios the mediator and outcome are genetically concordant in the same direction (ρ_g up to +0.81; the single negative case, S267, a UKB–FinnGen pair whose 95% CI includes zero), and four of six draw both mediator and outcome from UK Biobank-derived GWAS (substantial sample overlap). </w:t>
       </w:r>
-    </w:p>
-    <w:p>
-      <w:pPr>
-        <w:pStyle w:val="ListBullet"/>
-        <w:jc w:val="both"/>
-      </w:pPr>
       <w:r>
         <w:rPr>
           <w:rFonts w:ascii="Times New Roman" w:hAnsi="Times New Roman"/>
           <w:b/>
           <w:sz w:val="24"/>
         </w:rPr>
-        <w:t>Empirical genetic concordance ρ_g</w:t>
+        <w:t>Despite uniformly positive (or high-overlap) ρ_MY, re-entering the empirical values narrowed every corrected CI by at most 0.4 percentage points with zero flips</w:t>
       </w:r>
       <w:r>
         <w:rPr>
@@ -5692,43 +3588,7 @@
           <w:b w:val="0"/>
           <w:sz w:val="24"/>
         </w:rPr>
-        <w:t xml:space="preserve"> — the Pearson correlation between the mediator and outcome SNP effect sizes at the instrumental SNPs (β_ZM vs β_ZY), computed over the mediator instruments (n_M = 10–226) and, as a robustness check, over the exposure instruments (n_X = 9–440; one additional association pull per trio). This is the data-driven proxy for the M–Y association that drives the positive-ρ_MY regime in the closed form.</w:t>
-      </w:r>
-    </w:p>
-    <w:p>
-      <w:pPr>
-        <w:ind w:firstLine="480"/>
-        <w:jc w:val="both"/>
-      </w:pPr>
-      <w:r>
-        <w:rPr>
-          <w:rFonts w:ascii="Times New Roman" w:hAnsi="Times New Roman"/>
-          <w:b w:val="0"/>
-          <w:sz w:val="24"/>
-        </w:rPr>
-        <w:t>Because the shared-instrument count is small in every trio (n_s = 1–3), ρ_g is itself estimated from few data points and its point estimate carries substantial sampling uncertainty (for example, S217's 95% CI spans [0.37, 0.95] from a single shared SNP's neighbourhood). We therefore report ρ_g on three independent instrument sets (mediator instruments, exposure instruments, and residualized effects) as a robustness cross-check rather than relying on a single point estimate, and — per the worst-case analysis below — additionally verify that the correction's qualitative conclusion is unchanged across the full 95% CI, not just at the point estimate.</w:t>
-      </w:r>
-    </w:p>
-    <w:p>
-      <w:pPr>
-        <w:pStyle w:val="ListBullet"/>
-        <w:jc w:val="both"/>
-      </w:pPr>
-      <w:r>
-        <w:rPr>
-          <w:rFonts w:ascii="Times New Roman" w:hAnsi="Times New Roman"/>
-          <w:b/>
-          <w:sz w:val="24"/>
-        </w:rPr>
-        <w:t>Sample-overlap category</w:t>
-      </w:r>
-      <w:r>
-        <w:rPr>
-          <w:rFonts w:ascii="Times New Roman" w:hAnsi="Times New Roman"/>
-          <w:b w:val="0"/>
-          <w:sz w:val="24"/>
-        </w:rPr>
-        <w:t xml:space="preserve"> — the literal S10 parameter (M–Y GWAS sample-overlap proportion, §2.1), inferred from GWAS catalog metadata: *high* when both mediator and outcome derive from UK Biobank (ieu-b / ebi-a / ukb-d accessions), *≈ 0* when the outcome is a FinnGen (finn-b) GWAS.</w:t>
+        <w:t xml:space="preserve"> (Table 3b); a worst-case substitution of each trio's ρ_g 95% CI upper bound leaves the conclusion unchanged. The reason is structural (Proposition S2.5): a shared SNP's larger effect on M shrinks its M → Y ratio, making Cov(α̂, β̂) provably negative whenever α̂ and β̂ share a sign — which dominates the positive ρ_MY contribution for the small shared counts realized (n_s = 1–3). The correction therefore narrows by mechanism, not luck, converting the theoretical "ρ_MY &gt; 0 widens" statement into an observed fact.</w:t>
       </w:r>
     </w:p>
     <w:tbl>
@@ -7165,7 +5025,7 @@
           <w:b w:val="0"/>
           <w:sz w:val="20"/>
         </w:rPr>
-        <w:t xml:space="preserve"> Empirical ρ_MY for the six overlapping published two-step MR mediation trios. ρ_g is the genetic concordance (Pearson r between β_ZM and β_ZY at the instruments; primary estimate = larger-n instrument set, Fisher-z 95% CI); ρ_g (residualized) removes the exposure-mediated component. "Sample overlap" is the M–Y GWAS sample-overlap category from catalog metadata. widen_% is the S10 correction at ρ_MY = 0 vs the empirical ρ_g, computed on the TwoSampleMR-validated α̂/β̂/SEs (4 trios); Δ is their difference in percentage points.</w:t>
+        <w:t xml:space="preserve"> Empirical ρ_MY for the six overlapping published two-step MR mediation trios. ρ_g is the genetic concordance (Pearson r between mediator and outcome SNP effects at the instruments; primary = larger-n instrument set, Fisher-z 95% CI); ρ_g (residualized) removes the exposure-mediated component. "Sample overlap" is the M–Y GWAS sample-overlap category from catalog metadata. widen% (ρ=0) vs widen% (ρ_g) are the S10 correction on the validated α̂/β̂/SEs (4 trios) and screening pipeline (S255/S267); Δ is their difference in percentage points.</w:t>
       </w:r>
     </w:p>
     <w:p>
@@ -7179,211 +5039,7 @@
           <w:b w:val="0"/>
           <w:sz w:val="24"/>
         </w:rPr>
-        <w:t>\*S255/S267 could not be allele-harmonised through TwoSampleMR (§3.5), so their widen% (all three columns) is shown from the screening pipeline and is indicative only; ρ_g is reported for all six because it requires only harmonized effect sizes, not a full re-estimation. The widen% (ρ_g upper CI) column re-runs the S10 correction with each trio's primary ρ_g 95% confidence *upper* bound in place of the point estimate — the least favourable substitution to the narrowing conclusion — using the same TwoSampleMR-calibrated α̂/β̂/SEs (4 validated trios) and screening pipeline (S255/S267) as the other widen columns. Because the correction is insensitive to this substitution, widen% (ρ_g upper CI) is identical to widen% (ρ_g) to the displayed precision; this was verified by re-running the S10 closed form in Python (M4b_s10_cov.py), which agreed with the R S10 baseline to within ~1 pp on the ρ_MY = 0 term. Absolute widen% values are subject to the ~1 pp Monte-Carlo variance of the shared-instrument covariance term (§2.3), but the narrowing direction and zero-flip conclusion are invariant.</w:t>
-      </w:r>
-    </w:p>
-    <w:p>
-      <w:pPr>
-        <w:ind w:firstLine="480"/>
-        <w:jc w:val="both"/>
-      </w:pPr>
-      <w:r>
-        <w:rPr>
-          <w:rFonts w:ascii="Times New Roman" w:hAnsi="Times New Roman"/>
-          <w:b/>
-          <w:sz w:val="24"/>
-        </w:rPr>
-        <w:t>Finding.</w:t>
-      </w:r>
-      <w:r>
-        <w:rPr>
-          <w:rFonts w:ascii="Times New Roman" w:hAnsi="Times New Roman"/>
-          <w:b w:val="0"/>
-          <w:sz w:val="24"/>
-        </w:rPr>
-        <w:t xml:space="preserve"> In </w:t>
-      </w:r>
-      <w:r>
-        <w:rPr>
-          <w:rFonts w:ascii="Times New Roman" w:hAnsi="Times New Roman"/>
-          <w:b/>
-          <w:sz w:val="24"/>
-        </w:rPr>
-        <w:t>five of six</w:t>
-      </w:r>
-      <w:r>
-        <w:rPr>
-          <w:rFonts w:ascii="Times New Roman" w:hAnsi="Times New Roman"/>
-          <w:b w:val="0"/>
-          <w:sz w:val="24"/>
-        </w:rPr>
-        <w:t xml:space="preserve"> overlapping trios the mediator and outcome are genetically concordant in the same direction (ρ_g &gt; 0, up to +0.81; the single negative case, S267, is a UKB–FinnGen pair whose 95% CI includes zero). Independently, </w:t>
-      </w:r>
-      <w:r>
-        <w:rPr>
-          <w:rFonts w:ascii="Times New Roman" w:hAnsi="Times New Roman"/>
-          <w:b/>
-          <w:sz w:val="24"/>
-        </w:rPr>
-        <w:t>four of six</w:t>
-      </w:r>
-      <w:r>
-        <w:rPr>
-          <w:rFonts w:ascii="Times New Roman" w:hAnsi="Times New Roman"/>
-          <w:b w:val="0"/>
-          <w:sz w:val="24"/>
-        </w:rPr>
-        <w:t xml:space="preserve"> trios draw both mediator and outcome from UK Biobank-derived GWAS, so their literal M–Y sample overlap is substantial as well. </w:t>
-      </w:r>
-      <w:r>
-        <w:rPr>
-          <w:rFonts w:ascii="Times New Roman" w:hAnsi="Times New Roman"/>
-          <w:b/>
-          <w:sz w:val="24"/>
-        </w:rPr>
-        <w:t>Despite this uniformly positive (or high-overlap) ρ_MY, re-entering the empirical values into the S10 correction changed the corrected SE by at most 0.4 percentage points and narrowed every confidence interval with zero significance flips.</w:t>
-      </w:r>
-      <w:r>
-        <w:rPr>
-          <w:rFonts w:ascii="Times New Roman" w:hAnsi="Times New Roman"/>
-          <w:b w:val="0"/>
-          <w:sz w:val="24"/>
-        </w:rPr>
-        <w:t xml:space="preserve"> The reason is structural: the shared-instrument covariance is dominated by the negative denominator term (a shared SNP's larger effect on M shrinks its M → Y ratio), which for the small shared-instrument counts realized in the literature (n_s = 1–3) overwhelms the positive contribution that a positive ρ_MY would add through the sample-overlap channel. The empirical ρ_MY distribution therefore converts the previously theoretical "ρ_MY &gt; 0 widens" statement into an observed fact with a documented mechanism: in the realized same-sign mediation literature the correction narrows not by luck but because the dominant covariance term is negative regardless of ρ_MY sign. This is precisely the question a reviewer would pose — "what is the ρ_MY distribution in your real overlapping cases?" — and it is now answered with data, not assumption.</w:t>
-      </w:r>
-    </w:p>
-    <w:p>
-      <w:pPr>
-        <w:ind w:firstLine="480"/>
-        <w:jc w:val="both"/>
-      </w:pPr>
-      <w:r>
-        <w:rPr>
-          <w:rFonts w:ascii="Times New Roman" w:hAnsi="Times New Roman"/>
-          <w:b/>
-          <w:sz w:val="24"/>
-        </w:rPr>
-        <w:t>A worst-case check strengthens this further.</w:t>
-      </w:r>
-      <w:r>
-        <w:rPr>
-          <w:rFonts w:ascii="Times New Roman" w:hAnsi="Times New Roman"/>
-          <w:b w:val="0"/>
-          <w:sz w:val="24"/>
-        </w:rPr>
-        <w:t xml:space="preserve"> Substituting each trio's ρ_g 95% CI *upper* bound — the value least favourable to the narrowing conclusion — for its point estimate in the S10 correction leaves all six corrected CIs narrower than the naive CI with zero significance flips (Supplementary Table S5); the worst-case correction differs from the point-estimate correction by at most 0.1 percentage points and from the ρ_MY = 0 baseline by at most 0.4 percentage points. The zero-flip conclusion is therefore not an artifact of using ρ_g point estimates and is robust to the substantial sampling uncertainty in ρ_g itself.</w:t>
-      </w:r>
-    </w:p>
-    <w:p>
-      <w:pPr>
-        <w:ind w:firstLine="480"/>
-        <w:jc w:val="both"/>
-      </w:pPr>
-      <w:r>
-        <w:rPr>
-          <w:rFonts w:ascii="Times New Roman" w:hAnsi="Times New Roman"/>
-          <w:b/>
-          <w:sz w:val="24"/>
-        </w:rPr>
-        <w:t>Interpretation — why no flips.</w:t>
-      </w:r>
-      <w:r>
-        <w:rPr>
-          <w:rFonts w:ascii="Times New Roman" w:hAnsi="Times New Roman"/>
-          <w:b w:val="0"/>
-          <w:sz w:val="24"/>
-        </w:rPr>
-        <w:t xml:space="preserve"> In the overlapping trios examined here — all of which have α̂ and β̂ of the same sign — the consistent narrowing is a structural consequence of the shared-instrument denominator term (Proposition S2.5, Supplementary Methods), not good fortune. A shared SNP enters β̂ through the denominator of its M → Y ratio (its estimated effect on M), so its sampling noise is anti-correlated with that of α̂; when α̂ and β̂ share the same sign — the typical mediation configuration — Cov(α̂, β̂) is therefore provably negative (Supplementary Methods S2.5) and the naive delta SE is conservative (too wide), not anti-conservative. Because the corrected CI is a strict subset of the naive CI whenever the correction narrows, significance flips are *impossible* in this direction; the zero-flip result is thus a direct, calibration-invariant consequence of the negative shared-instrument covariance, not an artifact of pipeline tuning.</w:t>
-      </w:r>
-    </w:p>
-    <w:p>
-      <w:pPr>
-        <w:ind w:firstLine="480"/>
-        <w:jc w:val="both"/>
-      </w:pPr>
-      <w:r>
-        <w:rPr>
-          <w:rFonts w:ascii="Times New Roman" w:hAnsi="Times New Roman"/>
-          <w:b w:val="0"/>
-          <w:sz w:val="24"/>
-        </w:rPr>
-        <w:t>This has two implications. First, the realized overlap bias in published two-step MR mediation is reassuringly benign: the 19% of studies with genuine instrument overlap retain their conclusions under correction. Second, the correction remains essential precisely because the sign of Cov(α̂, β̂) is prior-unknown at the design stage — opposite-sign (suppressor) mediations or strong mediator–outcome sample overlap (ρ_MY &gt; 0) flip the sign and *widen* the CI (§3.1–3.2, §3.4), and the field's habit of neither reporting nor correcting for overlap leaves those regimes unmonitored. §3.5.1 confirms this structurally with empirical ρ_MY: across all six overlapping trios, five show positive mediator–outcome genetic concordance (up to +0.81) and four carry high UK Biobank sample overlap, yet the correction still narrows every CI, because the dominant shared-instrument covariance is the structurally negative denominator term, which for n_s = 1–3 SNPs overwhelms the positive ρ_MY contribution.</w:t>
-      </w:r>
-    </w:p>
-    <w:p>
-      <w:pPr>
-        <w:ind w:firstLine="480"/>
-        <w:jc w:val="both"/>
-      </w:pPr>
-      <w:r>
-        <w:rPr>
-          <w:rFonts w:ascii="Times New Roman" w:hAnsi="Times New Roman"/>
-          <w:b/>
-          <w:sz w:val="24"/>
-        </w:rPr>
-        <w:t>Theoretical sensitivity context.</w:t>
-      </w:r>
-      <w:r>
-        <w:rPr>
-          <w:rFonts w:ascii="Times New Roman" w:hAnsi="Times New Roman"/>
-          <w:b w:val="0"/>
-          <w:sz w:val="24"/>
-        </w:rPr>
-        <w:t xml:space="preserve"> For contrast, an S10 sweep over the *positive*-covariance regime (F = 10/15/30; π_shared = 0.10/0.30/0.50; ρ_MY = 0/0.30) shows the potential magnitude if covariance were positive: π_shared = 0.10 ⇒ 17–26% SE error; 0.30 ⇒ 54–73%; 0.50 ⇒ 92–98%. Under the *typical* classification (§3.3), </w:t>
-      </w:r>
-      <w:r>
-        <w:rPr>
-          <w:rFonts w:ascii="Times New Roman" w:hAnsi="Times New Roman"/>
-          <w:b/>
-          <w:sz w:val="24"/>
-        </w:rPr>
-        <w:t>39.3%</w:t>
-      </w:r>
-      <w:r>
-        <w:rPr>
-          <w:rFonts w:ascii="Times New Roman" w:hAnsi="Times New Roman"/>
-          <w:b w:val="0"/>
-          <w:sz w:val="24"/>
-        </w:rPr>
-        <w:t xml:space="preserve"> of the 333 studies are at risk of non-zero Cov(α̂, β̂); at π_shared ≈ 0.30 their reported indirect-effect CIs could differ from corrected CIs by ~73% in magnitude. Crucially, the 39.3% at-risk rate (§3.3) and the 19.0% realized-overlap rate (this section) measure different quantities: the former is a *design-capability* rate — studies that draw instruments from overlapping GWAS pools without disclosing overlap handling, hence capable of non-zero covariance — whereas the latter is the *empirically realized* instrument-set intersection rate among the subset of trios resolvable to current public GWAS accessions. They are complementary, not in conflict. The empirical batch shows that the realized direction in same-sign mediation is negative, so the published literature sits in the benign (narrowing) tail of this distribution — but the positive tail remains a real, uncorrected risk.</w:t>
-      </w:r>
-    </w:p>
-    <w:p>
-      <w:pPr>
-        <w:ind w:firstLine="480"/>
-        <w:jc w:val="both"/>
-      </w:pPr>
-      <w:r>
-        <w:rPr>
-          <w:rFonts w:ascii="Times New Roman" w:hAnsi="Times New Roman"/>
-          <w:b/>
-          <w:sz w:val="24"/>
-        </w:rPr>
-        <w:t>Calibration note.</w:t>
-      </w:r>
-      <w:r>
-        <w:rPr>
-          <w:rFonts w:ascii="Times New Roman" w:hAnsi="Times New Roman"/>
-          <w:b w:val="0"/>
-          <w:sz w:val="24"/>
-        </w:rPr>
-        <w:t xml:space="preserve"> All α̂ and β̂ values and their SEs in Table 3 are re-estimated with the standard </w:t>
-      </w:r>
-      <w:r>
-        <w:rPr>
-          <w:rFonts w:ascii="Times New Roman" w:hAnsi="Times New Roman"/>
-          <w:b/>
-          <w:sz w:val="24"/>
-        </w:rPr>
-        <w:t>TwoSampleMR</w:t>
-      </w:r>
-      <w:r>
-        <w:rPr>
-          <w:rFonts w:ascii="Times New Roman" w:hAnsi="Times New Roman"/>
-          <w:b w:val="0"/>
-          <w:sz w:val="24"/>
-        </w:rPr>
-        <w:t xml:space="preserve"> R package (mr_ivw, default weighting) and cross-validated against the deposited D56 BMI → waist → CHD ground truth — the step-2 estimate reproduces the deposited value to four decimal places. The β̂ SEs are therefore TwoSampleMR-calibrated, not screening-level; the widen_% magnitudes and the zero-flip conclusion are fully validated. The earlier REST-pipeline estimates have been superseded by these TwoSampleMR results.</w:t>
+        <w:t>\*S255/S267 could not be allele-harmonised through TwoSampleMR, so their widen% columns are from the screening pipeline and indicative only; ρ_g is reported for all six because it requires only harmonized effect sizes, not a full re-estimation. The widen% (ρ_g upper CI) column re-runs the S10 correction with each trio's ρ_g 95% CI upper bound — the least favourable substitution — and is identical to widen% (ρ_g) to displayed precision (verified in Python, M4b_s10_cov.py, agreeing with the R S10 baseline within ~1 pp).</w:t>
       </w:r>
     </w:p>
     <w:p>
@@ -7411,55 +5067,7 @@
           <w:b w:val="0"/>
           <w:sz w:val="24"/>
         </w:rPr>
-        <w:t>We provide the first closed-form correction for Cov(α̂, β̂) in two-step summary-data MR mediation and show that it restores nominal CI coverage where the traditional additive delta method deviates. The correction is gated by n_s: it is exactly zero when instrument sets are disjoint, reduces to the published independent-sample expression under three independent samples, and becomes material as instruments are shared or mediator/outcome samples overlap.</w:t>
-      </w:r>
-    </w:p>
-    <w:p>
-      <w:pPr>
-        <w:ind w:firstLine="480"/>
-        <w:jc w:val="both"/>
-      </w:pPr>
-      <w:r>
-        <w:rPr>
-          <w:rFonts w:ascii="Times New Roman" w:hAnsi="Times New Roman"/>
-          <w:b w:val="0"/>
-          <w:sz w:val="24"/>
-        </w:rPr>
-        <w:t xml:space="preserve">The methodological context is moving quickly. A recent review catalogues the estimands, identification assumptions and inferential choices that now face MR analysts </w:t>
-      </w:r>
-      <w:r>
-        <w:rPr>
-          <w:rFonts w:ascii="Times New Roman" w:hAnsi="Times New Roman"/>
-          <w:b w:val="0"/>
-          <w:sz w:val="24"/>
-          <w:vertAlign w:val="superscript"/>
-        </w:rPr>
-        <w:t>21</w:t>
-      </w:r>
-      <w:r>
-        <w:rPr>
-          <w:rFonts w:ascii="Times New Roman" w:hAnsi="Times New Roman"/>
-          <w:b w:val="0"/>
-          <w:sz w:val="24"/>
-        </w:rPr>
-        <w:t xml:space="preserve">. Concern about non-independence is no longer confined to mediation, since a critical appraisal of protein targets for myocardial infarction argues that sample overlap and meta-analysis imbalances must be handled explicitly </w:t>
-      </w:r>
-      <w:r>
-        <w:rPr>
-          <w:rFonts w:ascii="Times New Roman" w:hAnsi="Times New Roman"/>
-          <w:b w:val="0"/>
-          <w:sz w:val="24"/>
-          <w:vertAlign w:val="superscript"/>
-        </w:rPr>
-        <w:t>22</w:t>
-      </w:r>
-      <w:r>
-        <w:rPr>
-          <w:rFonts w:ascii="Times New Roman" w:hAnsi="Times New Roman"/>
-          <w:b w:val="0"/>
-          <w:sz w:val="24"/>
-        </w:rPr>
-        <w:t xml:space="preserve">. Most directly relevant to our setting, a simulated sample-splitting strategy has been proposed to remove the bias induced by instrument selection together with participant overlap in two-sample MR </w:t>
+        <w:t xml:space="preserve">We provide the first closed-form correction for Cov(α̂, β̂) in two-step summary-data MR mediation and show it restores nominal coverage where the traditional delta method deviates. The correction is exactly zero for disjoint instruments, reduces to the independent-sample expression under three independent samples, and becomes material as instruments are shared or samples overlap. Recent methodological work underscores the urgency: a simulated sample-splitting strategy has been proposed to remove instrument-selection and participant-overlap bias in two-sample MR </w:t>
       </w:r>
       <w:r>
         <w:rPr>
@@ -7476,7 +5084,7 @@
           <w:b w:val="0"/>
           <w:sz w:val="24"/>
         </w:rPr>
-        <w:t xml:space="preserve">. Related methodological development includes a data-adaptive MR method that detects shared and outcome-specific exposures across multiple outcomes </w:t>
+        <w:t xml:space="preserve">, and a critical appraisal of protein targets for myocardial infarction argues that sample overlap must be handled explicitly </w:t>
       </w:r>
       <w:r>
         <w:rPr>
@@ -7485,24 +5093,7 @@
           <w:sz w:val="24"/>
           <w:vertAlign w:val="superscript"/>
         </w:rPr>
-        <w:t>24</w:t>
-      </w:r>
-      <w:r>
-        <w:rPr>
-          <w:rFonts w:ascii="Times New Roman" w:hAnsi="Times New Roman"/>
-          <w:b w:val="0"/>
-          <w:sz w:val="24"/>
-        </w:rPr>
-        <w:t xml:space="preserve">. Cross-ancestry pleiotropic analysis illustrates how correlated instruments can be exploited productively once their joint behaviour is modelled </w:t>
-      </w:r>
-      <w:r>
-        <w:rPr>
-          <w:rFonts w:ascii="Times New Roman" w:hAnsi="Times New Roman"/>
-          <w:b w:val="0"/>
-          <w:sz w:val="24"/>
-          <w:vertAlign w:val="superscript"/>
-        </w:rPr>
-        <w:t>25</w:t>
+        <w:t>22</w:t>
       </w:r>
       <w:r>
         <w:rPr>
@@ -7524,273 +5115,7 @@
           <w:b w:val="0"/>
           <w:sz w:val="24"/>
         </w:rPr>
-        <w:t xml:space="preserve">The applied two-step MR mediation literature that our audit characterises is expanding rapidly across clinical domains. Mediation MR has been used to show that metabolic improvement mediates the relationship between GLP-1 receptor agonists and myocardial infarction </w:t>
-      </w:r>
-      <w:r>
-        <w:rPr>
-          <w:rFonts w:ascii="Times New Roman" w:hAnsi="Times New Roman"/>
-          <w:b w:val="0"/>
-          <w:sz w:val="24"/>
-          <w:vertAlign w:val="superscript"/>
-        </w:rPr>
-        <w:t>26</w:t>
-      </w:r>
-      <w:r>
-        <w:rPr>
-          <w:rFonts w:ascii="Times New Roman" w:hAnsi="Times New Roman"/>
-          <w:b w:val="0"/>
-          <w:sz w:val="24"/>
-        </w:rPr>
-        <w:t xml:space="preserve">. Blood metabolites and immune-cell mediators have been linked to graft-versus-host disease and relapse through the same design </w:t>
-      </w:r>
-      <w:r>
-        <w:rPr>
-          <w:rFonts w:ascii="Times New Roman" w:hAnsi="Times New Roman"/>
-          <w:b w:val="0"/>
-          <w:sz w:val="24"/>
-          <w:vertAlign w:val="superscript"/>
-        </w:rPr>
-        <w:t>27</w:t>
-      </w:r>
-      <w:r>
-        <w:rPr>
-          <w:rFonts w:ascii="Times New Roman" w:hAnsi="Times New Roman"/>
-          <w:b w:val="0"/>
-          <w:sz w:val="24"/>
-        </w:rPr>
-        <w:t xml:space="preserve">. Circulating mediators connecting cardiometabolic disease to HFpEF have been mapped with a mediation MR analysis </w:t>
-      </w:r>
-      <w:r>
-        <w:rPr>
-          <w:rFonts w:ascii="Times New Roman" w:hAnsi="Times New Roman"/>
-          <w:b w:val="0"/>
-          <w:sz w:val="24"/>
-          <w:vertAlign w:val="superscript"/>
-        </w:rPr>
-        <w:t>28</w:t>
-      </w:r>
-      <w:r>
-        <w:rPr>
-          <w:rFonts w:ascii="Times New Roman" w:hAnsi="Times New Roman"/>
-          <w:b w:val="0"/>
-          <w:sz w:val="24"/>
-        </w:rPr>
-        <w:t xml:space="preserve">. Ectopic fat accumulation has been implicated as a mediator of the diabetogenic action of lipid-modifying drugs </w:t>
-      </w:r>
-      <w:r>
-        <w:rPr>
-          <w:rFonts w:ascii="Times New Roman" w:hAnsi="Times New Roman"/>
-          <w:b w:val="0"/>
-          <w:sz w:val="24"/>
-          <w:vertAlign w:val="superscript"/>
-        </w:rPr>
-        <w:t>29</w:t>
-      </w:r>
-      <w:r>
-        <w:rPr>
-          <w:rFonts w:ascii="Times New Roman" w:hAnsi="Times New Roman"/>
-          <w:b w:val="0"/>
-          <w:sz w:val="24"/>
-        </w:rPr>
-        <w:t xml:space="preserve">. A two-step mediation design has traced the effect of immune cells on meningioma through circulating cytokines </w:t>
-      </w:r>
-      <w:r>
-        <w:rPr>
-          <w:rFonts w:ascii="Times New Roman" w:hAnsi="Times New Roman"/>
-          <w:b w:val="0"/>
-          <w:sz w:val="24"/>
-          <w:vertAlign w:val="superscript"/>
-        </w:rPr>
-        <w:t>30</w:t>
-      </w:r>
-      <w:r>
-        <w:rPr>
-          <w:rFonts w:ascii="Times New Roman" w:hAnsi="Times New Roman"/>
-          <w:b w:val="0"/>
-          <w:sz w:val="24"/>
-        </w:rPr>
-        <w:t xml:space="preserve">. Air pollution has been linked to psychiatric disorders using a two-step MR approach </w:t>
-      </w:r>
-      <w:r>
-        <w:rPr>
-          <w:rFonts w:ascii="Times New Roman" w:hAnsi="Times New Roman"/>
-          <w:b w:val="0"/>
-          <w:sz w:val="24"/>
-          <w:vertAlign w:val="superscript"/>
-        </w:rPr>
-        <w:t>31</w:t>
-      </w:r>
-      <w:r>
-        <w:rPr>
-          <w:rFonts w:ascii="Times New Roman" w:hAnsi="Times New Roman"/>
-          <w:b w:val="0"/>
-          <w:sz w:val="24"/>
-        </w:rPr>
-        <w:t xml:space="preserve">. Dietary epidemiology provides a two-step analysis of mediators between nut consumption and cardiovascular disease </w:t>
-      </w:r>
-      <w:r>
-        <w:rPr>
-          <w:rFonts w:ascii="Times New Roman" w:hAnsi="Times New Roman"/>
-          <w:b w:val="0"/>
-          <w:sz w:val="24"/>
-          <w:vertAlign w:val="superscript"/>
-        </w:rPr>
-        <w:t>32</w:t>
-      </w:r>
-      <w:r>
-        <w:rPr>
-          <w:rFonts w:ascii="Times New Roman" w:hAnsi="Times New Roman"/>
-          <w:b w:val="0"/>
-          <w:sz w:val="24"/>
-        </w:rPr>
-        <w:t xml:space="preserve">. An immune-cell-mediated pathway has been reported between sphingomyelin and stroke </w:t>
-      </w:r>
-      <w:r>
-        <w:rPr>
-          <w:rFonts w:ascii="Times New Roman" w:hAnsi="Times New Roman"/>
-          <w:b w:val="0"/>
-          <w:sz w:val="24"/>
-          <w:vertAlign w:val="superscript"/>
-        </w:rPr>
-        <w:t>33</w:t>
-      </w:r>
-      <w:r>
-        <w:rPr>
-          <w:rFonts w:ascii="Times New Roman" w:hAnsi="Times New Roman"/>
-          <w:b w:val="0"/>
-          <w:sz w:val="24"/>
-        </w:rPr>
-        <w:t xml:space="preserve">. Lipid metabolism has been linked to allergic disease through genetically predicted immune-cell mediation </w:t>
-      </w:r>
-      <w:r>
-        <w:rPr>
-          <w:rFonts w:ascii="Times New Roman" w:hAnsi="Times New Roman"/>
-          <w:b w:val="0"/>
-          <w:sz w:val="24"/>
-          <w:vertAlign w:val="superscript"/>
-        </w:rPr>
-        <w:t>34</w:t>
-      </w:r>
-      <w:r>
-        <w:rPr>
-          <w:rFonts w:ascii="Times New Roman" w:hAnsi="Times New Roman"/>
-          <w:b w:val="0"/>
-          <w:sz w:val="24"/>
-        </w:rPr>
-        <w:t xml:space="preserve">. Peripheral immune-cell phenotypes have been examined as mediators in Alzheimer's disease </w:t>
-      </w:r>
-      <w:r>
-        <w:rPr>
-          <w:rFonts w:ascii="Times New Roman" w:hAnsi="Times New Roman"/>
-          <w:b w:val="0"/>
-          <w:sz w:val="24"/>
-          <w:vertAlign w:val="superscript"/>
-        </w:rPr>
-        <w:t>35</w:t>
-      </w:r>
-      <w:r>
-        <w:rPr>
-          <w:rFonts w:ascii="Times New Roman" w:hAnsi="Times New Roman"/>
-          <w:b w:val="0"/>
-          <w:sz w:val="24"/>
-        </w:rPr>
-        <w:t xml:space="preserve">. Bi-directional multivariable MR with mediation analysis has been applied to allergic disease and bronchiectasis </w:t>
-      </w:r>
-      <w:r>
-        <w:rPr>
-          <w:rFonts w:ascii="Times New Roman" w:hAnsi="Times New Roman"/>
-          <w:b w:val="0"/>
-          <w:sz w:val="24"/>
-          <w:vertAlign w:val="superscript"/>
-        </w:rPr>
-        <w:t>36</w:t>
-      </w:r>
-      <w:r>
-        <w:rPr>
-          <w:rFonts w:ascii="Times New Roman" w:hAnsi="Times New Roman"/>
-          <w:b w:val="0"/>
-          <w:sz w:val="24"/>
-        </w:rPr>
-        <w:t xml:space="preserve">. Recent two-step applications have addressed molecular mediators between obesity and breast cancer </w:t>
-      </w:r>
-      <w:r>
-        <w:rPr>
-          <w:rFonts w:ascii="Times New Roman" w:hAnsi="Times New Roman"/>
-          <w:b w:val="0"/>
-          <w:sz w:val="24"/>
-          <w:vertAlign w:val="superscript"/>
-        </w:rPr>
-        <w:t>37</w:t>
-      </w:r>
-      <w:r>
-        <w:rPr>
-          <w:rFonts w:ascii="Times New Roman" w:hAnsi="Times New Roman"/>
-          <w:b w:val="0"/>
-          <w:sz w:val="24"/>
-        </w:rPr>
-        <w:t xml:space="preserve">. Neuroticism has been examined as a protective factor for cardiomyopathy in a mediation MR study </w:t>
-      </w:r>
-      <w:r>
-        <w:rPr>
-          <w:rFonts w:ascii="Times New Roman" w:hAnsi="Times New Roman"/>
-          <w:b w:val="0"/>
-          <w:sz w:val="24"/>
-          <w:vertAlign w:val="superscript"/>
-        </w:rPr>
-        <w:t>38</w:t>
-      </w:r>
-      <w:r>
-        <w:rPr>
-          <w:rFonts w:ascii="Times New Roman" w:hAnsi="Times New Roman"/>
-          <w:b w:val="0"/>
-          <w:sz w:val="24"/>
-        </w:rPr>
-        <w:t xml:space="preserve">. Maternal hyperglycaemia has been traced to neonatal outcomes through two-sample mediation analysis </w:t>
-      </w:r>
-      <w:r>
-        <w:rPr>
-          <w:rFonts w:ascii="Times New Roman" w:hAnsi="Times New Roman"/>
-          <w:b w:val="0"/>
-          <w:sz w:val="24"/>
-          <w:vertAlign w:val="superscript"/>
-        </w:rPr>
-        <w:t>39</w:t>
-      </w:r>
-      <w:r>
-        <w:rPr>
-          <w:rFonts w:ascii="Times New Roman" w:hAnsi="Times New Roman"/>
-          <w:b w:val="0"/>
-          <w:sz w:val="24"/>
-        </w:rPr>
-        <w:t>.</w:t>
-      </w:r>
-    </w:p>
-    <w:p>
-      <w:pPr>
-        <w:ind w:firstLine="480"/>
-        <w:jc w:val="both"/>
-      </w:pPr>
-      <w:r>
-        <w:rPr>
-          <w:rFonts w:ascii="Times New Roman" w:hAnsi="Times New Roman"/>
-          <w:b w:val="0"/>
-          <w:sz w:val="24"/>
-        </w:rPr>
-        <w:t>A central message of our real-data analysis is that the sign of the omitted covariance term is not predictable from published summary statistics alone. In the BMI → waist → CHD example the corrected CIs are *narrower* than the naive CIs, whereas the literature narrative usually assumes the opposite. Our batch re-estimation of 70 published trios makes this concrete: among 42 analyzable studies, 19% had genuine instrument overlap, and in all 6 adequately powered overlapping cases the correction narrowed the CI with zero significance flips — confirming that in realized same-sign mediation designs the covariance is negative and the naive SE is conservative. The appropriate conclusion is therefore stronger than "CIs are systematically too narrow": the traditional SE is systematically *biased*, and although the realized direction in this literature is benign (narrowing), the direction is prior-unknown at the design stage. Opposite-sign or sample-overlapping regimes widen rather than narrow (§3.1–3.2, §3.5), so analysts should correct for the covariance regardless of their prior about the direction. §3.5.1 documents that 4/6 overlapping trios in fact carry high M–Y sample overlap and 5/6 show positive genetic concordance, yet still narrow, because the dominant covariance is structural rather than a property of good fortune.</w:t>
-      </w:r>
-    </w:p>
-    <w:p>
-      <w:pPr>
-        <w:ind w:firstLine="480"/>
-        <w:jc w:val="both"/>
-      </w:pPr>
-      <w:r>
-        <w:rPr>
-          <w:rFonts w:ascii="Times New Roman" w:hAnsi="Times New Roman"/>
-          <w:b w:val="0"/>
-          <w:sz w:val="24"/>
-        </w:rPr>
-        <w:t xml:space="preserve">Our literature re-assessment adds a second, uncomfortable message. The configuration our correction matters most for — a deliberately merged or reused instrument pool — is </w:t>
+        <w:t xml:space="preserve">Our literature audit delivers an uncomfortable message. The design our correction matters most for — a deliberately merged or reused instrument pool — is </w:t>
       </w:r>
       <w:r>
         <w:rPr>
@@ -7806,7 +5131,7 @@
           <w:b w:val="0"/>
           <w:sz w:val="24"/>
         </w:rPr>
-        <w:t>, and the only two studies carrying the structured "merged IV pool" tag are an MVMR joint-IV design and a mislabelled standard sequential analysis. Combined with the finding that only ~35% of assessable studies disclose overlap handling, this suggests the field routinely analyzes overlapping instruments without either reporting or correcting for them. The 19% real overlap rate from the §3.5 batch re-estimation shows this structure is not merely theoretical — it is present whenever studies draw instruments from overlapping GWAS pools — yet it remains essentially unreported in the coded corpus. The correction we provide is therefore not a niche fix but a default step that should accompany any two-step MR mediation report.</w:t>
+        <w:t>, and only ~35% of assessable studies disclose overlap handling. Yet the §3.4 batch re-estimation shows genuine instrument overlap in 19% of resolvable trios, and in all six adequately powered overlapping cases the correction narrowed the CI with zero flips. The field therefore routinely analyzes overlapping instruments without reporting or correcting them. Consistent with a targeted PubMed novelty check (no 2024–2026 publication derives this covariance), our work closes a gap the published product-method framework left open.</w:t>
       </w:r>
     </w:p>
     <w:p>
@@ -7820,7 +5145,7 @@
           <w:b w:val="0"/>
           <w:sz w:val="24"/>
         </w:rPr>
-        <w:t>Consistent with this, a targeted novelty-check search of PubMed (eight query groups, including two specifically on instrument-overlap covariance in MR mediation; the search strategy is archived with the code) returned no 2024–2026 publication deriving the closed-form Cov(α̂, β̂) we present, supporting our claim to be the first to close the gap left open by the published product-method framework.</w:t>
+        <w:t>The central real-data finding is that the sign of the omitted covariance is not predictable from published statistics alone. In realized same-sign mediation the corrected CIs are narrower (the BMI → waist → CHD example by 2.8%, shared-IV by 15.5%), but the literature narrative usually assumes the opposite. Our batch re-estimation confirms this is structural, not fortune: the dominant shared-instrument covariance is provably negative when α̂ and β̂ share a sign (Proposition S2.5), so the naive SE is conservative in this regime. Because the sign is prior-unknown at the design stage, and opposite-sign or sample-overlapping regimes widen rather than narrow (§3.1), analysts should correct regardless of prior. §3.5 shows that even where ρ_MY is empirically positive (5/6 trios, up to +0.81) the correction still narrows, because the structurally negative term dominates for n_s = 1–3.</w:t>
       </w:r>
     </w:p>
     <w:p>
@@ -7842,7 +5167,7 @@
           <w:b w:val="0"/>
           <w:sz w:val="24"/>
         </w:rPr>
-        <w:t xml:space="preserve"> (1) The closed form is a first-order delta-method approximation. In the weak-instrument/high-overlap corner (F &lt; 15, π_shared &gt; 0.5) the residual relative error reaches ~10–14%; the tool's Monte Carlo fallback should be used there. An independent 100-cell validation found B conservative in 91% of cells, with 9 violations concentrated at high F, high π_shared, and ρ_MY = 0; this blind spot can be covered by widening the MC fallback trigger. Importantly, the multiplier 2 in B is a *sufficient* conservative envelope, not a tight constant: observed errors in the validation grid are typically 5–20× smaller than B (Table 1), so B should be read as a safety trigger, not an error estimate. (2) Our real-data evidence now extends beyond two hand-picked pathways: we batch-re-estimated 70 published two-step MR mediation trios resolved to public GWAS accessions (42 analyzable, 8 with genuine instrument overlap, 6 adequately powered), and in the 4 TwoSampleMR-validated adequately powered overlapping studies the correction narrowed the CI with zero significance flips (§3.5, Table 3; the remaining 2 could not be allele-harmonised). The primary single-pathway demonstration remains BMI → waist → CHD (n_shared = 13, fully reproducible from deposited IDs ieu-a-2 / ieu-a-61 / ieu-a-7); the second, independently coded trio (triglycerides → metabolite/protein → multiple myeloma, S245; ieu-a-302, met-a-509, prot-a-2100, finn-b-CD2_MULTIPLE_MYELOMA_PLASMA_CELL) showed π_shared = 0 because both mediators carried only 2 genome-wide-significant instruments each, so it could not demonstrate a non-zero-overlap correction. Two caveats apply to the batch. First, the batch is restricted to studies whose traits resolve to current OpenGWAS/FinnGen accessions and effectively excludes non-European and many protein/QTL traits (28/70 returned no EUR-clumped instruments); the true overlap rate in the full literature may therefore differ. Second, the zero-flip conclusion rests on only 4 TwoSampleMR-validated adequately powered trios and should be read as preliminary, descriptive evidence rather than a universal law: with n = 4 we cannot exclude the possibility of flips in a larger sample, and broadening the validated set — for example by relaxing the European-ancestry restriction in a sensitivity analysis — is a priority for future work. (3) ρ_MY was previously treated as a fixed sensitivity parameter (0 by default, because sample overlap is undisclosed). We now estimate it empirically for all six overlapping trios (§3.5.1), finding 5/6 positive (up to +0.81). This empirical estimate is a genetic-concordance proxy for the undisclosed M–Y sample-overlap proportion and should be read as such; the true sample-overlap fraction requires cohort-level metadata not released with summary statistics, so our high/≈0 categories inferred from GWAS catalog sources are approximate. Because n_s is only 1–3 in every trio, the ρ_g point estimates carry substantial sampling variance (S217's 95% CI spans [0.37, 0.95]); we therefore report three instrument sets as a robustness cross-check and verify the conclusion across the full 95% CI rather than at the point estimate alone. On the literature coding that underpins the audit, blind re-coding of 50 studies gave 94.0% observed agreement on design type (47/50; PABAK 0.88; 95% CI 83.8–97.9%) — though the raw Cohen's κ collapses to 0.00 as a mathematical artifact of the answer key containing no "exclude" instances (expected agreement Pe → 1.0); the primary reliability metrics are the observed agreement and PABAK reported in §3.3, and the raw κ with its artifact is explained in full in Supplementary Methods S7.3 — and κ = 0.50 (moderate) on the IV-selection-strategy field; the single-coder origin and blank fields in the source table mean the 39.3% at-risk rate is a lower bound.</w:t>
+        <w:t xml:space="preserve"> (1) The closed form is a first-order delta approximation; in the weak-instrument/high-overlap corner (F &lt; 15, π_shared &gt; 0.5) residual error reaches ~10–14% and the Monte Carlo fallback should be used. The bound B is a sufficient conservative envelope (observed errors 5–20× smaller), not a tight constant. (2) Real-data evidence rests on 4 TwoSampleMR-validated trios plus 2 screening-level; the batch excludes non-European and many protein/QTL traits (28/70 returned no EUR-clumped instruments), so the true overlap rate in the full literature may differ. (3) The κ statistics come from a second blinded coding pass, not an independent human rater.</w:t>
       </w:r>
     </w:p>
     <w:p>
@@ -7853,10 +5178,18 @@
       <w:r>
         <w:rPr>
           <w:rFonts w:ascii="Times New Roman" w:hAnsi="Times New Roman"/>
+          <w:b/>
+          <w:sz w:val="24"/>
+        </w:rPr>
+        <w:t>Reporting implications.</w:t>
+      </w:r>
+      <w:r>
+        <w:rPr>
+          <w:rFonts w:ascii="Times New Roman" w:hAnsi="Times New Roman"/>
           <w:b w:val="0"/>
           <w:sz w:val="24"/>
         </w:rPr>
-        <w:t xml:space="preserve">Reporting practice is the binding constraint on everything above. The STROBE-MR statement sets out the items that MR studies should report </w:t>
+        <w:t xml:space="preserve"> The STROBE-MR statement </w:t>
       </w:r>
       <w:r>
         <w:rPr>
@@ -7873,29 +5206,7 @@
           <w:b w:val="0"/>
           <w:sz w:val="24"/>
         </w:rPr>
-        <w:t>. Our results suggest it should be extended, or at minimum interpreted, to require explicit disclosure of the step-1 and step-2 instrument sets and of their intersection, since without n_s no reader can recover the omitted covariance term.</w:t>
-      </w:r>
-    </w:p>
-    <w:p>
-      <w:pPr>
-        <w:ind w:firstLine="480"/>
-        <w:jc w:val="both"/>
-      </w:pPr>
-      <w:r>
-        <w:rPr>
-          <w:rFonts w:ascii="Times New Roman" w:hAnsi="Times New Roman"/>
-          <w:b/>
-          <w:sz w:val="24"/>
-        </w:rPr>
-        <w:t>Implications.</w:t>
-      </w:r>
-      <w:r>
-        <w:rPr>
-          <w:rFonts w:ascii="Times New Roman" w:hAnsi="Times New Roman"/>
-          <w:b w:val="0"/>
-          <w:sz w:val="24"/>
-        </w:rPr>
-        <w:t xml:space="preserve"> Because overlap-prone designs are present and under-disclosed while publication volume grows rapidly, uncorrected CIs in this literature are biased. Our tool lets analysts compute n_s from published summary statistics and apply the correction — or trigger the bootstrap fallback — without full reanalysis.</w:t>
+        <w:t xml:space="preserve"> should be extended to require explicit disclosure of the step-1 and step-2 instrument sets and their intersection, since without n_s no reader can recover the omitted covariance. Our tool lets analysts compute n_s from published summary statistics and apply the correction without full reanalysis.</w:t>
       </w:r>
     </w:p>
     <w:p>
@@ -7923,7 +5234,7 @@
           <w:b w:val="0"/>
           <w:sz w:val="24"/>
         </w:rPr>
-        <w:t>Ignoring Cov(α̂, β̂) under overlapping instruments or samples yields biased inference in two-step MR mediation. The closed-form correction and its diagnostic tool close a gap left open by the published summary-data mediation framework, and our literature coding shows the gap is both real and increasingly prevalent — yet the very design the correction targets is so rarely reported that the field does not even tag it. The bias can be conservative or anti-conservative depending on the genetic architecture; either way, correction is necessary. Our systematic batch re-estimation shows that in realized same-sign mediation the bias is typically conservative (narrowing), so published conclusions are robust to correction — but because the sign is prior-unknown and the positive-covariance / sample-overlap regime widens rather than narrows, correction remains necessary for valid inference in every two-step MR mediation report. Our empirical characterization of ρ_MY across all six overlapping trios (5/6 positive, up to +0.81) shows that, under the same-sign configuration realized in our sample, the realized literature sits in the benign tail for a documented structural reason — the dominant shared-instrument covariance is provably negative whenever α̂ and β̂ share a sign (Proposition S2.5), regardless of ρ_MY sign — rather than by chance.</w:t>
+        <w:t>Ignoring Cov(α̂, β̂) under overlapping instruments or samples yields biased inference in two-step MR mediation; the closed-form correction closes a gap left open by the published summary-data framework. Our literature coding shows the gap is real and increasingly prevalent, yet the targeted design is so rarely reported that the field does not even tag it. In realized same-sign mediation the bias is typically conservative (narrowing), so published conclusions are robust — but because the sign is prior-unknown and the positive-covariance/sample-overlap regime widens, correction is necessary for valid inference in every two-step MR mediation report.</w:t>
       </w:r>
     </w:p>
     <w:p>
@@ -7951,7 +5262,119 @@
           <w:b w:val="0"/>
           <w:sz w:val="24"/>
         </w:rPr>
-        <w:t>The diagnostic tool estimate_cov_prod_mr() and all replication scripts are deposited in a public GitHub repository (https://github.com/author/two-step-mr-cov; archived at Zenodo, DOI: 10.5281/zenodo.XXXXXXX) and are organised as follows. The core tool and its dependencies are in code/method_core/ (S10_prod_mr_cov_tool.R, weak_instrument_threshold_FIXED.R, S16_bootstrap_fallback_indirect_var_FIXED.R); validation scripts are code/method_core/T2_validation.R and code/method_core/T5_bootstrap_coverage.R. The TwoSampleMR-compatible wrapper mr_cov_correct() is code/correct_cov_prod_mr.R (self-test code/test_correct_cov_prod_mr.R), the ieugwasr-compatible wrapper mr_mediation_correct_from_frames() is code/correct_from_ieugwasr.py, and the usage guide is code/TOOL_README.md; both wrappers were cross-checked against code/method_core/S10_prod_mr_cov_tool.R and the D56 ground truth. The inter-coder reliability work package (blind re-coding sheet, second-coder template, sealed answer key, and compute_kappa_2nd.py calculator with Pe→1-artifact detection and bootstrap CI) is in code/ (kappa_second_coder_template.csv, code/kappa/kappa_answer_key_20260903.csv, compute_kappa_2nd.py, kappa_instructions.md) and is re-runnable by an independent coder. Real GWAS summary statistics were obtained through IEU OpenGWAS and are subject to the OpenGWAS data-use policy; the BMI → waist → CHD illustration uses trait IDs ieu-a-2, ieu-a-61, ieu-a-7, and the S245 re-examination uses ieu-a-302, met-a-509, prot-a-2100, finn-b-CD2_MULTIPLE_MYELOMA_PLASMA_CELL. Instrument sets were extracted via the OpenGWAS REST /tophits endpoint; the accession-resolution and overlap scripts are code/replication/S245_resolve_mediators.py and code/replication/S245_pi_shared.py. The Phase-B batch re-estimation pipeline (OpenGWAS REST /tophits + /associations, harmonized IVW, S10 correction) is code/replication/M4b_phaseB_pipeline.py, with the candidate screening, π_shared and re-estimation outputs in code/replication/. The literature coding table underlying §3.3 is code/literature_coding_table_UPDATED.xlsx. The Zenodo DOI will be minted upon acceptance; the GitHub repository is public at submission.</w:t>
+        <w:t>The diagnostic tool estimate_cov_prod_mr() and all replication scripts are deposited in a public GitHub repository (https://github.com/javenzju/two-step-mr-cov; archived at Zenodo, DOI: 10.5281/zenodo.XXXXXXX) and are organised as follows. The core tool and its dependencies are in code/method_core/ (S10_prod_mr_cov_tool.R, weak_instrument_threshold_FIXED.R, S16_bootstrap_fallback_indirect_var_FIXED.R); validation scripts are code/method_core/T2_validation.R and code/method_core/T5_bootstrap_coverage.R. The TwoSampleMR-compatible wrapper mr_cov_correct() is code/correct_cov_prod_mr.R (self-test code/test_correct_cov_prod_mr.R), the ieugwasr-compatible wrapper mr_mediation_correct_from_frames() is code/correct_from_ieugwasr.py, and the usage guide is code/TOOL_README.md; both wrappers were cross-checked against code/method_core/S10_prod_mr_cov_tool.R and the D56 ground truth. The inter-coder reliability work package (blind re-coding sheet, second-coder template, sealed answer key, and compute_kappa_2nd.py calculator with Pe→1-artifact detection and bootstrap CI) is in code/ (kappa_second_coder_template.csv, code/kappa/kappa_answer_key_20260903.csv, compute_kappa_2nd.py, kappa_instructions.md) and is re-runnable via a second blinded coding pass. Real GWAS summary statistics were obtained through IEU OpenGWAS and are subject to the OpenGWAS data-use policy; the BMI → waist → CHD illustration uses trait IDs ieu-a-2, ieu-a-61, ieu-a-7, and the S245 re-examination uses ieu-a-302, met-a-509, prot-a-2100, finn-b-CD2_MULTIPLE_MYELOMA_PLASMA_CELL. Instrument sets were extracted via the OpenGWAS REST /tophits endpoint; the accession-resolution and overlap scripts are code/replication/S245_resolve_mediators.py and code/replication/S245_pi_shared.py. The Phase-B batch re-estimation pipeline (OpenGWAS REST /tophits + /associations, harmonized IVW, S10 correction) is code/replication/M4b_phaseB_pipeline.py, with the candidate screening, π_shared and re-estimation outputs in code/replication/. The literature coding table underlying §3.3 is code/literature_coding_table_UPDATED.xlsx. The Zenodo DOI will be minted upon acceptance; the GitHub repository is public at submission.</w:t>
+      </w:r>
+    </w:p>
+    <w:p>
+      <w:pPr>
+        <w:spacing w:before="200" w:after="80"/>
+        <w:jc w:val="left"/>
+      </w:pPr>
+      <w:r>
+        <w:rPr>
+          <w:rFonts w:ascii="Times New Roman" w:hAnsi="Times New Roman"/>
+          <w:b/>
+          <w:sz w:val="26"/>
+        </w:rPr>
+        <w:t>Acknowledgments</w:t>
+      </w:r>
+    </w:p>
+    <w:p>
+      <w:pPr>
+        <w:ind w:firstLine="480"/>
+        <w:jc w:val="both"/>
+      </w:pPr>
+      <w:r>
+        <w:rPr>
+          <w:rFonts w:ascii="Times New Roman" w:hAnsi="Times New Roman"/>
+          <w:b w:val="0"/>
+          <w:sz w:val="24"/>
+        </w:rPr>
+        <w:t>This work was supported by the Zhejiang Traditional Chinese Medicine Science and Technology Plan Project (2023ZL390, 2024ZL381) and the Zhejiang Provincial Medical and Health Science and Technology Plan (2023KY860, 2021KY827). The authors thank the creators and maintainers of the IEU OpenGWAS platform and the original GWAS consortia for making summary statistics publicly available.</w:t>
+      </w:r>
+    </w:p>
+    <w:p>
+      <w:pPr>
+        <w:spacing w:before="200" w:after="80"/>
+        <w:jc w:val="left"/>
+      </w:pPr>
+      <w:r>
+        <w:rPr>
+          <w:rFonts w:ascii="Times New Roman" w:hAnsi="Times New Roman"/>
+          <w:b/>
+          <w:sz w:val="26"/>
+        </w:rPr>
+        <w:t>Author contributions</w:t>
+      </w:r>
+    </w:p>
+    <w:p>
+      <w:pPr>
+        <w:ind w:firstLine="480"/>
+        <w:jc w:val="both"/>
+      </w:pPr>
+      <w:r>
+        <w:rPr>
+          <w:rFonts w:ascii="Times New Roman" w:hAnsi="Times New Roman"/>
+          <w:b w:val="0"/>
+          <w:sz w:val="24"/>
+        </w:rPr>
+        <w:t>YC and JW conceived the study, derived the closed-form covariance, and wrote the manuscript. YC performed the literature screening and coding. JW implemented the reliability bound, the diagnostic tool, and the replication pipeline, and carried out the simulations and real-data analyses. Both authors read and approved the final manuscript.</w:t>
+      </w:r>
+    </w:p>
+    <w:p>
+      <w:pPr>
+        <w:spacing w:before="200" w:after="80"/>
+        <w:jc w:val="left"/>
+      </w:pPr>
+      <w:r>
+        <w:rPr>
+          <w:rFonts w:ascii="Times New Roman" w:hAnsi="Times New Roman"/>
+          <w:b/>
+          <w:sz w:val="26"/>
+        </w:rPr>
+        <w:t>Ethical approval</w:t>
+      </w:r>
+    </w:p>
+    <w:p>
+      <w:pPr>
+        <w:ind w:firstLine="480"/>
+        <w:jc w:val="both"/>
+      </w:pPr>
+      <w:r>
+        <w:rPr>
+          <w:rFonts w:ascii="Times New Roman" w:hAnsi="Times New Roman"/>
+          <w:b w:val="0"/>
+          <w:sz w:val="24"/>
+        </w:rPr>
+        <w:t>This study used only publicly available, summary-level GWAS data and did not involve individual-level data, human participants, or animals. No new ethical approval or informed consent was required beyond that obtained by the original GWAS consortia.</w:t>
+      </w:r>
+    </w:p>
+    <w:p>
+      <w:pPr>
+        <w:spacing w:before="200" w:after="80"/>
+        <w:jc w:val="left"/>
+      </w:pPr>
+      <w:r>
+        <w:rPr>
+          <w:rFonts w:ascii="Times New Roman" w:hAnsi="Times New Roman"/>
+          <w:b/>
+          <w:sz w:val="26"/>
+        </w:rPr>
+        <w:t>Competing interests</w:t>
+      </w:r>
+    </w:p>
+    <w:p>
+      <w:pPr>
+        <w:ind w:firstLine="480"/>
+        <w:jc w:val="both"/>
+      </w:pPr>
+      <w:r>
+        <w:rPr>
+          <w:rFonts w:ascii="Times New Roman" w:hAnsi="Times New Roman"/>
+          <w:b w:val="0"/>
+          <w:sz w:val="24"/>
+        </w:rPr>
+        <w:t>The authors declare no competing interests.</w:t>
       </w:r>
     </w:p>
     <w:p>
@@ -8550,7 +5973,7 @@
         <w:drawing>
           <wp:inline xmlns:a="http://schemas.openxmlformats.org/drawingml/2006/main" xmlns:pic="http://schemas.openxmlformats.org/drawingml/2006/picture">
             <wp:extent cx="5486400" cy="3587262"/>
-            <wp:docPr id="5" name="Picture 5"/>
+            <wp:docPr id="1" name="Picture 1"/>
             <wp:cNvGraphicFramePr>
               <a:graphicFrameLocks noChangeAspect="1"/>
             </wp:cNvGraphicFramePr>
@@ -8562,7 +5985,7 @@
                     <pic:cNvPicPr/>
                   </pic:nvPicPr>
                   <pic:blipFill>
-                    <a:blip r:embed="rId13"/>
+                    <a:blip r:embed="rId9"/>
                     <a:stretch>
                       <a:fillRect/>
                     </a:stretch>
@@ -8589,7 +6012,7 @@
         <w:drawing>
           <wp:inline xmlns:a="http://schemas.openxmlformats.org/drawingml/2006/main" xmlns:pic="http://schemas.openxmlformats.org/drawingml/2006/picture">
             <wp:extent cx="5486400" cy="2493818"/>
-            <wp:docPr id="6" name="Picture 6"/>
+            <wp:docPr id="2" name="Picture 2"/>
             <wp:cNvGraphicFramePr>
               <a:graphicFrameLocks noChangeAspect="1"/>
             </wp:cNvGraphicFramePr>
@@ -8601,7 +6024,7 @@
                     <pic:cNvPicPr/>
                   </pic:nvPicPr>
                   <pic:blipFill>
-                    <a:blip r:embed="rId14"/>
+                    <a:blip r:embed="rId10"/>
                     <a:stretch>
                       <a:fillRect/>
                     </a:stretch>
@@ -8622,34 +6045,13 @@
     </w:p>
     <w:p>
       <w:pPr>
-        <w:jc w:val="both"/>
-      </w:pPr>
-      <w:r>
-        <w:rPr>
-          <w:rFonts w:ascii="Times New Roman" w:hAnsi="Times New Roman"/>
-          <w:b/>
-          <w:sz w:val="24"/>
-        </w:rPr>
-        <w:t>Figure 2.</w:t>
-      </w:r>
-      <w:r>
-        <w:rPr>
-          <w:rFonts w:ascii="Times New Roman" w:hAnsi="Times New Roman"/>
-          <w:b w:val="0"/>
-          <w:sz w:val="24"/>
-        </w:rPr>
-        <w:t xml:space="preserve"> *Left:* relative error of the traditional delta-method SE as a function of the proportion of shared instruments (π_shared), for instrument strengths F = 10, 15, 30 and ρ_MY = 0. At π_shared = 0.30 and F = 15 the traditional SE differs from the corrected SE by ~73% in magnitude. *Right:* empirical 95% CI coverage from an independent bootstrap validation (8 cells, 100 batches × 1000 replications). The corrected delta method (S10) tracks the bootstrap benchmark but shows residual under-coverage at very high overlap (π_shared = 0.7), motivating the Monte Carlo fallback.</w:t>
-      </w:r>
-    </w:p>
-    <w:p>
-      <w:pPr>
         <w:jc w:val="center"/>
       </w:pPr>
       <w:r>
         <w:drawing>
           <wp:inline xmlns:a="http://schemas.openxmlformats.org/drawingml/2006/main" xmlns:pic="http://schemas.openxmlformats.org/drawingml/2006/picture">
             <wp:extent cx="5486400" cy="3086100"/>
-            <wp:docPr id="7" name="Picture 7"/>
+            <wp:docPr id="3" name="Picture 3"/>
             <wp:cNvGraphicFramePr>
               <a:graphicFrameLocks noChangeAspect="1"/>
             </wp:cNvGraphicFramePr>
@@ -8661,7 +6063,7 @@
                     <pic:cNvPicPr/>
                   </pic:nvPicPr>
                   <pic:blipFill>
-                    <a:blip r:embed="rId15"/>
+                    <a:blip r:embed="rId11"/>
                     <a:stretch>
                       <a:fillRect/>
                     </a:stretch>
@@ -8682,34 +6084,13 @@
     </w:p>
     <w:p>
       <w:pPr>
-        <w:jc w:val="both"/>
-      </w:pPr>
-      <w:r>
-        <w:rPr>
-          <w:rFonts w:ascii="Times New Roman" w:hAnsi="Times New Roman"/>
-          <w:b/>
-          <w:sz w:val="24"/>
-        </w:rPr>
-        <w:t>Figure 3.</w:t>
-      </w:r>
-      <w:r>
-        <w:rPr>
-          <w:rFonts w:ascii="Times New Roman" w:hAnsi="Times New Roman"/>
-          <w:b w:val="0"/>
-          <w:sz w:val="24"/>
-        </w:rPr>
-        <w:t xml:space="preserve"> Indirect effect (α̂β̂) and 95% confidence intervals for the BMI → waist → CHD pathway. Red segments show the naive (traditional delta) CI; blue segments show the S10-corrected CI. *Top:* shared-IV design (n_s = 78), where the corrected SE is 15.5% smaller. *Bottom:* natural overlap (n_s = 13), where the corrected SE is 2.8% smaller.</w:t>
-      </w:r>
-    </w:p>
-    <w:p>
-      <w:pPr>
         <w:jc w:val="center"/>
       </w:pPr>
       <w:r>
         <w:drawing>
           <wp:inline xmlns:a="http://schemas.openxmlformats.org/drawingml/2006/main" xmlns:pic="http://schemas.openxmlformats.org/drawingml/2006/picture">
             <wp:extent cx="5486400" cy="3657600"/>
-            <wp:docPr id="8" name="Picture 8"/>
+            <wp:docPr id="4" name="Picture 4"/>
             <wp:cNvGraphicFramePr>
               <a:graphicFrameLocks noChangeAspect="1"/>
             </wp:cNvGraphicFramePr>
@@ -8721,7 +6102,7 @@
                     <pic:cNvPicPr/>
                   </pic:nvPicPr>
                   <pic:blipFill>
-                    <a:blip r:embed="rId16"/>
+                    <a:blip r:embed="rId12"/>
                     <a:stretch>
                       <a:fillRect/>
                     </a:stretch>
@@ -8742,50 +6123,13 @@
     </w:p>
     <w:p>
       <w:pPr>
-        <w:jc w:val="both"/>
-      </w:pPr>
-      <w:r>
-        <w:rPr>
-          <w:rFonts w:ascii="Times New Roman" w:hAnsi="Times New Roman"/>
-          <w:b/>
-          <w:sz w:val="24"/>
-        </w:rPr>
-        <w:t>Figure 4.</w:t>
-      </w:r>
-      <w:r>
-        <w:rPr>
-          <w:rFonts w:ascii="Times New Roman" w:hAnsi="Times New Roman"/>
-          <w:b w:val="0"/>
-          <w:sz w:val="24"/>
-        </w:rPr>
-        <w:t xml:space="preserve"> Percentage of 333 two-step MR mediation studies at risk of non-zero Cov(α̂, β̂) under three classification assumptions. *Conservative* counts only merged-IV-pool and MVMR-joint designs (9.3%). *Typical* additionally counts separate-IV designs that do not report overlap handling, yielding the headline estimate of </w:t>
-      </w:r>
-      <w:r>
-        <w:rPr>
-          <w:rFonts w:ascii="Times New Roman" w:hAnsi="Times New Roman"/>
-          <w:b/>
-          <w:sz w:val="24"/>
-        </w:rPr>
-        <w:t>39.3%</w:t>
-      </w:r>
-      <w:r>
-        <w:rPr>
-          <w:rFonts w:ascii="Times New Roman" w:hAnsi="Times New Roman"/>
-          <w:b w:val="0"/>
-          <w:sz w:val="24"/>
-        </w:rPr>
-        <w:t>. *Structural* counts all separate-IV designs as capable of overlap (41.1%).</w:t>
-      </w:r>
-    </w:p>
-    <w:p>
-      <w:pPr>
         <w:jc w:val="center"/>
       </w:pPr>
       <w:r>
         <w:drawing>
           <wp:inline xmlns:a="http://schemas.openxmlformats.org/drawingml/2006/main" xmlns:pic="http://schemas.openxmlformats.org/drawingml/2006/picture">
             <wp:extent cx="5486400" cy="2473693"/>
-            <wp:docPr id="9" name="Picture 9"/>
+            <wp:docPr id="5" name="Picture 5"/>
             <wp:cNvGraphicFramePr>
               <a:graphicFrameLocks noChangeAspect="1"/>
             </wp:cNvGraphicFramePr>
@@ -8797,7 +6141,7 @@
                     <pic:cNvPicPr/>
                   </pic:nvPicPr>
                   <pic:blipFill>
-                    <a:blip r:embed="rId17"/>
+                    <a:blip r:embed="rId13"/>
                     <a:stretch>
                       <a:fillRect/>
                     </a:stretch>
@@ -8818,34 +6162,13 @@
     </w:p>
     <w:p>
       <w:pPr>
-        <w:jc w:val="both"/>
-      </w:pPr>
-      <w:r>
-        <w:rPr>
-          <w:rFonts w:ascii="Times New Roman" w:hAnsi="Times New Roman"/>
-          <w:b/>
-          <w:sz w:val="24"/>
-        </w:rPr>
-        <w:t>Figure 5.</w:t>
-      </w:r>
-      <w:r>
-        <w:rPr>
-          <w:rFonts w:ascii="Times New Roman" w:hAnsi="Times New Roman"/>
-          <w:b w:val="0"/>
-          <w:sz w:val="24"/>
-        </w:rPr>
-        <w:t xml:space="preserve"> Targeted validation sweep at non-degenerate shared-instrument proportions (ρ_MY = 0.5, n_reps = 30,000). *Left:* empirical Cov(α̂, β̂) (points) versus the closed-form analytical prediction (lines) across π_shared, for F = 10 and F = 30; the two coincide. *Right:* relative error of the analytical covariance versus the conservative reliability bound B(F, ρ_MY, π_shared) for all 12 cells; all points fall below the bound, with the worst cell at 14.1%.</w:t>
-      </w:r>
-    </w:p>
-    <w:p>
-      <w:pPr>
         <w:jc w:val="center"/>
       </w:pPr>
       <w:r>
         <w:drawing>
           <wp:inline xmlns:a="http://schemas.openxmlformats.org/drawingml/2006/main" xmlns:pic="http://schemas.openxmlformats.org/drawingml/2006/picture">
             <wp:extent cx="5486400" cy="2682830"/>
-            <wp:docPr id="10" name="Picture 10"/>
+            <wp:docPr id="6" name="Picture 6"/>
             <wp:cNvGraphicFramePr>
               <a:graphicFrameLocks noChangeAspect="1"/>
             </wp:cNvGraphicFramePr>
@@ -8857,7 +6180,7 @@
                     <pic:cNvPicPr/>
                   </pic:nvPicPr>
                   <pic:blipFill>
-                    <a:blip r:embed="rId18"/>
+                    <a:blip r:embed="rId14"/>
                     <a:stretch>
                       <a:fillRect/>
                     </a:stretch>
@@ -8886,27 +6209,6 @@
           <w:b/>
           <w:sz w:val="24"/>
         </w:rPr>
-        <w:t>Figure 6.</w:t>
-      </w:r>
-      <w:r>
-        <w:rPr>
-          <w:rFonts w:ascii="Times New Roman" w:hAnsi="Times New Roman"/>
-          <w:b w:val="0"/>
-          <w:sz w:val="24"/>
-        </w:rPr>
-        <w:t xml:space="preserve"> Relative change in the indirect-effect standard error after the S10 correction, for the adequately powered published two-step MR mediation studies with genuine instrument overlap (batch re-estimation, Table 3). Every value is negative, i.e. the corrected SE is smaller and the CI narrows. Bars are TwoSampleMR-calibrated (cross-validated against the deposited D56 ground truth); the negative direction and the zero-flip conclusion are therefore fully validated, not screening-level.</w:t>
-      </w:r>
-    </w:p>
-    <w:p>
-      <w:pPr>
-        <w:jc w:val="both"/>
-      </w:pPr>
-      <w:r>
-        <w:rPr>
-          <w:rFonts w:ascii="Times New Roman" w:hAnsi="Times New Roman"/>
-          <w:b/>
-          <w:sz w:val="24"/>
-        </w:rPr>
         <w:t>Figure 1.</w:t>
       </w:r>
       <w:r>
@@ -8920,6 +6222,7 @@
     </w:p>
     <w:p>
       <w:pPr>
+        <w:ind w:firstLine="480"/>
         <w:jc w:val="both"/>
       </w:pPr>
       <w:r>
@@ -8928,7 +6231,7 @@
           <w:b/>
           <w:sz w:val="24"/>
         </w:rPr>
-        <w:t>Figure 2.</w:t>
+        <w:t>Supplementary Figure S1.</w:t>
       </w:r>
       <w:r>
         <w:rPr>
@@ -8999,6 +6302,7 @@
     </w:p>
     <w:p>
       <w:pPr>
+        <w:ind w:firstLine="480"/>
         <w:jc w:val="both"/>
       </w:pPr>
       <w:r>
@@ -9007,7 +6311,7 @@
           <w:b/>
           <w:sz w:val="24"/>
         </w:rPr>
-        <w:t>Figure 5.</w:t>
+        <w:t>Supplementary Figure S2.</w:t>
       </w:r>
       <w:r>
         <w:rPr>
@@ -9020,6 +6324,7 @@
     </w:p>
     <w:p>
       <w:pPr>
+        <w:ind w:firstLine="480"/>
         <w:jc w:val="both"/>
       </w:pPr>
       <w:r>
@@ -9028,7 +6333,7 @@
           <w:b/>
           <w:sz w:val="24"/>
         </w:rPr>
-        <w:t>Figure 6.</w:t>
+        <w:t>Supplementary Figure S3.</w:t>
       </w:r>
       <w:r>
         <w:rPr>
@@ -9039,6 +6344,1049 @@
         <w:t xml:space="preserve"> Relative change in the indirect-effect SE after the S10 correction across the adequately powered overlapping studies from the batch re-estimation (Table 3). All values are negative (the CI narrows). Bars are TwoSampleMR-calibrated (cross-validated against the deposited D56 ground truth); the negative direction and the zero-flip conclusion are therefore fully validated, not screening-level.</w:t>
       </w:r>
     </w:p>
+    <w:p>
+      <w:pPr>
+        <w:ind w:firstLine="480"/>
+        <w:jc w:val="both"/>
+      </w:pPr>
+      <w:r>
+        <w:rPr>
+          <w:rFonts w:ascii="Times New Roman" w:hAnsi="Times New Roman"/>
+          <w:b/>
+          <w:sz w:val="24"/>
+        </w:rPr>
+        <w:t>Supplementary Table S1.</w:t>
+      </w:r>
+      <w:r>
+        <w:rPr>
+          <w:rFonts w:ascii="Times New Roman" w:hAnsi="Times New Roman"/>
+          <w:b w:val="0"/>
+          <w:sz w:val="24"/>
+        </w:rPr>
+        <w:t xml:space="preserve"> Targeted sweep at ρ_MY = 0.5, n_reps = 30,000. emp_cov and theory_total are the empirical and analytical Cov(α̂, β̂); rel_err is their relative difference (%). All 12 cells satisfy the conservative reliability bound B.</w:t>
+      </w:r>
+    </w:p>
+    <w:tbl>
+      <w:tblPr>
+        <w:tblStyle w:val="TableGrid"/>
+        <w:tblW w:type="auto" w:w="0"/>
+        <w:jc w:val="center"/>
+        <w:tblLook w:firstColumn="1" w:firstRow="1" w:lastColumn="0" w:lastRow="0" w:noHBand="0" w:noVBand="1" w:val="04A0"/>
+      </w:tblPr>
+      <w:tblGrid>
+        <w:gridCol w:w="1728"/>
+        <w:gridCol w:w="1728"/>
+        <w:gridCol w:w="1728"/>
+        <w:gridCol w:w="1728"/>
+        <w:gridCol w:w="1728"/>
+      </w:tblGrid>
+      <w:tr>
+        <w:tc>
+          <w:tcPr>
+            <w:tcW w:type="dxa" w:w="1728"/>
+          </w:tcPr>
+          <w:p>
+            <w:r/>
+            <w:r>
+              <w:rPr>
+                <w:rFonts w:ascii="Times New Roman" w:hAnsi="Times New Roman"/>
+                <w:b/>
+                <w:sz w:val="19"/>
+              </w:rPr>
+              <w:t>F</w:t>
+            </w:r>
+          </w:p>
+        </w:tc>
+        <w:tc>
+          <w:tcPr>
+            <w:tcW w:type="dxa" w:w="1728"/>
+          </w:tcPr>
+          <w:p>
+            <w:r/>
+            <w:r>
+              <w:rPr>
+                <w:rFonts w:ascii="Times New Roman" w:hAnsi="Times New Roman"/>
+                <w:b/>
+                <w:sz w:val="19"/>
+              </w:rPr>
+              <w:t>π_shared</w:t>
+            </w:r>
+          </w:p>
+        </w:tc>
+        <w:tc>
+          <w:tcPr>
+            <w:tcW w:type="dxa" w:w="1728"/>
+          </w:tcPr>
+          <w:p>
+            <w:r/>
+            <w:r>
+              <w:rPr>
+                <w:rFonts w:ascii="Times New Roman" w:hAnsi="Times New Roman"/>
+                <w:b/>
+                <w:sz w:val="19"/>
+              </w:rPr>
+              <w:t>emp_cov</w:t>
+            </w:r>
+          </w:p>
+        </w:tc>
+        <w:tc>
+          <w:tcPr>
+            <w:tcW w:type="dxa" w:w="1728"/>
+          </w:tcPr>
+          <w:p>
+            <w:r/>
+            <w:r>
+              <w:rPr>
+                <w:rFonts w:ascii="Times New Roman" w:hAnsi="Times New Roman"/>
+                <w:b/>
+                <w:sz w:val="19"/>
+              </w:rPr>
+              <w:t>theory_total</w:t>
+            </w:r>
+          </w:p>
+        </w:tc>
+        <w:tc>
+          <w:tcPr>
+            <w:tcW w:type="dxa" w:w="1728"/>
+          </w:tcPr>
+          <w:p>
+            <w:r/>
+            <w:r>
+              <w:rPr>
+                <w:rFonts w:ascii="Times New Roman" w:hAnsi="Times New Roman"/>
+                <w:b/>
+                <w:sz w:val="19"/>
+              </w:rPr>
+              <w:t>rel_err (%)</w:t>
+            </w:r>
+          </w:p>
+        </w:tc>
+      </w:tr>
+      <w:tr>
+        <w:tc>
+          <w:tcPr>
+            <w:tcW w:type="dxa" w:w="1728"/>
+          </w:tcPr>
+          <w:p>
+            <w:r/>
+            <w:r>
+              <w:rPr>
+                <w:rFonts w:ascii="Times New Roman" w:hAnsi="Times New Roman"/>
+                <w:sz w:val="19"/>
+              </w:rPr>
+              <w:t>30</w:t>
+            </w:r>
+          </w:p>
+        </w:tc>
+        <w:tc>
+          <w:tcPr>
+            <w:tcW w:type="dxa" w:w="1728"/>
+          </w:tcPr>
+          <w:p>
+            <w:r/>
+            <w:r>
+              <w:rPr>
+                <w:rFonts w:ascii="Times New Roman" w:hAnsi="Times New Roman"/>
+                <w:sz w:val="19"/>
+              </w:rPr>
+              <w:t>0.1</w:t>
+            </w:r>
+          </w:p>
+        </w:tc>
+        <w:tc>
+          <w:tcPr>
+            <w:tcW w:type="dxa" w:w="1728"/>
+          </w:tcPr>
+          <w:p>
+            <w:r/>
+            <w:r>
+              <w:rPr>
+                <w:rFonts w:ascii="Times New Roman" w:hAnsi="Times New Roman"/>
+                <w:sz w:val="19"/>
+              </w:rPr>
+              <w:t>−0.0003731</w:t>
+            </w:r>
+          </w:p>
+        </w:tc>
+        <w:tc>
+          <w:tcPr>
+            <w:tcW w:type="dxa" w:w="1728"/>
+          </w:tcPr>
+          <w:p>
+            <w:r/>
+            <w:r>
+              <w:rPr>
+                <w:rFonts w:ascii="Times New Roman" w:hAnsi="Times New Roman"/>
+                <w:sz w:val="19"/>
+              </w:rPr>
+              <w:t>−0.0003357</w:t>
+            </w:r>
+          </w:p>
+        </w:tc>
+        <w:tc>
+          <w:tcPr>
+            <w:tcW w:type="dxa" w:w="1728"/>
+          </w:tcPr>
+          <w:p>
+            <w:r/>
+            <w:r>
+              <w:rPr>
+                <w:rFonts w:ascii="Times New Roman" w:hAnsi="Times New Roman"/>
+                <w:sz w:val="19"/>
+              </w:rPr>
+              <w:t>10.02</w:t>
+            </w:r>
+          </w:p>
+        </w:tc>
+      </w:tr>
+      <w:tr>
+        <w:tc>
+          <w:tcPr>
+            <w:tcW w:type="dxa" w:w="1728"/>
+          </w:tcPr>
+          <w:p>
+            <w:r/>
+            <w:r>
+              <w:rPr>
+                <w:rFonts w:ascii="Times New Roman" w:hAnsi="Times New Roman"/>
+                <w:sz w:val="19"/>
+              </w:rPr>
+              <w:t>30</w:t>
+            </w:r>
+          </w:p>
+        </w:tc>
+        <w:tc>
+          <w:tcPr>
+            <w:tcW w:type="dxa" w:w="1728"/>
+          </w:tcPr>
+          <w:p>
+            <w:r/>
+            <w:r>
+              <w:rPr>
+                <w:rFonts w:ascii="Times New Roman" w:hAnsi="Times New Roman"/>
+                <w:sz w:val="19"/>
+              </w:rPr>
+              <w:t>0.2</w:t>
+            </w:r>
+          </w:p>
+        </w:tc>
+        <w:tc>
+          <w:tcPr>
+            <w:tcW w:type="dxa" w:w="1728"/>
+          </w:tcPr>
+          <w:p>
+            <w:r/>
+            <w:r>
+              <w:rPr>
+                <w:rFonts w:ascii="Times New Roman" w:hAnsi="Times New Roman"/>
+                <w:sz w:val="19"/>
+              </w:rPr>
+              <w:t>−0.0006333</w:t>
+            </w:r>
+          </w:p>
+        </w:tc>
+        <w:tc>
+          <w:tcPr>
+            <w:tcW w:type="dxa" w:w="1728"/>
+          </w:tcPr>
+          <w:p>
+            <w:r/>
+            <w:r>
+              <w:rPr>
+                <w:rFonts w:ascii="Times New Roman" w:hAnsi="Times New Roman"/>
+                <w:sz w:val="19"/>
+              </w:rPr>
+              <w:t>−0.0006713</w:t>
+            </w:r>
+          </w:p>
+        </w:tc>
+        <w:tc>
+          <w:tcPr>
+            <w:tcW w:type="dxa" w:w="1728"/>
+          </w:tcPr>
+          <w:p>
+            <w:r/>
+            <w:r>
+              <w:rPr>
+                <w:rFonts w:ascii="Times New Roman" w:hAnsi="Times New Roman"/>
+                <w:sz w:val="19"/>
+              </w:rPr>
+              <w:t>6.01</w:t>
+            </w:r>
+          </w:p>
+        </w:tc>
+      </w:tr>
+      <w:tr>
+        <w:tc>
+          <w:tcPr>
+            <w:tcW w:type="dxa" w:w="1728"/>
+          </w:tcPr>
+          <w:p>
+            <w:r/>
+            <w:r>
+              <w:rPr>
+                <w:rFonts w:ascii="Times New Roman" w:hAnsi="Times New Roman"/>
+                <w:sz w:val="19"/>
+              </w:rPr>
+              <w:t>30</w:t>
+            </w:r>
+          </w:p>
+        </w:tc>
+        <w:tc>
+          <w:tcPr>
+            <w:tcW w:type="dxa" w:w="1728"/>
+          </w:tcPr>
+          <w:p>
+            <w:r/>
+            <w:r>
+              <w:rPr>
+                <w:rFonts w:ascii="Times New Roman" w:hAnsi="Times New Roman"/>
+                <w:sz w:val="19"/>
+              </w:rPr>
+              <w:t>0.3</w:t>
+            </w:r>
+          </w:p>
+        </w:tc>
+        <w:tc>
+          <w:tcPr>
+            <w:tcW w:type="dxa" w:w="1728"/>
+          </w:tcPr>
+          <w:p>
+            <w:r/>
+            <w:r>
+              <w:rPr>
+                <w:rFonts w:ascii="Times New Roman" w:hAnsi="Times New Roman"/>
+                <w:sz w:val="19"/>
+              </w:rPr>
+              <w:t>−0.0010047</w:t>
+            </w:r>
+          </w:p>
+        </w:tc>
+        <w:tc>
+          <w:tcPr>
+            <w:tcW w:type="dxa" w:w="1728"/>
+          </w:tcPr>
+          <w:p>
+            <w:r/>
+            <w:r>
+              <w:rPr>
+                <w:rFonts w:ascii="Times New Roman" w:hAnsi="Times New Roman"/>
+                <w:sz w:val="19"/>
+              </w:rPr>
+              <w:t>−0.0010070</w:t>
+            </w:r>
+          </w:p>
+        </w:tc>
+        <w:tc>
+          <w:tcPr>
+            <w:tcW w:type="dxa" w:w="1728"/>
+          </w:tcPr>
+          <w:p>
+            <w:r/>
+            <w:r>
+              <w:rPr>
+                <w:rFonts w:ascii="Times New Roman" w:hAnsi="Times New Roman"/>
+                <w:sz w:val="19"/>
+              </w:rPr>
+              <w:t>0.23</w:t>
+            </w:r>
+          </w:p>
+        </w:tc>
+      </w:tr>
+      <w:tr>
+        <w:tc>
+          <w:tcPr>
+            <w:tcW w:type="dxa" w:w="1728"/>
+          </w:tcPr>
+          <w:p>
+            <w:r/>
+            <w:r>
+              <w:rPr>
+                <w:rFonts w:ascii="Times New Roman" w:hAnsi="Times New Roman"/>
+                <w:sz w:val="19"/>
+              </w:rPr>
+              <w:t>30</w:t>
+            </w:r>
+          </w:p>
+        </w:tc>
+        <w:tc>
+          <w:tcPr>
+            <w:tcW w:type="dxa" w:w="1728"/>
+          </w:tcPr>
+          <w:p>
+            <w:r/>
+            <w:r>
+              <w:rPr>
+                <w:rFonts w:ascii="Times New Roman" w:hAnsi="Times New Roman"/>
+                <w:sz w:val="19"/>
+              </w:rPr>
+              <w:t>0.7</w:t>
+            </w:r>
+          </w:p>
+        </w:tc>
+        <w:tc>
+          <w:tcPr>
+            <w:tcW w:type="dxa" w:w="1728"/>
+          </w:tcPr>
+          <w:p>
+            <w:r/>
+            <w:r>
+              <w:rPr>
+                <w:rFonts w:ascii="Times New Roman" w:hAnsi="Times New Roman"/>
+                <w:sz w:val="19"/>
+              </w:rPr>
+              <w:t>−0.0023361</w:t>
+            </w:r>
+          </w:p>
+        </w:tc>
+        <w:tc>
+          <w:tcPr>
+            <w:tcW w:type="dxa" w:w="1728"/>
+          </w:tcPr>
+          <w:p>
+            <w:r/>
+            <w:r>
+              <w:rPr>
+                <w:rFonts w:ascii="Times New Roman" w:hAnsi="Times New Roman"/>
+                <w:sz w:val="19"/>
+              </w:rPr>
+              <w:t>−0.0023497</w:t>
+            </w:r>
+          </w:p>
+        </w:tc>
+        <w:tc>
+          <w:tcPr>
+            <w:tcW w:type="dxa" w:w="1728"/>
+          </w:tcPr>
+          <w:p>
+            <w:r/>
+            <w:r>
+              <w:rPr>
+                <w:rFonts w:ascii="Times New Roman" w:hAnsi="Times New Roman"/>
+                <w:sz w:val="19"/>
+              </w:rPr>
+              <w:t>0.58</w:t>
+            </w:r>
+          </w:p>
+        </w:tc>
+      </w:tr>
+      <w:tr>
+        <w:tc>
+          <w:tcPr>
+            <w:tcW w:type="dxa" w:w="1728"/>
+          </w:tcPr>
+          <w:p>
+            <w:r/>
+            <w:r>
+              <w:rPr>
+                <w:rFonts w:ascii="Times New Roman" w:hAnsi="Times New Roman"/>
+                <w:sz w:val="19"/>
+              </w:rPr>
+              <w:t>30</w:t>
+            </w:r>
+          </w:p>
+        </w:tc>
+        <w:tc>
+          <w:tcPr>
+            <w:tcW w:type="dxa" w:w="1728"/>
+          </w:tcPr>
+          <w:p>
+            <w:r/>
+            <w:r>
+              <w:rPr>
+                <w:rFonts w:ascii="Times New Roman" w:hAnsi="Times New Roman"/>
+                <w:sz w:val="19"/>
+              </w:rPr>
+              <w:t>0.9</w:t>
+            </w:r>
+          </w:p>
+        </w:tc>
+        <w:tc>
+          <w:tcPr>
+            <w:tcW w:type="dxa" w:w="1728"/>
+          </w:tcPr>
+          <w:p>
+            <w:r/>
+            <w:r>
+              <w:rPr>
+                <w:rFonts w:ascii="Times New Roman" w:hAnsi="Times New Roman"/>
+                <w:sz w:val="19"/>
+              </w:rPr>
+              <w:t>−0.0030894</w:t>
+            </w:r>
+          </w:p>
+        </w:tc>
+        <w:tc>
+          <w:tcPr>
+            <w:tcW w:type="dxa" w:w="1728"/>
+          </w:tcPr>
+          <w:p>
+            <w:r/>
+            <w:r>
+              <w:rPr>
+                <w:rFonts w:ascii="Times New Roman" w:hAnsi="Times New Roman"/>
+                <w:sz w:val="19"/>
+              </w:rPr>
+              <w:t>−0.0030210</w:t>
+            </w:r>
+          </w:p>
+        </w:tc>
+        <w:tc>
+          <w:tcPr>
+            <w:tcW w:type="dxa" w:w="1728"/>
+          </w:tcPr>
+          <w:p>
+            <w:r/>
+            <w:r>
+              <w:rPr>
+                <w:rFonts w:ascii="Times New Roman" w:hAnsi="Times New Roman"/>
+                <w:sz w:val="19"/>
+              </w:rPr>
+              <w:t>2.21</w:t>
+            </w:r>
+          </w:p>
+        </w:tc>
+      </w:tr>
+      <w:tr>
+        <w:tc>
+          <w:tcPr>
+            <w:tcW w:type="dxa" w:w="1728"/>
+          </w:tcPr>
+          <w:p>
+            <w:r/>
+            <w:r>
+              <w:rPr>
+                <w:rFonts w:ascii="Times New Roman" w:hAnsi="Times New Roman"/>
+                <w:sz w:val="19"/>
+              </w:rPr>
+              <w:t>30</w:t>
+            </w:r>
+          </w:p>
+        </w:tc>
+        <w:tc>
+          <w:tcPr>
+            <w:tcW w:type="dxa" w:w="1728"/>
+          </w:tcPr>
+          <w:p>
+            <w:r/>
+            <w:r>
+              <w:rPr>
+                <w:rFonts w:ascii="Times New Roman" w:hAnsi="Times New Roman"/>
+                <w:sz w:val="19"/>
+              </w:rPr>
+              <w:t>1.0</w:t>
+            </w:r>
+          </w:p>
+        </w:tc>
+        <w:tc>
+          <w:tcPr>
+            <w:tcW w:type="dxa" w:w="1728"/>
+          </w:tcPr>
+          <w:p>
+            <w:r/>
+            <w:r>
+              <w:rPr>
+                <w:rFonts w:ascii="Times New Roman" w:hAnsi="Times New Roman"/>
+                <w:sz w:val="19"/>
+              </w:rPr>
+              <w:t>−0.0034441</w:t>
+            </w:r>
+          </w:p>
+        </w:tc>
+        <w:tc>
+          <w:tcPr>
+            <w:tcW w:type="dxa" w:w="1728"/>
+          </w:tcPr>
+          <w:p>
+            <w:r/>
+            <w:r>
+              <w:rPr>
+                <w:rFonts w:ascii="Times New Roman" w:hAnsi="Times New Roman"/>
+                <w:sz w:val="19"/>
+              </w:rPr>
+              <w:t>−0.0033567</w:t>
+            </w:r>
+          </w:p>
+        </w:tc>
+        <w:tc>
+          <w:tcPr>
+            <w:tcW w:type="dxa" w:w="1728"/>
+          </w:tcPr>
+          <w:p>
+            <w:r/>
+            <w:r>
+              <w:rPr>
+                <w:rFonts w:ascii="Times New Roman" w:hAnsi="Times New Roman"/>
+                <w:sz w:val="19"/>
+              </w:rPr>
+              <w:t>2.54</w:t>
+            </w:r>
+          </w:p>
+        </w:tc>
+      </w:tr>
+      <w:tr>
+        <w:tc>
+          <w:tcPr>
+            <w:tcW w:type="dxa" w:w="1728"/>
+          </w:tcPr>
+          <w:p>
+            <w:r/>
+            <w:r>
+              <w:rPr>
+                <w:rFonts w:ascii="Times New Roman" w:hAnsi="Times New Roman"/>
+                <w:sz w:val="19"/>
+              </w:rPr>
+              <w:t>10</w:t>
+            </w:r>
+          </w:p>
+        </w:tc>
+        <w:tc>
+          <w:tcPr>
+            <w:tcW w:type="dxa" w:w="1728"/>
+          </w:tcPr>
+          <w:p>
+            <w:r/>
+            <w:r>
+              <w:rPr>
+                <w:rFonts w:ascii="Times New Roman" w:hAnsi="Times New Roman"/>
+                <w:sz w:val="19"/>
+              </w:rPr>
+              <w:t>0.1</w:t>
+            </w:r>
+          </w:p>
+        </w:tc>
+        <w:tc>
+          <w:tcPr>
+            <w:tcW w:type="dxa" w:w="1728"/>
+          </w:tcPr>
+          <w:p>
+            <w:r/>
+            <w:r>
+              <w:rPr>
+                <w:rFonts w:ascii="Times New Roman" w:hAnsi="Times New Roman"/>
+                <w:sz w:val="19"/>
+              </w:rPr>
+              <w:t>−0.0002971</w:t>
+            </w:r>
+          </w:p>
+        </w:tc>
+        <w:tc>
+          <w:tcPr>
+            <w:tcW w:type="dxa" w:w="1728"/>
+          </w:tcPr>
+          <w:p>
+            <w:r/>
+            <w:r>
+              <w:rPr>
+                <w:rFonts w:ascii="Times New Roman" w:hAnsi="Times New Roman"/>
+                <w:sz w:val="19"/>
+              </w:rPr>
+              <w:t>−0.0003391</w:t>
+            </w:r>
+          </w:p>
+        </w:tc>
+        <w:tc>
+          <w:tcPr>
+            <w:tcW w:type="dxa" w:w="1728"/>
+          </w:tcPr>
+          <w:p>
+            <w:r/>
+            <w:r>
+              <w:rPr>
+                <w:rFonts w:ascii="Times New Roman" w:hAnsi="Times New Roman"/>
+                <w:sz w:val="19"/>
+              </w:rPr>
+              <w:t>14.13</w:t>
+            </w:r>
+          </w:p>
+        </w:tc>
+      </w:tr>
+      <w:tr>
+        <w:tc>
+          <w:tcPr>
+            <w:tcW w:type="dxa" w:w="1728"/>
+          </w:tcPr>
+          <w:p>
+            <w:r/>
+            <w:r>
+              <w:rPr>
+                <w:rFonts w:ascii="Times New Roman" w:hAnsi="Times New Roman"/>
+                <w:sz w:val="19"/>
+              </w:rPr>
+              <w:t>10</w:t>
+            </w:r>
+          </w:p>
+        </w:tc>
+        <w:tc>
+          <w:tcPr>
+            <w:tcW w:type="dxa" w:w="1728"/>
+          </w:tcPr>
+          <w:p>
+            <w:r/>
+            <w:r>
+              <w:rPr>
+                <w:rFonts w:ascii="Times New Roman" w:hAnsi="Times New Roman"/>
+                <w:sz w:val="19"/>
+              </w:rPr>
+              <w:t>0.2</w:t>
+            </w:r>
+          </w:p>
+        </w:tc>
+        <w:tc>
+          <w:tcPr>
+            <w:tcW w:type="dxa" w:w="1728"/>
+          </w:tcPr>
+          <w:p>
+            <w:r/>
+            <w:r>
+              <w:rPr>
+                <w:rFonts w:ascii="Times New Roman" w:hAnsi="Times New Roman"/>
+                <w:sz w:val="19"/>
+              </w:rPr>
+              <w:t>−0.0007604</w:t>
+            </w:r>
+          </w:p>
+        </w:tc>
+        <w:tc>
+          <w:tcPr>
+            <w:tcW w:type="dxa" w:w="1728"/>
+          </w:tcPr>
+          <w:p>
+            <w:r/>
+            <w:r>
+              <w:rPr>
+                <w:rFonts w:ascii="Times New Roman" w:hAnsi="Times New Roman"/>
+                <w:sz w:val="19"/>
+              </w:rPr>
+              <w:t>−0.0006782</w:t>
+            </w:r>
+          </w:p>
+        </w:tc>
+        <w:tc>
+          <w:tcPr>
+            <w:tcW w:type="dxa" w:w="1728"/>
+          </w:tcPr>
+          <w:p>
+            <w:r/>
+            <w:r>
+              <w:rPr>
+                <w:rFonts w:ascii="Times New Roman" w:hAnsi="Times New Roman"/>
+                <w:sz w:val="19"/>
+              </w:rPr>
+              <w:t>10.81</w:t>
+            </w:r>
+          </w:p>
+        </w:tc>
+      </w:tr>
+      <w:tr>
+        <w:tc>
+          <w:tcPr>
+            <w:tcW w:type="dxa" w:w="1728"/>
+          </w:tcPr>
+          <w:p>
+            <w:r/>
+            <w:r>
+              <w:rPr>
+                <w:rFonts w:ascii="Times New Roman" w:hAnsi="Times New Roman"/>
+                <w:sz w:val="19"/>
+              </w:rPr>
+              <w:t>10</w:t>
+            </w:r>
+          </w:p>
+        </w:tc>
+        <w:tc>
+          <w:tcPr>
+            <w:tcW w:type="dxa" w:w="1728"/>
+          </w:tcPr>
+          <w:p>
+            <w:r/>
+            <w:r>
+              <w:rPr>
+                <w:rFonts w:ascii="Times New Roman" w:hAnsi="Times New Roman"/>
+                <w:sz w:val="19"/>
+              </w:rPr>
+              <w:t>0.3</w:t>
+            </w:r>
+          </w:p>
+        </w:tc>
+        <w:tc>
+          <w:tcPr>
+            <w:tcW w:type="dxa" w:w="1728"/>
+          </w:tcPr>
+          <w:p>
+            <w:r/>
+            <w:r>
+              <w:rPr>
+                <w:rFonts w:ascii="Times New Roman" w:hAnsi="Times New Roman"/>
+                <w:sz w:val="19"/>
+              </w:rPr>
+              <w:t>−0.0008952</w:t>
+            </w:r>
+          </w:p>
+        </w:tc>
+        <w:tc>
+          <w:tcPr>
+            <w:tcW w:type="dxa" w:w="1728"/>
+          </w:tcPr>
+          <w:p>
+            <w:r/>
+            <w:r>
+              <w:rPr>
+                <w:rFonts w:ascii="Times New Roman" w:hAnsi="Times New Roman"/>
+                <w:sz w:val="19"/>
+              </w:rPr>
+              <w:t>−0.0010173</w:t>
+            </w:r>
+          </w:p>
+        </w:tc>
+        <w:tc>
+          <w:tcPr>
+            <w:tcW w:type="dxa" w:w="1728"/>
+          </w:tcPr>
+          <w:p>
+            <w:r/>
+            <w:r>
+              <w:rPr>
+                <w:rFonts w:ascii="Times New Roman" w:hAnsi="Times New Roman"/>
+                <w:sz w:val="19"/>
+              </w:rPr>
+              <w:t>13.64</w:t>
+            </w:r>
+          </w:p>
+        </w:tc>
+      </w:tr>
+      <w:tr>
+        <w:tc>
+          <w:tcPr>
+            <w:tcW w:type="dxa" w:w="1728"/>
+          </w:tcPr>
+          <w:p>
+            <w:r/>
+            <w:r>
+              <w:rPr>
+                <w:rFonts w:ascii="Times New Roman" w:hAnsi="Times New Roman"/>
+                <w:sz w:val="19"/>
+              </w:rPr>
+              <w:t>10</w:t>
+            </w:r>
+          </w:p>
+        </w:tc>
+        <w:tc>
+          <w:tcPr>
+            <w:tcW w:type="dxa" w:w="1728"/>
+          </w:tcPr>
+          <w:p>
+            <w:r/>
+            <w:r>
+              <w:rPr>
+                <w:rFonts w:ascii="Times New Roman" w:hAnsi="Times New Roman"/>
+                <w:sz w:val="19"/>
+              </w:rPr>
+              <w:t>0.7</w:t>
+            </w:r>
+          </w:p>
+        </w:tc>
+        <w:tc>
+          <w:tcPr>
+            <w:tcW w:type="dxa" w:w="1728"/>
+          </w:tcPr>
+          <w:p>
+            <w:r/>
+            <w:r>
+              <w:rPr>
+                <w:rFonts w:ascii="Times New Roman" w:hAnsi="Times New Roman"/>
+                <w:sz w:val="19"/>
+              </w:rPr>
+              <w:t>−0.0022428</w:t>
+            </w:r>
+          </w:p>
+        </w:tc>
+        <w:tc>
+          <w:tcPr>
+            <w:tcW w:type="dxa" w:w="1728"/>
+          </w:tcPr>
+          <w:p>
+            <w:r/>
+            <w:r>
+              <w:rPr>
+                <w:rFonts w:ascii="Times New Roman" w:hAnsi="Times New Roman"/>
+                <w:sz w:val="19"/>
+              </w:rPr>
+              <w:t>−0.0023736</w:t>
+            </w:r>
+          </w:p>
+        </w:tc>
+        <w:tc>
+          <w:tcPr>
+            <w:tcW w:type="dxa" w:w="1728"/>
+          </w:tcPr>
+          <w:p>
+            <w:r/>
+            <w:r>
+              <w:rPr>
+                <w:rFonts w:ascii="Times New Roman" w:hAnsi="Times New Roman"/>
+                <w:sz w:val="19"/>
+              </w:rPr>
+              <w:t>5.83</w:t>
+            </w:r>
+          </w:p>
+        </w:tc>
+      </w:tr>
+      <w:tr>
+        <w:tc>
+          <w:tcPr>
+            <w:tcW w:type="dxa" w:w="1728"/>
+          </w:tcPr>
+          <w:p>
+            <w:r/>
+            <w:r>
+              <w:rPr>
+                <w:rFonts w:ascii="Times New Roman" w:hAnsi="Times New Roman"/>
+                <w:sz w:val="19"/>
+              </w:rPr>
+              <w:t>10</w:t>
+            </w:r>
+          </w:p>
+        </w:tc>
+        <w:tc>
+          <w:tcPr>
+            <w:tcW w:type="dxa" w:w="1728"/>
+          </w:tcPr>
+          <w:p>
+            <w:r/>
+            <w:r>
+              <w:rPr>
+                <w:rFonts w:ascii="Times New Roman" w:hAnsi="Times New Roman"/>
+                <w:sz w:val="19"/>
+              </w:rPr>
+              <w:t>0.9</w:t>
+            </w:r>
+          </w:p>
+        </w:tc>
+        <w:tc>
+          <w:tcPr>
+            <w:tcW w:type="dxa" w:w="1728"/>
+          </w:tcPr>
+          <w:p>
+            <w:r/>
+            <w:r>
+              <w:rPr>
+                <w:rFonts w:ascii="Times New Roman" w:hAnsi="Times New Roman"/>
+                <w:sz w:val="19"/>
+              </w:rPr>
+              <w:t>−0.0031135</w:t>
+            </w:r>
+          </w:p>
+        </w:tc>
+        <w:tc>
+          <w:tcPr>
+            <w:tcW w:type="dxa" w:w="1728"/>
+          </w:tcPr>
+          <w:p>
+            <w:r/>
+            <w:r>
+              <w:rPr>
+                <w:rFonts w:ascii="Times New Roman" w:hAnsi="Times New Roman"/>
+                <w:sz w:val="19"/>
+              </w:rPr>
+              <w:t>−0.0030518</w:t>
+            </w:r>
+          </w:p>
+        </w:tc>
+        <w:tc>
+          <w:tcPr>
+            <w:tcW w:type="dxa" w:w="1728"/>
+          </w:tcPr>
+          <w:p>
+            <w:r/>
+            <w:r>
+              <w:rPr>
+                <w:rFonts w:ascii="Times New Roman" w:hAnsi="Times New Roman"/>
+                <w:sz w:val="19"/>
+              </w:rPr>
+              <w:t>1.98</w:t>
+            </w:r>
+          </w:p>
+        </w:tc>
+      </w:tr>
+      <w:tr>
+        <w:tc>
+          <w:tcPr>
+            <w:tcW w:type="dxa" w:w="1728"/>
+          </w:tcPr>
+          <w:p>
+            <w:r/>
+            <w:r>
+              <w:rPr>
+                <w:rFonts w:ascii="Times New Roman" w:hAnsi="Times New Roman"/>
+                <w:sz w:val="19"/>
+              </w:rPr>
+              <w:t>10</w:t>
+            </w:r>
+          </w:p>
+        </w:tc>
+        <w:tc>
+          <w:tcPr>
+            <w:tcW w:type="dxa" w:w="1728"/>
+          </w:tcPr>
+          <w:p>
+            <w:r/>
+            <w:r>
+              <w:rPr>
+                <w:rFonts w:ascii="Times New Roman" w:hAnsi="Times New Roman"/>
+                <w:sz w:val="19"/>
+              </w:rPr>
+              <w:t>1.0</w:t>
+            </w:r>
+          </w:p>
+        </w:tc>
+        <w:tc>
+          <w:tcPr>
+            <w:tcW w:type="dxa" w:w="1728"/>
+          </w:tcPr>
+          <w:p>
+            <w:r/>
+            <w:r>
+              <w:rPr>
+                <w:rFonts w:ascii="Times New Roman" w:hAnsi="Times New Roman"/>
+                <w:sz w:val="19"/>
+              </w:rPr>
+              <w:t>−0.0035006</w:t>
+            </w:r>
+          </w:p>
+        </w:tc>
+        <w:tc>
+          <w:tcPr>
+            <w:tcW w:type="dxa" w:w="1728"/>
+          </w:tcPr>
+          <w:p>
+            <w:r/>
+            <w:r>
+              <w:rPr>
+                <w:rFonts w:ascii="Times New Roman" w:hAnsi="Times New Roman"/>
+                <w:sz w:val="19"/>
+              </w:rPr>
+              <w:t>−0.0033909</w:t>
+            </w:r>
+          </w:p>
+        </w:tc>
+        <w:tc>
+          <w:tcPr>
+            <w:tcW w:type="dxa" w:w="1728"/>
+          </w:tcPr>
+          <w:p>
+            <w:r/>
+            <w:r>
+              <w:rPr>
+                <w:rFonts w:ascii="Times New Roman" w:hAnsi="Times New Roman"/>
+                <w:sz w:val="19"/>
+              </w:rPr>
+              <w:t>3.14</w:t>
+            </w:r>
+          </w:p>
+        </w:tc>
+      </w:tr>
+    </w:tbl>
     <w:p>
       <w:pPr>
         <w:spacing w:before="200" w:after="80"/>
@@ -9073,6 +7421,28 @@
           <w:sz w:val="24"/>
         </w:rPr>
         <w:t xml:space="preserve"> full derivation, two-channel decomposition, boundary proofs, κ thresholds, complete Var(α̂)/Var(β̂) derivations, and Monte Carlo fallback (D61_Supplementary_S1-S6_derivation.md).</w:t>
+      </w:r>
+    </w:p>
+    <w:p>
+      <w:pPr>
+        <w:pStyle w:val="ListBullet"/>
+        <w:jc w:val="both"/>
+      </w:pPr>
+      <w:r>
+        <w:rPr>
+          <w:rFonts w:ascii="Times New Roman" w:hAnsi="Times New Roman"/>
+          <w:b/>
+          <w:sz w:val="24"/>
+        </w:rPr>
+        <w:t>Supplementary Figures S1, S2 and S3:</w:t>
+      </w:r>
+      <w:r>
+        <w:rPr>
+          <w:rFonts w:ascii="Times New Roman" w:hAnsi="Times New Roman"/>
+          <w:b w:val="0"/>
+          <w:sz w:val="24"/>
+        </w:rPr>
+        <w:t xml:space="preserve"> the simulation-coverage plot (former Fig. 2), the validation sweep (former Fig. 5) and the SE-change forest (former Fig. 6) are provided here as supplementary figures to meet the EJHG four-main-figure limit; their legends appear in the Figure legends section under their supplementary labels.</w:t>
       </w:r>
     </w:p>
     <w:p>

</xml_diff>

<commit_message>
JCE formatting pass: sequential 1-40 citations, TNR/justify/first-line indent, Figure 1 citation, within-team blinded kappa disclosure (co-author eligible, original coder excluded); prep GitHub push + Zenodo
</commit_message>
<xml_diff>
--- a/D61_论文终稿_20260906.docx
+++ b/D61_论文终稿_20260906.docx
@@ -83,7 +83,7 @@
           <w:b w:val="0"/>
           <w:sz w:val="24"/>
         </w:rPr>
-        <w:t>Two-step (product-method) Mendelian randomization mediation analyses routinely assume that the exposure-step and mediator-step instrument sets are independent, yet this assumption has never been checked at scale. We screened 333 published two-step MR mediation studies and found that 39.3% use an instrument-selection design capable of producing non-independent (alpha_hat, beta_hat) estimates; a batch re-estimation resolving 42 trios to public GWAS accessions confirmed genuine SNP overlap in 19.0% (8/42), and essentially none of the 333 studies report or correct for this at the covariance level. We close this gap by deriving a closed-form expression for Cov(alpha_hat, beta_hat) under instrument overlap, with a conservative reliability bound validated across 192 simulation cells and a diagnostic tool. Applied to the adequately powered overlapping trios recoverable through TwoSampleMR, the correction narrowed every confidence interval (mean -3.9%, range -9.0% to -0.1%) and changed no validated conclusion. Crucially, rather than treating rho_MY as an assumed-zero sensitivity parameter, we estimated it empirically for all six overlapping trios from harmonized GWAS effect sizes; in five of six it was unambiguously positive (+0.07 to +0.81), and re-entering these values preserved the narrowing in every case (0 flips). A PubMed novelty check returned no 2024-2026 publication deriving this covariance, framing the work as both a methodological closure and an empirical warning.</w:t>
+        <w:t>Two-step (product-method) Mendelian randomization mediation analyses routinely assume that the exposure-step and mediator-step instrument sets are independent, yet this assumption has never been checked at scale, and no closed-form correction exists for when it fails. We screened 333 published two-step MR mediation studies and found that 39.3% (95% CI 34.2–44.7%) use an instrument-selection design capable of producing non-independent (α̂, β̂) estimates, and essentially none report or correct for this at the covariance level. We close the methodological gap by deriving a closed-form expression for Cov(α̂, β̂) under instrument overlap, with a conservative reliability bound validated across 180 simulation cells, and we characterize analytically the exact boundary conditions — weak instruments, high shared-instrument proportion, discordant mediation sign — under which the omitted covariance is large enough to overturn a published conclusion (up to 10.4% flip probability in our 200-cell scan). A batch re-estimation of 113 coded studies resolved to public GWAS accessions (108 succeeded) found genuine instrument overlap in 6.5% (95% CI 3.2–12.8%; 7/108); among the five non-degenerate cases the correction narrowed every confidence interval with no observed flip, though this null result is imprecisely estimated (95% CI for the underlying flip rate: 0–43.4%) and should not be read as evidence that flips are rare in the wider, less-resolvable literature. Rather than treating ρ_MY as an assumed-zero sensitivity parameter, we estimated it empirically for the overlapping trios and show the observed narrowing is a structural, mechanism-explained consequence of shared-instrument covariance rather than a fortunate coincidence. The contribution of this work is therefore a validated method and a quantified, bounded description of an unreported design vulnerability — not a claim that any specific published conclusion is wrong.</w:t>
       </w:r>
     </w:p>
     <w:p>
@@ -426,7 +426,7 @@
           <w:b w:val="0"/>
           <w:sz w:val="24"/>
         </w:rPr>
-        <w:t>. The overlap result above applies to an *isolated* estimator, not to the *product* of two. In applied two-step MR mediation, strict independence of the step-1 and step-2 instrument sets is frequently violated: studies select instruments from overlapping GWAS candidate pools, draw both steps from the same biobank-scale consortium (for example UK Biobank-derived summary statistics), or actively merge candidate pools to increase power. Under these conditions α̂ and β̂ are not asymptotically independent, and the product variance must include the non-zero term 2α̂β̂·Cov(α̂, β̂), which every closed-form expression to date omits. To our knowledge, no study has formally derived this covariance or systematically quantified how often the overlapping configuration occurs in the applied literature.</w:t>
+        <w:t>. The overlap result above applies to an *isolated* estimator, not to the *product* of two. In applied two-step MR mediation, strict independence of the step-1 and step-2 instrument sets is frequently violated: studies select instruments from overlapping GWAS candidate pools, draw both steps from the same biobank-scale consortium (for example UK Biobank-derived summary statistics), or actively merge candidate pools to increase power. Under these conditions α̂ and β̂ are not asymptotically independent, and the product variance must include the non-zero term 2α̂β̂·Cov(α̂, β̂), which every closed-form expression to date omits. To our knowledge, no study has formally derived this covariance or systematically quantified how often the overlapping configuration occurs in the applied literature. Figure 1 illustrates the overlapping-instrument configuration that produces a non-zero Cov(α̂, β̂).</w:t>
       </w:r>
     </w:p>
     <w:p>
@@ -440,7 +440,7 @@
           <w:b w:val="0"/>
           <w:sz w:val="24"/>
         </w:rPr>
-        <w:t>Our contribution is fourfold. First, we provide the first large-scale empirical audit of how often the two-step MR mediation literature actually uses an instrument-selection design capable of violating the independence assumption, and how rarely this is disclosed. Second, we derive the closed-form Cov(α̂, β̂) that this design implies, closing the gap that the summary-data product-method framework explicitly left open. Third, we apply the correction to every published trio we could resolve to real, public GWAS data, and report the result honestly: in our sample the correction happened to narrow confidence intervals rather than overturn conclusions, but we show analytically that this is a property of the *direction* of mediation in the cases we found, not a general guarantee, and that the field currently lacks the reporting practices needed to tell, for any given published result, which regime it falls into. Fourth, and addressing the gap that the first three leave open, we empirically estimate ρ_MY — the directional concordance (genetic correlation) between mediator and outcome — for every overlapping trio directly from harmonized summary statistics, replacing the previously assumed-zero sensitivity value with an observed distribution (5/6 positive, up to +0.81). We show that the realized narrowing is a structural consequence of the shared-instrument covariance, not good fortune, and that the field's same-sign mediations sit in the benign tail for a now-documented reason.</w:t>
+        <w:t>Our contribution is fourfold. First, we provide the first large-scale empirical audit of how often the two-step MR mediation literature actually uses an instrument-selection design capable of violating the independence assumption, and how rarely this is disclosed. Second, we derive the closed-form Cov(α̂, β̂) that this design implies, closing the gap that the summary-data product-method framework explicitly left open. Third, we apply the correction to every published trio we could resolve to real, public GWAS data, and report the result honestly: in our sample the correction happened to narrow confidence intervals rather than overturn conclusions, but we show analytically that this is a property of the *direction* of mediation in the cases we found, not a general guarantee, and that the field currently lacks the reporting practices needed to tell, for any given published result, which regime it falls into. Fourth, and addressing the gap that the first three leave open, we empirically estimate ρ_MY — the directional concordance (genetic correlation) between mediator and outcome — for every overlapping trio directly from harmonized summary statistics, replacing the previously assumed-zero sensitivity value with an observed distribution (5/6 positive, up to +0.81). We show that the realized narrowing is a structural consequence of the shared-instrument covariance, not good fortune, and that the field's same-sign mediations sit in the benign tail for a now-documented reason. Taken together, these four contributions establish not that overlap-induced bias has already altered a published conclusion, but that the field lacks the reporting infrastructure to know whether or when it will — and we provide the closed-form tool, the empirical boundary conditions, and the audit baseline needed to close that infrastructure gap.</w:t>
       </w:r>
     </w:p>
     <w:p>
@@ -526,7 +526,7 @@
           <w:b w:val="0"/>
           <w:sz w:val="24"/>
         </w:rPr>
-        <w:t xml:space="preserve"> Nine PubMed query strings were screened to code 695 primary studies on design type and overlap handling; 333 (47.9%) are summary-data two-step MR mediation. Rules are in Codebook S1. Every study with a structured "merged instrument pool" tag was hand-verified (§3.2). A second blinded coding pass re-coded a stratified 50-study sample against a sealed answer key to quantify classification reproducibility (Supplementary Methods S7).</w:t>
+        <w:t xml:space="preserve"> Nine PubMed query strings were screened to code 695 primary studies on design type and overlap handling; 333 (47.9% [95% CI 44.2–51.6%]) are summary-data two-step MR mediation (PRISMA 2020 flow, Fig. 2). Rules are in Codebook S1. Every study with a structured "merged instrument pool" tag was hand-verified (§3.2). A second blinded coding pass re-coded a stratified 50-study sample against a sealed answer key to quantify classification reproducibility (Supplementary Methods S7).</w:t>
       </w:r>
     </w:p>
     <w:p>
@@ -548,7 +548,109 @@
           <w:b w:val="0"/>
           <w:sz w:val="24"/>
         </w:rPr>
-        <w:t xml:space="preserve"> Summary statistics came from IEU OpenGWAS. Per-study re-estimation used inverse-variance weighting (TwoSampleMR, mr_ivw) with clumped instruments, validated by reproducing the deposited BMI → waist → CHD ground truth to four decimals before any new candidate was analyzed. ρ_MY was estimated empirically as genetic concordance (Pearson r between mediator and outcome SNP effects) at the instrumental SNPs from harmonized effect sizes already pulled by the pipeline.</w:t>
+        <w:t xml:space="preserve"> Summary statistics came from IEU OpenGWAS </w:t>
+      </w:r>
+      <w:r>
+        <w:rPr>
+          <w:rFonts w:ascii="Times New Roman" w:hAnsi="Times New Roman"/>
+          <w:b w:val="0"/>
+          <w:sz w:val="24"/>
+          <w:vertAlign w:val="superscript"/>
+        </w:rPr>
+        <w:t>16</w:t>
+      </w:r>
+      <w:r>
+        <w:rPr>
+          <w:rFonts w:ascii="Times New Roman" w:hAnsi="Times New Roman"/>
+          <w:b w:val="0"/>
+          <w:sz w:val="24"/>
+        </w:rPr>
+        <w:t xml:space="preserve">. Per-study re-estimation used inverse-variance weighting via the TwoSampleMR package (mr_ivw) with clumped instruments </w:t>
+      </w:r>
+      <w:r>
+        <w:rPr>
+          <w:rFonts w:ascii="Times New Roman" w:hAnsi="Times New Roman"/>
+          <w:b w:val="0"/>
+          <w:sz w:val="24"/>
+          <w:vertAlign w:val="superscript"/>
+        </w:rPr>
+        <w:t>17</w:t>
+      </w:r>
+      <w:r>
+        <w:rPr>
+          <w:rFonts w:ascii="Times New Roman" w:hAnsi="Times New Roman"/>
+          <w:b w:val="0"/>
+          <w:sz w:val="24"/>
+        </w:rPr>
+        <w:t xml:space="preserve">. Weak-instrument robustness was enforced at the F &gt; 10 threshold </w:t>
+      </w:r>
+      <w:r>
+        <w:rPr>
+          <w:rFonts w:ascii="Times New Roman" w:hAnsi="Times New Roman"/>
+          <w:b w:val="0"/>
+          <w:sz w:val="24"/>
+          <w:vertAlign w:val="superscript"/>
+        </w:rPr>
+        <w:t>18</w:t>
+      </w:r>
+      <w:r>
+        <w:rPr>
+          <w:rFonts w:ascii="Times New Roman" w:hAnsi="Times New Roman"/>
+          <w:b w:val="0"/>
+          <w:sz w:val="24"/>
+        </w:rPr>
+        <w:t xml:space="preserve">, and multivariable extensions follow the weak- and pleiotropy-robust testing of Sanderson et al. </w:t>
+      </w:r>
+      <w:r>
+        <w:rPr>
+          <w:rFonts w:ascii="Times New Roman" w:hAnsi="Times New Roman"/>
+          <w:b w:val="0"/>
+          <w:sz w:val="24"/>
+          <w:vertAlign w:val="superscript"/>
+        </w:rPr>
+        <w:t>19</w:t>
+      </w:r>
+      <w:r>
+        <w:rPr>
+          <w:rFonts w:ascii="Times New Roman" w:hAnsi="Times New Roman"/>
+          <w:b w:val="0"/>
+          <w:sz w:val="24"/>
+        </w:rPr>
+        <w:t xml:space="preserve">. LD Score regression separates polygenicity from confounding </w:t>
+      </w:r>
+      <w:r>
+        <w:rPr>
+          <w:rFonts w:ascii="Times New Roman" w:hAnsi="Times New Roman"/>
+          <w:b w:val="0"/>
+          <w:sz w:val="24"/>
+          <w:vertAlign w:val="superscript"/>
+        </w:rPr>
+        <w:t>20</w:t>
+      </w:r>
+      <w:r>
+        <w:rPr>
+          <w:rFonts w:ascii="Times New Roman" w:hAnsi="Times New Roman"/>
+          <w:b w:val="0"/>
+          <w:sz w:val="24"/>
+        </w:rPr>
+        <w:t xml:space="preserve">, and our target estimand follows the causal-estimand framework of Yao et al. </w:t>
+      </w:r>
+      <w:r>
+        <w:rPr>
+          <w:rFonts w:ascii="Times New Roman" w:hAnsi="Times New Roman"/>
+          <w:b w:val="0"/>
+          <w:sz w:val="24"/>
+          <w:vertAlign w:val="superscript"/>
+        </w:rPr>
+        <w:t>21</w:t>
+      </w:r>
+      <w:r>
+        <w:rPr>
+          <w:rFonts w:ascii="Times New Roman" w:hAnsi="Times New Roman"/>
+          <w:b w:val="0"/>
+          <w:sz w:val="24"/>
+        </w:rPr>
+        <w:t>. The pipeline was validated by reproducing the deposited BMI → waist → CHD ground truth to four decimals before any new candidate was analyzed. ρ_MY was estimated empirically as genetic concordance (Pearson r between mediator and outcome SNP effects) at the instrumental SNPs from harmonized effect sizes already pulled by the pipeline.</w:t>
       </w:r>
     </w:p>
     <w:p>
@@ -590,7 +692,35 @@
           <w:b w:val="0"/>
           <w:sz w:val="24"/>
         </w:rPr>
-        <w:t>On the 180-cell grid the traditional additive delta method loses nominal coverage as π_shared and ρ_MY increase, whereas the corrected delta method restores it and tracks the bootstrap benchmark; when π_shared = 0 the analytical covariance is algebraically exactly 0, and under π_shared = ρ_MY = 0 it reduces to the published independent-sample expression (Supplementary Methods S6, Supplementary Fig. S1). All 12 cells of the targeted sweep satisfy the conservative reliability bound B; the worst cell (F = 10, π_shared = 0.10) shows 14.1% error against a bound near 30%, and observed errors are 5–20× smaller than B, confirming the coefficient-2 multiplier is conservative, not tight.</w:t>
+        <w:t>On the 180-cell grid the traditional additive delta method loses nominal coverage as π_shared and ρ_MY increase, whereas the corrected delta method restores it and tracks the bootstrap benchmark; when π_shared = 0 the analytical covariance is algebraically exactly 0, and under π_shared = ρ_MY = 0 it reduces to the published independent-sample expression (Supplementary Methods S6, Supplementary Fig. S1). All 12 cells of the targeted sweep satisfy the conservative reliability bound B; the worst cell (F = 10, π_shared = 0.10) shows 14.1% error against a bound near 30%, and observed errors are 5–20× smaller than B, confirming the coefficient-2 multiplier is conservative, not tight. Supplementary Fig. S2 shows the targeted validation sweep at non-degenerate shared-instrument proportions.</w:t>
+      </w:r>
+    </w:p>
+    <w:p>
+      <w:pPr>
+        <w:spacing w:before="200" w:after="80"/>
+        <w:jc w:val="left"/>
+      </w:pPr>
+      <w:r>
+        <w:rPr>
+          <w:rFonts w:ascii="Times New Roman" w:hAnsi="Times New Roman"/>
+          <w:b/>
+          <w:sz w:val="24"/>
+        </w:rPr>
+        <w:t>3.1.1 When does the correction change significance? A flip-probability scan</w:t>
+      </w:r>
+    </w:p>
+    <w:p>
+      <w:pPr>
+        <w:ind w:firstLine="480"/>
+        <w:jc w:val="both"/>
+      </w:pPr>
+      <w:r>
+        <w:rPr>
+          <w:rFonts w:ascii="Times New Roman" w:hAnsi="Times New Roman"/>
+          <w:b w:val="0"/>
+          <w:sz w:val="24"/>
+        </w:rPr>
+        <w:t>Because the sign of Cov(α̂, β̂) is prior-unknown, a reader may ask whether the correction can actually flip a published conclusion. We answer this systematically on a 200-cell design grid (F ∈ {10,20,30,50} × ρ_MY ∈ {0,0.2,0.5,0.8,1} × π_shared ∈ {0.1,0.3,0.5,0.8,1.0}, under both concordant and discordant mediation signs), evaluating the flip probability analytically across the true indirect-effect non-centrality λ = δ/σ_naive ∈ [0,4]. Two regimes emerge. Under concordant mediation the shared-instrument covariance is negative, so the corrected SE is smaller; the correction can therefore only *gain* significance (turn a naively non-significant result significant) and never remove it. The maximum flip probability is 5.7% (at F = 30, ρ_MY = 0, π_shared = 1.0, λ ≈ 2.0); only 3/100 design points exceed 5%. Under discordant mediation or sample overlap the covariance is positive and the corrected SE is larger, so the correction can *lose* significance; the maximum flip probability is 10.4% (at F = 10, ρ_MY = 1.0, π_shared = 1.0, λ ≈ 2.25) and 31/100 design points exceed 5%. In both regimes the flip band straddles the naive 1.96 threshold (roughly λ ∈ [1.7, 2.4]) — only results that are marginally significant under the naive method are ever at risk — and the flip probability rises monotonically with π_shared (Supplementary Fig. S4). Because the realized published trios have small effects far from this boundary (§3.4–3.5), no flip is observed empirically, which is consistent with the simulation rather than a selectivity artefact.</w:t>
       </w:r>
     </w:p>
     <w:p>
@@ -634,7 +764,7 @@
           <w:b w:val="0"/>
           <w:sz w:val="24"/>
         </w:rPr>
-        <w:t xml:space="preserve"> — the field does not structurally track the overlap our method corrects. Overlap handling was assessable for 54/333 studies; only 19 (35.2%) reported or adjusted for it. Under the typical classification, </w:t>
+        <w:t xml:space="preserve"> — the field does not structurally track the overlap our method corrects. Overlap handling was assessable for 54/333 studies; only 19 (35.2% [95% CI 23.8-48.5%]) reported or adjusted for it. Under the typical classification, </w:t>
       </w:r>
       <w:r>
         <w:rPr>
@@ -642,7 +772,7 @@
           <w:b/>
           <w:sz w:val="24"/>
         </w:rPr>
-        <w:t>39.3%</w:t>
+        <w:t>39.3% (95% CI 34.2-44.7%)</w:t>
       </w:r>
       <w:r>
         <w:rPr>
@@ -650,7 +780,7 @@
           <w:b w:val="0"/>
           <w:sz w:val="24"/>
         </w:rPr>
-        <w:t xml:space="preserve"> of the 333 studies draw instruments from overlapping GWAS pools without disclosing overlap handling and are therefore capable of non-zero Cov(α̂, β̂) (conservative 9.3%, structural 41.1%; Fig. 4).</w:t>
+        <w:t xml:space="preserve"> of the 333 studies draw instruments from overlapping GWAS pools without disclosing overlap handling and are therefore capable of non-zero Cov(α̂, β̂) (conservative 9.3% [95% CI 6.6-12.9%], structural 41.1% [95% CI 36.0-46.5%]; Fig. 3). Beyond the two mis-tagged cases, 78 of 695 coded reports (11.2% [95% CI 9.1-13.8%]) used an MVMR-variant design whose merged-pool form is the maximal-overlap regime the correction addresses; its closed-form extension is derived in Supplementary Methods S8 and illustrated on the audited S110 design.</w:t>
       </w:r>
     </w:p>
     <w:p>
@@ -700,7 +830,7 @@
           <w:b w:val="0"/>
           <w:sz w:val="24"/>
         </w:rPr>
-        <w:t>Applied to BMI → waist circumference → CHD (IEU IDs ieu-a-2, ieu-a-61, ieu-a-7) the natural instrument intersection was n_s = 13 SNPs (π_shared = 0.317). After correction the indirect-effect SE narrowed by 2.8%; reusing the 78 BMI instruments in both steps (π_shared = 1.0) narrowed it by 15.5% (Table 2, Fig. 3). The corrected SE is smaller because the shared-instrument covariance is negative, so the naive method is conservative, not anti-conservative; the direction depends on sign(α̂β̂·Cov) and is prior-unknown. A second trio (triglycerides → metabolite/protein → multiple myeloma, S245) showed π_shared = 0 because both mediators carried only 2 instruments each, so it cannot demonstrate non-zero overlap — confirming overlap is negligible precisely when mediators lack independent instrument strength.</w:t>
+        <w:t>Applied to BMI → waist circumference → CHD (IEU IDs ieu-a-2, ieu-a-61, ieu-a-7) the natural instrument intersection was n_s = 13 SNPs (π_shared = 0.317). After correction the indirect-effect SE narrowed by 2.8%; reusing the 78 BMI instruments in both steps (π_shared = 1.0) narrowed it by 15.5% (Table 2, Fig. 4). The corrected SE is smaller because the shared-instrument covariance is negative, so the naive method is conservative, not anti-conservative; the direction depends on sign(α̂β̂·Cov) and is prior-unknown. A second trio (triglycerides → metabolite/protein → multiple myeloma, S245) showed π_shared = 0 because both mediators carried only 2 instruments each, so it cannot demonstrate non-zero overlap — confirming overlap is negligible precisely when mediators lack independent instrument strength.</w:t>
       </w:r>
     </w:p>
     <w:tbl>
@@ -2285,7 +2415,7 @@
           <w:b w:val="0"/>
           <w:sz w:val="24"/>
         </w:rPr>
-        <w:t xml:space="preserve">Of 333 studies, 70 resolved to public GWAS accessions with mediator N_M ≥ 20,000; 42 had usable instruments for both steps. </w:t>
+        <w:t xml:space="preserve">To test the correction on realised data at scale, we re-estimated every coded study whose exposure, mediator and outcome all resolved to public GWAS accessions (n = 113) directly from OpenGWAS summary statistics, using an all-Python pipeline (harmonized fixed-effects IVW plus the S10 correction) that does not depend on the TwoSampleMR harmonisation which earlier failed on two FinnGen outcomes. Of 113, 108 re-estimations succeeded and 5 were skipped for accession-resolution or network errors (S210, S173, S255, S291, S326). </w:t>
       </w:r>
       <w:r>
         <w:rPr>
@@ -2293,7 +2423,7 @@
           <w:b/>
           <w:sz w:val="24"/>
         </w:rPr>
-        <w:t>8 (19.0%) exhibited genuine SNP overlap (π_shared &gt; 0)</w:t>
+        <w:t>Seven (6.5% [95% CI 3.2–12.8%]) of the 108 showed genuine instrument overlap (n_s = 1–3, π_shared = 0.019–1.0).</w:t>
       </w:r>
       <w:r>
         <w:rPr>
@@ -2301,7 +2431,7 @@
           <w:b w:val="0"/>
           <w:sz w:val="24"/>
         </w:rPr>
-        <w:t xml:space="preserve">; 6 were adequately powered (≥ 9 instruments/step, F &gt; 15) and 2 underpowered. Among the 6, 4 were resolved to TwoSampleMR-validated estimates (2 FinnGen-outcome trios were not allele-harmonisable). In all 4 the corrected SE was smaller than the naive SE (mean −3.9%, range −9.0% to −0.1%) and </w:t>
+        <w:t xml:space="preserve"> Every overlapping trio was same-sign, so the correction narrowed every CI (−0.2% to −16.0% among the non-degenerate trios, −32.8% including the degenerate S293). Two of the seven (S320, S293) are methodologically degenerate: their exposure and mediator resolve to the *same* GWAS accession, giving α̂ = 1.0 exactly and π_shared = 1.0 — a self-mediating (non-mediation) design rather than a substantive pathway. Among the remaining </w:t>
       </w:r>
       <w:r>
         <w:rPr>
@@ -2309,7 +2439,7 @@
           <w:b/>
           <w:sz w:val="24"/>
         </w:rPr>
-        <w:t>no study changed significance (0/4 flips)</w:t>
+        <w:t>five non-degenerate overlapping trios, zero changed significance (0/5 flips)</w:t>
       </w:r>
       <w:r>
         <w:rPr>
@@ -2317,7 +2447,7 @@
           <w:b w:val="0"/>
           <w:sz w:val="24"/>
         </w:rPr>
-        <w:t xml:space="preserve"> (Table 3).</w:t>
+        <w:t xml:space="preserve"> and all corrections narrowed the CI. The single flip in the entire batch, S320, is a flip-gain (naive non-significant, corrected significant) that arises entirely from its degenerate π_shared = 1.0 structure; we report it as a boundary illustration, not a mediation finding. The all-Python pipeline also recovered trio S267, which TwoSampleMR could not allele-harmonise (FinnGen outcome), re-estimating it as overlapping (n_s = 3, −1.6%, no flip) — evidence the pipeline is wider-coverage than the gold-standard wrapper. Supplementary Fig. S3 shows the SE-change forest across the overlapping trios.</w:t>
       </w:r>
     </w:p>
     <w:tbl>
@@ -2688,7 +2818,7 @@
                 <w:rFonts w:ascii="Times New Roman" w:hAnsi="Times New Roman"/>
                 <w:sz w:val="19"/>
               </w:rPr>
-              <w:t>0.00591 (0.00345)</w:t>
+              <w:t>0.00378 (0.00096)</w:t>
             </w:r>
           </w:p>
         </w:tc>
@@ -2703,7 +2833,7 @@
                 <w:rFonts w:ascii="Times New Roman" w:hAnsi="Times New Roman"/>
                 <w:sz w:val="19"/>
               </w:rPr>
-              <w:t>0.1242 (0.0112)</w:t>
+              <w:t>0.12832 (0.00494)</w:t>
             </w:r>
           </w:p>
         </w:tc>
@@ -2718,7 +2848,7 @@
                 <w:rFonts w:ascii="Times New Roman" w:hAnsi="Times New Roman"/>
                 <w:sz w:val="19"/>
               </w:rPr>
-              <w:t>7.34e-04</w:t>
+              <w:t>4.9e-04</w:t>
             </w:r>
           </w:p>
         </w:tc>
@@ -2733,7 +2863,7 @@
                 <w:rFonts w:ascii="Times New Roman" w:hAnsi="Times New Roman"/>
                 <w:sz w:val="19"/>
               </w:rPr>
-              <w:t>4.34e-04</w:t>
+              <w:t>1.3e-04</w:t>
             </w:r>
           </w:p>
         </w:tc>
@@ -2748,7 +2878,7 @@
                 <w:rFonts w:ascii="Times New Roman" w:hAnsi="Times New Roman"/>
                 <w:sz w:val="19"/>
               </w:rPr>
-              <w:t>3.95e-04</w:t>
+              <w:t>1.1e-04</w:t>
             </w:r>
           </w:p>
         </w:tc>
@@ -2763,7 +2893,7 @@
                 <w:rFonts w:ascii="Times New Roman" w:hAnsi="Times New Roman"/>
                 <w:sz w:val="19"/>
               </w:rPr>
-              <w:t>−9.0</w:t>
+              <w:t>−16.0</w:t>
             </w:r>
           </w:p>
         </w:tc>
@@ -2778,7 +2908,7 @@
                 <w:rFonts w:ascii="Times New Roman" w:hAnsi="Times New Roman"/>
                 <w:sz w:val="19"/>
               </w:rPr>
-              <w:t>no</w:t>
+              <w:t>yes</w:t>
             </w:r>
           </w:p>
         </w:tc>
@@ -2793,7 +2923,7 @@
                 <w:rFonts w:ascii="Times New Roman" w:hAnsi="Times New Roman"/>
                 <w:sz w:val="19"/>
               </w:rPr>
-              <w:t>no</w:t>
+              <w:t>yes</w:t>
             </w:r>
           </w:p>
         </w:tc>
@@ -2825,7 +2955,7 @@
                 <w:rFonts w:ascii="Times New Roman" w:hAnsi="Times New Roman"/>
                 <w:sz w:val="19"/>
               </w:rPr>
-              <w:t>S273</w:t>
+              <w:t>S137</w:t>
             </w:r>
           </w:p>
         </w:tc>
@@ -2840,7 +2970,7 @@
                 <w:rFonts w:ascii="Times New Roman" w:hAnsi="Times New Roman"/>
                 <w:sz w:val="19"/>
               </w:rPr>
-              <w:t>inflam./gut/immune → immune traits → IgAN</w:t>
+              <w:t>25(OH)D → serum calcium → migraine</w:t>
             </w:r>
           </w:p>
         </w:tc>
@@ -2855,7 +2985,7 @@
                 <w:rFonts w:ascii="Times New Roman" w:hAnsi="Times New Roman"/>
                 <w:sz w:val="19"/>
               </w:rPr>
-              <w:t>440</w:t>
+              <w:t>105</w:t>
             </w:r>
           </w:p>
         </w:tc>
@@ -2870,7 +3000,7 @@
                 <w:rFonts w:ascii="Times New Roman" w:hAnsi="Times New Roman"/>
                 <w:sz w:val="19"/>
               </w:rPr>
-              <w:t>13</w:t>
+              <w:t>220</w:t>
             </w:r>
           </w:p>
         </w:tc>
@@ -2900,7 +3030,7 @@
                 <w:rFonts w:ascii="Times New Roman" w:hAnsi="Times New Roman"/>
                 <w:sz w:val="19"/>
               </w:rPr>
-              <w:t>0.1538</w:t>
+              <w:t>0.019</w:t>
             </w:r>
           </w:p>
         </w:tc>
@@ -2915,7 +3045,7 @@
                 <w:rFonts w:ascii="Times New Roman" w:hAnsi="Times New Roman"/>
                 <w:sz w:val="19"/>
               </w:rPr>
-              <w:t>0.00392 (0.00115)</w:t>
+              <w:t>0.04031 (0.01441)</w:t>
             </w:r>
           </w:p>
         </w:tc>
@@ -2930,7 +3060,7 @@
                 <w:rFonts w:ascii="Times New Roman" w:hAnsi="Times New Roman"/>
                 <w:sz w:val="19"/>
               </w:rPr>
-              <w:t>1.963 (1.265)</w:t>
+              <w:t>0.00178 (0.00106)</w:t>
             </w:r>
           </w:p>
         </w:tc>
@@ -2945,7 +3075,7 @@
                 <w:rFonts w:ascii="Times New Roman" w:hAnsi="Times New Roman"/>
                 <w:sz w:val="19"/>
               </w:rPr>
-              <w:t>0.00769</w:t>
+              <w:t>7.0e-05</w:t>
             </w:r>
           </w:p>
         </w:tc>
@@ -2960,7 +3090,7 @@
                 <w:rFonts w:ascii="Times New Roman" w:hAnsi="Times New Roman"/>
                 <w:sz w:val="19"/>
               </w:rPr>
-              <w:t>0.00545</w:t>
+              <w:t>5.0e-05</w:t>
             </w:r>
           </w:p>
         </w:tc>
@@ -2975,7 +3105,7 @@
                 <w:rFonts w:ascii="Times New Roman" w:hAnsi="Times New Roman"/>
                 <w:sz w:val="19"/>
               </w:rPr>
-              <w:t>0.00541</w:t>
+              <w:t>4.0e-05</w:t>
             </w:r>
           </w:p>
         </w:tc>
@@ -2990,7 +3120,7 @@
                 <w:rFonts w:ascii="Times New Roman" w:hAnsi="Times New Roman"/>
                 <w:sz w:val="19"/>
               </w:rPr>
-              <w:t>−0.7</w:t>
+              <w:t>−14.2</w:t>
             </w:r>
           </w:p>
         </w:tc>
@@ -3052,7 +3182,7 @@
                 <w:rFonts w:ascii="Times New Roman" w:hAnsi="Times New Roman"/>
                 <w:sz w:val="19"/>
               </w:rPr>
-              <w:t>S137</w:t>
+              <w:t>S217</w:t>
             </w:r>
           </w:p>
         </w:tc>
@@ -3067,7 +3197,7 @@
                 <w:rFonts w:ascii="Times New Roman" w:hAnsi="Times New Roman"/>
                 <w:sz w:val="19"/>
               </w:rPr>
-              <w:t>25(OH)D → serum calcium → migraine</w:t>
+              <w:t>RA → immunosuppressants → bronchiectasis</w:t>
             </w:r>
           </w:p>
         </w:tc>
@@ -3082,7 +3212,7 @@
                 <w:rFonts w:ascii="Times New Roman" w:hAnsi="Times New Roman"/>
                 <w:sz w:val="19"/>
               </w:rPr>
-              <w:t>105</w:t>
+              <w:t>9</w:t>
             </w:r>
           </w:p>
         </w:tc>
@@ -3097,7 +3227,7 @@
                 <w:rFonts w:ascii="Times New Roman" w:hAnsi="Times New Roman"/>
                 <w:sz w:val="19"/>
               </w:rPr>
-              <w:t>220</w:t>
+              <w:t>10</w:t>
             </w:r>
           </w:p>
         </w:tc>
@@ -3112,7 +3242,7 @@
                 <w:rFonts w:ascii="Times New Roman" w:hAnsi="Times New Roman"/>
                 <w:sz w:val="19"/>
               </w:rPr>
-              <w:t>2</w:t>
+              <w:t>1</w:t>
             </w:r>
           </w:p>
         </w:tc>
@@ -3127,7 +3257,7 @@
                 <w:rFonts w:ascii="Times New Roman" w:hAnsi="Times New Roman"/>
                 <w:sz w:val="19"/>
               </w:rPr>
-              <w:t>0.019</w:t>
+              <w:t>0.1111</w:t>
             </w:r>
           </w:p>
         </w:tc>
@@ -3142,7 +3272,7 @@
                 <w:rFonts w:ascii="Times New Roman" w:hAnsi="Times New Roman"/>
                 <w:sz w:val="19"/>
               </w:rPr>
-              <w:t>0.0221 (0.0299)</w:t>
+              <w:t>40.09082 (2.69133)</w:t>
             </w:r>
           </w:p>
         </w:tc>
@@ -3157,7 +3287,7 @@
                 <w:rFonts w:ascii="Times New Roman" w:hAnsi="Times New Roman"/>
                 <w:sz w:val="19"/>
               </w:rPr>
-              <w:t>0.00163 (0.00143)</w:t>
+              <w:t>0.17607 (0.03778)</w:t>
             </w:r>
           </w:p>
         </w:tc>
@@ -3172,7 +3302,7 @@
                 <w:rFonts w:ascii="Times New Roman" w:hAnsi="Times New Roman"/>
                 <w:sz w:val="19"/>
               </w:rPr>
-              <w:t>3.60e-05</w:t>
+              <w:t>7.05891</w:t>
             </w:r>
           </w:p>
         </w:tc>
@@ -3187,7 +3317,7 @@
                 <w:rFonts w:ascii="Times New Roman" w:hAnsi="Times New Roman"/>
                 <w:sz w:val="19"/>
               </w:rPr>
-              <w:t>5.80e-05</w:t>
+              <w:t>1.58715</w:t>
             </w:r>
           </w:p>
         </w:tc>
@@ -3202,7 +3332,7 @@
                 <w:rFonts w:ascii="Times New Roman" w:hAnsi="Times New Roman"/>
                 <w:sz w:val="19"/>
               </w:rPr>
-              <w:t>5.50e-05</w:t>
+              <w:t>1.58342</w:t>
             </w:r>
           </w:p>
         </w:tc>
@@ -3217,7 +3347,7 @@
                 <w:rFonts w:ascii="Times New Roman" w:hAnsi="Times New Roman"/>
                 <w:sz w:val="19"/>
               </w:rPr>
-              <w:t>−5.9</w:t>
+              <w:t>−0.2</w:t>
             </w:r>
           </w:p>
         </w:tc>
@@ -3232,7 +3362,7 @@
                 <w:rFonts w:ascii="Times New Roman" w:hAnsi="Times New Roman"/>
                 <w:sz w:val="19"/>
               </w:rPr>
-              <w:t>no</w:t>
+              <w:t>yes</w:t>
             </w:r>
           </w:p>
         </w:tc>
@@ -3247,7 +3377,7 @@
                 <w:rFonts w:ascii="Times New Roman" w:hAnsi="Times New Roman"/>
                 <w:sz w:val="19"/>
               </w:rPr>
-              <w:t>no</w:t>
+              <w:t>yes</w:t>
             </w:r>
           </w:p>
         </w:tc>
@@ -3279,7 +3409,7 @@
                 <w:rFonts w:ascii="Times New Roman" w:hAnsi="Times New Roman"/>
                 <w:sz w:val="19"/>
               </w:rPr>
-              <w:t>S217</w:t>
+              <w:t>S273</w:t>
             </w:r>
           </w:p>
         </w:tc>
@@ -3294,7 +3424,7 @@
                 <w:rFonts w:ascii="Times New Roman" w:hAnsi="Times New Roman"/>
                 <w:sz w:val="19"/>
               </w:rPr>
-              <w:t>RA → immunosuppressants → bronchiectasis</w:t>
+              <w:t>inflam./gut/immune → immune traits → IgAN</w:t>
             </w:r>
           </w:p>
         </w:tc>
@@ -3309,7 +3439,7 @@
                 <w:rFonts w:ascii="Times New Roman" w:hAnsi="Times New Roman"/>
                 <w:sz w:val="19"/>
               </w:rPr>
-              <w:t>9</w:t>
+              <w:t>440</w:t>
             </w:r>
           </w:p>
         </w:tc>
@@ -3324,7 +3454,7 @@
                 <w:rFonts w:ascii="Times New Roman" w:hAnsi="Times New Roman"/>
                 <w:sz w:val="19"/>
               </w:rPr>
-              <w:t>10</w:t>
+              <w:t>13</w:t>
             </w:r>
           </w:p>
         </w:tc>
@@ -3339,7 +3469,7 @@
                 <w:rFonts w:ascii="Times New Roman" w:hAnsi="Times New Roman"/>
                 <w:sz w:val="19"/>
               </w:rPr>
-              <w:t>1</w:t>
+              <w:t>2</w:t>
             </w:r>
           </w:p>
         </w:tc>
@@ -3354,7 +3484,7 @@
                 <w:rFonts w:ascii="Times New Roman" w:hAnsi="Times New Roman"/>
                 <w:sz w:val="19"/>
               </w:rPr>
-              <w:t>0.1111</w:t>
+              <w:t>0.1538</w:t>
             </w:r>
           </w:p>
         </w:tc>
@@ -3369,7 +3499,7 @@
                 <w:rFonts w:ascii="Times New Roman" w:hAnsi="Times New Roman"/>
                 <w:sz w:val="19"/>
               </w:rPr>
-              <w:t>44.853 (6.464)</w:t>
+              <w:t>0.00721 (0.00081)</w:t>
             </w:r>
           </w:p>
         </w:tc>
@@ -3384,7 +3514,7 @@
                 <w:rFonts w:ascii="Times New Roman" w:hAnsi="Times New Roman"/>
                 <w:sz w:val="19"/>
               </w:rPr>
-              <w:t>0.1986 (0.0543)</w:t>
+              <w:t>3.12071 (0.95001)</w:t>
             </w:r>
           </w:p>
         </w:tc>
@@ -3399,7 +3529,7 @@
                 <w:rFonts w:ascii="Times New Roman" w:hAnsi="Times New Roman"/>
                 <w:sz w:val="19"/>
               </w:rPr>
-              <w:t>8.908</w:t>
+              <w:t>0.02248</w:t>
             </w:r>
           </w:p>
         </w:tc>
@@ -3414,7 +3544,7 @@
                 <w:rFonts w:ascii="Times New Roman" w:hAnsi="Times New Roman"/>
                 <w:sz w:val="19"/>
               </w:rPr>
-              <w:t>2.753</w:t>
+              <w:t>0.00730</w:t>
             </w:r>
           </w:p>
         </w:tc>
@@ -3429,7 +3559,7 @@
                 <w:rFonts w:ascii="Times New Roman" w:hAnsi="Times New Roman"/>
                 <w:sz w:val="19"/>
               </w:rPr>
-              <w:t>2.750</w:t>
+              <w:t>0.00721</w:t>
             </w:r>
           </w:p>
         </w:tc>
@@ -3444,7 +3574,688 @@
                 <w:rFonts w:ascii="Times New Roman" w:hAnsi="Times New Roman"/>
                 <w:sz w:val="19"/>
               </w:rPr>
-              <w:t>−0.1</w:t>
+              <w:t>−1.1</w:t>
+            </w:r>
+          </w:p>
+        </w:tc>
+        <w:tc>
+          <w:tcPr>
+            <w:tcW w:type="dxa" w:w="576"/>
+          </w:tcPr>
+          <w:p>
+            <w:r/>
+            <w:r>
+              <w:rPr>
+                <w:rFonts w:ascii="Times New Roman" w:hAnsi="Times New Roman"/>
+                <w:sz w:val="19"/>
+              </w:rPr>
+              <w:t>yes</w:t>
+            </w:r>
+          </w:p>
+        </w:tc>
+        <w:tc>
+          <w:tcPr>
+            <w:tcW w:type="dxa" w:w="576"/>
+          </w:tcPr>
+          <w:p>
+            <w:r/>
+            <w:r>
+              <w:rPr>
+                <w:rFonts w:ascii="Times New Roman" w:hAnsi="Times New Roman"/>
+                <w:sz w:val="19"/>
+              </w:rPr>
+              <w:t>yes</w:t>
+            </w:r>
+          </w:p>
+        </w:tc>
+        <w:tc>
+          <w:tcPr>
+            <w:tcW w:type="dxa" w:w="576"/>
+          </w:tcPr>
+          <w:p>
+            <w:r/>
+            <w:r>
+              <w:rPr>
+                <w:rFonts w:ascii="Times New Roman" w:hAnsi="Times New Roman"/>
+                <w:sz w:val="19"/>
+              </w:rPr>
+              <w:t>none</w:t>
+            </w:r>
+          </w:p>
+        </w:tc>
+      </w:tr>
+      <w:tr>
+        <w:tc>
+          <w:tcPr>
+            <w:tcW w:type="dxa" w:w="576"/>
+          </w:tcPr>
+          <w:p>
+            <w:r/>
+            <w:r>
+              <w:rPr>
+                <w:rFonts w:ascii="Times New Roman" w:hAnsi="Times New Roman"/>
+                <w:sz w:val="19"/>
+              </w:rPr>
+              <w:t>S267</w:t>
+            </w:r>
+          </w:p>
+        </w:tc>
+        <w:tc>
+          <w:tcPr>
+            <w:tcW w:type="dxa" w:w="576"/>
+          </w:tcPr>
+          <w:p>
+            <w:r/>
+            <w:r>
+              <w:rPr>
+                <w:rFonts w:ascii="Times New Roman" w:hAnsi="Times New Roman"/>
+                <w:sz w:val="19"/>
+              </w:rPr>
+              <w:t>vitamin D → lipids → ocular disorders</w:t>
+            </w:r>
+          </w:p>
+        </w:tc>
+        <w:tc>
+          <w:tcPr>
+            <w:tcW w:type="dxa" w:w="576"/>
+          </w:tcPr>
+          <w:p>
+            <w:r/>
+            <w:r>
+              <w:rPr>
+                <w:rFonts w:ascii="Times New Roman" w:hAnsi="Times New Roman"/>
+                <w:sz w:val="19"/>
+              </w:rPr>
+              <w:t>88</w:t>
+            </w:r>
+          </w:p>
+        </w:tc>
+        <w:tc>
+          <w:tcPr>
+            <w:tcW w:type="dxa" w:w="576"/>
+          </w:tcPr>
+          <w:p>
+            <w:r/>
+            <w:r>
+              <w:rPr>
+                <w:rFonts w:ascii="Times New Roman" w:hAnsi="Times New Roman"/>
+                <w:sz w:val="19"/>
+              </w:rPr>
+              <w:t>53</w:t>
+            </w:r>
+          </w:p>
+        </w:tc>
+        <w:tc>
+          <w:tcPr>
+            <w:tcW w:type="dxa" w:w="576"/>
+          </w:tcPr>
+          <w:p>
+            <w:r/>
+            <w:r>
+              <w:rPr>
+                <w:rFonts w:ascii="Times New Roman" w:hAnsi="Times New Roman"/>
+                <w:sz w:val="19"/>
+              </w:rPr>
+              <w:t>3</w:t>
+            </w:r>
+          </w:p>
+        </w:tc>
+        <w:tc>
+          <w:tcPr>
+            <w:tcW w:type="dxa" w:w="576"/>
+          </w:tcPr>
+          <w:p>
+            <w:r/>
+            <w:r>
+              <w:rPr>
+                <w:rFonts w:ascii="Times New Roman" w:hAnsi="Times New Roman"/>
+                <w:sz w:val="19"/>
+              </w:rPr>
+              <w:t>0.0566</w:t>
+            </w:r>
+          </w:p>
+        </w:tc>
+        <w:tc>
+          <w:tcPr>
+            <w:tcW w:type="dxa" w:w="576"/>
+          </w:tcPr>
+          <w:p>
+            <w:r/>
+            <w:r>
+              <w:rPr>
+                <w:rFonts w:ascii="Times New Roman" w:hAnsi="Times New Roman"/>
+                <w:sz w:val="19"/>
+              </w:rPr>
+              <w:t>−0.01081 (0.01407)</w:t>
+            </w:r>
+          </w:p>
+        </w:tc>
+        <w:tc>
+          <w:tcPr>
+            <w:tcW w:type="dxa" w:w="576"/>
+          </w:tcPr>
+          <w:p>
+            <w:r/>
+            <w:r>
+              <w:rPr>
+                <w:rFonts w:ascii="Times New Roman" w:hAnsi="Times New Roman"/>
+                <w:sz w:val="19"/>
+              </w:rPr>
+              <w:t>−0.169 (0.05426)</w:t>
+            </w:r>
+          </w:p>
+        </w:tc>
+        <w:tc>
+          <w:tcPr>
+            <w:tcW w:type="dxa" w:w="576"/>
+          </w:tcPr>
+          <w:p>
+            <w:r/>
+            <w:r>
+              <w:rPr>
+                <w:rFonts w:ascii="Times New Roman" w:hAnsi="Times New Roman"/>
+                <w:sz w:val="19"/>
+              </w:rPr>
+              <w:t>0.00183</w:t>
+            </w:r>
+          </w:p>
+        </w:tc>
+        <w:tc>
+          <w:tcPr>
+            <w:tcW w:type="dxa" w:w="576"/>
+          </w:tcPr>
+          <w:p>
+            <w:r/>
+            <w:r>
+              <w:rPr>
+                <w:rFonts w:ascii="Times New Roman" w:hAnsi="Times New Roman"/>
+                <w:sz w:val="19"/>
+              </w:rPr>
+              <w:t>0.00245</w:t>
+            </w:r>
+          </w:p>
+        </w:tc>
+        <w:tc>
+          <w:tcPr>
+            <w:tcW w:type="dxa" w:w="576"/>
+          </w:tcPr>
+          <w:p>
+            <w:r/>
+            <w:r>
+              <w:rPr>
+                <w:rFonts w:ascii="Times New Roman" w:hAnsi="Times New Roman"/>
+                <w:sz w:val="19"/>
+              </w:rPr>
+              <w:t>0.00241</w:t>
+            </w:r>
+          </w:p>
+        </w:tc>
+        <w:tc>
+          <w:tcPr>
+            <w:tcW w:type="dxa" w:w="576"/>
+          </w:tcPr>
+          <w:p>
+            <w:r/>
+            <w:r>
+              <w:rPr>
+                <w:rFonts w:ascii="Times New Roman" w:hAnsi="Times New Roman"/>
+                <w:sz w:val="19"/>
+              </w:rPr>
+              <w:t>−1.6</w:t>
+            </w:r>
+          </w:p>
+        </w:tc>
+        <w:tc>
+          <w:tcPr>
+            <w:tcW w:type="dxa" w:w="576"/>
+          </w:tcPr>
+          <w:p>
+            <w:r/>
+            <w:r>
+              <w:rPr>
+                <w:rFonts w:ascii="Times New Roman" w:hAnsi="Times New Roman"/>
+                <w:sz w:val="19"/>
+              </w:rPr>
+              <w:t>no</w:t>
+            </w:r>
+          </w:p>
+        </w:tc>
+        <w:tc>
+          <w:tcPr>
+            <w:tcW w:type="dxa" w:w="576"/>
+          </w:tcPr>
+          <w:p>
+            <w:r/>
+            <w:r>
+              <w:rPr>
+                <w:rFonts w:ascii="Times New Roman" w:hAnsi="Times New Roman"/>
+                <w:sz w:val="19"/>
+              </w:rPr>
+              <w:t>no</w:t>
+            </w:r>
+          </w:p>
+        </w:tc>
+        <w:tc>
+          <w:tcPr>
+            <w:tcW w:type="dxa" w:w="576"/>
+          </w:tcPr>
+          <w:p>
+            <w:r/>
+            <w:r>
+              <w:rPr>
+                <w:rFonts w:ascii="Times New Roman" w:hAnsi="Times New Roman"/>
+                <w:sz w:val="19"/>
+              </w:rPr>
+              <w:t>none</w:t>
+            </w:r>
+          </w:p>
+        </w:tc>
+      </w:tr>
+      <w:tr>
+        <w:tc>
+          <w:tcPr>
+            <w:tcW w:type="dxa" w:w="576"/>
+          </w:tcPr>
+          <w:p>
+            <w:r/>
+            <w:r>
+              <w:rPr>
+                <w:rFonts w:ascii="Times New Roman" w:hAnsi="Times New Roman"/>
+                <w:sz w:val="19"/>
+              </w:rPr>
+              <w:t>S320*</w:t>
+            </w:r>
+          </w:p>
+        </w:tc>
+        <w:tc>
+          <w:tcPr>
+            <w:tcW w:type="dxa" w:w="576"/>
+          </w:tcPr>
+          <w:p>
+            <w:r/>
+            <w:r>
+              <w:rPr>
+                <w:rFonts w:ascii="Times New Roman" w:hAnsi="Times New Roman"/>
+                <w:sz w:val="19"/>
+              </w:rPr>
+              <w:t>genes (eQTL/pQTL) → circulating metabolites → sepsis</w:t>
+            </w:r>
+          </w:p>
+        </w:tc>
+        <w:tc>
+          <w:tcPr>
+            <w:tcW w:type="dxa" w:w="576"/>
+          </w:tcPr>
+          <w:p>
+            <w:r/>
+            <w:r>
+              <w:rPr>
+                <w:rFonts w:ascii="Times New Roman" w:hAnsi="Times New Roman"/>
+                <w:sz w:val="19"/>
+              </w:rPr>
+              <w:t>2</w:t>
+            </w:r>
+          </w:p>
+        </w:tc>
+        <w:tc>
+          <w:tcPr>
+            <w:tcW w:type="dxa" w:w="576"/>
+          </w:tcPr>
+          <w:p>
+            <w:r/>
+            <w:r>
+              <w:rPr>
+                <w:rFonts w:ascii="Times New Roman" w:hAnsi="Times New Roman"/>
+                <w:sz w:val="19"/>
+              </w:rPr>
+              <w:t>2</w:t>
+            </w:r>
+          </w:p>
+        </w:tc>
+        <w:tc>
+          <w:tcPr>
+            <w:tcW w:type="dxa" w:w="576"/>
+          </w:tcPr>
+          <w:p>
+            <w:r/>
+            <w:r>
+              <w:rPr>
+                <w:rFonts w:ascii="Times New Roman" w:hAnsi="Times New Roman"/>
+                <w:sz w:val="19"/>
+              </w:rPr>
+              <w:t>2</w:t>
+            </w:r>
+          </w:p>
+        </w:tc>
+        <w:tc>
+          <w:tcPr>
+            <w:tcW w:type="dxa" w:w="576"/>
+          </w:tcPr>
+          <w:p>
+            <w:r/>
+            <w:r>
+              <w:rPr>
+                <w:rFonts w:ascii="Times New Roman" w:hAnsi="Times New Roman"/>
+                <w:sz w:val="19"/>
+              </w:rPr>
+              <w:t>1.000</w:t>
+            </w:r>
+          </w:p>
+        </w:tc>
+        <w:tc>
+          <w:tcPr>
+            <w:tcW w:type="dxa" w:w="576"/>
+          </w:tcPr>
+          <w:p>
+            <w:r/>
+            <w:r>
+              <w:rPr>
+                <w:rFonts w:ascii="Times New Roman" w:hAnsi="Times New Roman"/>
+                <w:sz w:val="19"/>
+              </w:rPr>
+              <w:t>1.000 (0.12449)</w:t>
+            </w:r>
+          </w:p>
+        </w:tc>
+        <w:tc>
+          <w:tcPr>
+            <w:tcW w:type="dxa" w:w="576"/>
+          </w:tcPr>
+          <w:p>
+            <w:r/>
+            <w:r>
+              <w:rPr>
+                <w:rFonts w:ascii="Times New Roman" w:hAnsi="Times New Roman"/>
+                <w:sz w:val="19"/>
+              </w:rPr>
+              <w:t>3.39987 (1.79212)</w:t>
+            </w:r>
+          </w:p>
+        </w:tc>
+        <w:tc>
+          <w:tcPr>
+            <w:tcW w:type="dxa" w:w="576"/>
+          </w:tcPr>
+          <w:p>
+            <w:r/>
+            <w:r>
+              <w:rPr>
+                <w:rFonts w:ascii="Times New Roman" w:hAnsi="Times New Roman"/>
+                <w:sz w:val="19"/>
+              </w:rPr>
+              <w:t>3.39987</w:t>
+            </w:r>
+          </w:p>
+        </w:tc>
+        <w:tc>
+          <w:tcPr>
+            <w:tcW w:type="dxa" w:w="576"/>
+          </w:tcPr>
+          <w:p>
+            <w:r/>
+            <w:r>
+              <w:rPr>
+                <w:rFonts w:ascii="Times New Roman" w:hAnsi="Times New Roman"/>
+                <w:sz w:val="19"/>
+              </w:rPr>
+              <w:t>1.84142</w:t>
+            </w:r>
+          </w:p>
+        </w:tc>
+        <w:tc>
+          <w:tcPr>
+            <w:tcW w:type="dxa" w:w="576"/>
+          </w:tcPr>
+          <w:p>
+            <w:r/>
+            <w:r>
+              <w:rPr>
+                <w:rFonts w:ascii="Times New Roman" w:hAnsi="Times New Roman"/>
+                <w:sz w:val="19"/>
+              </w:rPr>
+              <w:t>1.72112</w:t>
+            </w:r>
+          </w:p>
+        </w:tc>
+        <w:tc>
+          <w:tcPr>
+            <w:tcW w:type="dxa" w:w="576"/>
+          </w:tcPr>
+          <w:p>
+            <w:r/>
+            <w:r>
+              <w:rPr>
+                <w:rFonts w:ascii="Times New Roman" w:hAnsi="Times New Roman"/>
+                <w:sz w:val="19"/>
+              </w:rPr>
+              <w:t>−6.5</w:t>
+            </w:r>
+          </w:p>
+        </w:tc>
+        <w:tc>
+          <w:tcPr>
+            <w:tcW w:type="dxa" w:w="576"/>
+          </w:tcPr>
+          <w:p>
+            <w:r/>
+            <w:r>
+              <w:rPr>
+                <w:rFonts w:ascii="Times New Roman" w:hAnsi="Times New Roman"/>
+                <w:sz w:val="19"/>
+              </w:rPr>
+              <w:t>no</w:t>
+            </w:r>
+          </w:p>
+        </w:tc>
+        <w:tc>
+          <w:tcPr>
+            <w:tcW w:type="dxa" w:w="576"/>
+          </w:tcPr>
+          <w:p>
+            <w:r/>
+            <w:r>
+              <w:rPr>
+                <w:rFonts w:ascii="Times New Roman" w:hAnsi="Times New Roman"/>
+                <w:sz w:val="19"/>
+              </w:rPr>
+              <w:t>yes</w:t>
+            </w:r>
+          </w:p>
+        </w:tc>
+        <w:tc>
+          <w:tcPr>
+            <w:tcW w:type="dxa" w:w="576"/>
+          </w:tcPr>
+          <w:p>
+            <w:r/>
+            <w:r>
+              <w:rPr>
+                <w:rFonts w:ascii="Times New Roman" w:hAnsi="Times New Roman"/>
+                <w:sz w:val="19"/>
+              </w:rPr>
+              <w:t>gain*</w:t>
+            </w:r>
+          </w:p>
+        </w:tc>
+      </w:tr>
+      <w:tr>
+        <w:tc>
+          <w:tcPr>
+            <w:tcW w:type="dxa" w:w="576"/>
+          </w:tcPr>
+          <w:p>
+            <w:r/>
+            <w:r>
+              <w:rPr>
+                <w:rFonts w:ascii="Times New Roman" w:hAnsi="Times New Roman"/>
+                <w:sz w:val="19"/>
+              </w:rPr>
+              <w:t>S293*</w:t>
+            </w:r>
+          </w:p>
+        </w:tc>
+        <w:tc>
+          <w:tcPr>
+            <w:tcW w:type="dxa" w:w="576"/>
+          </w:tcPr>
+          <w:p>
+            <w:r/>
+            <w:r>
+              <w:rPr>
+                <w:rFonts w:ascii="Times New Roman" w:hAnsi="Times New Roman"/>
+                <w:sz w:val="19"/>
+              </w:rPr>
+              <w:t>BMI → 4907 plasma proteins → cardiometabolic</w:t>
+            </w:r>
+          </w:p>
+        </w:tc>
+        <w:tc>
+          <w:tcPr>
+            <w:tcW w:type="dxa" w:w="576"/>
+          </w:tcPr>
+          <w:p>
+            <w:r/>
+            <w:r>
+              <w:rPr>
+                <w:rFonts w:ascii="Times New Roman" w:hAnsi="Times New Roman"/>
+                <w:sz w:val="19"/>
+              </w:rPr>
+              <w:t>2</w:t>
+            </w:r>
+          </w:p>
+        </w:tc>
+        <w:tc>
+          <w:tcPr>
+            <w:tcW w:type="dxa" w:w="576"/>
+          </w:tcPr>
+          <w:p>
+            <w:r/>
+            <w:r>
+              <w:rPr>
+                <w:rFonts w:ascii="Times New Roman" w:hAnsi="Times New Roman"/>
+                <w:sz w:val="19"/>
+              </w:rPr>
+              <w:t>2</w:t>
+            </w:r>
+          </w:p>
+        </w:tc>
+        <w:tc>
+          <w:tcPr>
+            <w:tcW w:type="dxa" w:w="576"/>
+          </w:tcPr>
+          <w:p>
+            <w:r/>
+            <w:r>
+              <w:rPr>
+                <w:rFonts w:ascii="Times New Roman" w:hAnsi="Times New Roman"/>
+                <w:sz w:val="19"/>
+              </w:rPr>
+              <w:t>2</w:t>
+            </w:r>
+          </w:p>
+        </w:tc>
+        <w:tc>
+          <w:tcPr>
+            <w:tcW w:type="dxa" w:w="576"/>
+          </w:tcPr>
+          <w:p>
+            <w:r/>
+            <w:r>
+              <w:rPr>
+                <w:rFonts w:ascii="Times New Roman" w:hAnsi="Times New Roman"/>
+                <w:sz w:val="19"/>
+              </w:rPr>
+              <w:t>1.000</w:t>
+            </w:r>
+          </w:p>
+        </w:tc>
+        <w:tc>
+          <w:tcPr>
+            <w:tcW w:type="dxa" w:w="576"/>
+          </w:tcPr>
+          <w:p>
+            <w:r/>
+            <w:r>
+              <w:rPr>
+                <w:rFonts w:ascii="Times New Roman" w:hAnsi="Times New Roman"/>
+                <w:sz w:val="19"/>
+              </w:rPr>
+              <w:t>1.000 (0.10665)</w:t>
+            </w:r>
+          </w:p>
+        </w:tc>
+        <w:tc>
+          <w:tcPr>
+            <w:tcW w:type="dxa" w:w="576"/>
+          </w:tcPr>
+          <w:p>
+            <w:r/>
+            <w:r>
+              <w:rPr>
+                <w:rFonts w:ascii="Times New Roman" w:hAnsi="Times New Roman"/>
+                <w:sz w:val="19"/>
+              </w:rPr>
+              <w:t>0.00415 (0.00148)</w:t>
+            </w:r>
+          </w:p>
+        </w:tc>
+        <w:tc>
+          <w:tcPr>
+            <w:tcW w:type="dxa" w:w="576"/>
+          </w:tcPr>
+          <w:p>
+            <w:r/>
+            <w:r>
+              <w:rPr>
+                <w:rFonts w:ascii="Times New Roman" w:hAnsi="Times New Roman"/>
+                <w:sz w:val="19"/>
+              </w:rPr>
+              <w:t>0.00415</w:t>
+            </w:r>
+          </w:p>
+        </w:tc>
+        <w:tc>
+          <w:tcPr>
+            <w:tcW w:type="dxa" w:w="576"/>
+          </w:tcPr>
+          <w:p>
+            <w:r/>
+            <w:r>
+              <w:rPr>
+                <w:rFonts w:ascii="Times New Roman" w:hAnsi="Times New Roman"/>
+                <w:sz w:val="19"/>
+              </w:rPr>
+              <w:t>0.00154</w:t>
+            </w:r>
+          </w:p>
+        </w:tc>
+        <w:tc>
+          <w:tcPr>
+            <w:tcW w:type="dxa" w:w="576"/>
+          </w:tcPr>
+          <w:p>
+            <w:r/>
+            <w:r>
+              <w:rPr>
+                <w:rFonts w:ascii="Times New Roman" w:hAnsi="Times New Roman"/>
+                <w:sz w:val="19"/>
+              </w:rPr>
+              <w:t>0.00104</w:t>
+            </w:r>
+          </w:p>
+        </w:tc>
+        <w:tc>
+          <w:tcPr>
+            <w:tcW w:type="dxa" w:w="576"/>
+          </w:tcPr>
+          <w:p>
+            <w:r/>
+            <w:r>
+              <w:rPr>
+                <w:rFonts w:ascii="Times New Roman" w:hAnsi="Times New Roman"/>
+                <w:sz w:val="19"/>
+              </w:rPr>
+              <w:t>−32.8</w:t>
             </w:r>
           </w:p>
         </w:tc>
@@ -3514,7 +4325,7 @@
           <w:b w:val="0"/>
           <w:sz w:val="20"/>
         </w:rPr>
-        <w:t xml:space="preserve"> Batch re-estimation of the 4 adequately powered published two-step MR mediation studies with genuine instrument overlap resolved to public GWAS accessions (of 6 identified; 2 not estimable, see note). π_shared and n_s are exact (computed from extracted clumped instrument sets); α̂, β̂ and their SEs are re-estimated with TwoSampleMR (mr_ivw) and cross-validated against the deposited D56 ground truth. widen_% is the S10 correction at ρ_MY = 0; negative = narrower. Significance two-sided at α = 0.05.</w:t>
+        <w:t xml:space="preserve"> All-Python batch re-estimation of the seven published two-step MR mediation trios (of 108 re-estimated) with genuine instrument overlap, resolved directly from OpenGWAS summary statistics. π_shared and n_s are exact (extracted clumped instrument sets); α̂, β̂ and their SEs are re-estimated with harmonized fixed-effects IVW; widen_% is the S10 correction at ρ_MY = 0; negative = narrower. Significance two-sided at α = 0.05. *S320 and S293 are degenerate self-mediating designs (exposure ≡ mediator accession, α̂ = 1.0, π_shared = 1.0), flagged and not counted as substantive mediation evidence; S320's flip-gain is a boundary illustration of the §3.1.1 prediction, not a finding.</w:t>
       </w:r>
     </w:p>
     <w:p>
@@ -3528,7 +4339,7 @@
           <w:b w:val="0"/>
           <w:sz w:val="24"/>
         </w:rPr>
-        <w:t>*Note:* S255 (immune cells → serum metabolites → lymphoid leukemia) and S267 (vitamin D → lipids → ocular disorders) could not be re-estimated through TwoSampleMR: the package returned a non-finite estimate during allele harmonisation of their FinnGen outcome GWASs. These two trios are reported as not estimable through the gold-standard pipeline and are excluded from the validated flip count; the overlap-rate and zero-flip conclusions rest on the 4 validated trios plus the structural argument in §3.4.</w:t>
+        <w:t>*Note (full):* S320 (ukb-d-1468_2 → ukb-d-1468_2 → ieu-b-69) and S293 (ebi-a-GCST90103751 → ebi-a-GCST90103751 → ebi-a-GCST90038634) are degenerate: exposure and mediator resolve to the identical GWAS accession, so α̂ = 1.0 exactly and π_shared = 1.0; they represent self-mediating (non-mediation) designs and are flagged, not counted as substantive mediation evidence. S320's flip-gain is reported as a boundary illustration of the §3.1.1 prediction (same-sign, π_shared = 1.0 → flip-gain), not as a finding. S267 was not estimable through TwoSampleMR (FinnGen harmonisation failure) but succeeded here. Five trios (S210, S173, S255, S291, S326) were skipped for accession-resolution or network errors.</w:t>
       </w:r>
     </w:p>
     <w:p>
@@ -3556,7 +4367,7 @@
           <w:b w:val="0"/>
           <w:sz w:val="24"/>
         </w:rPr>
-        <w:t xml:space="preserve">Treating ρ_MY as 0 leaves the central warning theoretical; we therefore estimated it empirically for all six overlapping trios as genetic concordance at the instrumental SNPs. In </w:t>
+        <w:t xml:space="preserve">Treating ρ_MY as 0 leaves the central warning theoretical; we therefore estimated it empirically for the overlapping trios as genetic concordance at the instrumental SNPs (six resolved through the TwoSampleMR-compatible ρ_MY scan in Table 3b; the all-Python batch in §3.4 recovers five of these non-degenerate trios plus two additional degenerate self-mediating trios, S320/S293, excluded from the ρ_MY scan because exposure ≡ mediator). In </w:t>
       </w:r>
       <w:r>
         <w:rPr>
@@ -5051,6 +5862,34 @@
         <w:rPr>
           <w:rFonts w:ascii="Times New Roman" w:hAnsi="Times New Roman"/>
           <w:b/>
+          <w:sz w:val="24"/>
+        </w:rPr>
+        <w:t>3.6 Statistical precision of the null re-estimation result</w:t>
+      </w:r>
+    </w:p>
+    <w:p>
+      <w:pPr>
+        <w:ind w:firstLine="480"/>
+        <w:jc w:val="both"/>
+      </w:pPr>
+      <w:r>
+        <w:rPr>
+          <w:rFonts w:ascii="Times New Roman" w:hAnsi="Times New Roman"/>
+          <w:b w:val="0"/>
+          <w:sz w:val="24"/>
+        </w:rPr>
+        <w:t>The headline re-estimation findings — 6.5% genuine overlap (7/108) and zero significance flips among the five non-degenerate overlapping trios — are point estimates from small samples and should be read with their sampling uncertainty made explicit. Using the Wilson score method, the 95% CI for the overlap prevalence is 3.2–12.8%, and the 95% CI for the underlying flip rate implied by 0/5 observed flips is 0.0–43.4%. The zero-flip result is therefore consistent both with flips being genuinely rare in this design space and with flips occurring in as many as two in five comparable cases without our five trios happening to reveal one; the data cannot distinguish between these possibilities. We report this explicitly because the flip-probability scan (§3.1.1) independently predicts that flips are concentrated near the naive significance boundary (λ ≈ 1.7–2.4) and rise with π_shared — conditions that describe a minority, but not a negligible fraction, of the design space — so the small-sample null result should not be interpreted as evidence that the boundary conditions we characterize analytically are rare in practice, only that they did not happen to be realized in the five cases we could resolve to public data.</w:t>
+      </w:r>
+    </w:p>
+    <w:p>
+      <w:pPr>
+        <w:spacing w:before="200" w:after="80"/>
+        <w:jc w:val="left"/>
+      </w:pPr>
+      <w:r>
+        <w:rPr>
+          <w:rFonts w:ascii="Times New Roman" w:hAnsi="Times New Roman"/>
+          <w:b/>
           <w:sz w:val="26"/>
         </w:rPr>
         <w:t>4. Discussion</w:t>
@@ -5067,41 +5906,7 @@
           <w:b w:val="0"/>
           <w:sz w:val="24"/>
         </w:rPr>
-        <w:t xml:space="preserve">We provide the first closed-form correction for Cov(α̂, β̂) in two-step summary-data MR mediation and show it restores nominal coverage where the traditional delta method deviates. The correction is exactly zero for disjoint instruments, reduces to the independent-sample expression under three independent samples, and becomes material as instruments are shared or samples overlap. Recent methodological work underscores the urgency: a simulated sample-splitting strategy has been proposed to remove instrument-selection and participant-overlap bias in two-sample MR </w:t>
-      </w:r>
-      <w:r>
-        <w:rPr>
-          <w:rFonts w:ascii="Times New Roman" w:hAnsi="Times New Roman"/>
-          <w:b w:val="0"/>
-          <w:sz w:val="24"/>
-          <w:vertAlign w:val="superscript"/>
-        </w:rPr>
-        <w:t>23</w:t>
-      </w:r>
-      <w:r>
-        <w:rPr>
-          <w:rFonts w:ascii="Times New Roman" w:hAnsi="Times New Roman"/>
-          <w:b w:val="0"/>
-          <w:sz w:val="24"/>
-        </w:rPr>
-        <w:t xml:space="preserve">, and a critical appraisal of protein targets for myocardial infarction argues that sample overlap must be handled explicitly </w:t>
-      </w:r>
-      <w:r>
-        <w:rPr>
-          <w:rFonts w:ascii="Times New Roman" w:hAnsi="Times New Roman"/>
-          <w:b w:val="0"/>
-          <w:sz w:val="24"/>
-          <w:vertAlign w:val="superscript"/>
-        </w:rPr>
-        <w:t>22</w:t>
-      </w:r>
-      <w:r>
-        <w:rPr>
-          <w:rFonts w:ascii="Times New Roman" w:hAnsi="Times New Roman"/>
-          <w:b w:val="0"/>
-          <w:sz w:val="24"/>
-        </w:rPr>
-        <w:t>.</w:t>
+        <w:t>This work quantifies, rather than dramatizes, a methodological blind spot. We do not claim that any specific published two-step MR mediation conclusion is incorrect: in every real trio we could resolve, the omitted covariance happened to be structurally negative, and the naive method was conservative rather than anti-conservative. What we do establish is that this favorable direction is a property of the small, same-sign, low-overlap cases we were able to observe — not a guarantee — and that the field currently has no reporting convention (n_s, π_shared, or ρ_MY) that would let a reader distinguish a benign case from a harmful one without rerunning the analysis, as we did. The value of this paper is therefore the closed-form tool and the documented boundary conditions under which the direction flips, not a retrospective correction of the existing literature's conclusions.</w:t>
       </w:r>
     </w:p>
     <w:p>
@@ -5131,7 +5936,7 @@
           <w:b w:val="0"/>
           <w:sz w:val="24"/>
         </w:rPr>
-        <w:t>, and only ~35% of assessable studies disclose overlap handling. Yet the §3.4 batch re-estimation shows genuine instrument overlap in 19% of resolvable trios, and in all six adequately powered overlapping cases the correction narrowed the CI with zero flips. The field therefore routinely analyzes overlapping instruments without reporting or correcting them. Consistent with a targeted PubMed novelty check (no 2024–2026 publication derives this covariance), our work closes a gap the published product-method framework left open.</w:t>
+        <w:t>, and only ~35% of assessable studies disclose overlap handling. Yet the §3.4 batch re-estimation finds genuine instrument overlap in 6.5% (7/108) of re-estimated trios, and among the five non-degenerate overlapping trios the correction narrowed every CI (0.2–16.0%) with zero flips; the only flip in the batch (S320) is a degenerate self-mediating design (exposure ≡ mediator accession) reported as a boundary illustration, not a mediation finding. The field therefore routinely analyzes overlapping instruments without reporting or correcting them. Consistent with a targeted PubMed novelty check (no 2024–2026 publication derives this covariance), our work closes a gap the published product-method framework left open.</w:t>
       </w:r>
     </w:p>
     <w:p>
@@ -5145,7 +5950,831 @@
           <w:b w:val="0"/>
           <w:sz w:val="24"/>
         </w:rPr>
-        <w:t>The central real-data finding is that the sign of the omitted covariance is not predictable from published statistics alone. In realized same-sign mediation the corrected CIs are narrower (the BMI → waist → CHD example by 2.8%, shared-IV by 15.5%), but the literature narrative usually assumes the opposite. Our batch re-estimation confirms this is structural, not fortune: the dominant shared-instrument covariance is provably negative when α̂ and β̂ share a sign (Proposition S2.5), so the naive SE is conservative in this regime. Because the sign is prior-unknown at the design stage, and opposite-sign or sample-overlapping regimes widen rather than narrow (§3.1), analysts should correct regardless of prior. §3.5 shows that even where ρ_MY is empirically positive (5/6 trios, up to +0.81) the correction still narrows, because the structurally negative term dominates for n_s = 1–3.</w:t>
+        <w:t>The central real-data finding is that the sign of the omitted covariance is not predictable from published statistics alone. In realized same-sign mediation the corrected CIs are narrower (the BMI → waist → CHD example by 2.8%, shared-IV by 15.5%), but the literature narrative usually assumes the opposite. Our batch re-estimation confirms this is structural, not fortune: the dominant shared-instrument covariance is provably negative when α̂ and β̂ share a sign (Proposition S2.5), so the naive SE is conservative in this regime. Because the sign is prior-unknown at the design stage, and opposite-sign or sample-overlapping regimes widen rather than narrow (§3.1.1), analysts should correct regardless of prior. §3.5 shows that even where ρ_MY is empirically positive the correction still narrows, because the structurally negative term dominates for n_s = 1–3.</w:t>
+      </w:r>
+    </w:p>
+    <w:p>
+      <w:pPr>
+        <w:ind w:firstLine="480"/>
+        <w:jc w:val="both"/>
+      </w:pPr>
+      <w:r>
+        <w:rPr>
+          <w:rFonts w:ascii="Times New Roman" w:hAnsi="Times New Roman"/>
+          <w:b/>
+          <w:sz w:val="24"/>
+        </w:rPr>
+        <w:t>Positioning relative to concurrent overlap-correction methods.</w:t>
+      </w:r>
+      <w:r>
+        <w:rPr>
+          <w:rFonts w:ascii="Times New Roman" w:hAnsi="Times New Roman"/>
+          <w:b w:val="0"/>
+          <w:sz w:val="24"/>
+        </w:rPr>
+        <w:t xml:space="preserve"> Two independent lines of work published as we wrote converge on the same broad problem — overlap-induced bias in MR — but operate at different levels, so they are complementary rather than competing. Chen et al. </w:t>
+      </w:r>
+      <w:r>
+        <w:rPr>
+          <w:rFonts w:ascii="Times New Roman" w:hAnsi="Times New Roman"/>
+          <w:b w:val="0"/>
+          <w:sz w:val="24"/>
+          <w:vertAlign w:val="superscript"/>
+        </w:rPr>
+        <w:t>22</w:t>
+      </w:r>
+      <w:r>
+        <w:rPr>
+          <w:rFonts w:ascii="Times New Roman" w:hAnsi="Times New Roman"/>
+          <w:b w:val="0"/>
+          <w:sz w:val="24"/>
+        </w:rPr>
+        <w:t xml:space="preserve"> (Eur Heart J correspondence, 2025) is a critical appraisal that flags exposure–outcome sample overlap and meta-analysis weighting imbalance in a protein→MI MR and recommends LDSC or dataset replacement; it proposes no quantitative correction for the mediation product estimand. Forde et al. </w:t>
+      </w:r>
+      <w:r>
+        <w:rPr>
+          <w:rFonts w:ascii="Times New Roman" w:hAnsi="Times New Roman"/>
+          <w:b w:val="0"/>
+          <w:sz w:val="24"/>
+          <w:vertAlign w:val="superscript"/>
+        </w:rPr>
+        <w:t>23</w:t>
+      </w:r>
+      <w:r>
+        <w:rPr>
+          <w:rFonts w:ascii="Times New Roman" w:hAnsi="Times New Roman"/>
+          <w:b w:val="0"/>
+          <w:sz w:val="24"/>
+        </w:rPr>
+        <w:t xml:space="preserve"> (PLoS Genet, 2026) propose MR Simulated Sample Splitting (MR-SimSS), which corrects bias in a *single* two-sample MR estimand (instrument-selection / Winner's Curse, weak-instrument bias, and exposure–outcome sample overlap) by simulating statistically independent summary statistics; it does not derive the covariance of a *product* estimand, so it leaves the two-step mediation term Cov(α̂, β̂) unaddressed. Table 4 contrasts the three.</w:t>
+      </w:r>
+    </w:p>
+    <w:tbl>
+      <w:tblPr>
+        <w:tblStyle w:val="TableGrid"/>
+        <w:tblW w:type="auto" w:w="0"/>
+        <w:jc w:val="center"/>
+        <w:tblLook w:firstColumn="1" w:firstRow="1" w:lastColumn="0" w:lastRow="0" w:noHBand="0" w:noVBand="1" w:val="04A0"/>
+      </w:tblPr>
+      <w:tblGrid>
+        <w:gridCol w:w="2160"/>
+        <w:gridCol w:w="2160"/>
+        <w:gridCol w:w="2160"/>
+        <w:gridCol w:w="2160"/>
+      </w:tblGrid>
+      <w:tr>
+        <w:tc>
+          <w:tcPr>
+            <w:tcW w:type="dxa" w:w="2160"/>
+          </w:tcPr>
+          <w:p>
+            <w:r/>
+            <w:r>
+              <w:rPr>
+                <w:rFonts w:ascii="Times New Roman" w:hAnsi="Times New Roman"/>
+                <w:b/>
+                <w:sz w:val="19"/>
+              </w:rPr>
+              <w:t>Feature</w:t>
+            </w:r>
+          </w:p>
+        </w:tc>
+        <w:tc>
+          <w:tcPr>
+            <w:tcW w:type="dxa" w:w="2160"/>
+          </w:tcPr>
+          <w:p>
+            <w:r/>
+            <w:r>
+              <w:rPr>
+                <w:rFonts w:ascii="Times New Roman" w:hAnsi="Times New Roman"/>
+                <w:b/>
+                <w:sz w:val="19"/>
+              </w:rPr>
+              <w:t>This work</w:t>
+            </w:r>
+          </w:p>
+        </w:tc>
+        <w:tc>
+          <w:tcPr>
+            <w:tcW w:type="dxa" w:w="2160"/>
+          </w:tcPr>
+          <w:p>
+            <w:r/>
+            <w:r>
+              <w:rPr>
+                <w:rFonts w:ascii="Times New Roman" w:hAnsi="Times New Roman"/>
+                <w:b/>
+                <w:sz w:val="19"/>
+              </w:rPr>
+              <w:t>Forde et al. 2026 (MR-SimSS)</w:t>
+            </w:r>
+          </w:p>
+        </w:tc>
+        <w:tc>
+          <w:tcPr>
+            <w:tcW w:type="dxa" w:w="2160"/>
+          </w:tcPr>
+          <w:p>
+            <w:r/>
+            <w:r>
+              <w:rPr>
+                <w:rFonts w:ascii="Times New Roman" w:hAnsi="Times New Roman"/>
+                <w:b/>
+                <w:sz w:val="19"/>
+              </w:rPr>
+              <w:t>Chen et al. 2025 (correspondence)</w:t>
+            </w:r>
+          </w:p>
+        </w:tc>
+      </w:tr>
+      <w:tr>
+        <w:tc>
+          <w:tcPr>
+            <w:tcW w:type="dxa" w:w="2160"/>
+          </w:tcPr>
+          <w:p>
+            <w:r/>
+            <w:r>
+              <w:rPr>
+                <w:rFonts w:ascii="Times New Roman" w:hAnsi="Times New Roman"/>
+                <w:sz w:val="19"/>
+              </w:rPr>
+              <w:t>Target estimand</w:t>
+            </w:r>
+          </w:p>
+        </w:tc>
+        <w:tc>
+          <w:tcPr>
+            <w:tcW w:type="dxa" w:w="2160"/>
+          </w:tcPr>
+          <w:p>
+            <w:r/>
+            <w:r>
+              <w:rPr>
+                <w:rFonts w:ascii="Times New Roman" w:hAnsi="Times New Roman"/>
+                <w:sz w:val="19"/>
+              </w:rPr>
+              <w:t>indirect effect α̂β̂ in two-step MR mediation (product of two IVW estimates)</w:t>
+            </w:r>
+          </w:p>
+        </w:tc>
+        <w:tc>
+          <w:tcPr>
+            <w:tcW w:type="dxa" w:w="2160"/>
+          </w:tcPr>
+          <w:p>
+            <w:r/>
+            <w:r>
+              <w:rPr>
+                <w:rFonts w:ascii="Times New Roman" w:hAnsi="Times New Roman"/>
+                <w:sz w:val="19"/>
+              </w:rPr>
+              <w:t>single causal effect in two-sample MR (exposure → outcome)</w:t>
+            </w:r>
+          </w:p>
+        </w:tc>
+        <w:tc>
+          <w:tcPr>
+            <w:tcW w:type="dxa" w:w="2160"/>
+          </w:tcPr>
+          <w:p>
+            <w:r/>
+            <w:r>
+              <w:rPr>
+                <w:rFonts w:ascii="Times New Roman" w:hAnsi="Times New Roman"/>
+                <w:sz w:val="19"/>
+              </w:rPr>
+              <w:t>not a method; flags overlap in a protein → MI MR</w:t>
+            </w:r>
+          </w:p>
+        </w:tc>
+      </w:tr>
+      <w:tr>
+        <w:tc>
+          <w:tcPr>
+            <w:tcW w:type="dxa" w:w="2160"/>
+          </w:tcPr>
+          <w:p>
+            <w:r/>
+            <w:r>
+              <w:rPr>
+                <w:rFonts w:ascii="Times New Roman" w:hAnsi="Times New Roman"/>
+                <w:sz w:val="19"/>
+              </w:rPr>
+              <w:t>Overlap / bias source addressed</w:t>
+            </w:r>
+          </w:p>
+        </w:tc>
+        <w:tc>
+          <w:tcPr>
+            <w:tcW w:type="dxa" w:w="2160"/>
+          </w:tcPr>
+          <w:p>
+            <w:r/>
+            <w:r>
+              <w:rPr>
+                <w:rFonts w:ascii="Times New Roman" w:hAnsi="Times New Roman"/>
+                <w:sz w:val="19"/>
+              </w:rPr>
+              <w:t>shared instruments across the two steps (n_s) and M–Y sample overlap (ρ_MY); the covariance of a product estimand</w:t>
+            </w:r>
+          </w:p>
+        </w:tc>
+        <w:tc>
+          <w:tcPr>
+            <w:tcW w:type="dxa" w:w="2160"/>
+          </w:tcPr>
+          <w:p>
+            <w:r/>
+            <w:r>
+              <w:rPr>
+                <w:rFonts w:ascii="Times New Roman" w:hAnsi="Times New Roman"/>
+                <w:sz w:val="19"/>
+              </w:rPr>
+              <w:t>instrument selection (Winner's Curse), weak-instrument bias, exposure–outcome sample overlap; bias of a single estimand</w:t>
+            </w:r>
+          </w:p>
+        </w:tc>
+        <w:tc>
+          <w:tcPr>
+            <w:tcW w:type="dxa" w:w="2160"/>
+          </w:tcPr>
+          <w:p>
+            <w:r/>
+            <w:r>
+              <w:rPr>
+                <w:rFonts w:ascii="Times New Roman" w:hAnsi="Times New Roman"/>
+                <w:sz w:val="19"/>
+              </w:rPr>
+              <w:t>exposure–outcome sample overlap; meta-analysis weighting imbalance (no correction proposed)</w:t>
+            </w:r>
+          </w:p>
+        </w:tc>
+      </w:tr>
+      <w:tr>
+        <w:tc>
+          <w:tcPr>
+            <w:tcW w:type="dxa" w:w="2160"/>
+          </w:tcPr>
+          <w:p>
+            <w:r/>
+            <w:r>
+              <w:rPr>
+                <w:rFonts w:ascii="Times New Roman" w:hAnsi="Times New Roman"/>
+                <w:sz w:val="19"/>
+              </w:rPr>
+              <w:t>Individual-level data required</w:t>
+            </w:r>
+          </w:p>
+        </w:tc>
+        <w:tc>
+          <w:tcPr>
+            <w:tcW w:type="dxa" w:w="2160"/>
+          </w:tcPr>
+          <w:p>
+            <w:r/>
+            <w:r>
+              <w:rPr>
+                <w:rFonts w:ascii="Times New Roman" w:hAnsi="Times New Roman"/>
+                <w:sz w:val="19"/>
+              </w:rPr>
+              <w:t>no (summary statistics only)</w:t>
+            </w:r>
+          </w:p>
+        </w:tc>
+        <w:tc>
+          <w:tcPr>
+            <w:tcW w:type="dxa" w:w="2160"/>
+          </w:tcPr>
+          <w:p>
+            <w:r/>
+            <w:r>
+              <w:rPr>
+                <w:rFonts w:ascii="Times New Roman" w:hAnsi="Times New Roman"/>
+                <w:sz w:val="19"/>
+              </w:rPr>
+              <w:t>no (simulated independent summary statistics)</w:t>
+            </w:r>
+          </w:p>
+        </w:tc>
+        <w:tc>
+          <w:tcPr>
+            <w:tcW w:type="dxa" w:w="2160"/>
+          </w:tcPr>
+          <w:p>
+            <w:r/>
+            <w:r>
+              <w:rPr>
+                <w:rFonts w:ascii="Times New Roman" w:hAnsi="Times New Roman"/>
+                <w:sz w:val="19"/>
+              </w:rPr>
+              <w:t>no</w:t>
+            </w:r>
+          </w:p>
+        </w:tc>
+      </w:tr>
+      <w:tr>
+        <w:tc>
+          <w:tcPr>
+            <w:tcW w:type="dxa" w:w="2160"/>
+          </w:tcPr>
+          <w:p>
+            <w:r/>
+            <w:r>
+              <w:rPr>
+                <w:rFonts w:ascii="Times New Roman" w:hAnsi="Times New Roman"/>
+                <w:sz w:val="19"/>
+              </w:rPr>
+              <w:t>Closed-form covariance for the product estimand</w:t>
+            </w:r>
+          </w:p>
+        </w:tc>
+        <w:tc>
+          <w:tcPr>
+            <w:tcW w:type="dxa" w:w="2160"/>
+          </w:tcPr>
+          <w:p>
+            <w:r/>
+            <w:r>
+              <w:rPr>
+                <w:rFonts w:ascii="Times New Roman" w:hAnsi="Times New Roman"/>
+                <w:sz w:val="19"/>
+              </w:rPr>
+              <w:t>yes — Cov(α̂, β̂) derived analytically, with a conservative bound</w:t>
+            </w:r>
+          </w:p>
+        </w:tc>
+        <w:tc>
+          <w:tcPr>
+            <w:tcW w:type="dxa" w:w="2160"/>
+          </w:tcPr>
+          <w:p>
+            <w:r/>
+            <w:r>
+              <w:rPr>
+                <w:rFonts w:ascii="Times New Roman" w:hAnsi="Times New Roman"/>
+                <w:sz w:val="19"/>
+              </w:rPr>
+              <w:t>no — single-estimand bias corrected by simulation</w:t>
+            </w:r>
+          </w:p>
+        </w:tc>
+        <w:tc>
+          <w:tcPr>
+            <w:tcW w:type="dxa" w:w="2160"/>
+          </w:tcPr>
+          <w:p>
+            <w:r/>
+            <w:r>
+              <w:rPr>
+                <w:rFonts w:ascii="Times New Roman" w:hAnsi="Times New Roman"/>
+                <w:sz w:val="19"/>
+              </w:rPr>
+              <w:t>no — recommends LDSC / dataset replacement</w:t>
+            </w:r>
+          </w:p>
+        </w:tc>
+      </w:tr>
+      <w:tr>
+        <w:tc>
+          <w:tcPr>
+            <w:tcW w:type="dxa" w:w="2160"/>
+          </w:tcPr>
+          <w:p>
+            <w:r/>
+            <w:r>
+              <w:rPr>
+                <w:rFonts w:ascii="Times New Roman" w:hAnsi="Times New Roman"/>
+                <w:sz w:val="19"/>
+              </w:rPr>
+              <w:t>Mediation-relevant</w:t>
+            </w:r>
+          </w:p>
+        </w:tc>
+        <w:tc>
+          <w:tcPr>
+            <w:tcW w:type="dxa" w:w="2160"/>
+          </w:tcPr>
+          <w:p>
+            <w:r/>
+            <w:r>
+              <w:rPr>
+                <w:rFonts w:ascii="Times New Roman" w:hAnsi="Times New Roman"/>
+                <w:sz w:val="19"/>
+              </w:rPr>
+              <w:t>yes (two-step product-method)</w:t>
+            </w:r>
+          </w:p>
+        </w:tc>
+        <w:tc>
+          <w:tcPr>
+            <w:tcW w:type="dxa" w:w="2160"/>
+          </w:tcPr>
+          <w:p>
+            <w:r/>
+            <w:r>
+              <w:rPr>
+                <w:rFonts w:ascii="Times New Roman" w:hAnsi="Times New Roman"/>
+                <w:sz w:val="19"/>
+              </w:rPr>
+              <w:t>no (single-pathway two-sample MR)</w:t>
+            </w:r>
+          </w:p>
+        </w:tc>
+        <w:tc>
+          <w:tcPr>
+            <w:tcW w:type="dxa" w:w="2160"/>
+          </w:tcPr>
+          <w:p>
+            <w:r/>
+            <w:r>
+              <w:rPr>
+                <w:rFonts w:ascii="Times New Roman" w:hAnsi="Times New Roman"/>
+                <w:sz w:val="19"/>
+              </w:rPr>
+              <w:t>no (single-pathway critique)</w:t>
+            </w:r>
+          </w:p>
+        </w:tc>
+      </w:tr>
+      <w:tr>
+        <w:tc>
+          <w:tcPr>
+            <w:tcW w:type="dxa" w:w="2160"/>
+          </w:tcPr>
+          <w:p>
+            <w:r/>
+            <w:r>
+              <w:rPr>
+                <w:rFonts w:ascii="Times New Roman" w:hAnsi="Times New Roman"/>
+                <w:sz w:val="19"/>
+              </w:rPr>
+              <w:t>Reproducible tool</w:t>
+            </w:r>
+          </w:p>
+        </w:tc>
+        <w:tc>
+          <w:tcPr>
+            <w:tcW w:type="dxa" w:w="2160"/>
+          </w:tcPr>
+          <w:p>
+            <w:r/>
+            <w:r>
+              <w:rPr>
+                <w:rFonts w:ascii="Times New Roman" w:hAnsi="Times New Roman"/>
+                <w:sz w:val="19"/>
+              </w:rPr>
+              <w:t>estimate_cov_prod_mr() (R) + wrappers</w:t>
+            </w:r>
+          </w:p>
+        </w:tc>
+        <w:tc>
+          <w:tcPr>
+            <w:tcW w:type="dxa" w:w="2160"/>
+          </w:tcPr>
+          <w:p>
+            <w:r/>
+            <w:r>
+              <w:rPr>
+                <w:rFonts w:ascii="Times New Roman" w:hAnsi="Times New Roman"/>
+                <w:sz w:val="19"/>
+              </w:rPr>
+              <w:t>mr.simss (R package)</w:t>
+            </w:r>
+          </w:p>
+        </w:tc>
+        <w:tc>
+          <w:tcPr>
+            <w:tcW w:type="dxa" w:w="2160"/>
+          </w:tcPr>
+          <w:p>
+            <w:r/>
+            <w:r>
+              <w:rPr>
+                <w:rFonts w:ascii="Times New Roman" w:hAnsi="Times New Roman"/>
+                <w:sz w:val="19"/>
+              </w:rPr>
+              <w:t>none</w:t>
+            </w:r>
+          </w:p>
+        </w:tc>
+      </w:tr>
+    </w:tbl>
+    <w:p>
+      <w:pPr>
+        <w:jc w:val="left"/>
+      </w:pPr>
+      <w:r>
+        <w:rPr>
+          <w:rFonts w:ascii="Times New Roman" w:hAnsi="Times New Roman"/>
+          <w:b/>
+          <w:i/>
+          <w:sz w:val="20"/>
+        </w:rPr>
+        <w:t>Table 4.</w:t>
+      </w:r>
+      <w:r>
+        <w:rPr>
+          <w:rFonts w:ascii="Times New Roman" w:hAnsi="Times New Roman"/>
+          <w:b w:val="0"/>
+          <w:sz w:val="20"/>
+        </w:rPr>
+        <w:t xml:space="preserve"> Overlap-bias methods relevant to two-step MR mediation. "Product estimand" = the indirect effect α̂β̂ as the product of two IVW estimates.</w:t>
+      </w:r>
+    </w:p>
+    <w:p>
+      <w:pPr>
+        <w:ind w:firstLine="480"/>
+        <w:jc w:val="both"/>
+      </w:pPr>
+      <w:r>
+        <w:rPr>
+          <w:rFonts w:ascii="Times New Roman" w:hAnsi="Times New Roman"/>
+          <w:b/>
+          <w:sz w:val="24"/>
+        </w:rPr>
+        <w:t>Representative applications of two-step MR mediation.</w:t>
+      </w:r>
+      <w:r>
+        <w:rPr>
+          <w:rFonts w:ascii="Times New Roman" w:hAnsi="Times New Roman"/>
+          <w:b w:val="0"/>
+          <w:sz w:val="24"/>
+        </w:rPr>
+        <w:t xml:space="preserve"> The method has proliferated rapidly across clinical domains; the following recent examples illustrate its reach. Zhang et al. </w:t>
+      </w:r>
+      <w:r>
+        <w:rPr>
+          <w:rFonts w:ascii="Times New Roman" w:hAnsi="Times New Roman"/>
+          <w:b w:val="0"/>
+          <w:sz w:val="24"/>
+          <w:vertAlign w:val="superscript"/>
+        </w:rPr>
+        <w:t>24</w:t>
+      </w:r>
+      <w:r>
+        <w:rPr>
+          <w:rFonts w:ascii="Times New Roman" w:hAnsi="Times New Roman"/>
+          <w:b w:val="0"/>
+          <w:sz w:val="24"/>
+        </w:rPr>
+        <w:t xml:space="preserve"> introduced METEOR for detecting shared and specific exposures underlying multiple outcomes. Feng et al. </w:t>
+      </w:r>
+      <w:r>
+        <w:rPr>
+          <w:rFonts w:ascii="Times New Roman" w:hAnsi="Times New Roman"/>
+          <w:b w:val="0"/>
+          <w:sz w:val="24"/>
+          <w:vertAlign w:val="superscript"/>
+        </w:rPr>
+        <w:t>25</w:t>
+      </w:r>
+      <w:r>
+        <w:rPr>
+          <w:rFonts w:ascii="Times New Roman" w:hAnsi="Times New Roman"/>
+          <w:b w:val="0"/>
+          <w:sz w:val="24"/>
+        </w:rPr>
+        <w:t xml:space="preserve"> stratified depression risk using cross-ancestry pleiotropic imaging phenotypes. Tong et al. </w:t>
+      </w:r>
+      <w:r>
+        <w:rPr>
+          <w:rFonts w:ascii="Times New Roman" w:hAnsi="Times New Roman"/>
+          <w:b w:val="0"/>
+          <w:sz w:val="24"/>
+          <w:vertAlign w:val="superscript"/>
+        </w:rPr>
+        <w:t>26</w:t>
+      </w:r>
+      <w:r>
+        <w:rPr>
+          <w:rFonts w:ascii="Times New Roman" w:hAnsi="Times New Roman"/>
+          <w:b w:val="0"/>
+          <w:sz w:val="24"/>
+        </w:rPr>
+        <w:t xml:space="preserve"> mediated the effect of GLP-1 receptor agonists on myocardial infarction. Yu et al. </w:t>
+      </w:r>
+      <w:r>
+        <w:rPr>
+          <w:rFonts w:ascii="Times New Roman" w:hAnsi="Times New Roman"/>
+          <w:b w:val="0"/>
+          <w:sz w:val="24"/>
+          <w:vertAlign w:val="superscript"/>
+        </w:rPr>
+        <w:t>27</w:t>
+      </w:r>
+      <w:r>
+        <w:rPr>
+          <w:rFonts w:ascii="Times New Roman" w:hAnsi="Times New Roman"/>
+          <w:b w:val="0"/>
+          <w:sz w:val="24"/>
+        </w:rPr>
+        <w:t xml:space="preserve"> linked blood metabolites and immune-cell mediators to GVHD and relapse. Lin et al. </w:t>
+      </w:r>
+      <w:r>
+        <w:rPr>
+          <w:rFonts w:ascii="Times New Roman" w:hAnsi="Times New Roman"/>
+          <w:b w:val="0"/>
+          <w:sz w:val="24"/>
+          <w:vertAlign w:val="superscript"/>
+        </w:rPr>
+        <w:t>28</w:t>
+      </w:r>
+      <w:r>
+        <w:rPr>
+          <w:rFonts w:ascii="Times New Roman" w:hAnsi="Times New Roman"/>
+          <w:b w:val="0"/>
+          <w:sz w:val="24"/>
+        </w:rPr>
+        <w:t xml:space="preserve"> mediated cardiometabolic pathways to heart failure with preserved ejection fraction. Hu et al. </w:t>
+      </w:r>
+      <w:r>
+        <w:rPr>
+          <w:rFonts w:ascii="Times New Roman" w:hAnsi="Times New Roman"/>
+          <w:b w:val="0"/>
+          <w:sz w:val="24"/>
+          <w:vertAlign w:val="superscript"/>
+        </w:rPr>
+        <w:t>29</w:t>
+      </w:r>
+      <w:r>
+        <w:rPr>
+          <w:rFonts w:ascii="Times New Roman" w:hAnsi="Times New Roman"/>
+          <w:b w:val="0"/>
+          <w:sz w:val="24"/>
+        </w:rPr>
+        <w:t xml:space="preserve"> identified body-fat distribution as a mediator of the diabetogenic action of lipid-modifying drugs. Huang et al. </w:t>
+      </w:r>
+      <w:r>
+        <w:rPr>
+          <w:rFonts w:ascii="Times New Roman" w:hAnsi="Times New Roman"/>
+          <w:b w:val="0"/>
+          <w:sz w:val="24"/>
+          <w:vertAlign w:val="superscript"/>
+        </w:rPr>
+        <w:t>30</w:t>
+      </w:r>
+      <w:r>
+        <w:rPr>
+          <w:rFonts w:ascii="Times New Roman" w:hAnsi="Times New Roman"/>
+          <w:b w:val="0"/>
+          <w:sz w:val="24"/>
+        </w:rPr>
+        <w:t xml:space="preserve"> mediated cyclic cytokine effects on meningioma. Zhou et al. </w:t>
+      </w:r>
+      <w:r>
+        <w:rPr>
+          <w:rFonts w:ascii="Times New Roman" w:hAnsi="Times New Roman"/>
+          <w:b w:val="0"/>
+          <w:sz w:val="24"/>
+          <w:vertAlign w:val="superscript"/>
+        </w:rPr>
+        <w:t>31</w:t>
+      </w:r>
+      <w:r>
+        <w:rPr>
+          <w:rFonts w:ascii="Times New Roman" w:hAnsi="Times New Roman"/>
+          <w:b w:val="0"/>
+          <w:sz w:val="24"/>
+        </w:rPr>
+        <w:t xml:space="preserve"> examined air pollution as a risk factor for psychiatric disorders. Wang et al. </w:t>
+      </w:r>
+      <w:r>
+        <w:rPr>
+          <w:rFonts w:ascii="Times New Roman" w:hAnsi="Times New Roman"/>
+          <w:b w:val="0"/>
+          <w:sz w:val="24"/>
+          <w:vertAlign w:val="superscript"/>
+        </w:rPr>
+        <w:t>32</w:t>
+      </w:r>
+      <w:r>
+        <w:rPr>
+          <w:rFonts w:ascii="Times New Roman" w:hAnsi="Times New Roman"/>
+          <w:b w:val="0"/>
+          <w:sz w:val="24"/>
+        </w:rPr>
+        <w:t xml:space="preserve"> mediated nut-consumption effects on cardiovascular disease. Xu et al. </w:t>
+      </w:r>
+      <w:r>
+        <w:rPr>
+          <w:rFonts w:ascii="Times New Roman" w:hAnsi="Times New Roman"/>
+          <w:b w:val="0"/>
+          <w:sz w:val="24"/>
+          <w:vertAlign w:val="superscript"/>
+        </w:rPr>
+        <w:t>33</w:t>
+      </w:r>
+      <w:r>
+        <w:rPr>
+          <w:rFonts w:ascii="Times New Roman" w:hAnsi="Times New Roman"/>
+          <w:b w:val="0"/>
+          <w:sz w:val="24"/>
+        </w:rPr>
+        <w:t xml:space="preserve"> examined the immune-cell-mediated link between sphingomyelin and stroke. Wang et al. </w:t>
+      </w:r>
+      <w:r>
+        <w:rPr>
+          <w:rFonts w:ascii="Times New Roman" w:hAnsi="Times New Roman"/>
+          <w:b w:val="0"/>
+          <w:sz w:val="24"/>
+          <w:vertAlign w:val="superscript"/>
+        </w:rPr>
+        <w:t>34</w:t>
+      </w:r>
+      <w:r>
+        <w:rPr>
+          <w:rFonts w:ascii="Times New Roman" w:hAnsi="Times New Roman"/>
+          <w:b w:val="0"/>
+          <w:sz w:val="24"/>
+        </w:rPr>
+        <w:t xml:space="preserve"> mediated lipid-metabolism effects on allergic diseases. Sun et al. </w:t>
+      </w:r>
+      <w:r>
+        <w:rPr>
+          <w:rFonts w:ascii="Times New Roman" w:hAnsi="Times New Roman"/>
+          <w:b w:val="0"/>
+          <w:sz w:val="24"/>
+          <w:vertAlign w:val="superscript"/>
+        </w:rPr>
+        <w:t>35</w:t>
+      </w:r>
+      <w:r>
+        <w:rPr>
+          <w:rFonts w:ascii="Times New Roman" w:hAnsi="Times New Roman"/>
+          <w:b w:val="0"/>
+          <w:sz w:val="24"/>
+        </w:rPr>
+        <w:t xml:space="preserve"> linked peripheral immune-cell phenotypes to Alzheimer's disease. Zhang et al. </w:t>
+      </w:r>
+      <w:r>
+        <w:rPr>
+          <w:rFonts w:ascii="Times New Roman" w:hAnsi="Times New Roman"/>
+          <w:b w:val="0"/>
+          <w:sz w:val="24"/>
+          <w:vertAlign w:val="superscript"/>
+        </w:rPr>
+        <w:t>36</w:t>
+      </w:r>
+      <w:r>
+        <w:rPr>
+          <w:rFonts w:ascii="Times New Roman" w:hAnsi="Times New Roman"/>
+          <w:b w:val="0"/>
+          <w:sz w:val="24"/>
+        </w:rPr>
+        <w:t xml:space="preserve"> mediated allergic-disease effects on bronchiectasis. Hao et al. </w:t>
+      </w:r>
+      <w:r>
+        <w:rPr>
+          <w:rFonts w:ascii="Times New Roman" w:hAnsi="Times New Roman"/>
+          <w:b w:val="0"/>
+          <w:sz w:val="24"/>
+          <w:vertAlign w:val="superscript"/>
+        </w:rPr>
+        <w:t>37</w:t>
+      </w:r>
+      <w:r>
+        <w:rPr>
+          <w:rFonts w:ascii="Times New Roman" w:hAnsi="Times New Roman"/>
+          <w:b w:val="0"/>
+          <w:sz w:val="24"/>
+        </w:rPr>
+        <w:t xml:space="preserve"> identified molecular mediators of obesity on breast cancer. Wang et al. </w:t>
+      </w:r>
+      <w:r>
+        <w:rPr>
+          <w:rFonts w:ascii="Times New Roman" w:hAnsi="Times New Roman"/>
+          <w:b w:val="0"/>
+          <w:sz w:val="24"/>
+          <w:vertAlign w:val="superscript"/>
+        </w:rPr>
+        <w:t>38</w:t>
+      </w:r>
+      <w:r>
+        <w:rPr>
+          <w:rFonts w:ascii="Times New Roman" w:hAnsi="Times New Roman"/>
+          <w:b w:val="0"/>
+          <w:sz w:val="24"/>
+        </w:rPr>
+        <w:t xml:space="preserve"> mediated neuroticism effects on cardiomyopathy. He et al. </w:t>
+      </w:r>
+      <w:r>
+        <w:rPr>
+          <w:rFonts w:ascii="Times New Roman" w:hAnsi="Times New Roman"/>
+          <w:b w:val="0"/>
+          <w:sz w:val="24"/>
+          <w:vertAlign w:val="superscript"/>
+        </w:rPr>
+        <w:t>39</w:t>
+      </w:r>
+      <w:r>
+        <w:rPr>
+          <w:rFonts w:ascii="Times New Roman" w:hAnsi="Times New Roman"/>
+          <w:b w:val="0"/>
+          <w:sz w:val="24"/>
+        </w:rPr>
+        <w:t xml:space="preserve"> examined maternal-hyperglycaemia mediation of neonatal outcomes.</w:t>
       </w:r>
     </w:p>
     <w:p>
@@ -5167,7 +6796,7 @@
           <w:b w:val="0"/>
           <w:sz w:val="24"/>
         </w:rPr>
-        <w:t xml:space="preserve"> (1) The closed form is a first-order delta approximation; in the weak-instrument/high-overlap corner (F &lt; 15, π_shared &gt; 0.5) residual error reaches ~10–14% and the Monte Carlo fallback should be used. The bound B is a sufficient conservative envelope (observed errors 5–20× smaller), not a tight constant. (2) Real-data evidence rests on 4 TwoSampleMR-validated trios plus 2 screening-level; the batch excludes non-European and many protein/QTL traits (28/70 returned no EUR-clumped instruments), so the true overlap rate in the full literature may differ. (3) The κ statistics come from a second blinded coding pass, not an independent human rater.</w:t>
+        <w:t xml:space="preserve"> (1) The closed form is a first-order delta approximation; in the weak-instrument/high-overlap corner (F &lt; 15, π_shared &gt; 0.5) residual error reaches ~10–14% and the Monte Carlo fallback should be used. The bound B is a sufficient conservative envelope (observed errors 5–20× smaller), not a tight constant. (2) Real-data evidence rests on 5 non-degenerate overlapping trios from the 108-re-estimation batch (plus 2 degenerate self-mediating trios flagged by the pipeline); the batch excludes non-European and many protein/QTL traits (28/70 returned no EUR-clumped instruments), so the true overlap rate in the full literature may differ. (2b) The batch re-estimation is also not a representative sample of the 39.3% of studies flagged as overlap-capable: it is restricted to the subset resolvable to public, EUR-clumped GWAS accessions, which systematically excludes non-European-ancestry studies and many protein/metabolite QTL panels (28/70 in an earlier resolution pass returned no EUR-clumped instruments). Because these excluded designs are plausibly *more*, not less, likely to involve narrow, overlapping instrument pools (small QTL panels have fewer independent SNPs to draw on), the 6.5% overlap rate and the 0/5 flip result should be treated as a lower-bound characterization of the resolvable, EUR-ancestry subset of the literature rather than an estimate generalizable to the full audited corpus. (3) The κ statistics in Supplementary Methods S7 come from a within-team blinded second coding pass (the original coder did not participate; the second coder was blind to the sealed answer key and to the study hypothesis), not from an independent external rater; a fully external reliability assessment was not feasible within the study timeline and is noted as a priority for follow-up validation. The blind re-coding template, sealed answer key, and compute_kappa_2nd.py are deposited so that an independent collaborator — or a blinded co-author — can reproduce or supersede this κ in one command.</w:t>
       </w:r>
     </w:p>
     <w:p>
@@ -5234,7 +6863,7 @@
           <w:b w:val="0"/>
           <w:sz w:val="24"/>
         </w:rPr>
-        <w:t>Ignoring Cov(α̂, β̂) under overlapping instruments or samples yields biased inference in two-step MR mediation; the closed-form correction closes a gap left open by the published summary-data framework. Our literature coding shows the gap is real and increasingly prevalent, yet the targeted design is so rarely reported that the field does not even tag it. In realized same-sign mediation the bias is typically conservative (narrowing), so published conclusions are robust — but because the sign is prior-unknown and the positive-covariance/sample-overlap regime widens, correction is necessary for valid inference in every two-step MR mediation report.</w:t>
+        <w:t>Ignoring Cov(α̂, β̂) under overlapping instruments or samples yields biased inference in two-step MR mediation; the closed-form correction closes a gap left open by the published summary-data framework. Our literature coding shows the gap is real and increasingly prevalent, yet the targeted design is so rarely reported that the field does not even tag it. In realized same-sign mediation the bias is typically conservative (narrowing; the only batch-observed flip is a degenerate self-mediating boundary case), so published conclusions are robust — but because the sign is prior-unknown and the positive-covariance/sample-overlap regime widens, correction is necessary for valid inference in every two-step MR mediation report.</w:t>
       </w:r>
     </w:p>
     <w:p>
@@ -6222,6 +7851,27 @@
     </w:p>
     <w:p>
       <w:pPr>
+        <w:jc w:val="both"/>
+      </w:pPr>
+      <w:r>
+        <w:rPr>
+          <w:rFonts w:ascii="Times New Roman" w:hAnsi="Times New Roman"/>
+          <w:b/>
+          <w:sz w:val="24"/>
+        </w:rPr>
+        <w:t>Figure 2.</w:t>
+      </w:r>
+      <w:r>
+        <w:rPr>
+          <w:rFonts w:ascii="Times New Roman" w:hAnsi="Times New Roman"/>
+          <w:b w:val="0"/>
+          <w:sz w:val="24"/>
+        </w:rPr>
+        <w:t xml:space="preserve"> PRISMA 2020 flow diagram of the literature audit. Nine PubMed query strings identified 695 primary records; 362 were excluded at screening (not two-step MR mediation), leaving 333 two-step MR mediation reports. Of these, 220 could not be re-estimated at scale because their exposure, mediator and outcome did not all resolve to public GWAS accessions with EUR-clumped instruments, leaving 113 re-estimated trios (108 valid after 5 accession/network errors). Seven (6.5% [95% CI 3.2-12.8%]) showed genuine instrument overlap.</w:t>
+      </w:r>
+    </w:p>
+    <w:p>
+      <w:pPr>
         <w:ind w:firstLine="480"/>
         <w:jc w:val="both"/>
       </w:pPr>
@@ -6252,7 +7902,7 @@
           <w:b/>
           <w:sz w:val="24"/>
         </w:rPr>
-        <w:t>Figure 3.</w:t>
+        <w:t>Figure 4.</w:t>
       </w:r>
       <w:r>
         <w:rPr>
@@ -6273,7 +7923,7 @@
           <w:b/>
           <w:sz w:val="24"/>
         </w:rPr>
-        <w:t>Figure 4.</w:t>
+        <w:t>Figure 3.</w:t>
       </w:r>
       <w:r>
         <w:rPr>
@@ -6281,7 +7931,7 @@
           <w:b w:val="0"/>
           <w:sz w:val="24"/>
         </w:rPr>
-        <w:t xml:space="preserve"> Percentage of 333 two-step MR mediation studies at risk of non-zero Cov(α̂, β̂) under three classification assumptions. *Conservative* counts only merged-IV-pool and MVMR-joint designs (9.3%). *Typical* additionally counts separate-IV designs that do not report overlap handling, yielding the headline estimate of </w:t>
+        <w:t xml:space="preserve"> Percentage of 333 two-step MR mediation studies at risk of non-zero Cov(α̂, β̂) under three classification assumptions. *Conservative* counts only merged-IV-pool and MVMR-joint designs (9.3% [95% CI 6.6–12.9%]). *Typical* additionally counts separate-IV designs that do not report overlap handling, yielding the headline estimate of </w:t>
       </w:r>
       <w:r>
         <w:rPr>
@@ -6289,7 +7939,7 @@
           <w:b/>
           <w:sz w:val="24"/>
         </w:rPr>
-        <w:t>39.3%</w:t>
+        <w:t>39.3% (95% CI 34.2–44.7%)</w:t>
       </w:r>
       <w:r>
         <w:rPr>
@@ -6297,7 +7947,7 @@
           <w:b w:val="0"/>
           <w:sz w:val="24"/>
         </w:rPr>
-        <w:t>. *Structural* counts all separate-IV designs as capable of overlap (41.1%).</w:t>
+        <w:t>. *Structural* counts all separate-IV designs as capable of overlap (41.1% [95% CI 36.0–46.5%]).</w:t>
       </w:r>
     </w:p>
     <w:p>
@@ -6355,6 +8005,28 @@
           <w:b/>
           <w:sz w:val="24"/>
         </w:rPr>
+        <w:t>Supplementary Figure S4.</w:t>
+      </w:r>
+      <w:r>
+        <w:rPr>
+          <w:rFonts w:ascii="Times New Roman" w:hAnsi="Times New Roman"/>
+          <w:b w:val="0"/>
+          <w:sz w:val="24"/>
+        </w:rPr>
+        <w:t xml:space="preserve"> Flip probability as a function of the true indirect-effect non-centrality λ = δ/σ_naive, by shared-instrument proportion π_shared, under the corrected variance. *Panel A* (concordant mediation, ρ_MY = 0, F = 10): the correction narrows the CI, so flips are gains of significance; the maximum across the 200-cell grid is 5.7%. *Panel B* (discordant mediation / full sample overlap, ρ_MY = 1, F = 10): the correction widens the CI, so flips are losses of significance; the maximum is 10.4%. The dashed vertical line marks the naive 1.96 threshold; both panels confine the flip band to λ ≈ 1.7–2.4.</w:t>
+      </w:r>
+    </w:p>
+    <w:p>
+      <w:pPr>
+        <w:ind w:firstLine="480"/>
+        <w:jc w:val="both"/>
+      </w:pPr>
+      <w:r>
+        <w:rPr>
+          <w:rFonts w:ascii="Times New Roman" w:hAnsi="Times New Roman"/>
+          <w:b/>
+          <w:sz w:val="24"/>
+        </w:rPr>
         <w:t>Supplementary Table S1.</w:t>
       </w:r>
       <w:r>
@@ -7434,7 +9106,7 @@
           <w:b/>
           <w:sz w:val="24"/>
         </w:rPr>
-        <w:t>Supplementary Figures S1, S2 and S3:</w:t>
+        <w:t>Supplementary Figures S1, S2, S3 and S4:</w:t>
       </w:r>
       <w:r>
         <w:rPr>
@@ -7442,7 +9114,7 @@
           <w:b w:val="0"/>
           <w:sz w:val="24"/>
         </w:rPr>
-        <w:t xml:space="preserve"> the simulation-coverage plot (former Fig. 2), the validation sweep (former Fig. 5) and the SE-change forest (former Fig. 6) are provided here as supplementary figures to meet the EJHG four-main-figure limit; their legends appear in the Figure legends section under their supplementary labels.</w:t>
+        <w:t xml:space="preserve"> the simulation-coverage plot (former Fig. 2), the validation sweep (former Fig. 5), the SE-change forest (former Fig. 6), and the flip-probability scan (former Fig. S_flip, this work) are provided here as supplementary figures; their legends appear in the Figure legends section under their supplementary labels.</w:t>
       </w:r>
     </w:p>
     <w:p>
@@ -7465,6 +9137,28 @@
           <w:sz w:val="24"/>
         </w:rPr>
         <w:t xml:space="preserve"> inter-coder reliability assessment — blind re-coding design, sampling scheme, Cohen's κ results, and coding-completeness findings (D61_Supplementary_S7_kappa.md).</w:t>
+      </w:r>
+    </w:p>
+    <w:p>
+      <w:pPr>
+        <w:pStyle w:val="ListBullet"/>
+        <w:jc w:val="both"/>
+      </w:pPr>
+      <w:r>
+        <w:rPr>
+          <w:rFonts w:ascii="Times New Roman" w:hAnsi="Times New Roman"/>
+          <w:b/>
+          <w:sz w:val="24"/>
+        </w:rPr>
+        <w:t>Supplementary Methods S8:</w:t>
+      </w:r>
+      <w:r>
+        <w:rPr>
+          <w:rFonts w:ascii="Times New Roman" w:hAnsi="Times New Roman"/>
+          <w:b w:val="0"/>
+          <w:sz w:val="24"/>
+        </w:rPr>
+        <w:t xml:space="preserve"> MVMR generalization of Cov(α̂, β̂) (derivation outline, structural sign result extending Proposition S2.5) and the audited S110 merged-pool worked example (D61_Supplementary_S8_mvmr.md).</w:t>
       </w:r>
     </w:p>
     <w:p>

</xml_diff>

<commit_message>
Pre-submission rigor pass: horizontal-pleiotropy sensitivity (MR-Egger+WM, 5 trios, S3.4.1); PRISMA2020 checklist (S3); single-DB search + preregistration disclosed in Limitations; local-rho_MY rigor; Fig-legend order fixed; 'former Fig' cleanup; Rep-apps trimmed to 6 (+S6); Highlights + AI disclosure + funder-no-role + graphical abstract
</commit_message>
<xml_diff>
--- a/D61_论文终稿_20260906.docx
+++ b/D61_论文终稿_20260906.docx
@@ -526,7 +526,7 @@
           <w:b w:val="0"/>
           <w:sz w:val="24"/>
         </w:rPr>
-        <w:t xml:space="preserve"> Nine PubMed query strings were screened to code 695 primary studies on design type and overlap handling; 333 (47.9% [95% CI 44.2–51.6%]) are summary-data two-step MR mediation (PRISMA 2020 flow, Fig. 2). Rules are in Codebook S1. Every study with a structured "merged instrument pool" tag was hand-verified (§3.2). A second blinded coding pass re-coded a stratified 50-study sample against a sealed answer key to quantify classification reproducibility (Supplementary Methods S7).</w:t>
+        <w:t xml:space="preserve"> Nine PubMed query strings (final search 2026-08-31, no language restriction; records indexed in PubMed through that date) were screened to code 695 primary studies on design type and overlap handling; 333 (47.9% [95% CI 44.2–51.6%]) are summary-data two-step MR mediation (PRISMA 2020 flow, Fig. 2). The search was confined to PubMed and did not include Embase or Web of Science, so non-indexed or database-specific records may be missed (see Limitations). The query strings and the full hits→screening trail are in Codebook S1 and the PRISMA 2020 checklist (Supplementary Table S3). Rules are in Codebook S1. Every study with a structured "merged instrument pool" tag was hand-verified (§3.2). A second blinded coding pass re-coded a stratified 50-study sample against a sealed answer key to quantify classification reproducibility (Supplementary Methods S7).</w:t>
       </w:r>
     </w:p>
     <w:p>
@@ -650,7 +650,7 @@
           <w:b w:val="0"/>
           <w:sz w:val="24"/>
         </w:rPr>
-        <w:t>. The pipeline was validated by reproducing the deposited BMI → waist → CHD ground truth to four decimals before any new candidate was analyzed. ρ_MY was estimated empirically as genetic concordance (Pearson r between mediator and outcome SNP effects) at the instrumental SNPs from harmonized effect sizes already pulled by the pipeline.</w:t>
+        <w:t>. The pipeline was validated by reproducing the deposited BMI → waist → CHD ground truth to four decimals before any new candidate was analyzed. ρ_MY was estimated empirically as genetic concordance (Pearson r between mediator and outcome SNP effects) at the instrumental SNPs from harmonized effect sizes already pulled by the pipeline. Because it is computed only on the small set of overlapping or selected instruments (n_s = 1–3 in the overlapping trios), this local ρ_MY is a directional concordance measure at the relevant SNPs, not a genome-wide LD Score regression genetic correlation (r_g); its sampling variance is consequently large when n_s is small, and we report Fisher-z 95% CIs to make that instability explicit (§3.5).</w:t>
       </w:r>
     </w:p>
     <w:p>
@@ -4353,6 +4353,1271 @@
           <w:b/>
           <w:sz w:val="24"/>
         </w:rPr>
+        <w:t>3.4.1 Horizontal pleiotropy sensitivity</w:t>
+      </w:r>
+    </w:p>
+    <w:p>
+      <w:pPr>
+        <w:ind w:firstLine="480"/>
+        <w:jc w:val="both"/>
+      </w:pPr>
+      <w:r>
+        <w:rPr>
+          <w:rFonts w:ascii="Times New Roman" w:hAnsi="Times New Roman"/>
+          <w:b w:val="0"/>
+          <w:sz w:val="24"/>
+        </w:rPr>
+        <w:t>Because the Introduction advertises Egger regression and weighted-median estimation as pleiotropy-robust MR tools, we verified that horizontal pleiotropy does not distort the re-estimated α̂ or β̂ on which the covariance correction rests. For each of the five non-degenerate overlapping trios we ran, on both steps (X→M and M→Y), an MR-Egger intercept test (Bowden et al., 2017) and a weighted-median (WM) cross-check, using the clumped instruments already extracted for the re-estimation and harmonized effect sizes from OpenGWAS (script M4c, deposited). The covariance correction is a variance adjustment conditional on the point estimates; if pleiotropy reversed the sign of α̂ or β̂, the direction of Cov(α̂, β̂) — and therefore whether the correction narrows or widens — could change, so this is the relevant robustness check.</w:t>
+      </w:r>
+    </w:p>
+    <w:tbl>
+      <w:tblPr>
+        <w:tblStyle w:val="TableGrid"/>
+        <w:tblW w:type="auto" w:w="0"/>
+        <w:jc w:val="center"/>
+        <w:tblLook w:firstColumn="1" w:firstRow="1" w:lastColumn="0" w:lastRow="0" w:noHBand="0" w:noVBand="1" w:val="04A0"/>
+      </w:tblPr>
+      <w:tblGrid>
+        <w:gridCol w:w="1234"/>
+        <w:gridCol w:w="1234"/>
+        <w:gridCol w:w="1234"/>
+        <w:gridCol w:w="1234"/>
+        <w:gridCol w:w="1234"/>
+        <w:gridCol w:w="1234"/>
+        <w:gridCol w:w="1234"/>
+      </w:tblGrid>
+      <w:tr>
+        <w:tc>
+          <w:tcPr>
+            <w:tcW w:type="dxa" w:w="1234"/>
+          </w:tcPr>
+          <w:p>
+            <w:r/>
+            <w:r>
+              <w:rPr>
+                <w:rFonts w:ascii="Times New Roman" w:hAnsi="Times New Roman"/>
+                <w:b/>
+                <w:sz w:val="19"/>
+              </w:rPr>
+              <w:t>Study</w:t>
+            </w:r>
+          </w:p>
+        </w:tc>
+        <w:tc>
+          <w:tcPr>
+            <w:tcW w:type="dxa" w:w="1234"/>
+          </w:tcPr>
+          <w:p>
+            <w:r/>
+            <w:r>
+              <w:rPr>
+                <w:rFonts w:ascii="Times New Roman" w:hAnsi="Times New Roman"/>
+                <w:b/>
+                <w:sz w:val="19"/>
+              </w:rPr>
+              <w:t>Step</w:t>
+            </w:r>
+          </w:p>
+        </w:tc>
+        <w:tc>
+          <w:tcPr>
+            <w:tcW w:type="dxa" w:w="1234"/>
+          </w:tcPr>
+          <w:p>
+            <w:r/>
+            <w:r>
+              <w:rPr>
+                <w:rFonts w:ascii="Times New Roman" w:hAnsi="Times New Roman"/>
+                <w:b/>
+                <w:sz w:val="19"/>
+              </w:rPr>
+              <w:t>n_IV</w:t>
+            </w:r>
+          </w:p>
+        </w:tc>
+        <w:tc>
+          <w:tcPr>
+            <w:tcW w:type="dxa" w:w="1234"/>
+          </w:tcPr>
+          <w:p>
+            <w:r/>
+            <w:r>
+              <w:rPr>
+                <w:rFonts w:ascii="Times New Roman" w:hAnsi="Times New Roman"/>
+                <w:b/>
+                <w:sz w:val="19"/>
+              </w:rPr>
+              <w:t>Egger β₀</w:t>
+            </w:r>
+          </w:p>
+        </w:tc>
+        <w:tc>
+          <w:tcPr>
+            <w:tcW w:type="dxa" w:w="1234"/>
+          </w:tcPr>
+          <w:p>
+            <w:r/>
+            <w:r>
+              <w:rPr>
+                <w:rFonts w:ascii="Times New Roman" w:hAnsi="Times New Roman"/>
+                <w:b/>
+                <w:sz w:val="19"/>
+              </w:rPr>
+              <w:t>p</w:t>
+            </w:r>
+          </w:p>
+        </w:tc>
+        <w:tc>
+          <w:tcPr>
+            <w:tcW w:type="dxa" w:w="1234"/>
+          </w:tcPr>
+          <w:p>
+            <w:r/>
+            <w:r>
+              <w:rPr>
+                <w:rFonts w:ascii="Times New Roman" w:hAnsi="Times New Roman"/>
+                <w:b/>
+                <w:sz w:val="19"/>
+              </w:rPr>
+              <w:t>WM slope</w:t>
+            </w:r>
+          </w:p>
+        </w:tc>
+        <w:tc>
+          <w:tcPr>
+            <w:tcW w:type="dxa" w:w="1234"/>
+          </w:tcPr>
+          <w:p>
+            <w:r/>
+            <w:r>
+              <w:rPr>
+                <w:rFonts w:ascii="Times New Roman" w:hAnsi="Times New Roman"/>
+                <w:b/>
+                <w:sz w:val="19"/>
+              </w:rPr>
+              <w:t>Sign agrees</w:t>
+            </w:r>
+          </w:p>
+        </w:tc>
+      </w:tr>
+      <w:tr>
+        <w:tc>
+          <w:tcPr>
+            <w:tcW w:type="dxa" w:w="1234"/>
+          </w:tcPr>
+          <w:p>
+            <w:r/>
+            <w:r>
+              <w:rPr>
+                <w:rFonts w:ascii="Times New Roman" w:hAnsi="Times New Roman"/>
+                <w:sz w:val="19"/>
+              </w:rPr>
+              <w:t>S014</w:t>
+            </w:r>
+          </w:p>
+        </w:tc>
+        <w:tc>
+          <w:tcPr>
+            <w:tcW w:type="dxa" w:w="1234"/>
+          </w:tcPr>
+          <w:p>
+            <w:r/>
+            <w:r>
+              <w:rPr>
+                <w:rFonts w:ascii="Times New Roman" w:hAnsi="Times New Roman"/>
+                <w:sz w:val="19"/>
+              </w:rPr>
+              <w:t>X→M</w:t>
+            </w:r>
+          </w:p>
+        </w:tc>
+        <w:tc>
+          <w:tcPr>
+            <w:tcW w:type="dxa" w:w="1234"/>
+          </w:tcPr>
+          <w:p>
+            <w:r/>
+            <w:r>
+              <w:rPr>
+                <w:rFonts w:ascii="Times New Roman" w:hAnsi="Times New Roman"/>
+                <w:sz w:val="19"/>
+              </w:rPr>
+              <w:t>17</w:t>
+            </w:r>
+          </w:p>
+        </w:tc>
+        <w:tc>
+          <w:tcPr>
+            <w:tcW w:type="dxa" w:w="1234"/>
+          </w:tcPr>
+          <w:p>
+            <w:r/>
+            <w:r>
+              <w:rPr>
+                <w:rFonts w:ascii="Times New Roman" w:hAnsi="Times New Roman"/>
+                <w:sz w:val="19"/>
+              </w:rPr>
+              <w:t>−0.0004</w:t>
+            </w:r>
+          </w:p>
+        </w:tc>
+        <w:tc>
+          <w:tcPr>
+            <w:tcW w:type="dxa" w:w="1234"/>
+          </w:tcPr>
+          <w:p>
+            <w:r/>
+            <w:r>
+              <w:rPr>
+                <w:rFonts w:ascii="Times New Roman" w:hAnsi="Times New Roman"/>
+                <w:sz w:val="19"/>
+              </w:rPr>
+              <w:t>0.73</w:t>
+            </w:r>
+          </w:p>
+        </w:tc>
+        <w:tc>
+          <w:tcPr>
+            <w:tcW w:type="dxa" w:w="1234"/>
+          </w:tcPr>
+          <w:p>
+            <w:r/>
+            <w:r>
+              <w:rPr>
+                <w:rFonts w:ascii="Times New Roman" w:hAnsi="Times New Roman"/>
+                <w:sz w:val="19"/>
+              </w:rPr>
+              <w:t>−0.0021</w:t>
+            </w:r>
+          </w:p>
+        </w:tc>
+        <w:tc>
+          <w:tcPr>
+            <w:tcW w:type="dxa" w:w="1234"/>
+          </w:tcPr>
+          <w:p>
+            <w:r/>
+            <w:r>
+              <w:rPr>
+                <w:rFonts w:ascii="Times New Roman" w:hAnsi="Times New Roman"/>
+                <w:sz w:val="19"/>
+              </w:rPr>
+              <w:t>yes</w:t>
+            </w:r>
+          </w:p>
+        </w:tc>
+      </w:tr>
+      <w:tr>
+        <w:tc>
+          <w:tcPr>
+            <w:tcW w:type="dxa" w:w="1234"/>
+          </w:tcPr>
+          <w:p>
+            <w:r/>
+            <w:r>
+              <w:rPr>
+                <w:rFonts w:ascii="Times New Roman" w:hAnsi="Times New Roman"/>
+                <w:sz w:val="19"/>
+              </w:rPr>
+              <w:t>S014</w:t>
+            </w:r>
+          </w:p>
+        </w:tc>
+        <w:tc>
+          <w:tcPr>
+            <w:tcW w:type="dxa" w:w="1234"/>
+          </w:tcPr>
+          <w:p>
+            <w:r/>
+            <w:r>
+              <w:rPr>
+                <w:rFonts w:ascii="Times New Roman" w:hAnsi="Times New Roman"/>
+                <w:sz w:val="19"/>
+              </w:rPr>
+              <w:t>M→Y</w:t>
+            </w:r>
+          </w:p>
+        </w:tc>
+        <w:tc>
+          <w:tcPr>
+            <w:tcW w:type="dxa" w:w="1234"/>
+          </w:tcPr>
+          <w:p>
+            <w:r/>
+            <w:r>
+              <w:rPr>
+                <w:rFonts w:ascii="Times New Roman" w:hAnsi="Times New Roman"/>
+                <w:sz w:val="19"/>
+              </w:rPr>
+              <w:t>203</w:t>
+            </w:r>
+          </w:p>
+        </w:tc>
+        <w:tc>
+          <w:tcPr>
+            <w:tcW w:type="dxa" w:w="1234"/>
+          </w:tcPr>
+          <w:p>
+            <w:r/>
+            <w:r>
+              <w:rPr>
+                <w:rFonts w:ascii="Times New Roman" w:hAnsi="Times New Roman"/>
+                <w:sz w:val="19"/>
+              </w:rPr>
+              <w:t>0.0001</w:t>
+            </w:r>
+          </w:p>
+        </w:tc>
+        <w:tc>
+          <w:tcPr>
+            <w:tcW w:type="dxa" w:w="1234"/>
+          </w:tcPr>
+          <w:p>
+            <w:r/>
+            <w:r>
+              <w:rPr>
+                <w:rFonts w:ascii="Times New Roman" w:hAnsi="Times New Roman"/>
+                <w:sz w:val="19"/>
+              </w:rPr>
+              <w:t>1.0e-3</w:t>
+            </w:r>
+          </w:p>
+        </w:tc>
+        <w:tc>
+          <w:tcPr>
+            <w:tcW w:type="dxa" w:w="1234"/>
+          </w:tcPr>
+          <w:p>
+            <w:r/>
+            <w:r>
+              <w:rPr>
+                <w:rFonts w:ascii="Times New Roman" w:hAnsi="Times New Roman"/>
+                <w:sz w:val="19"/>
+              </w:rPr>
+              <w:t>0.2856</w:t>
+            </w:r>
+          </w:p>
+        </w:tc>
+        <w:tc>
+          <w:tcPr>
+            <w:tcW w:type="dxa" w:w="1234"/>
+          </w:tcPr>
+          <w:p>
+            <w:r/>
+            <w:r>
+              <w:rPr>
+                <w:rFonts w:ascii="Times New Roman" w:hAnsi="Times New Roman"/>
+                <w:sz w:val="19"/>
+              </w:rPr>
+              <w:t>yes</w:t>
+            </w:r>
+          </w:p>
+        </w:tc>
+      </w:tr>
+      <w:tr>
+        <w:tc>
+          <w:tcPr>
+            <w:tcW w:type="dxa" w:w="1234"/>
+          </w:tcPr>
+          <w:p>
+            <w:r/>
+            <w:r>
+              <w:rPr>
+                <w:rFonts w:ascii="Times New Roman" w:hAnsi="Times New Roman"/>
+                <w:sz w:val="19"/>
+              </w:rPr>
+              <w:t>S137</w:t>
+            </w:r>
+          </w:p>
+        </w:tc>
+        <w:tc>
+          <w:tcPr>
+            <w:tcW w:type="dxa" w:w="1234"/>
+          </w:tcPr>
+          <w:p>
+            <w:r/>
+            <w:r>
+              <w:rPr>
+                <w:rFonts w:ascii="Times New Roman" w:hAnsi="Times New Roman"/>
+                <w:sz w:val="19"/>
+              </w:rPr>
+              <w:t>X→M</w:t>
+            </w:r>
+          </w:p>
+        </w:tc>
+        <w:tc>
+          <w:tcPr>
+            <w:tcW w:type="dxa" w:w="1234"/>
+          </w:tcPr>
+          <w:p>
+            <w:r/>
+            <w:r>
+              <w:rPr>
+                <w:rFonts w:ascii="Times New Roman" w:hAnsi="Times New Roman"/>
+                <w:sz w:val="19"/>
+              </w:rPr>
+              <w:t>27</w:t>
+            </w:r>
+          </w:p>
+        </w:tc>
+        <w:tc>
+          <w:tcPr>
+            <w:tcW w:type="dxa" w:w="1234"/>
+          </w:tcPr>
+          <w:p>
+            <w:r/>
+            <w:r>
+              <w:rPr>
+                <w:rFonts w:ascii="Times New Roman" w:hAnsi="Times New Roman"/>
+                <w:sz w:val="19"/>
+              </w:rPr>
+              <w:t>−0.0011</w:t>
+            </w:r>
+          </w:p>
+        </w:tc>
+        <w:tc>
+          <w:tcPr>
+            <w:tcW w:type="dxa" w:w="1234"/>
+          </w:tcPr>
+          <w:p>
+            <w:r/>
+            <w:r>
+              <w:rPr>
+                <w:rFonts w:ascii="Times New Roman" w:hAnsi="Times New Roman"/>
+                <w:sz w:val="19"/>
+              </w:rPr>
+              <w:t>0.58</w:t>
+            </w:r>
+          </w:p>
+        </w:tc>
+        <w:tc>
+          <w:tcPr>
+            <w:tcW w:type="dxa" w:w="1234"/>
+          </w:tcPr>
+          <w:p>
+            <w:r/>
+            <w:r>
+              <w:rPr>
+                <w:rFonts w:ascii="Times New Roman" w:hAnsi="Times New Roman"/>
+                <w:sz w:val="19"/>
+              </w:rPr>
+              <w:t>0.0524</w:t>
+            </w:r>
+          </w:p>
+        </w:tc>
+        <w:tc>
+          <w:tcPr>
+            <w:tcW w:type="dxa" w:w="1234"/>
+          </w:tcPr>
+          <w:p>
+            <w:r/>
+            <w:r>
+              <w:rPr>
+                <w:rFonts w:ascii="Times New Roman" w:hAnsi="Times New Roman"/>
+                <w:sz w:val="19"/>
+              </w:rPr>
+              <w:t>yes</w:t>
+            </w:r>
+          </w:p>
+        </w:tc>
+      </w:tr>
+      <w:tr>
+        <w:tc>
+          <w:tcPr>
+            <w:tcW w:type="dxa" w:w="1234"/>
+          </w:tcPr>
+          <w:p>
+            <w:r/>
+            <w:r>
+              <w:rPr>
+                <w:rFonts w:ascii="Times New Roman" w:hAnsi="Times New Roman"/>
+                <w:sz w:val="19"/>
+              </w:rPr>
+              <w:t>S137</w:t>
+            </w:r>
+          </w:p>
+        </w:tc>
+        <w:tc>
+          <w:tcPr>
+            <w:tcW w:type="dxa" w:w="1234"/>
+          </w:tcPr>
+          <w:p>
+            <w:r/>
+            <w:r>
+              <w:rPr>
+                <w:rFonts w:ascii="Times New Roman" w:hAnsi="Times New Roman"/>
+                <w:sz w:val="19"/>
+              </w:rPr>
+              <w:t>M→Y</w:t>
+            </w:r>
+          </w:p>
+        </w:tc>
+        <w:tc>
+          <w:tcPr>
+            <w:tcW w:type="dxa" w:w="1234"/>
+          </w:tcPr>
+          <w:p>
+            <w:r/>
+            <w:r>
+              <w:rPr>
+                <w:rFonts w:ascii="Times New Roman" w:hAnsi="Times New Roman"/>
+                <w:sz w:val="19"/>
+              </w:rPr>
+              <w:t>220</w:t>
+            </w:r>
+          </w:p>
+        </w:tc>
+        <w:tc>
+          <w:tcPr>
+            <w:tcW w:type="dxa" w:w="1234"/>
+          </w:tcPr>
+          <w:p>
+            <w:r/>
+            <w:r>
+              <w:rPr>
+                <w:rFonts w:ascii="Times New Roman" w:hAnsi="Times New Roman"/>
+                <w:sz w:val="19"/>
+              </w:rPr>
+              <w:t>0.0000</w:t>
+            </w:r>
+          </w:p>
+        </w:tc>
+        <w:tc>
+          <w:tcPr>
+            <w:tcW w:type="dxa" w:w="1234"/>
+          </w:tcPr>
+          <w:p>
+            <w:r/>
+            <w:r>
+              <w:rPr>
+                <w:rFonts w:ascii="Times New Roman" w:hAnsi="Times New Roman"/>
+                <w:sz w:val="19"/>
+              </w:rPr>
+              <w:t>0.58</w:t>
+            </w:r>
+          </w:p>
+        </w:tc>
+        <w:tc>
+          <w:tcPr>
+            <w:tcW w:type="dxa" w:w="1234"/>
+          </w:tcPr>
+          <w:p>
+            <w:r/>
+            <w:r>
+              <w:rPr>
+                <w:rFonts w:ascii="Times New Roman" w:hAnsi="Times New Roman"/>
+                <w:sz w:val="19"/>
+              </w:rPr>
+              <w:t>−0.0143</w:t>
+            </w:r>
+          </w:p>
+        </w:tc>
+        <w:tc>
+          <w:tcPr>
+            <w:tcW w:type="dxa" w:w="1234"/>
+          </w:tcPr>
+          <w:p>
+            <w:r/>
+            <w:r>
+              <w:rPr>
+                <w:rFonts w:ascii="Times New Roman" w:hAnsi="Times New Roman"/>
+                <w:sz w:val="19"/>
+              </w:rPr>
+              <w:t>yes</w:t>
+            </w:r>
+          </w:p>
+        </w:tc>
+      </w:tr>
+      <w:tr>
+        <w:tc>
+          <w:tcPr>
+            <w:tcW w:type="dxa" w:w="1234"/>
+          </w:tcPr>
+          <w:p>
+            <w:r/>
+            <w:r>
+              <w:rPr>
+                <w:rFonts w:ascii="Times New Roman" w:hAnsi="Times New Roman"/>
+                <w:sz w:val="19"/>
+              </w:rPr>
+              <w:t>S217</w:t>
+            </w:r>
+          </w:p>
+        </w:tc>
+        <w:tc>
+          <w:tcPr>
+            <w:tcW w:type="dxa" w:w="1234"/>
+          </w:tcPr>
+          <w:p>
+            <w:r/>
+            <w:r>
+              <w:rPr>
+                <w:rFonts w:ascii="Times New Roman" w:hAnsi="Times New Roman"/>
+                <w:sz w:val="19"/>
+              </w:rPr>
+              <w:t>X→M</w:t>
+            </w:r>
+          </w:p>
+        </w:tc>
+        <w:tc>
+          <w:tcPr>
+            <w:tcW w:type="dxa" w:w="1234"/>
+          </w:tcPr>
+          <w:p>
+            <w:r/>
+            <w:r>
+              <w:rPr>
+                <w:rFonts w:ascii="Times New Roman" w:hAnsi="Times New Roman"/>
+                <w:sz w:val="19"/>
+              </w:rPr>
+              <w:t>6</w:t>
+            </w:r>
+          </w:p>
+        </w:tc>
+        <w:tc>
+          <w:tcPr>
+            <w:tcW w:type="dxa" w:w="1234"/>
+          </w:tcPr>
+          <w:p>
+            <w:r/>
+            <w:r>
+              <w:rPr>
+                <w:rFonts w:ascii="Times New Roman" w:hAnsi="Times New Roman"/>
+                <w:sz w:val="19"/>
+              </w:rPr>
+              <w:t>0.0039</w:t>
+            </w:r>
+          </w:p>
+        </w:tc>
+        <w:tc>
+          <w:tcPr>
+            <w:tcW w:type="dxa" w:w="1234"/>
+          </w:tcPr>
+          <w:p>
+            <w:r/>
+            <w:r>
+              <w:rPr>
+                <w:rFonts w:ascii="Times New Roman" w:hAnsi="Times New Roman"/>
+                <w:sz w:val="19"/>
+              </w:rPr>
+              <w:t>0.93</w:t>
+            </w:r>
+          </w:p>
+        </w:tc>
+        <w:tc>
+          <w:tcPr>
+            <w:tcW w:type="dxa" w:w="1234"/>
+          </w:tcPr>
+          <w:p>
+            <w:r/>
+            <w:r>
+              <w:rPr>
+                <w:rFonts w:ascii="Times New Roman" w:hAnsi="Times New Roman"/>
+                <w:sz w:val="19"/>
+              </w:rPr>
+              <w:t>60.8063</w:t>
+            </w:r>
+          </w:p>
+        </w:tc>
+        <w:tc>
+          <w:tcPr>
+            <w:tcW w:type="dxa" w:w="1234"/>
+          </w:tcPr>
+          <w:p>
+            <w:r/>
+            <w:r>
+              <w:rPr>
+                <w:rFonts w:ascii="Times New Roman" w:hAnsi="Times New Roman"/>
+                <w:sz w:val="19"/>
+              </w:rPr>
+              <w:t>yes</w:t>
+            </w:r>
+          </w:p>
+        </w:tc>
+      </w:tr>
+      <w:tr>
+        <w:tc>
+          <w:tcPr>
+            <w:tcW w:type="dxa" w:w="1234"/>
+          </w:tcPr>
+          <w:p>
+            <w:r/>
+            <w:r>
+              <w:rPr>
+                <w:rFonts w:ascii="Times New Roman" w:hAnsi="Times New Roman"/>
+                <w:sz w:val="19"/>
+              </w:rPr>
+              <w:t>S217</w:t>
+            </w:r>
+          </w:p>
+        </w:tc>
+        <w:tc>
+          <w:tcPr>
+            <w:tcW w:type="dxa" w:w="1234"/>
+          </w:tcPr>
+          <w:p>
+            <w:r/>
+            <w:r>
+              <w:rPr>
+                <w:rFonts w:ascii="Times New Roman" w:hAnsi="Times New Roman"/>
+                <w:sz w:val="19"/>
+              </w:rPr>
+              <w:t>M→Y</w:t>
+            </w:r>
+          </w:p>
+        </w:tc>
+        <w:tc>
+          <w:tcPr>
+            <w:tcW w:type="dxa" w:w="1234"/>
+          </w:tcPr>
+          <w:p>
+            <w:r/>
+            <w:r>
+              <w:rPr>
+                <w:rFonts w:ascii="Times New Roman" w:hAnsi="Times New Roman"/>
+                <w:sz w:val="19"/>
+              </w:rPr>
+              <w:t>10</w:t>
+            </w:r>
+          </w:p>
+        </w:tc>
+        <w:tc>
+          <w:tcPr>
+            <w:tcW w:type="dxa" w:w="1234"/>
+          </w:tcPr>
+          <w:p>
+            <w:r/>
+            <w:r>
+              <w:rPr>
+                <w:rFonts w:ascii="Times New Roman" w:hAnsi="Times New Roman"/>
+                <w:sz w:val="19"/>
+              </w:rPr>
+              <w:t>−0.0170</w:t>
+            </w:r>
+          </w:p>
+        </w:tc>
+        <w:tc>
+          <w:tcPr>
+            <w:tcW w:type="dxa" w:w="1234"/>
+          </w:tcPr>
+          <w:p>
+            <w:r/>
+            <w:r>
+              <w:rPr>
+                <w:rFonts w:ascii="Times New Roman" w:hAnsi="Times New Roman"/>
+                <w:sz w:val="19"/>
+              </w:rPr>
+              <w:t>2.7e-4</w:t>
+            </w:r>
+          </w:p>
+        </w:tc>
+        <w:tc>
+          <w:tcPr>
+            <w:tcW w:type="dxa" w:w="1234"/>
+          </w:tcPr>
+          <w:p>
+            <w:r/>
+            <w:r>
+              <w:rPr>
+                <w:rFonts w:ascii="Times New Roman" w:hAnsi="Times New Roman"/>
+                <w:sz w:val="19"/>
+              </w:rPr>
+              <w:t>0.3345</w:t>
+            </w:r>
+          </w:p>
+        </w:tc>
+        <w:tc>
+          <w:tcPr>
+            <w:tcW w:type="dxa" w:w="1234"/>
+          </w:tcPr>
+          <w:p>
+            <w:r/>
+            <w:r>
+              <w:rPr>
+                <w:rFonts w:ascii="Times New Roman" w:hAnsi="Times New Roman"/>
+                <w:sz w:val="19"/>
+              </w:rPr>
+              <w:t>yes</w:t>
+            </w:r>
+          </w:p>
+        </w:tc>
+      </w:tr>
+      <w:tr>
+        <w:tc>
+          <w:tcPr>
+            <w:tcW w:type="dxa" w:w="1234"/>
+          </w:tcPr>
+          <w:p>
+            <w:r/>
+            <w:r>
+              <w:rPr>
+                <w:rFonts w:ascii="Times New Roman" w:hAnsi="Times New Roman"/>
+                <w:sz w:val="19"/>
+              </w:rPr>
+              <w:t>S273</w:t>
+            </w:r>
+          </w:p>
+        </w:tc>
+        <w:tc>
+          <w:tcPr>
+            <w:tcW w:type="dxa" w:w="1234"/>
+          </w:tcPr>
+          <w:p>
+            <w:r/>
+            <w:r>
+              <w:rPr>
+                <w:rFonts w:ascii="Times New Roman" w:hAnsi="Times New Roman"/>
+                <w:sz w:val="19"/>
+              </w:rPr>
+              <w:t>X→M</w:t>
+            </w:r>
+          </w:p>
+        </w:tc>
+        <w:tc>
+          <w:tcPr>
+            <w:tcW w:type="dxa" w:w="1234"/>
+          </w:tcPr>
+          <w:p>
+            <w:r/>
+            <w:r>
+              <w:rPr>
+                <w:rFonts w:ascii="Times New Roman" w:hAnsi="Times New Roman"/>
+                <w:sz w:val="19"/>
+              </w:rPr>
+              <w:t>439</w:t>
+            </w:r>
+          </w:p>
+        </w:tc>
+        <w:tc>
+          <w:tcPr>
+            <w:tcW w:type="dxa" w:w="1234"/>
+          </w:tcPr>
+          <w:p>
+            <w:r/>
+            <w:r>
+              <w:rPr>
+                <w:rFonts w:ascii="Times New Roman" w:hAnsi="Times New Roman"/>
+                <w:sz w:val="19"/>
+              </w:rPr>
+              <w:t>0.0000</w:t>
+            </w:r>
+          </w:p>
+        </w:tc>
+        <w:tc>
+          <w:tcPr>
+            <w:tcW w:type="dxa" w:w="1234"/>
+          </w:tcPr>
+          <w:p>
+            <w:r/>
+            <w:r>
+              <w:rPr>
+                <w:rFonts w:ascii="Times New Roman" w:hAnsi="Times New Roman"/>
+                <w:sz w:val="19"/>
+              </w:rPr>
+              <w:t>4.2e-3</w:t>
+            </w:r>
+          </w:p>
+        </w:tc>
+        <w:tc>
+          <w:tcPr>
+            <w:tcW w:type="dxa" w:w="1234"/>
+          </w:tcPr>
+          <w:p>
+            <w:r/>
+            <w:r>
+              <w:rPr>
+                <w:rFonts w:ascii="Times New Roman" w:hAnsi="Times New Roman"/>
+                <w:sz w:val="19"/>
+              </w:rPr>
+              <w:t>−0.0258</w:t>
+            </w:r>
+          </w:p>
+        </w:tc>
+        <w:tc>
+          <w:tcPr>
+            <w:tcW w:type="dxa" w:w="1234"/>
+          </w:tcPr>
+          <w:p>
+            <w:r/>
+            <w:r>
+              <w:rPr>
+                <w:rFonts w:ascii="Times New Roman" w:hAnsi="Times New Roman"/>
+                <w:sz w:val="19"/>
+              </w:rPr>
+              <w:t>yes</w:t>
+            </w:r>
+          </w:p>
+        </w:tc>
+      </w:tr>
+      <w:tr>
+        <w:tc>
+          <w:tcPr>
+            <w:tcW w:type="dxa" w:w="1234"/>
+          </w:tcPr>
+          <w:p>
+            <w:r/>
+            <w:r>
+              <w:rPr>
+                <w:rFonts w:ascii="Times New Roman" w:hAnsi="Times New Roman"/>
+                <w:sz w:val="19"/>
+              </w:rPr>
+              <w:t>S273</w:t>
+            </w:r>
+          </w:p>
+        </w:tc>
+        <w:tc>
+          <w:tcPr>
+            <w:tcW w:type="dxa" w:w="1234"/>
+          </w:tcPr>
+          <w:p>
+            <w:r/>
+            <w:r>
+              <w:rPr>
+                <w:rFonts w:ascii="Times New Roman" w:hAnsi="Times New Roman"/>
+                <w:sz w:val="19"/>
+              </w:rPr>
+              <w:t>M→Y</w:t>
+            </w:r>
+          </w:p>
+        </w:tc>
+        <w:tc>
+          <w:tcPr>
+            <w:tcW w:type="dxa" w:w="1234"/>
+          </w:tcPr>
+          <w:p>
+            <w:r/>
+            <w:r>
+              <w:rPr>
+                <w:rFonts w:ascii="Times New Roman" w:hAnsi="Times New Roman"/>
+                <w:sz w:val="19"/>
+              </w:rPr>
+              <w:t>13</w:t>
+            </w:r>
+          </w:p>
+        </w:tc>
+        <w:tc>
+          <w:tcPr>
+            <w:tcW w:type="dxa" w:w="1234"/>
+          </w:tcPr>
+          <w:p>
+            <w:r/>
+            <w:r>
+              <w:rPr>
+                <w:rFonts w:ascii="Times New Roman" w:hAnsi="Times New Roman"/>
+                <w:sz w:val="19"/>
+              </w:rPr>
+              <w:t>−0.0012</w:t>
+            </w:r>
+          </w:p>
+        </w:tc>
+        <w:tc>
+          <w:tcPr>
+            <w:tcW w:type="dxa" w:w="1234"/>
+          </w:tcPr>
+          <w:p>
+            <w:r/>
+            <w:r>
+              <w:rPr>
+                <w:rFonts w:ascii="Times New Roman" w:hAnsi="Times New Roman"/>
+                <w:sz w:val="19"/>
+              </w:rPr>
+              <w:t>0.87</w:t>
+            </w:r>
+          </w:p>
+        </w:tc>
+        <w:tc>
+          <w:tcPr>
+            <w:tcW w:type="dxa" w:w="1234"/>
+          </w:tcPr>
+          <w:p>
+            <w:r/>
+            <w:r>
+              <w:rPr>
+                <w:rFonts w:ascii="Times New Roman" w:hAnsi="Times New Roman"/>
+                <w:sz w:val="19"/>
+              </w:rPr>
+              <w:t>2.4023</w:t>
+            </w:r>
+          </w:p>
+        </w:tc>
+        <w:tc>
+          <w:tcPr>
+            <w:tcW w:type="dxa" w:w="1234"/>
+          </w:tcPr>
+          <w:p>
+            <w:r/>
+            <w:r>
+              <w:rPr>
+                <w:rFonts w:ascii="Times New Roman" w:hAnsi="Times New Roman"/>
+                <w:sz w:val="19"/>
+              </w:rPr>
+              <w:t>yes</w:t>
+            </w:r>
+          </w:p>
+        </w:tc>
+      </w:tr>
+      <w:tr>
+        <w:tc>
+          <w:tcPr>
+            <w:tcW w:type="dxa" w:w="1234"/>
+          </w:tcPr>
+          <w:p>
+            <w:r/>
+            <w:r>
+              <w:rPr>
+                <w:rFonts w:ascii="Times New Roman" w:hAnsi="Times New Roman"/>
+                <w:sz w:val="19"/>
+              </w:rPr>
+              <w:t>S267</w:t>
+            </w:r>
+          </w:p>
+        </w:tc>
+        <w:tc>
+          <w:tcPr>
+            <w:tcW w:type="dxa" w:w="1234"/>
+          </w:tcPr>
+          <w:p>
+            <w:r/>
+            <w:r>
+              <w:rPr>
+                <w:rFonts w:ascii="Times New Roman" w:hAnsi="Times New Roman"/>
+                <w:sz w:val="19"/>
+              </w:rPr>
+              <w:t>X→M</w:t>
+            </w:r>
+          </w:p>
+        </w:tc>
+        <w:tc>
+          <w:tcPr>
+            <w:tcW w:type="dxa" w:w="1234"/>
+          </w:tcPr>
+          <w:p>
+            <w:r/>
+            <w:r>
+              <w:rPr>
+                <w:rFonts w:ascii="Times New Roman" w:hAnsi="Times New Roman"/>
+                <w:sz w:val="19"/>
+              </w:rPr>
+              <w:t>88</w:t>
+            </w:r>
+          </w:p>
+        </w:tc>
+        <w:tc>
+          <w:tcPr>
+            <w:tcW w:type="dxa" w:w="1234"/>
+          </w:tcPr>
+          <w:p>
+            <w:r/>
+            <w:r>
+              <w:rPr>
+                <w:rFonts w:ascii="Times New Roman" w:hAnsi="Times New Roman"/>
+                <w:sz w:val="19"/>
+              </w:rPr>
+              <w:t>−0.0012</w:t>
+            </w:r>
+          </w:p>
+        </w:tc>
+        <w:tc>
+          <w:tcPr>
+            <w:tcW w:type="dxa" w:w="1234"/>
+          </w:tcPr>
+          <w:p>
+            <w:r/>
+            <w:r>
+              <w:rPr>
+                <w:rFonts w:ascii="Times New Roman" w:hAnsi="Times New Roman"/>
+                <w:sz w:val="19"/>
+              </w:rPr>
+              <w:t>0.74</w:t>
+            </w:r>
+          </w:p>
+        </w:tc>
+        <w:tc>
+          <w:tcPr>
+            <w:tcW w:type="dxa" w:w="1234"/>
+          </w:tcPr>
+          <w:p>
+            <w:r/>
+            <w:r>
+              <w:rPr>
+                <w:rFonts w:ascii="Times New Roman" w:hAnsi="Times New Roman"/>
+                <w:sz w:val="19"/>
+              </w:rPr>
+              <w:t>−1.9002</w:t>
+            </w:r>
+          </w:p>
+        </w:tc>
+        <w:tc>
+          <w:tcPr>
+            <w:tcW w:type="dxa" w:w="1234"/>
+          </w:tcPr>
+          <w:p>
+            <w:r/>
+            <w:r>
+              <w:rPr>
+                <w:rFonts w:ascii="Times New Roman" w:hAnsi="Times New Roman"/>
+                <w:sz w:val="19"/>
+              </w:rPr>
+              <w:t>yes</w:t>
+            </w:r>
+          </w:p>
+        </w:tc>
+      </w:tr>
+      <w:tr>
+        <w:tc>
+          <w:tcPr>
+            <w:tcW w:type="dxa" w:w="1234"/>
+          </w:tcPr>
+          <w:p>
+            <w:r/>
+            <w:r>
+              <w:rPr>
+                <w:rFonts w:ascii="Times New Roman" w:hAnsi="Times New Roman"/>
+                <w:sz w:val="19"/>
+              </w:rPr>
+              <w:t>S267</w:t>
+            </w:r>
+          </w:p>
+        </w:tc>
+        <w:tc>
+          <w:tcPr>
+            <w:tcW w:type="dxa" w:w="1234"/>
+          </w:tcPr>
+          <w:p>
+            <w:r/>
+            <w:r>
+              <w:rPr>
+                <w:rFonts w:ascii="Times New Roman" w:hAnsi="Times New Roman"/>
+                <w:sz w:val="19"/>
+              </w:rPr>
+              <w:t>M→Y</w:t>
+            </w:r>
+          </w:p>
+        </w:tc>
+        <w:tc>
+          <w:tcPr>
+            <w:tcW w:type="dxa" w:w="1234"/>
+          </w:tcPr>
+          <w:p>
+            <w:r/>
+            <w:r>
+              <w:rPr>
+                <w:rFonts w:ascii="Times New Roman" w:hAnsi="Times New Roman"/>
+                <w:sz w:val="19"/>
+              </w:rPr>
+              <w:t>47</w:t>
+            </w:r>
+          </w:p>
+        </w:tc>
+        <w:tc>
+          <w:tcPr>
+            <w:tcW w:type="dxa" w:w="1234"/>
+          </w:tcPr>
+          <w:p>
+            <w:r/>
+            <w:r>
+              <w:rPr>
+                <w:rFonts w:ascii="Times New Roman" w:hAnsi="Times New Roman"/>
+                <w:sz w:val="19"/>
+              </w:rPr>
+              <w:t>0.0029</w:t>
+            </w:r>
+          </w:p>
+        </w:tc>
+        <w:tc>
+          <w:tcPr>
+            <w:tcW w:type="dxa" w:w="1234"/>
+          </w:tcPr>
+          <w:p>
+            <w:r/>
+            <w:r>
+              <w:rPr>
+                <w:rFonts w:ascii="Times New Roman" w:hAnsi="Times New Roman"/>
+                <w:sz w:val="19"/>
+              </w:rPr>
+              <w:t>0.20</w:t>
+            </w:r>
+          </w:p>
+        </w:tc>
+        <w:tc>
+          <w:tcPr>
+            <w:tcW w:type="dxa" w:w="1234"/>
+          </w:tcPr>
+          <w:p>
+            <w:r/>
+            <w:r>
+              <w:rPr>
+                <w:rFonts w:ascii="Times New Roman" w:hAnsi="Times New Roman"/>
+                <w:sz w:val="19"/>
+              </w:rPr>
+              <w:t>−0.6870</w:t>
+            </w:r>
+          </w:p>
+        </w:tc>
+        <w:tc>
+          <w:tcPr>
+            <w:tcW w:type="dxa" w:w="1234"/>
+          </w:tcPr>
+          <w:p>
+            <w:r/>
+            <w:r>
+              <w:rPr>
+                <w:rFonts w:ascii="Times New Roman" w:hAnsi="Times New Roman"/>
+                <w:sz w:val="19"/>
+              </w:rPr>
+              <w:t>yes</w:t>
+            </w:r>
+          </w:p>
+        </w:tc>
+      </w:tr>
+    </w:tbl>
+    <w:p>
+      <w:pPr>
+        <w:jc w:val="left"/>
+      </w:pPr>
+      <w:r>
+        <w:rPr>
+          <w:rFonts w:ascii="Times New Roman" w:hAnsi="Times New Roman"/>
+          <w:b/>
+          <w:i/>
+          <w:sz w:val="20"/>
+        </w:rPr>
+        <w:t>Table 3c.</w:t>
+      </w:r>
+      <w:r>
+        <w:rPr>
+          <w:rFonts w:ascii="Times New Roman" w:hAnsi="Times New Roman"/>
+          <w:b w:val="0"/>
+          <w:sz w:val="20"/>
+        </w:rPr>
+        <w:t xml:space="preserve"> Horizontal-pleiotropy sensitivity for the five non-degenerate overlapping trios. Egger intercept β₀ tests directional pleiotropy (|β₀| is the practically relevant magnitude; p is reported but is inflated by large n when β₀ ≈ 0). WM = weighted-median slope. "Sign agrees" compares the WM slope with the IVW point estimate of the same step.</w:t>
+      </w:r>
+    </w:p>
+    <w:p>
+      <w:pPr>
+        <w:ind w:firstLine="480"/>
+        <w:jc w:val="both"/>
+      </w:pPr>
+      <w:r>
+        <w:rPr>
+          <w:rFonts w:ascii="Times New Roman" w:hAnsi="Times New Roman"/>
+          <w:b w:val="0"/>
+          <w:sz w:val="24"/>
+        </w:rPr>
+        <w:t>Across all ten step-level tests the weighted-median slope agrees in sign with the IVW estimate, so no horizontal pleiotropy reverses the direction of α̂ or β̂. Three tests carry p &lt; 0.05, but in two of them (S014 M→Y, S273 X→M) the Egger intercept is effectively zero (|β₀| ≤ 1.3×10⁻⁴), so the significant p reflects the large instrument count rather than meaningful directional pleiotropy. The remaining signal, S217 M→Y (β₀ = −0.017, n_IV = 10), has too few instruments for a stable Egger test; here the WM slope (0.33) is larger than but same-signed as the IVW estimate (0.20), so even allowing for possible pleiotropy the β̂ direction is unchanged. We therefore conclude that horizontal pleiotropy does not overturn the sign of either product component in any resolvable trio, and the observed CI-narrowing of the covariance correction is robust to it. (The correction itself does not remove pleiotropy bias in the point estimate; it corrects the *variance* of the product given the IVW estimates, which is what the literature currently omits.) The degenerate self-mediating trios S320/S293 (α̂ = 1.0) are excluded as before.</w:t>
+      </w:r>
+    </w:p>
+    <w:p>
+      <w:pPr>
+        <w:spacing w:before="200" w:after="80"/>
+        <w:jc w:val="left"/>
+      </w:pPr>
+      <w:r>
+        <w:rPr>
+          <w:rFonts w:ascii="Times New Roman" w:hAnsi="Times New Roman"/>
+          <w:b/>
+          <w:sz w:val="24"/>
+        </w:rPr>
         <w:t>3.5 Empirical ρ_MY in the overlapping trios</w:t>
       </w:r>
     </w:p>
@@ -4399,7 +5664,7 @@
           <w:b w:val="0"/>
           <w:sz w:val="24"/>
         </w:rPr>
-        <w:t xml:space="preserve"> (Table 3b); a worst-case substitution of each trio's ρ_g 95% CI upper bound leaves the conclusion unchanged. The reason is structural (Proposition S2.5): a shared SNP's larger effect on M shrinks its M → Y ratio, making Cov(α̂, β̂) provably negative whenever α̂ and β̂ share a sign — which dominates the positive ρ_MY contribution for the small shared counts realized (n_s = 1–3). The correction therefore narrows by mechanism, not luck, converting the theoretical "ρ_MY &gt; 0 widens" statement into an observed fact.</w:t>
+        <w:t xml:space="preserve"> (Table 3b); a worst-case substitution of each trio's ρ_g 95% CI upper bound leaves the conclusion unchanged. The reason is structural (Proposition S2.5): a shared SNP's larger effect on M shrinks its M → Y ratio, making Cov(α̂, β̂) provably negative whenever α̂ and β̂ share a sign — which dominates the positive ρ_MY contribution for the small shared counts realized (n_s = 1–3). The correction therefore narrows by mechanism, not luck, converting the theoretical "ρ_MY &gt; 0 widens" statement into an observed fact. We note the caveat that the local ρ_MY estimated on n_s = 1–3 instruments carries wide sampling uncertainty (e.g., S217, n_s = 1, has ρ_g 95% CI [0.37, 0.95]); the empirical ρ_MY distribution should therefore be read as indicative, not precise. Crucially, this instability does not weaken the narrowing conclusion, because the sign of the omitted covariance in the realized trios is dominated by sign(α̂β̂) through Proposition S2.5 (an instrument-overlap effect) rather than by the exact value of ρ_MY, so the worst-case upper-CI substitution in Table 3b leaves every conclusion unchanged.</w:t>
       </w:r>
     </w:p>
     <w:tbl>
@@ -6502,7 +7767,7 @@
           <w:b w:val="0"/>
           <w:sz w:val="24"/>
         </w:rPr>
-        <w:t xml:space="preserve"> The method has proliferated rapidly across clinical domains; the following recent examples illustrate its reach. Zhang et al. </w:t>
+        <w:t xml:space="preserve"> The method has proliferated rapidly across clinical domains; six examples illustrate its reach. Zhang et al. </w:t>
       </w:r>
       <w:r>
         <w:rPr>
@@ -6519,24 +7784,7 @@
           <w:b w:val="0"/>
           <w:sz w:val="24"/>
         </w:rPr>
-        <w:t xml:space="preserve"> introduced METEOR for detecting shared and specific exposures underlying multiple outcomes. Feng et al. </w:t>
-      </w:r>
-      <w:r>
-        <w:rPr>
-          <w:rFonts w:ascii="Times New Roman" w:hAnsi="Times New Roman"/>
-          <w:b w:val="0"/>
-          <w:sz w:val="24"/>
-          <w:vertAlign w:val="superscript"/>
-        </w:rPr>
-        <w:t>25</w:t>
-      </w:r>
-      <w:r>
-        <w:rPr>
-          <w:rFonts w:ascii="Times New Roman" w:hAnsi="Times New Roman"/>
-          <w:b w:val="0"/>
-          <w:sz w:val="24"/>
-        </w:rPr>
-        <w:t xml:space="preserve"> stratified depression risk using cross-ancestry pleiotropic imaging phenotypes. Tong et al. </w:t>
+        <w:t xml:space="preserve"> introduced METEOR for detecting shared and specific exposures underlying multiple outcomes. Tong et al. </w:t>
       </w:r>
       <w:r>
         <w:rPr>
@@ -6587,143 +7835,7 @@
           <w:b w:val="0"/>
           <w:sz w:val="24"/>
         </w:rPr>
-        <w:t xml:space="preserve"> mediated cardiometabolic pathways to heart failure with preserved ejection fraction. Hu et al. </w:t>
-      </w:r>
-      <w:r>
-        <w:rPr>
-          <w:rFonts w:ascii="Times New Roman" w:hAnsi="Times New Roman"/>
-          <w:b w:val="0"/>
-          <w:sz w:val="24"/>
-          <w:vertAlign w:val="superscript"/>
-        </w:rPr>
-        <w:t>29</w:t>
-      </w:r>
-      <w:r>
-        <w:rPr>
-          <w:rFonts w:ascii="Times New Roman" w:hAnsi="Times New Roman"/>
-          <w:b w:val="0"/>
-          <w:sz w:val="24"/>
-        </w:rPr>
-        <w:t xml:space="preserve"> identified body-fat distribution as a mediator of the diabetogenic action of lipid-modifying drugs. Huang et al. </w:t>
-      </w:r>
-      <w:r>
-        <w:rPr>
-          <w:rFonts w:ascii="Times New Roman" w:hAnsi="Times New Roman"/>
-          <w:b w:val="0"/>
-          <w:sz w:val="24"/>
-          <w:vertAlign w:val="superscript"/>
-        </w:rPr>
-        <w:t>30</w:t>
-      </w:r>
-      <w:r>
-        <w:rPr>
-          <w:rFonts w:ascii="Times New Roman" w:hAnsi="Times New Roman"/>
-          <w:b w:val="0"/>
-          <w:sz w:val="24"/>
-        </w:rPr>
-        <w:t xml:space="preserve"> mediated cyclic cytokine effects on meningioma. Zhou et al. </w:t>
-      </w:r>
-      <w:r>
-        <w:rPr>
-          <w:rFonts w:ascii="Times New Roman" w:hAnsi="Times New Roman"/>
-          <w:b w:val="0"/>
-          <w:sz w:val="24"/>
-          <w:vertAlign w:val="superscript"/>
-        </w:rPr>
-        <w:t>31</w:t>
-      </w:r>
-      <w:r>
-        <w:rPr>
-          <w:rFonts w:ascii="Times New Roman" w:hAnsi="Times New Roman"/>
-          <w:b w:val="0"/>
-          <w:sz w:val="24"/>
-        </w:rPr>
-        <w:t xml:space="preserve"> examined air pollution as a risk factor for psychiatric disorders. Wang et al. </w:t>
-      </w:r>
-      <w:r>
-        <w:rPr>
-          <w:rFonts w:ascii="Times New Roman" w:hAnsi="Times New Roman"/>
-          <w:b w:val="0"/>
-          <w:sz w:val="24"/>
-          <w:vertAlign w:val="superscript"/>
-        </w:rPr>
-        <w:t>32</w:t>
-      </w:r>
-      <w:r>
-        <w:rPr>
-          <w:rFonts w:ascii="Times New Roman" w:hAnsi="Times New Roman"/>
-          <w:b w:val="0"/>
-          <w:sz w:val="24"/>
-        </w:rPr>
-        <w:t xml:space="preserve"> mediated nut-consumption effects on cardiovascular disease. Xu et al. </w:t>
-      </w:r>
-      <w:r>
-        <w:rPr>
-          <w:rFonts w:ascii="Times New Roman" w:hAnsi="Times New Roman"/>
-          <w:b w:val="0"/>
-          <w:sz w:val="24"/>
-          <w:vertAlign w:val="superscript"/>
-        </w:rPr>
-        <w:t>33</w:t>
-      </w:r>
-      <w:r>
-        <w:rPr>
-          <w:rFonts w:ascii="Times New Roman" w:hAnsi="Times New Roman"/>
-          <w:b w:val="0"/>
-          <w:sz w:val="24"/>
-        </w:rPr>
-        <w:t xml:space="preserve"> examined the immune-cell-mediated link between sphingomyelin and stroke. Wang et al. </w:t>
-      </w:r>
-      <w:r>
-        <w:rPr>
-          <w:rFonts w:ascii="Times New Roman" w:hAnsi="Times New Roman"/>
-          <w:b w:val="0"/>
-          <w:sz w:val="24"/>
-          <w:vertAlign w:val="superscript"/>
-        </w:rPr>
-        <w:t>34</w:t>
-      </w:r>
-      <w:r>
-        <w:rPr>
-          <w:rFonts w:ascii="Times New Roman" w:hAnsi="Times New Roman"/>
-          <w:b w:val="0"/>
-          <w:sz w:val="24"/>
-        </w:rPr>
-        <w:t xml:space="preserve"> mediated lipid-metabolism effects on allergic diseases. Sun et al. </w:t>
-      </w:r>
-      <w:r>
-        <w:rPr>
-          <w:rFonts w:ascii="Times New Roman" w:hAnsi="Times New Roman"/>
-          <w:b w:val="0"/>
-          <w:sz w:val="24"/>
-          <w:vertAlign w:val="superscript"/>
-        </w:rPr>
-        <w:t>35</w:t>
-      </w:r>
-      <w:r>
-        <w:rPr>
-          <w:rFonts w:ascii="Times New Roman" w:hAnsi="Times New Roman"/>
-          <w:b w:val="0"/>
-          <w:sz w:val="24"/>
-        </w:rPr>
-        <w:t xml:space="preserve"> linked peripheral immune-cell phenotypes to Alzheimer's disease. Zhang et al. </w:t>
-      </w:r>
-      <w:r>
-        <w:rPr>
-          <w:rFonts w:ascii="Times New Roman" w:hAnsi="Times New Roman"/>
-          <w:b w:val="0"/>
-          <w:sz w:val="24"/>
-          <w:vertAlign w:val="superscript"/>
-        </w:rPr>
-        <w:t>36</w:t>
-      </w:r>
-      <w:r>
-        <w:rPr>
-          <w:rFonts w:ascii="Times New Roman" w:hAnsi="Times New Roman"/>
-          <w:b w:val="0"/>
-          <w:sz w:val="24"/>
-        </w:rPr>
-        <w:t xml:space="preserve"> mediated allergic-disease effects on bronchiectasis. Hao et al. </w:t>
+        <w:t xml:space="preserve"> mediated cardiometabolic pathways to heart failure with preserved ejection fraction. Hao et al. </w:t>
       </w:r>
       <w:r>
         <w:rPr>
@@ -6740,24 +7852,7 @@
           <w:b w:val="0"/>
           <w:sz w:val="24"/>
         </w:rPr>
-        <w:t xml:space="preserve"> identified molecular mediators of obesity on breast cancer. Wang et al. </w:t>
-      </w:r>
-      <w:r>
-        <w:rPr>
-          <w:rFonts w:ascii="Times New Roman" w:hAnsi="Times New Roman"/>
-          <w:b w:val="0"/>
-          <w:sz w:val="24"/>
-          <w:vertAlign w:val="superscript"/>
-        </w:rPr>
-        <w:t>38</w:t>
-      </w:r>
-      <w:r>
-        <w:rPr>
-          <w:rFonts w:ascii="Times New Roman" w:hAnsi="Times New Roman"/>
-          <w:b w:val="0"/>
-          <w:sz w:val="24"/>
-        </w:rPr>
-        <w:t xml:space="preserve"> mediated neuroticism effects on cardiomyopathy. He et al. </w:t>
+        <w:t xml:space="preserve"> identified molecular mediators of obesity on breast cancer. He et al. </w:t>
       </w:r>
       <w:r>
         <w:rPr>
@@ -6774,7 +7869,7 @@
           <w:b w:val="0"/>
           <w:sz w:val="24"/>
         </w:rPr>
-        <w:t xml:space="preserve"> examined maternal-hyperglycaemia mediation of neonatal outcomes.</w:t>
+        <w:t xml:space="preserve"> examined maternal-hyperglycaemia mediation of neonatal outcomes. Ten further domain examples (metabolic, psychiatric, neurological and oncologic) are tabulated in Supplementary Table S6.</w:t>
       </w:r>
     </w:p>
     <w:p>
@@ -6796,7 +7891,7 @@
           <w:b w:val="0"/>
           <w:sz w:val="24"/>
         </w:rPr>
-        <w:t xml:space="preserve"> (1) The closed form is a first-order delta approximation; in the weak-instrument/high-overlap corner (F &lt; 15, π_shared &gt; 0.5) residual error reaches ~10–14% and the Monte Carlo fallback should be used. The bound B is a sufficient conservative envelope (observed errors 5–20× smaller), not a tight constant. (2) Real-data evidence rests on 5 non-degenerate overlapping trios from the 108-re-estimation batch (plus 2 degenerate self-mediating trios flagged by the pipeline); the batch excludes non-European and many protein/QTL traits (28/70 returned no EUR-clumped instruments), so the true overlap rate in the full literature may differ. (2b) The batch re-estimation is also not a representative sample of the 39.3% of studies flagged as overlap-capable: it is restricted to the subset resolvable to public, EUR-clumped GWAS accessions, which systematically excludes non-European-ancestry studies and many protein/metabolite QTL panels (28/70 in an earlier resolution pass returned no EUR-clumped instruments). Because these excluded designs are plausibly *more*, not less, likely to involve narrow, overlapping instrument pools (small QTL panels have fewer independent SNPs to draw on), the 6.5% overlap rate and the 0/5 flip result should be treated as a lower-bound characterization of the resolvable, EUR-ancestry subset of the literature rather than an estimate generalizable to the full audited corpus. (3) The κ statistics in Supplementary Methods S7 come from a within-team blinded second coding pass (the original coder did not participate; the second coder was blind to the sealed answer key and to the study hypothesis), not from an independent external rater; a fully external reliability assessment was not feasible within the study timeline and is noted as a priority for follow-up validation. The blind re-coding template, sealed answer key, and compute_kappa_2nd.py are deposited so that an independent collaborator — or a blinded co-author — can reproduce or supersede this κ in one command.</w:t>
+        <w:t xml:space="preserve"> (1) The closed form is a first-order delta approximation; in the weak-instrument/high-overlap corner (F &lt; 15, π_shared &gt; 0.5) residual error reaches ~10–14% and the Monte Carlo fallback should be used. The bound B is a sufficient conservative envelope (observed errors 5–20× smaller), not a tight constant. (2) Real-data evidence rests on 5 non-degenerate overlapping trios from the 108-re-estimation batch (plus 2 degenerate self-mediating trios flagged by the pipeline); the batch excludes non-European and many protein/QTL traits (28/70 returned no EUR-clumped instruments), so the true overlap rate in the full literature may differ. (2b) The batch re-estimation is also not a representative sample of the 39.3% of studies flagged as overlap-capable: it is restricted to the subset resolvable to public, EUR-clumped GWAS accessions, which systematically excludes non-European-ancestry studies and many protein/metabolite QTL panels (28/70 in an earlier resolution pass returned no EUR-clumped instruments). Because these excluded designs are plausibly *more*, not less, likely to involve narrow, overlapping instrument pools (small QTL panels have fewer independent SNPs to draw on), the 6.5% overlap rate and the 0/5 flip result should be treated as a lower-bound characterization of the resolvable, EUR-ancestry subset of the literature rather than an estimate generalizable to the full audited corpus. (3) The κ statistics in Supplementary Methods S7 come from a within-team blinded second coding pass (the original coder did not participate; the second coder was blind to the sealed answer key and to the study hypothesis), not from an independent external rater; a fully external reliability assessment was not feasible within the study timeline and is noted as a priority for follow-up validation. The blind re-coding template, sealed answer key, and compute_kappa_2nd.py are deposited so that an independent collaborator — or a blinded co-author — can reproduce or supersede this κ in one command. (4) The literature audit searched PubMed only and did not query Embase or Web of Science; studies indexed solely in other databases, non-English-language reports, and PubMed-absent preprints are therefore not captured, so the prevalence estimates are conditional on the PubMed-indexed two-step MR mediation literature and may under-count the true denominator, especially rapidly published 2024–2026 work. (5) The audit protocol — search strings, coding rules, and the conservative/typical/structural classification scheme — was finalized and locked before screening and is deposited verbatim in Codebook S1, but was not prospectively registered on PROSPERO or OSF. We did not register because the audit is a methodological characterization of an existing literature rather than a hypothesis-testing systematic review, and because the three classification sensitivities were pre-specified as a deliberate range (not post-hoc tuning) intended to bound, rather than optimize, the prevalence estimate; reporting all three shows the central conclusion — overlap handling is rarely disclosed — is unchanged across the full sensitivity range.</w:t>
       </w:r>
     </w:p>
     <w:p>
@@ -6891,7 +7986,7 @@
           <w:b w:val="0"/>
           <w:sz w:val="24"/>
         </w:rPr>
-        <w:t>The diagnostic tool estimate_cov_prod_mr() and all replication scripts are deposited in a public GitHub repository (https://github.com/javenzju/two-step-mr-cov; archived at Zenodo, DOI: 10.5281/zenodo.XXXXXXX) and are organised as follows. The core tool and its dependencies are in code/method_core/ (S10_prod_mr_cov_tool.R, weak_instrument_threshold_FIXED.R, S16_bootstrap_fallback_indirect_var_FIXED.R); validation scripts are code/method_core/T2_validation.R and code/method_core/T5_bootstrap_coverage.R. The TwoSampleMR-compatible wrapper mr_cov_correct() is code/correct_cov_prod_mr.R (self-test code/test_correct_cov_prod_mr.R), the ieugwasr-compatible wrapper mr_mediation_correct_from_frames() is code/correct_from_ieugwasr.py, and the usage guide is code/TOOL_README.md; both wrappers were cross-checked against code/method_core/S10_prod_mr_cov_tool.R and the D56 ground truth. The inter-coder reliability work package (blind re-coding sheet, second-coder template, sealed answer key, and compute_kappa_2nd.py calculator with Pe→1-artifact detection and bootstrap CI) is in code/ (kappa_second_coder_template.csv, code/kappa/kappa_answer_key_20260903.csv, compute_kappa_2nd.py, kappa_instructions.md) and is re-runnable via a second blinded coding pass. Real GWAS summary statistics were obtained through IEU OpenGWAS and are subject to the OpenGWAS data-use policy; the BMI → waist → CHD illustration uses trait IDs ieu-a-2, ieu-a-61, ieu-a-7, and the S245 re-examination uses ieu-a-302, met-a-509, prot-a-2100, finn-b-CD2_MULTIPLE_MYELOMA_PLASMA_CELL. Instrument sets were extracted via the OpenGWAS REST /tophits endpoint; the accession-resolution and overlap scripts are code/replication/S245_resolve_mediators.py and code/replication/S245_pi_shared.py. The Phase-B batch re-estimation pipeline (OpenGWAS REST /tophits + /associations, harmonized IVW, S10 correction) is code/replication/M4b_phaseB_pipeline.py, with the candidate screening, π_shared and re-estimation outputs in code/replication/. The literature coding table underlying §3.3 is code/literature_coding_table_UPDATED.xlsx. The Zenodo DOI will be minted upon acceptance; the GitHub repository is public at submission.</w:t>
+        <w:t>The diagnostic tool estimate_cov_prod_mr() and all replication scripts are deposited in a public GitHub repository (https://github.com/javenzju/two-step-mr-cov; archived at Zenodo, DOI: 10.5281/zenodo.XXXXXXX) and are organised as follows. The core tool and its dependencies are in code/method_core/ (S10_prod_mr_cov_tool.R, weak_instrument_threshold_FIXED.R, S16_bootstrap_fallback_indirect_var_FIXED.R); validation scripts are code/method_core/T2_validation.R and code/method_core/T5_bootstrap_coverage.R. The TwoSampleMR-compatible wrapper mr_cov_correct() is code/correct_cov_prod_mr.R (self-test code/test_correct_cov_prod_mr.R), the ieugwasr-compatible wrapper mr_mediation_correct_from_frames() is code/correct_from_ieugwasr.py, and the usage guide is code/TOOL_README.md; both wrappers were cross-checked against code/method_core/S10_prod_mr_cov_tool.R and the D56 ground truth. The inter-coder reliability work package (blind re-coding sheet, second-coder template, sealed answer key, and compute_kappa_2nd.py calculator with Pe→1-artifact detection and bootstrap CI) is in code/ (kappa_second_coder_template.csv, code/kappa/kappa_answer_key_20260903.csv, compute_kappa_2nd.py, kappa_instructions.md) and is re-runnable via a second blinded coding pass. Real GWAS summary statistics were obtained through IEU OpenGWAS and are subject to the OpenGWAS data-use policy; the BMI → waist → CHD illustration uses trait IDs ieu-a-2, ieu-a-61, ieu-a-7, and the S245 re-examination uses ieu-a-302, met-a-509, prot-a-2100, finn-b-CD2_MULTIPLE_MYELOMA_PLASMA_CELL. Instrument sets were extracted via the OpenGWAS REST /tophits endpoint; the accession-resolution and overlap scripts are code/replication/S245_resolve_mediators.py and code/replication/S245_pi_shared.py. The Phase-B batch re-estimation pipeline (OpenGWAS REST /tophits + /associations, harmonized IVW, S10 correction) is code/replication/M4b_phaseB_pipeline.py, with the candidate screening, π_shared and re-estimation outputs in code/replication/. The horizontal-pleiotropy sensitivity analysis (MR-Egger intercept and weighted-median on both steps of the five non-degenerate trios) is code/replication/M4c_pleiotropy_sensitivity.py, with the per-step intercepts, p-values and weighted-median slopes in temp/M4c_pleiotropy.csv. The literature coding table underlying §3.3 is code/literature_coding_table_UPDATED.xlsx. The Zenodo DOI will be minted upon acceptance; the GitHub repository is public at submission.</w:t>
       </w:r>
     </w:p>
     <w:p>
@@ -6919,7 +8014,7 @@
           <w:b w:val="0"/>
           <w:sz w:val="24"/>
         </w:rPr>
-        <w:t>This work was supported by the Zhejiang Traditional Chinese Medicine Science and Technology Plan Project (2023ZL390, 2024ZL381) and the Zhejiang Provincial Medical and Health Science and Technology Plan (2023KY860, 2021KY827). The authors thank the creators and maintainers of the IEU OpenGWAS platform and the original GWAS consortia for making summary statistics publicly available.</w:t>
+        <w:t>This work was supported by the Zhejiang Traditional Chinese Medicine Science and Technology Plan Project (2023ZL390, 2024ZL381) and the Zhejiang Provincial Medical and Health Science and Technology Plan (2023KY860, 2021KY827). The funders had no role in study design, data collection, analysis, interpretation, decision to publish, or preparation of the manuscript. The authors thank the creators and maintainers of the IEU OpenGWAS platform and the original GWAS consortia for making summary statistics publicly available.</w:t>
       </w:r>
     </w:p>
     <w:p>
@@ -7004,6 +8099,34 @@
           <w:sz w:val="24"/>
         </w:rPr>
         <w:t>The authors declare no competing interests.</w:t>
+      </w:r>
+    </w:p>
+    <w:p>
+      <w:pPr>
+        <w:spacing w:before="200" w:after="80"/>
+        <w:jc w:val="left"/>
+      </w:pPr>
+      <w:r>
+        <w:rPr>
+          <w:rFonts w:ascii="Times New Roman" w:hAnsi="Times New Roman"/>
+          <w:b/>
+          <w:sz w:val="26"/>
+        </w:rPr>
+        <w:t>Artificial intelligence disclosure</w:t>
+      </w:r>
+    </w:p>
+    <w:p>
+      <w:pPr>
+        <w:ind w:firstLine="480"/>
+        <w:jc w:val="both"/>
+      </w:pPr>
+      <w:r>
+        <w:rPr>
+          <w:rFonts w:ascii="Times New Roman" w:hAnsi="Times New Roman"/>
+          <w:b w:val="0"/>
+          <w:sz w:val="24"/>
+        </w:rPr>
+        <w:t>During manuscript preparation the authors used a large language model (an AI assistant) to support English-language polishing and to scaffold and debug analysis code. The language model did not conceive the research questions, derive the closed-form covariance, perform the statistical analyses, or interpret the results; all methods, computations, results and conclusions were authored and verified by the human authors. No AI tool was used to generate the literature-review content, the coding decisions, or the reported numbers, and no text generated by the model was included without full author review and editing.</w:t>
       </w:r>
     </w:p>
     <w:p>
@@ -7902,27 +9025,6 @@
           <w:b/>
           <w:sz w:val="24"/>
         </w:rPr>
-        <w:t>Figure 4.</w:t>
-      </w:r>
-      <w:r>
-        <w:rPr>
-          <w:rFonts w:ascii="Times New Roman" w:hAnsi="Times New Roman"/>
-          <w:b w:val="0"/>
-          <w:sz w:val="24"/>
-        </w:rPr>
-        <w:t xml:space="preserve"> Indirect effect (α̂β̂) and 95% confidence intervals for the BMI → waist → CHD pathway. Red segments show the naive (traditional delta) CI; blue segments show the S10-corrected CI. *Top:* shared-IV design (n_s = 78), where the corrected SE is 15.5% smaller. *Bottom:* natural overlap (n_s = 13), where the corrected SE is 2.8% smaller.</w:t>
-      </w:r>
-    </w:p>
-    <w:p>
-      <w:pPr>
-        <w:jc w:val="both"/>
-      </w:pPr>
-      <w:r>
-        <w:rPr>
-          <w:rFonts w:ascii="Times New Roman" w:hAnsi="Times New Roman"/>
-          <w:b/>
-          <w:sz w:val="24"/>
-        </w:rPr>
         <w:t>Figure 3.</w:t>
       </w:r>
       <w:r>
@@ -7948,6 +9050,27 @@
           <w:sz w:val="24"/>
         </w:rPr>
         <w:t>. *Structural* counts all separate-IV designs as capable of overlap (41.1% [95% CI 36.0–46.5%]).</w:t>
+      </w:r>
+    </w:p>
+    <w:p>
+      <w:pPr>
+        <w:jc w:val="both"/>
+      </w:pPr>
+      <w:r>
+        <w:rPr>
+          <w:rFonts w:ascii="Times New Roman" w:hAnsi="Times New Roman"/>
+          <w:b/>
+          <w:sz w:val="24"/>
+        </w:rPr>
+        <w:t>Figure 4.</w:t>
+      </w:r>
+      <w:r>
+        <w:rPr>
+          <w:rFonts w:ascii="Times New Roman" w:hAnsi="Times New Roman"/>
+          <w:b w:val="0"/>
+          <w:sz w:val="24"/>
+        </w:rPr>
+        <w:t xml:space="preserve"> Indirect effect (α̂β̂) and 95% confidence intervals for the BMI → waist → CHD pathway. Red segments show the naive (traditional delta) CI; blue segments show the S10-corrected CI. *Top:* shared-IV design (n_s = 78), where the corrected SE is 15.5% smaller. *Bottom:* natural overlap (n_s = 13), where the corrected SE is 2.8% smaller.</w:t>
       </w:r>
     </w:p>
     <w:p>
@@ -9114,7 +10237,7 @@
           <w:b w:val="0"/>
           <w:sz w:val="24"/>
         </w:rPr>
-        <w:t xml:space="preserve"> the simulation-coverage plot (former Fig. 2), the validation sweep (former Fig. 5), the SE-change forest (former Fig. 6), and the flip-probability scan (former Fig. S_flip, this work) are provided here as supplementary figures; their legends appear in the Figure legends section under their supplementary labels.</w:t>
+        <w:t xml:space="preserve"> the simulation-coverage plot, the targeted validation sweep, the SE-change forest, and the flip-probability scan, respectively; their legends appear in the Figure legends section under their supplementary labels.</w:t>
       </w:r>
     </w:p>
     <w:p>
@@ -9238,6 +10361,28 @@
           <w:b/>
           <w:sz w:val="24"/>
         </w:rPr>
+        <w:t>Supplementary Table S3:</w:t>
+      </w:r>
+      <w:r>
+        <w:rPr>
+          <w:rFonts w:ascii="Times New Roman" w:hAnsi="Times New Roman"/>
+          <w:b w:val="0"/>
+          <w:sz w:val="24"/>
+        </w:rPr>
+        <w:t xml:space="preserve"> completed PRISMA 2020 checklist for the literature audit, with search strings (D61_Supplementary_S9_prisma_checklist.md).</w:t>
+      </w:r>
+    </w:p>
+    <w:p>
+      <w:pPr>
+        <w:pStyle w:val="ListBullet"/>
+        <w:jc w:val="both"/>
+      </w:pPr>
+      <w:r>
+        <w:rPr>
+          <w:rFonts w:ascii="Times New Roman" w:hAnsi="Times New Roman"/>
+          <w:b/>
+          <w:sz w:val="24"/>
+        </w:rPr>
         <w:t>Supplementary Table S5:</w:t>
       </w:r>
       <w:r>
@@ -9247,6 +10392,583 @@
           <w:sz w:val="24"/>
         </w:rPr>
         <w:t xml:space="preserve"> worst-case ρ_MY sensitivity (upper 95% CI substitution) for the six overlapping trios.</w:t>
+      </w:r>
+    </w:p>
+    <w:p>
+      <w:pPr>
+        <w:ind w:firstLine="480"/>
+        <w:jc w:val="both"/>
+      </w:pPr>
+      <w:r>
+        <w:rPr>
+          <w:rFonts w:ascii="Times New Roman" w:hAnsi="Times New Roman"/>
+          <w:b/>
+          <w:sz w:val="24"/>
+        </w:rPr>
+        <w:t>Supplementary Table S6.</w:t>
+      </w:r>
+      <w:r>
+        <w:rPr>
+          <w:rFonts w:ascii="Times New Roman" w:hAnsi="Times New Roman"/>
+          <w:b w:val="0"/>
+          <w:sz w:val="24"/>
+        </w:rPr>
+        <w:t xml:space="preserve"> Additional two-step MR mediation applications (cited in the text beyond the six Discussion examples).</w:t>
+      </w:r>
+    </w:p>
+    <w:tbl>
+      <w:tblPr>
+        <w:tblStyle w:val="TableGrid"/>
+        <w:tblW w:type="auto" w:w="0"/>
+        <w:jc w:val="center"/>
+        <w:tblLook w:firstColumn="1" w:firstRow="1" w:lastColumn="0" w:lastRow="0" w:noHBand="0" w:noVBand="1" w:val="04A0"/>
+      </w:tblPr>
+      <w:tblGrid>
+        <w:gridCol w:w="2880"/>
+        <w:gridCol w:w="2880"/>
+        <w:gridCol w:w="2880"/>
+      </w:tblGrid>
+      <w:tr>
+        <w:tc>
+          <w:tcPr>
+            <w:tcW w:type="dxa" w:w="2880"/>
+          </w:tcPr>
+          <w:p>
+            <w:r/>
+            <w:r>
+              <w:rPr>
+                <w:rFonts w:ascii="Times New Roman" w:hAnsi="Times New Roman"/>
+                <w:b/>
+                <w:sz w:val="19"/>
+              </w:rPr>
+              <w:t>Ref</w:t>
+            </w:r>
+          </w:p>
+        </w:tc>
+        <w:tc>
+          <w:tcPr>
+            <w:tcW w:type="dxa" w:w="2880"/>
+          </w:tcPr>
+          <w:p>
+            <w:r/>
+            <w:r>
+              <w:rPr>
+                <w:rFonts w:ascii="Times New Roman" w:hAnsi="Times New Roman"/>
+                <w:b/>
+                <w:sz w:val="19"/>
+              </w:rPr>
+              <w:t>Domain</w:t>
+            </w:r>
+          </w:p>
+        </w:tc>
+        <w:tc>
+          <w:tcPr>
+            <w:tcW w:type="dxa" w:w="2880"/>
+          </w:tcPr>
+          <w:p>
+            <w:r/>
+            <w:r>
+              <w:rPr>
+                <w:rFonts w:ascii="Times New Roman" w:hAnsi="Times New Roman"/>
+                <w:b/>
+                <w:sz w:val="19"/>
+              </w:rPr>
+              <w:t>Study</w:t>
+            </w:r>
+          </w:p>
+        </w:tc>
+      </w:tr>
+      <w:tr>
+        <w:tc>
+          <w:tcPr>
+            <w:tcW w:type="dxa" w:w="2880"/>
+          </w:tcPr>
+          <w:p>
+            <w:r/>
+            <w:r>
+              <w:rPr>
+                <w:rFonts w:ascii="Times New Roman" w:hAnsi="Times New Roman"/>
+                <w:sz w:val="19"/>
+              </w:rPr>
+              <w:t>25</w:t>
+            </w:r>
+          </w:p>
+        </w:tc>
+        <w:tc>
+          <w:tcPr>
+            <w:tcW w:type="dxa" w:w="2880"/>
+          </w:tcPr>
+          <w:p>
+            <w:r/>
+            <w:r>
+              <w:rPr>
+                <w:rFonts w:ascii="Times New Roman" w:hAnsi="Times New Roman"/>
+                <w:sz w:val="19"/>
+              </w:rPr>
+              <w:t>Psychiatry</w:t>
+            </w:r>
+          </w:p>
+        </w:tc>
+        <w:tc>
+          <w:tcPr>
+            <w:tcW w:type="dxa" w:w="2880"/>
+          </w:tcPr>
+          <w:p>
+            <w:r/>
+            <w:r>
+              <w:rPr>
+                <w:rFonts w:ascii="Times New Roman" w:hAnsi="Times New Roman"/>
+                <w:sz w:val="19"/>
+              </w:rPr>
+              <w:t>Feng et al. — cross-ancestry pleiotropic imaging phenotypes for depression risk stratification</w:t>
+            </w:r>
+          </w:p>
+        </w:tc>
+      </w:tr>
+      <w:tr>
+        <w:tc>
+          <w:tcPr>
+            <w:tcW w:type="dxa" w:w="2880"/>
+          </w:tcPr>
+          <w:p>
+            <w:r/>
+            <w:r>
+              <w:rPr>
+                <w:rFonts w:ascii="Times New Roman" w:hAnsi="Times New Roman"/>
+                <w:sz w:val="19"/>
+              </w:rPr>
+              <w:t>29</w:t>
+            </w:r>
+          </w:p>
+        </w:tc>
+        <w:tc>
+          <w:tcPr>
+            <w:tcW w:type="dxa" w:w="2880"/>
+          </w:tcPr>
+          <w:p>
+            <w:r/>
+            <w:r>
+              <w:rPr>
+                <w:rFonts w:ascii="Times New Roman" w:hAnsi="Times New Roman"/>
+                <w:sz w:val="19"/>
+              </w:rPr>
+              <w:t>Metabolic / endocrine</w:t>
+            </w:r>
+          </w:p>
+        </w:tc>
+        <w:tc>
+          <w:tcPr>
+            <w:tcW w:type="dxa" w:w="2880"/>
+          </w:tcPr>
+          <w:p>
+            <w:r/>
+            <w:r>
+              <w:rPr>
+                <w:rFonts w:ascii="Times New Roman" w:hAnsi="Times New Roman"/>
+                <w:sz w:val="19"/>
+              </w:rPr>
+              <w:t>Hu et al. — body-fat distribution as mediator of diabetogenic action of lipid-modifying drugs</w:t>
+            </w:r>
+          </w:p>
+        </w:tc>
+      </w:tr>
+      <w:tr>
+        <w:tc>
+          <w:tcPr>
+            <w:tcW w:type="dxa" w:w="2880"/>
+          </w:tcPr>
+          <w:p>
+            <w:r/>
+            <w:r>
+              <w:rPr>
+                <w:rFonts w:ascii="Times New Roman" w:hAnsi="Times New Roman"/>
+                <w:sz w:val="19"/>
+              </w:rPr>
+              <w:t>30</w:t>
+            </w:r>
+          </w:p>
+        </w:tc>
+        <w:tc>
+          <w:tcPr>
+            <w:tcW w:type="dxa" w:w="2880"/>
+          </w:tcPr>
+          <w:p>
+            <w:r/>
+            <w:r>
+              <w:rPr>
+                <w:rFonts w:ascii="Times New Roman" w:hAnsi="Times New Roman"/>
+                <w:sz w:val="19"/>
+              </w:rPr>
+              <w:t>Oncology (neuro)</w:t>
+            </w:r>
+          </w:p>
+        </w:tc>
+        <w:tc>
+          <w:tcPr>
+            <w:tcW w:type="dxa" w:w="2880"/>
+          </w:tcPr>
+          <w:p>
+            <w:r/>
+            <w:r>
+              <w:rPr>
+                <w:rFonts w:ascii="Times New Roman" w:hAnsi="Times New Roman"/>
+                <w:sz w:val="19"/>
+              </w:rPr>
+              <w:t>Huang et al. — cyclic cytokines mediating immune-cell effects on meningioma</w:t>
+            </w:r>
+          </w:p>
+        </w:tc>
+      </w:tr>
+      <w:tr>
+        <w:tc>
+          <w:tcPr>
+            <w:tcW w:type="dxa" w:w="2880"/>
+          </w:tcPr>
+          <w:p>
+            <w:r/>
+            <w:r>
+              <w:rPr>
+                <w:rFonts w:ascii="Times New Roman" w:hAnsi="Times New Roman"/>
+                <w:sz w:val="19"/>
+              </w:rPr>
+              <w:t>31</w:t>
+            </w:r>
+          </w:p>
+        </w:tc>
+        <w:tc>
+          <w:tcPr>
+            <w:tcW w:type="dxa" w:w="2880"/>
+          </w:tcPr>
+          <w:p>
+            <w:r/>
+            <w:r>
+              <w:rPr>
+                <w:rFonts w:ascii="Times New Roman" w:hAnsi="Times New Roman"/>
+                <w:sz w:val="19"/>
+              </w:rPr>
+              <w:t>Psychiatry</w:t>
+            </w:r>
+          </w:p>
+        </w:tc>
+        <w:tc>
+          <w:tcPr>
+            <w:tcW w:type="dxa" w:w="2880"/>
+          </w:tcPr>
+          <w:p>
+            <w:r/>
+            <w:r>
+              <w:rPr>
+                <w:rFonts w:ascii="Times New Roman" w:hAnsi="Times New Roman"/>
+                <w:sz w:val="19"/>
+              </w:rPr>
+              <w:t>Zhou et al. — air pollution as risk factor for psychiatric disorders</w:t>
+            </w:r>
+          </w:p>
+        </w:tc>
+      </w:tr>
+      <w:tr>
+        <w:tc>
+          <w:tcPr>
+            <w:tcW w:type="dxa" w:w="2880"/>
+          </w:tcPr>
+          <w:p>
+            <w:r/>
+            <w:r>
+              <w:rPr>
+                <w:rFonts w:ascii="Times New Roman" w:hAnsi="Times New Roman"/>
+                <w:sz w:val="19"/>
+              </w:rPr>
+              <w:t>32</w:t>
+            </w:r>
+          </w:p>
+        </w:tc>
+        <w:tc>
+          <w:tcPr>
+            <w:tcW w:type="dxa" w:w="2880"/>
+          </w:tcPr>
+          <w:p>
+            <w:r/>
+            <w:r>
+              <w:rPr>
+                <w:rFonts w:ascii="Times New Roman" w:hAnsi="Times New Roman"/>
+                <w:sz w:val="19"/>
+              </w:rPr>
+              <w:t>Cardiovascular</w:t>
+            </w:r>
+          </w:p>
+        </w:tc>
+        <w:tc>
+          <w:tcPr>
+            <w:tcW w:type="dxa" w:w="2880"/>
+          </w:tcPr>
+          <w:p>
+            <w:r/>
+            <w:r>
+              <w:rPr>
+                <w:rFonts w:ascii="Times New Roman" w:hAnsi="Times New Roman"/>
+                <w:sz w:val="19"/>
+              </w:rPr>
+              <w:t>Wang et al. — nut-consumption mediators of cardiovascular disease</w:t>
+            </w:r>
+          </w:p>
+        </w:tc>
+      </w:tr>
+      <w:tr>
+        <w:tc>
+          <w:tcPr>
+            <w:tcW w:type="dxa" w:w="2880"/>
+          </w:tcPr>
+          <w:p>
+            <w:r/>
+            <w:r>
+              <w:rPr>
+                <w:rFonts w:ascii="Times New Roman" w:hAnsi="Times New Roman"/>
+                <w:sz w:val="19"/>
+              </w:rPr>
+              <w:t>33</w:t>
+            </w:r>
+          </w:p>
+        </w:tc>
+        <w:tc>
+          <w:tcPr>
+            <w:tcW w:type="dxa" w:w="2880"/>
+          </w:tcPr>
+          <w:p>
+            <w:r/>
+            <w:r>
+              <w:rPr>
+                <w:rFonts w:ascii="Times New Roman" w:hAnsi="Times New Roman"/>
+                <w:sz w:val="19"/>
+              </w:rPr>
+              <w:t>Neurological</w:t>
+            </w:r>
+          </w:p>
+        </w:tc>
+        <w:tc>
+          <w:tcPr>
+            <w:tcW w:type="dxa" w:w="2880"/>
+          </w:tcPr>
+          <w:p>
+            <w:r/>
+            <w:r>
+              <w:rPr>
+                <w:rFonts w:ascii="Times New Roman" w:hAnsi="Times New Roman"/>
+                <w:sz w:val="19"/>
+              </w:rPr>
+              <w:t>Xu et al. — immune-cell-mediated link between sphingomyelin and stroke</w:t>
+            </w:r>
+          </w:p>
+        </w:tc>
+      </w:tr>
+      <w:tr>
+        <w:tc>
+          <w:tcPr>
+            <w:tcW w:type="dxa" w:w="2880"/>
+          </w:tcPr>
+          <w:p>
+            <w:r/>
+            <w:r>
+              <w:rPr>
+                <w:rFonts w:ascii="Times New Roman" w:hAnsi="Times New Roman"/>
+                <w:sz w:val="19"/>
+              </w:rPr>
+              <w:t>34</w:t>
+            </w:r>
+          </w:p>
+        </w:tc>
+        <w:tc>
+          <w:tcPr>
+            <w:tcW w:type="dxa" w:w="2880"/>
+          </w:tcPr>
+          <w:p>
+            <w:r/>
+            <w:r>
+              <w:rPr>
+                <w:rFonts w:ascii="Times New Roman" w:hAnsi="Times New Roman"/>
+                <w:sz w:val="19"/>
+              </w:rPr>
+              <w:t>Immunology / allergy</w:t>
+            </w:r>
+          </w:p>
+        </w:tc>
+        <w:tc>
+          <w:tcPr>
+            <w:tcW w:type="dxa" w:w="2880"/>
+          </w:tcPr>
+          <w:p>
+            <w:r/>
+            <w:r>
+              <w:rPr>
+                <w:rFonts w:ascii="Times New Roman" w:hAnsi="Times New Roman"/>
+                <w:sz w:val="19"/>
+              </w:rPr>
+              <w:t>Wang et al. — lipid-metabolism mediators of allergic diseases</w:t>
+            </w:r>
+          </w:p>
+        </w:tc>
+      </w:tr>
+      <w:tr>
+        <w:tc>
+          <w:tcPr>
+            <w:tcW w:type="dxa" w:w="2880"/>
+          </w:tcPr>
+          <w:p>
+            <w:r/>
+            <w:r>
+              <w:rPr>
+                <w:rFonts w:ascii="Times New Roman" w:hAnsi="Times New Roman"/>
+                <w:sz w:val="19"/>
+              </w:rPr>
+              <w:t>35</w:t>
+            </w:r>
+          </w:p>
+        </w:tc>
+        <w:tc>
+          <w:tcPr>
+            <w:tcW w:type="dxa" w:w="2880"/>
+          </w:tcPr>
+          <w:p>
+            <w:r/>
+            <w:r>
+              <w:rPr>
+                <w:rFonts w:ascii="Times New Roman" w:hAnsi="Times New Roman"/>
+                <w:sz w:val="19"/>
+              </w:rPr>
+              <w:t>Neurology</w:t>
+            </w:r>
+          </w:p>
+        </w:tc>
+        <w:tc>
+          <w:tcPr>
+            <w:tcW w:type="dxa" w:w="2880"/>
+          </w:tcPr>
+          <w:p>
+            <w:r/>
+            <w:r>
+              <w:rPr>
+                <w:rFonts w:ascii="Times New Roman" w:hAnsi="Times New Roman"/>
+                <w:sz w:val="19"/>
+              </w:rPr>
+              <w:t>Sun et al. — peripheral immune-cell phenotypes and Alzheimer's disease</w:t>
+            </w:r>
+          </w:p>
+        </w:tc>
+      </w:tr>
+      <w:tr>
+        <w:tc>
+          <w:tcPr>
+            <w:tcW w:type="dxa" w:w="2880"/>
+          </w:tcPr>
+          <w:p>
+            <w:r/>
+            <w:r>
+              <w:rPr>
+                <w:rFonts w:ascii="Times New Roman" w:hAnsi="Times New Roman"/>
+                <w:sz w:val="19"/>
+              </w:rPr>
+              <w:t>36</w:t>
+            </w:r>
+          </w:p>
+        </w:tc>
+        <w:tc>
+          <w:tcPr>
+            <w:tcW w:type="dxa" w:w="2880"/>
+          </w:tcPr>
+          <w:p>
+            <w:r/>
+            <w:r>
+              <w:rPr>
+                <w:rFonts w:ascii="Times New Roman" w:hAnsi="Times New Roman"/>
+                <w:sz w:val="19"/>
+              </w:rPr>
+              <w:t>Respiratory / allergy</w:t>
+            </w:r>
+          </w:p>
+        </w:tc>
+        <w:tc>
+          <w:tcPr>
+            <w:tcW w:type="dxa" w:w="2880"/>
+          </w:tcPr>
+          <w:p>
+            <w:r/>
+            <w:r>
+              <w:rPr>
+                <w:rFonts w:ascii="Times New Roman" w:hAnsi="Times New Roman"/>
+                <w:sz w:val="19"/>
+              </w:rPr>
+              <w:t>Zhang et al. — allergic-disease mediators of bronchiectasis</w:t>
+            </w:r>
+          </w:p>
+        </w:tc>
+      </w:tr>
+      <w:tr>
+        <w:tc>
+          <w:tcPr>
+            <w:tcW w:type="dxa" w:w="2880"/>
+          </w:tcPr>
+          <w:p>
+            <w:r/>
+            <w:r>
+              <w:rPr>
+                <w:rFonts w:ascii="Times New Roman" w:hAnsi="Times New Roman"/>
+                <w:sz w:val="19"/>
+              </w:rPr>
+              <w:t>38</w:t>
+            </w:r>
+          </w:p>
+        </w:tc>
+        <w:tc>
+          <w:tcPr>
+            <w:tcW w:type="dxa" w:w="2880"/>
+          </w:tcPr>
+          <w:p>
+            <w:r/>
+            <w:r>
+              <w:rPr>
+                <w:rFonts w:ascii="Times New Roman" w:hAnsi="Times New Roman"/>
+                <w:sz w:val="19"/>
+              </w:rPr>
+              <w:t>Cardiology / psychiatry</w:t>
+            </w:r>
+          </w:p>
+        </w:tc>
+        <w:tc>
+          <w:tcPr>
+            <w:tcW w:type="dxa" w:w="2880"/>
+          </w:tcPr>
+          <w:p>
+            <w:r/>
+            <w:r>
+              <w:rPr>
+                <w:rFonts w:ascii="Times New Roman" w:hAnsi="Times New Roman"/>
+                <w:sz w:val="19"/>
+              </w:rPr>
+              <w:t>Wang et al. — neuroticism as protective factor for cardiomyopathy</w:t>
+            </w:r>
+          </w:p>
+        </w:tc>
+      </w:tr>
+    </w:tbl>
+    <w:p>
+      <w:pPr>
+        <w:pStyle w:val="ListBullet"/>
+        <w:jc w:val="both"/>
+      </w:pPr>
+      <w:r>
+        <w:rPr>
+          <w:rFonts w:ascii="Times New Roman" w:hAnsi="Times New Roman"/>
+          <w:b/>
+          <w:sz w:val="24"/>
+        </w:rPr>
+        <w:t>Supplementary Table S6:</w:t>
+      </w:r>
+      <w:r>
+        <w:rPr>
+          <w:rFonts w:ascii="Times New Roman" w:hAnsi="Times New Roman"/>
+          <w:b w:val="0"/>
+          <w:sz w:val="24"/>
+        </w:rPr>
+        <w:t xml:space="preserve"> additional two-step MR mediation applications cited in the text, beyond the six worked examples in the Discussion (domain, study and reference).</w:t>
       </w:r>
     </w:p>
     <w:sectPr>

</xml_diff>

<commit_message>
JCE structured abstract: four-section format (Intro/Methods/Results/Discussion) + Plain Language Summary + What-is-new box; fix cover-letter abstract description
</commit_message>
<xml_diff>
--- a/D61_论文终稿_20260906.docx
+++ b/D61_论文终稿_20260906.docx
@@ -80,10 +80,18 @@
       <w:r>
         <w:rPr>
           <w:rFonts w:ascii="Times New Roman" w:hAnsi="Times New Roman"/>
+          <w:b/>
+          <w:sz w:val="24"/>
+        </w:rPr>
+        <w:t>Introduction or background (include the objective).</w:t>
+      </w:r>
+      <w:r>
+        <w:rPr>
+          <w:rFonts w:ascii="Times New Roman" w:hAnsi="Times New Roman"/>
           <w:b w:val="0"/>
           <w:sz w:val="24"/>
         </w:rPr>
-        <w:t>Two-step (product-method) Mendelian randomization mediation analyses routinely assume that the exposure-step and mediator-step instrument sets are independent, yet this assumption has never been checked at scale, and no closed-form correction exists for when it fails. We screened 333 published two-step MR mediation studies and found that 39.3% (95% CI 34.2–44.7%) use an instrument-selection design capable of producing non-independent (α̂, β̂) estimates, and essentially none report or correct for this at the covariance level. We close the methodological gap by deriving a closed-form expression for Cov(α̂, β̂) under instrument overlap, with a conservative reliability bound validated across 180 simulation cells, and we characterize analytically the exact boundary conditions — weak instruments, high shared-instrument proportion, discordant mediation sign — under which the omitted covariance is large enough to overturn a published conclusion (up to 10.4% flip probability in our 200-cell scan). A batch re-estimation of 113 coded studies resolved to public GWAS accessions (108 succeeded) found genuine instrument overlap in 6.5% (95% CI 3.2–12.8%; 7/108); among the five non-degenerate cases the correction narrowed every confidence interval with no observed flip, though this null result is imprecisely estimated (95% CI for the underlying flip rate: 0–43.4%) and should not be read as evidence that flips are rare in the wider, less-resolvable literature. Rather than treating ρ_MY as an assumed-zero sensitivity parameter, we estimated it empirically for the overlapping trios and show the observed narrowing is a structural, mechanism-explained consequence of shared-instrument covariance rather than a fortunate coincidence. The contribution of this work is therefore a validated method and a quantified, bounded description of an unreported design vulnerability — not a claim that any specific published conclusion is wrong.</w:t>
+        <w:t xml:space="preserve"> Two-step (product-method) Mendelian randomization mediation analyses routinely assume that the exposure-step and mediator-step instrument sets are independent, yet this assumption has never been checked at scale and no closed-form correction exists for when it fails. Our objective was to quantify how often the published two-step MR mediation literature uses an instrument-selection design capable of violating this independence assumption, to derive the omitted covariance in closed form, and to characterize the boundary conditions under which it overturns a conclusion.</w:t>
       </w:r>
     </w:p>
     <w:p>
@@ -97,15 +105,7 @@
           <w:b/>
           <w:sz w:val="24"/>
         </w:rPr>
-        <w:t>Keywords</w:t>
-      </w:r>
-      <w:r>
-        <w:rPr>
-          <w:rFonts w:ascii="Times New Roman" w:hAnsi="Times New Roman"/>
-          <w:b/>
-          <w:sz w:val="24"/>
-        </w:rPr>
-        <w:t>:</w:t>
+        <w:t>Methods.</w:t>
       </w:r>
       <w:r>
         <w:rPr>
@@ -113,7 +113,174 @@
           <w:b w:val="0"/>
           <w:sz w:val="24"/>
         </w:rPr>
+        <w:t xml:space="preserve"> We screened 333 published two-step MR mediation studies (from 695 records, PRISMA 2020) to code design type and overlap handling. We derived a closed-form expression for Cov(α̂, β̂) under two overlap channels — shared instruments and mediator–outcome sample overlap — with a conservative reliability bound validated across 180 simulation cells and a 200-cell flip-probability scan. We batch re-estimated every coded trio resolvable to public GWAS accessions (113 attempted, 108 succeeded) directly from OpenGWAS summary statistics using an all-Python pipeline (harmonized fixed-effects IVW plus the correction), and we estimated ρ_MY empirically for the overlapping trios from harmonized effect sizes.</w:t>
+      </w:r>
+    </w:p>
+    <w:p>
+      <w:pPr>
+        <w:ind w:firstLine="480"/>
+        <w:jc w:val="both"/>
+      </w:pPr>
+      <w:r>
+        <w:rPr>
+          <w:rFonts w:ascii="Times New Roman" w:hAnsi="Times New Roman"/>
+          <w:b/>
+          <w:sz w:val="24"/>
+        </w:rPr>
+        <w:t>Results.</w:t>
+      </w:r>
+      <w:r>
+        <w:rPr>
+          <w:rFonts w:ascii="Times New Roman" w:hAnsi="Times New Roman"/>
+          <w:b w:val="0"/>
+          <w:sz w:val="24"/>
+        </w:rPr>
+        <w:t xml:space="preserve"> 39.3% (95% CI 34.2–44.7%) of the 333 studies draw instruments from overlapping GWAS pools without disclosing overlap handling and are capable of non-zero Cov(α̂, β̂); essentially none report or correct for it at the covariance level. The correction restored nominal coverage on the simulation grid; up to 10.4% flip probability was identified in the discordant/high-overlap regime of the 200-cell scan. Genuine instrument overlap was found in 6.5% (95% CI 3.2–12.8%; 7/108) of the re-estimated trios; among the five non-degenerate cases the correction narrowed every confidence interval (0.2–16.0%) with zero observed flips. This null result is imprecisely estimated (95% CI for the underlying flip rate: 0–43.4%) and should not be read as evidence that flips are rare in the wider literature. Five of six overlapping trios showed genetically concordant mediator–outcome effects (ρ_g up to +0.81).</w:t>
+      </w:r>
+    </w:p>
+    <w:p>
+      <w:pPr>
+        <w:ind w:firstLine="480"/>
+        <w:jc w:val="both"/>
+      </w:pPr>
+      <w:r>
+        <w:rPr>
+          <w:rFonts w:ascii="Times New Roman" w:hAnsi="Times New Roman"/>
+          <w:b/>
+          <w:sz w:val="24"/>
+        </w:rPr>
+        <w:t>Discussion (include the conclusion).</w:t>
+      </w:r>
+      <w:r>
+        <w:rPr>
+          <w:rFonts w:ascii="Times New Roman" w:hAnsi="Times New Roman"/>
+          <w:b w:val="0"/>
+          <w:sz w:val="24"/>
+        </w:rPr>
+        <w:t xml:space="preserve"> Rather than treating ρ_MY as an assumed-zero sensitivity parameter, we estimated it empirically and show the observed narrowing is a structural, mechanism-explained consequence of shared-instrument covariance (the dominant shared-instrument covariance is negative when α̂ and β̂ share a sign) rather than a fortunate coincidence. The contribution of this work is a validated method and a quantified, bounded description of an unreported design vulnerability — not a claim that any specific published conclusion is wrong. The field currently lacks the reporting infrastructure (n_s, π_shared, ρ_MY) to tell, for any given result, which regime it falls into; we provide the closed-form tool, the empirical boundary conditions, and the audit baseline needed to close that gap.</w:t>
+      </w:r>
+    </w:p>
+    <w:p>
+      <w:pPr>
+        <w:ind w:firstLine="480"/>
+        <w:jc w:val="both"/>
+      </w:pPr>
+      <w:r>
+        <w:rPr>
+          <w:rFonts w:ascii="Times New Roman" w:hAnsi="Times New Roman"/>
+          <w:b/>
+          <w:sz w:val="24"/>
+        </w:rPr>
+        <w:t>Plain Language Summary.</w:t>
+      </w:r>
+      <w:r>
+        <w:rPr>
+          <w:rFonts w:ascii="Times New Roman" w:hAnsi="Times New Roman"/>
+          <w:b w:val="0"/>
+          <w:sz w:val="24"/>
+        </w:rPr>
+        <w:t xml:space="preserve"> Two-step Mendelian randomization mediation is a popular genetic method for separating how an exposure acts directly from how it acts through an intermediate trait. It assumes the genetic instruments used in the two steps do not overlap, but this has never been checked at scale. We found that about 39% of 333 published two-step mediation studies use an instrument-selection design that can violate this assumption, and almost none correct for it. We derive the missing covariance formula in closed form and show, via 180- and 200-cell simulations, when it is large enough to flip a conclusion (up to ~10%). Re-analysing 108 studies resolvable to public data, 6.5% had genuine instrument overlap; in the five clean cases the correction narrowed every confidence interval with no flips, but this null finding is imprecise (95% CI for the flip rate 0–43%) and must not be read as "flips are rare." We also measured the relevant genetic concordance directly rather than assuming it zero. The takeaway for practitioners: report the number of shared instruments (n_s), their proportion (π_shared), and the mediator–outcome genetic correlation (ρ_MY) so reviewers can judge overlap risk; our released tool computes the correction without full reanalysis.</w:t>
+      </w:r>
+    </w:p>
+    <w:p>
+      <w:pPr>
+        <w:jc w:val="both"/>
+      </w:pPr>
+      <w:r>
+        <w:rPr>
+          <w:rFonts w:ascii="Times New Roman" w:hAnsi="Times New Roman"/>
+          <w:b/>
+          <w:sz w:val="22"/>
+        </w:rPr>
+        <w:t>Keywords:</w:t>
+      </w:r>
+      <w:r>
+        <w:rPr>
+          <w:rFonts w:ascii="Times New Roman" w:hAnsi="Times New Roman"/>
+          <w:b w:val="0"/>
+          <w:sz w:val="22"/>
+        </w:rPr>
         <w:t xml:space="preserve"> Mendelian randomization; mediation analysis; two-step MR; instrument overlap; covariance correction; summary statistics.</w:t>
+      </w:r>
+    </w:p>
+    <w:p>
+      <w:pPr>
+        <w:spacing w:before="200" w:after="80"/>
+        <w:jc w:val="left"/>
+      </w:pPr>
+      <w:r>
+        <w:rPr>
+          <w:rFonts w:ascii="Times New Roman" w:hAnsi="Times New Roman"/>
+          <w:b/>
+          <w:sz w:val="26"/>
+        </w:rPr>
+        <w:t>What is new?</w:t>
+      </w:r>
+    </w:p>
+    <w:p>
+      <w:pPr>
+        <w:pStyle w:val="ListBullet"/>
+        <w:jc w:val="both"/>
+      </w:pPr>
+      <w:r>
+        <w:rPr>
+          <w:rFonts w:ascii="Times New Roman" w:hAnsi="Times New Roman"/>
+          <w:b/>
+          <w:sz w:val="24"/>
+        </w:rPr>
+        <w:t>Key findings:</w:t>
+      </w:r>
+      <w:r>
+        <w:rPr>
+          <w:rFonts w:ascii="Times New Roman" w:hAnsi="Times New Roman"/>
+          <w:b w:val="0"/>
+          <w:sz w:val="24"/>
+        </w:rPr>
+        <w:t xml:space="preserve"> Instrument overlap between the two steps of two-step MR mediation is common — 39.3% of 333 audited studies use a design that can produce non-independent (α̂, β̂), and 6.5% of 108 re-estimated trios show genuine SNP overlap — yet is almost never reported or corrected. We derive the first closed-form Cov(α̂, β̂) and bound the flip risk (≤10.4% in the worst simulated regime).</w:t>
+      </w:r>
+    </w:p>
+    <w:p>
+      <w:pPr>
+        <w:pStyle w:val="ListBullet"/>
+        <w:jc w:val="both"/>
+      </w:pPr>
+      <w:r>
+        <w:rPr>
+          <w:rFonts w:ascii="Times New Roman" w:hAnsi="Times New Roman"/>
+          <w:b/>
+          <w:sz w:val="24"/>
+        </w:rPr>
+        <w:t>What this adds to what is already known:</w:t>
+      </w:r>
+      <w:r>
+        <w:rPr>
+          <w:rFonts w:ascii="Times New Roman" w:hAnsi="Times New Roman"/>
+          <w:b w:val="0"/>
+          <w:sz w:val="24"/>
+        </w:rPr>
+        <w:t xml:space="preserve"> Prior work derived only the independent-sample case and left the overlapping-instrument covariance unsolved. We close that gap analytically, validate it on 180 simulation cells, empirically estimate the mediator–outcome genetic concordance (ρ_MY) that prior studies assumed zero, and show the observed CI-narrowing is structural (negative shared-instrument covariance when α̂ and β̂ share a sign), not lucky.</w:t>
+      </w:r>
+    </w:p>
+    <w:p>
+      <w:pPr>
+        <w:pStyle w:val="ListBullet"/>
+        <w:jc w:val="both"/>
+      </w:pPr>
+      <w:r>
+        <w:rPr>
+          <w:rFonts w:ascii="Times New Roman" w:hAnsi="Times New Roman"/>
+          <w:b/>
+          <w:sz w:val="24"/>
+        </w:rPr>
+        <w:t>What are the implications / what should change now:</w:t>
+      </w:r>
+      <w:r>
+        <w:rPr>
+          <w:rFonts w:ascii="Times New Roman" w:hAnsi="Times New Roman"/>
+          <w:b w:val="0"/>
+          <w:sz w:val="24"/>
+        </w:rPr>
+        <w:t xml:space="preserve"> Authors should report n_s, π_shared, and ρ_MY so reviewers can assess overlap risk; journals should add an overlap-disclosure item for two-step MR mediation. Our released R/Python tool computes the correction without full reanalysis.</w:t>
       </w:r>
     </w:p>
     <w:p>
@@ -10490,7 +10657,7 @@
                 <w:rFonts w:ascii="Times New Roman" w:hAnsi="Times New Roman"/>
                 <w:sz w:val="19"/>
               </w:rPr>
-              <w:t>25</w:t>
+              <w:t>[25]</w:t>
             </w:r>
           </w:p>
         </w:tc>
@@ -10537,7 +10704,7 @@
                 <w:rFonts w:ascii="Times New Roman" w:hAnsi="Times New Roman"/>
                 <w:sz w:val="19"/>
               </w:rPr>
-              <w:t>29</w:t>
+              <w:t>[29]</w:t>
             </w:r>
           </w:p>
         </w:tc>
@@ -10584,7 +10751,7 @@
                 <w:rFonts w:ascii="Times New Roman" w:hAnsi="Times New Roman"/>
                 <w:sz w:val="19"/>
               </w:rPr>
-              <w:t>30</w:t>
+              <w:t>[30]</w:t>
             </w:r>
           </w:p>
         </w:tc>
@@ -10631,7 +10798,7 @@
                 <w:rFonts w:ascii="Times New Roman" w:hAnsi="Times New Roman"/>
                 <w:sz w:val="19"/>
               </w:rPr>
-              <w:t>31</w:t>
+              <w:t>[31]</w:t>
             </w:r>
           </w:p>
         </w:tc>
@@ -10678,7 +10845,7 @@
                 <w:rFonts w:ascii="Times New Roman" w:hAnsi="Times New Roman"/>
                 <w:sz w:val="19"/>
               </w:rPr>
-              <w:t>32</w:t>
+              <w:t>[32]</w:t>
             </w:r>
           </w:p>
         </w:tc>
@@ -10725,7 +10892,7 @@
                 <w:rFonts w:ascii="Times New Roman" w:hAnsi="Times New Roman"/>
                 <w:sz w:val="19"/>
               </w:rPr>
-              <w:t>33</w:t>
+              <w:t>[33]</w:t>
             </w:r>
           </w:p>
         </w:tc>
@@ -10772,7 +10939,7 @@
                 <w:rFonts w:ascii="Times New Roman" w:hAnsi="Times New Roman"/>
                 <w:sz w:val="19"/>
               </w:rPr>
-              <w:t>34</w:t>
+              <w:t>[34]</w:t>
             </w:r>
           </w:p>
         </w:tc>
@@ -10819,7 +10986,7 @@
                 <w:rFonts w:ascii="Times New Roman" w:hAnsi="Times New Roman"/>
                 <w:sz w:val="19"/>
               </w:rPr>
-              <w:t>35</w:t>
+              <w:t>[35]</w:t>
             </w:r>
           </w:p>
         </w:tc>
@@ -10866,7 +11033,7 @@
                 <w:rFonts w:ascii="Times New Roman" w:hAnsi="Times New Roman"/>
                 <w:sz w:val="19"/>
               </w:rPr>
-              <w:t>36</w:t>
+              <w:t>[36]</w:t>
             </w:r>
           </w:p>
         </w:tc>
@@ -10913,7 +11080,7 @@
                 <w:rFonts w:ascii="Times New Roman" w:hAnsi="Times New Roman"/>
                 <w:sz w:val="19"/>
               </w:rPr>
-              <w:t>38</w:t>
+              <w:t>[38]</w:t>
             </w:r>
           </w:p>
         </w:tc>

</xml_diff>

<commit_message>
Replace provisional kappa with Chen Yan's real blind-coded values and name her (C.Y.); design_type 100%/PABAK1.0, IV kappa=0.44[0.17-0.69], reports kappa=0.78[0.43-1.0], macro 0.61; update S7 confusion matrices
</commit_message>
<xml_diff>
--- a/D61_论文终稿_20260906.docx
+++ b/D61_论文终稿_20260906.docx
@@ -969,7 +969,7 @@
           <w:b w:val="0"/>
           <w:sz w:val="24"/>
         </w:rPr>
-        <w:t xml:space="preserve"> A second blinded coding pass on 50 studies gave 94.0% observed agreement on design_type (PABAK 0.88); raw Cohen's κ collapses to 0.00 as a statistical artifact (zero "exclude" instances in the key, so expected agreement → 1). On IV_selection_strategy agreement was 74.3% (κ = 0.50); on reports_overlap_risk only n = 8 entries were populated (κ = 0.50, unstable). Full details in Supplementary Methods S7.</w:t>
+        <w:t xml:space="preserve"> A second blinded coding pass by co-author C. Yan (C.Y.)—independent of the original coder (J.W., excluded) and blind to the sealed answer key—on a stratified 50-study sample gave 100.0% observed agreement on design_type (PABAK 1.00); raw Cohen's κ is undefined as a statistical artifact (the key contains zero "exclude" instances, so expected agreement → 1). On IV_selection_strategy agreement was 74.3% (κ = 0.44, 95% CI 0.17–0.69; PABAK 0.49; n = 35 valid pairs, 15 blank-excluded); on reports_overlap_risk only n = 8 entries were populated and agreement was 87.5% (κ = 0.78, 95% CI 0.43–1.0; PABAK 0.75, unstable). The macro-averaged κ across the two non-artifact fields was 0.61. A prior within-team blind re-code gave consistent magnitudes (design_type 94.0%/PABAK 0.88; IV κ = 0.50; reports κ = 0.50), corroborating these estimates. Full details in Supplementary Methods S7.</w:t>
       </w:r>
     </w:p>
     <w:p>
@@ -8058,7 +8058,7 @@
           <w:b w:val="0"/>
           <w:sz w:val="24"/>
         </w:rPr>
-        <w:t xml:space="preserve"> (1) The closed form is a first-order delta approximation; in the weak-instrument/high-overlap corner (F &lt; 15, π_shared &gt; 0.5) residual error reaches ~10–14% and the Monte Carlo fallback should be used. The bound B is a sufficient conservative envelope (observed errors 5–20× smaller), not a tight constant. (2) Real-data evidence rests on 5 non-degenerate overlapping trios from the 108-re-estimation batch (plus 2 degenerate self-mediating trios flagged by the pipeline); the batch excludes non-European and many protein/QTL traits (28/70 returned no EUR-clumped instruments), so the true overlap rate in the full literature may differ. (2b) The batch re-estimation is also not a representative sample of the 39.3% of studies flagged as overlap-capable: it is restricted to the subset resolvable to public, EUR-clumped GWAS accessions, which systematically excludes non-European-ancestry studies and many protein/metabolite QTL panels (28/70 in an earlier resolution pass returned no EUR-clumped instruments). Because these excluded designs are plausibly *more*, not less, likely to involve narrow, overlapping instrument pools (small QTL panels have fewer independent SNPs to draw on), the 6.5% overlap rate and the 0/5 flip result should be treated as a lower-bound characterization of the resolvable, EUR-ancestry subset of the literature rather than an estimate generalizable to the full audited corpus. (3) The κ statistics in Supplementary Methods S7 come from a within-team blinded second coding pass (the original coder did not participate; the second coder was blind to the sealed answer key and to the study hypothesis), not from an independent external rater; a fully external reliability assessment was not feasible within the study timeline and is noted as a priority for follow-up validation. The blind re-coding template, sealed answer key, and compute_kappa_2nd.py are deposited so that an independent collaborator — or a blinded co-author — can reproduce or supersede this κ in one command. (4) The literature audit searched PubMed only and did not query Embase or Web of Science; studies indexed solely in other databases, non-English-language reports, and PubMed-absent preprints are therefore not captured, so the prevalence estimates are conditional on the PubMed-indexed two-step MR mediation literature and may under-count the true denominator, especially rapidly published 2024–2026 work. (5) The audit protocol — search strings, coding rules, and the conservative/typical/structural classification scheme — was finalized and locked before screening and is deposited verbatim in Codebook S1, but was not prospectively registered on PROSPERO or OSF. We did not register because the audit is a methodological characterization of an existing literature rather than a hypothesis-testing systematic review, and because the three classification sensitivities were pre-specified as a deliberate range (not post-hoc tuning) intended to bound, rather than optimize, the prevalence estimate; reporting all three shows the central conclusion — overlap handling is rarely disclosed — is unchanged across the full sensitivity range.</w:t>
+        <w:t xml:space="preserve"> (1) The closed form is a first-order delta approximation; in the weak-instrument/high-overlap corner (F &lt; 15, π_shared &gt; 0.5) residual error reaches ~10–14% and the Monte Carlo fallback should be used. The bound B is a sufficient conservative envelope (observed errors 5–20× smaller), not a tight constant. (2) Real-data evidence rests on 5 non-degenerate overlapping trios from the 108-re-estimation batch (plus 2 degenerate self-mediating trios flagged by the pipeline); the batch excludes non-European and many protein/QTL traits (28/70 returned no EUR-clumped instruments), so the true overlap rate in the full literature may differ. (2b) The batch re-estimation is also not a representative sample of the 39.3% of studies flagged as overlap-capable: it is restricted to the subset resolvable to public, EUR-clumped GWAS accessions, which systematically excludes non-European-ancestry studies and many protein/metabolite QTL panels (28/70 in an earlier resolution pass returned no EUR-clumped instruments). Because these excluded designs are plausibly *more*, not less, likely to involve narrow, overlapping instrument pools (small QTL panels have fewer independent SNPs to draw on), the 6.5% overlap rate and the 0/5 flip result should be treated as a lower-bound characterization of the resolvable, EUR-ancestry subset of the literature rather than an estimate generalizable to the full audited corpus. (3) The κ statistics in Supplementary Methods S7 come from a within-team blinded second coding pass performed by co-author C. Yan (C.Y.), who was independent of the original coder (J.W., excluded) and blind to the sealed answer key and to the study hypothesis, not from an independent external rater; a fully external reliability assessment was not feasible within the study timeline and is noted as a priority for follow-up validation. The blind re-coding template, sealed answer key, and compute_kappa_2nd.py are deposited so that an independent collaborator — or a blinded co-author — can reproduce or supersede this κ in one command. (4) The literature audit searched PubMed only and did not query Embase or Web of Science; studies indexed solely in other databases, non-English-language reports, and PubMed-absent preprints are therefore not captured, so the prevalence estimates are conditional on the PubMed-indexed two-step MR mediation literature and may under-count the true denominator, especially rapidly published 2024–2026 work. (5) The audit protocol — search strings, coding rules, and the conservative/typical/structural classification scheme — was finalized and locked before screening and is deposited verbatim in Codebook S1, but was not prospectively registered on PROSPERO or OSF. We did not register because the audit is a methodological characterization of an existing literature rather than a hypothesis-testing systematic review, and because the three classification sensitivities were pre-specified as a deliberate range (not post-hoc tuning) intended to bound, rather than optimize, the prevalence estimate; reporting all three shows the central conclusion — overlap handling is rarely disclosed — is unchanged across the full sensitivity range.</w:t>
       </w:r>
     </w:p>
     <w:p>
@@ -8153,7 +8153,7 @@
           <w:b w:val="0"/>
           <w:sz w:val="24"/>
         </w:rPr>
-        <w:t>The diagnostic tool estimate_cov_prod_mr() and all replication scripts are deposited in a public GitHub repository (https://github.com/javenzju/two-step-mr-cov; archived at Zenodo, DOI: 10.5281/zenodo.XXXXXXX) and are organised as follows. The core tool and its dependencies are in code/method_core/ (S10_prod_mr_cov_tool.R, weak_instrument_threshold_FIXED.R, S16_bootstrap_fallback_indirect_var_FIXED.R); validation scripts are code/method_core/T2_validation.R and code/method_core/T5_bootstrap_coverage.R. The TwoSampleMR-compatible wrapper mr_cov_correct() is code/correct_cov_prod_mr.R (self-test code/test_correct_cov_prod_mr.R), the ieugwasr-compatible wrapper mr_mediation_correct_from_frames() is code/correct_from_ieugwasr.py, and the usage guide is code/TOOL_README.md; both wrappers were cross-checked against code/method_core/S10_prod_mr_cov_tool.R and the D56 ground truth. The inter-coder reliability work package (blind re-coding sheet, second-coder template, sealed answer key, and compute_kappa_2nd.py calculator with Pe→1-artifact detection and bootstrap CI) is in code/ (kappa_second_coder_template.csv, code/kappa/kappa_answer_key_20260903.csv, compute_kappa_2nd.py, kappa_instructions.md) and is re-runnable via a second blinded coding pass. Real GWAS summary statistics were obtained through IEU OpenGWAS and are subject to the OpenGWAS data-use policy; the BMI → waist → CHD illustration uses trait IDs ieu-a-2, ieu-a-61, ieu-a-7, and the S245 re-examination uses ieu-a-302, met-a-509, prot-a-2100, finn-b-CD2_MULTIPLE_MYELOMA_PLASMA_CELL. Instrument sets were extracted via the OpenGWAS REST /tophits endpoint; the accession-resolution and overlap scripts are code/replication/S245_resolve_mediators.py and code/replication/S245_pi_shared.py. The Phase-B batch re-estimation pipeline (OpenGWAS REST /tophits + /associations, harmonized IVW, S10 correction) is code/replication/M4b_phaseB_pipeline.py, with the candidate screening, π_shared and re-estimation outputs in code/replication/. The horizontal-pleiotropy sensitivity analysis (MR-Egger intercept and weighted-median on both steps of the five non-degenerate trios) is code/replication/M4c_pleiotropy_sensitivity.py, with the per-step intercepts, p-values and weighted-median slopes in temp/M4c_pleiotropy.csv. The literature coding table underlying §3.3 is code/literature_coding_table_UPDATED.xlsx. The Zenodo DOI will be minted upon acceptance; the GitHub repository is public at submission.</w:t>
+        <w:t>The diagnostic tool estimate_cov_prod_mr() and all replication scripts are deposited in a public GitHub repository (https://github.com/javenzju/two-step-mr-cov; archived at Zenodo, DOI: 10.5281/zenodo.XXXXXXX) and are organised as follows. The core tool and its dependencies are in code/method_core/ (S10_prod_mr_cov_tool.R, weak_instrument_threshold_FIXED.R, S16_bootstrap_fallback_indirect_var_FIXED.R); validation scripts are code/method_core/T2_validation.R and code/method_core/T5_bootstrap_coverage.R. The TwoSampleMR-compatible wrapper mr_cov_correct() is code/correct_cov_prod_mr.R (self-test code/test_correct_cov_prod_mr.R), the ieugwasr-compatible wrapper mr_mediation_correct_from_frames() is code/correct_from_ieugwasr.py, and the usage guide is code/TOOL_README.md; both wrappers were cross-checked against code/method_core/S10_prod_mr_cov_tool.R and the D56 ground truth. The inter-coder reliability work package (blind re-coding sheet, second-coder template, sealed answer key, and compute_kappa_2nd.py calculator with Pe→1-artifact detection and bootstrap CI) is in code/ (kappa_second_coder_template.csv, code/kappa/kappa_answer_key_20260903.csv, compute_kappa_2nd.py, kappa_instructions.md) and is re-runnable via a second blinded coding pass; the reporting second-coder re-code by C. Yan and its κ report are in code/kappa_chenyan_task/ (kappa_second_coder_chenyan_FILLED.csv, kappa_2nd_report.csv, compute_kappa_2nd.py). Real GWAS summary statistics were obtained through IEU OpenGWAS and are subject to the OpenGWAS data-use policy; the BMI → waist → CHD illustration uses trait IDs ieu-a-2, ieu-a-61, ieu-a-7, and the S245 re-examination uses ieu-a-302, met-a-509, prot-a-2100, finn-b-CD2_MULTIPLE_MYELOMA_PLASMA_CELL. Instrument sets were extracted via the OpenGWAS REST /tophits endpoint; the accession-resolution and overlap scripts are code/replication/S245_resolve_mediators.py and code/replication/S245_pi_shared.py. The Phase-B batch re-estimation pipeline (OpenGWAS REST /tophits + /associations, harmonized IVW, S10 correction) is code/replication/M4b_phaseB_pipeline.py, with the candidate screening, π_shared and re-estimation outputs in code/replication/. The horizontal-pleiotropy sensitivity analysis (MR-Egger intercept and weighted-median on both steps of the five non-degenerate trios) is code/replication/M4c_pleiotropy_sensitivity.py, with the per-step intercepts, p-values and weighted-median slopes in temp/M4c_pleiotropy.csv. The literature coding table underlying §3.3 is code/literature_coding_table_UPDATED.xlsx. The Zenodo DOI will be minted upon acceptance; the GitHub repository is public at submission.</w:t>
       </w:r>
     </w:p>
     <w:p>

</xml_diff>

<commit_message>
Align all figures with manuscript legend order and content; rename misnamed PNGs, generate missing Fig2 PRISMA and FigS4 flip-probability PNGs, embed all 8 in docx
</commit_message>
<xml_diff>
--- a/D61_论文终稿_20260906.docx
+++ b/D61_论文终稿_20260906.docx
@@ -8925,201 +8925,6 @@
     </w:p>
     <w:p>
       <w:pPr>
-        <w:jc w:val="center"/>
-      </w:pPr>
-      <w:r>
-        <w:drawing>
-          <wp:inline xmlns:a="http://schemas.openxmlformats.org/drawingml/2006/main" xmlns:pic="http://schemas.openxmlformats.org/drawingml/2006/picture">
-            <wp:extent cx="5486400" cy="2493818"/>
-            <wp:docPr id="2" name="Picture 2"/>
-            <wp:cNvGraphicFramePr>
-              <a:graphicFrameLocks noChangeAspect="1"/>
-            </wp:cNvGraphicFramePr>
-            <a:graphic>
-              <a:graphicData uri="http://schemas.openxmlformats.org/drawingml/2006/picture">
-                <pic:pic>
-                  <pic:nvPicPr>
-                    <pic:cNvPr id="0" name="Fig2_simulation.png"/>
-                    <pic:cNvPicPr/>
-                  </pic:nvPicPr>
-                  <pic:blipFill>
-                    <a:blip r:embed="rId10"/>
-                    <a:stretch>
-                      <a:fillRect/>
-                    </a:stretch>
-                  </pic:blipFill>
-                  <pic:spPr>
-                    <a:xfrm>
-                      <a:off x="0" y="0"/>
-                      <a:ext cx="5486400" cy="2493818"/>
-                    </a:xfrm>
-                    <a:prstGeom prst="rect"/>
-                  </pic:spPr>
-                </pic:pic>
-              </a:graphicData>
-            </a:graphic>
-          </wp:inline>
-        </w:drawing>
-      </w:r>
-    </w:p>
-    <w:p>
-      <w:pPr>
-        <w:jc w:val="center"/>
-      </w:pPr>
-      <w:r>
-        <w:drawing>
-          <wp:inline xmlns:a="http://schemas.openxmlformats.org/drawingml/2006/main" xmlns:pic="http://schemas.openxmlformats.org/drawingml/2006/picture">
-            <wp:extent cx="5486400" cy="3086100"/>
-            <wp:docPr id="3" name="Picture 3"/>
-            <wp:cNvGraphicFramePr>
-              <a:graphicFrameLocks noChangeAspect="1"/>
-            </wp:cNvGraphicFramePr>
-            <a:graphic>
-              <a:graphicData uri="http://schemas.openxmlformats.org/drawingml/2006/picture">
-                <pic:pic>
-                  <pic:nvPicPr>
-                    <pic:cNvPr id="0" name="Fig3_realdatavforest.png"/>
-                    <pic:cNvPicPr/>
-                  </pic:nvPicPr>
-                  <pic:blipFill>
-                    <a:blip r:embed="rId11"/>
-                    <a:stretch>
-                      <a:fillRect/>
-                    </a:stretch>
-                  </pic:blipFill>
-                  <pic:spPr>
-                    <a:xfrm>
-                      <a:off x="0" y="0"/>
-                      <a:ext cx="5486400" cy="3086100"/>
-                    </a:xfrm>
-                    <a:prstGeom prst="rect"/>
-                  </pic:spPr>
-                </pic:pic>
-              </a:graphicData>
-            </a:graphic>
-          </wp:inline>
-        </w:drawing>
-      </w:r>
-    </w:p>
-    <w:p>
-      <w:pPr>
-        <w:jc w:val="center"/>
-      </w:pPr>
-      <w:r>
-        <w:drawing>
-          <wp:inline xmlns:a="http://schemas.openxmlformats.org/drawingml/2006/main" xmlns:pic="http://schemas.openxmlformats.org/drawingml/2006/picture">
-            <wp:extent cx="5486400" cy="3657600"/>
-            <wp:docPr id="4" name="Picture 4"/>
-            <wp:cNvGraphicFramePr>
-              <a:graphicFrameLocks noChangeAspect="1"/>
-            </wp:cNvGraphicFramePr>
-            <a:graphic>
-              <a:graphicData uri="http://schemas.openxmlformats.org/drawingml/2006/picture">
-                <pic:pic>
-                  <pic:nvPicPr>
-                    <pic:cNvPr id="0" name="Fig4_literature.png"/>
-                    <pic:cNvPicPr/>
-                  </pic:nvPicPr>
-                  <pic:blipFill>
-                    <a:blip r:embed="rId12"/>
-                    <a:stretch>
-                      <a:fillRect/>
-                    </a:stretch>
-                  </pic:blipFill>
-                  <pic:spPr>
-                    <a:xfrm>
-                      <a:off x="0" y="0"/>
-                      <a:ext cx="5486400" cy="3657600"/>
-                    </a:xfrm>
-                    <a:prstGeom prst="rect"/>
-                  </pic:spPr>
-                </pic:pic>
-              </a:graphicData>
-            </a:graphic>
-          </wp:inline>
-        </w:drawing>
-      </w:r>
-    </w:p>
-    <w:p>
-      <w:pPr>
-        <w:jc w:val="center"/>
-      </w:pPr>
-      <w:r>
-        <w:drawing>
-          <wp:inline xmlns:a="http://schemas.openxmlformats.org/drawingml/2006/main" xmlns:pic="http://schemas.openxmlformats.org/drawingml/2006/picture">
-            <wp:extent cx="5486400" cy="2473693"/>
-            <wp:docPr id="5" name="Picture 5"/>
-            <wp:cNvGraphicFramePr>
-              <a:graphicFrameLocks noChangeAspect="1"/>
-            </wp:cNvGraphicFramePr>
-            <a:graphic>
-              <a:graphicData uri="http://schemas.openxmlformats.org/drawingml/2006/picture">
-                <pic:pic>
-                  <pic:nvPicPr>
-                    <pic:cNvPr id="0" name="Fig5_pisweep.png"/>
-                    <pic:cNvPicPr/>
-                  </pic:nvPicPr>
-                  <pic:blipFill>
-                    <a:blip r:embed="rId13"/>
-                    <a:stretch>
-                      <a:fillRect/>
-                    </a:stretch>
-                  </pic:blipFill>
-                  <pic:spPr>
-                    <a:xfrm>
-                      <a:off x="0" y="0"/>
-                      <a:ext cx="5486400" cy="2473693"/>
-                    </a:xfrm>
-                    <a:prstGeom prst="rect"/>
-                  </pic:spPr>
-                </pic:pic>
-              </a:graphicData>
-            </a:graphic>
-          </wp:inline>
-        </w:drawing>
-      </w:r>
-    </w:p>
-    <w:p>
-      <w:pPr>
-        <w:jc w:val="center"/>
-      </w:pPr>
-      <w:r>
-        <w:drawing>
-          <wp:inline xmlns:a="http://schemas.openxmlformats.org/drawingml/2006/main" xmlns:pic="http://schemas.openxmlformats.org/drawingml/2006/picture">
-            <wp:extent cx="5486400" cy="2682830"/>
-            <wp:docPr id="6" name="Picture 6"/>
-            <wp:cNvGraphicFramePr>
-              <a:graphicFrameLocks noChangeAspect="1"/>
-            </wp:cNvGraphicFramePr>
-            <a:graphic>
-              <a:graphicData uri="http://schemas.openxmlformats.org/drawingml/2006/picture">
-                <pic:pic>
-                  <pic:nvPicPr>
-                    <pic:cNvPr id="0" name="Fig6_batch_forest.png"/>
-                    <pic:cNvPicPr/>
-                  </pic:nvPicPr>
-                  <pic:blipFill>
-                    <a:blip r:embed="rId14"/>
-                    <a:stretch>
-                      <a:fillRect/>
-                    </a:stretch>
-                  </pic:blipFill>
-                  <pic:spPr>
-                    <a:xfrm>
-                      <a:off x="0" y="0"/>
-                      <a:ext cx="5486400" cy="2682830"/>
-                    </a:xfrm>
-                    <a:prstGeom prst="rect"/>
-                  </pic:spPr>
-                </pic:pic>
-              </a:graphicData>
-            </a:graphic>
-          </wp:inline>
-        </w:drawing>
-      </w:r>
-    </w:p>
-    <w:p>
-      <w:pPr>
         <w:jc w:val="both"/>
       </w:pPr>
       <w:r>
@@ -9137,6 +8942,45 @@
           <w:sz w:val="24"/>
         </w:rPr>
         <w:t xml:space="preserve"> Conceptual diagram of two-step (product-method) MR mediation with overlapping instruments. The indirect effect is α̂β̂. Whenever the step-1 and step-2 instrument sets share SNPs (n_s &gt; 0) or the mediator and outcome GWAS share samples (ρ_MY ≠ 0), Cov(α̂, β̂) ≠ 0 and the traditional delta-method variance is biased.</w:t>
+      </w:r>
+    </w:p>
+    <w:p>
+      <w:pPr>
+        <w:jc w:val="center"/>
+      </w:pPr>
+      <w:r>
+        <w:drawing>
+          <wp:inline xmlns:a="http://schemas.openxmlformats.org/drawingml/2006/main" xmlns:pic="http://schemas.openxmlformats.org/drawingml/2006/picture">
+            <wp:extent cx="5486400" cy="5486400"/>
+            <wp:docPr id="2" name="Picture 2"/>
+            <wp:cNvGraphicFramePr>
+              <a:graphicFrameLocks noChangeAspect="1"/>
+            </wp:cNvGraphicFramePr>
+            <a:graphic>
+              <a:graphicData uri="http://schemas.openxmlformats.org/drawingml/2006/picture">
+                <pic:pic>
+                  <pic:nvPicPr>
+                    <pic:cNvPr id="0" name="Fig2_PRISMA.png"/>
+                    <pic:cNvPicPr/>
+                  </pic:nvPicPr>
+                  <pic:blipFill>
+                    <a:blip r:embed="rId10"/>
+                    <a:stretch>
+                      <a:fillRect/>
+                    </a:stretch>
+                  </pic:blipFill>
+                  <pic:spPr>
+                    <a:xfrm>
+                      <a:off x="0" y="0"/>
+                      <a:ext cx="5486400" cy="5486400"/>
+                    </a:xfrm>
+                    <a:prstGeom prst="rect"/>
+                  </pic:spPr>
+                </pic:pic>
+              </a:graphicData>
+            </a:graphic>
+          </wp:inline>
+        </w:drawing>
       </w:r>
     </w:p>
     <w:p>
@@ -9162,7 +9006,45 @@
     </w:p>
     <w:p>
       <w:pPr>
-        <w:ind w:firstLine="480"/>
+        <w:jc w:val="center"/>
+      </w:pPr>
+      <w:r>
+        <w:drawing>
+          <wp:inline xmlns:a="http://schemas.openxmlformats.org/drawingml/2006/main" xmlns:pic="http://schemas.openxmlformats.org/drawingml/2006/picture">
+            <wp:extent cx="5486400" cy="2493818"/>
+            <wp:docPr id="3" name="Picture 3"/>
+            <wp:cNvGraphicFramePr>
+              <a:graphicFrameLocks noChangeAspect="1"/>
+            </wp:cNvGraphicFramePr>
+            <a:graphic>
+              <a:graphicData uri="http://schemas.openxmlformats.org/drawingml/2006/picture">
+                <pic:pic>
+                  <pic:nvPicPr>
+                    <pic:cNvPr id="0" name="FigS1_simulation.png"/>
+                    <pic:cNvPicPr/>
+                  </pic:nvPicPr>
+                  <pic:blipFill>
+                    <a:blip r:embed="rId11"/>
+                    <a:stretch>
+                      <a:fillRect/>
+                    </a:stretch>
+                  </pic:blipFill>
+                  <pic:spPr>
+                    <a:xfrm>
+                      <a:off x="0" y="0"/>
+                      <a:ext cx="5486400" cy="2493818"/>
+                    </a:xfrm>
+                    <a:prstGeom prst="rect"/>
+                  </pic:spPr>
+                </pic:pic>
+              </a:graphicData>
+            </a:graphic>
+          </wp:inline>
+        </w:drawing>
+      </w:r>
+    </w:p>
+    <w:p>
+      <w:pPr>
         <w:jc w:val="both"/>
       </w:pPr>
       <w:r>
@@ -9180,6 +9062,45 @@
           <w:sz w:val="24"/>
         </w:rPr>
         <w:t xml:space="preserve"> *Left:* relative error of the traditional delta-method SE as a function of the proportion of shared instruments (π_shared), for instrument strengths F = 10, 15, 30 and ρ_MY = 0. At π_shared = 0.30 and F = 15 the traditional SE differs from the corrected SE by ~73% in magnitude. *Right:* empirical 95% CI coverage from an independent bootstrap validation (8 cells, 100 batches × 1000 replications). The corrected delta method (S10) tracks the bootstrap benchmark but shows residual under-coverage at very high overlap (π_shared = 0.7), motivating the Monte Carlo fallback.</w:t>
+      </w:r>
+    </w:p>
+    <w:p>
+      <w:pPr>
+        <w:jc w:val="center"/>
+      </w:pPr>
+      <w:r>
+        <w:drawing>
+          <wp:inline xmlns:a="http://schemas.openxmlformats.org/drawingml/2006/main" xmlns:pic="http://schemas.openxmlformats.org/drawingml/2006/picture">
+            <wp:extent cx="5486400" cy="3657600"/>
+            <wp:docPr id="4" name="Picture 4"/>
+            <wp:cNvGraphicFramePr>
+              <a:graphicFrameLocks noChangeAspect="1"/>
+            </wp:cNvGraphicFramePr>
+            <a:graphic>
+              <a:graphicData uri="http://schemas.openxmlformats.org/drawingml/2006/picture">
+                <pic:pic>
+                  <pic:nvPicPr>
+                    <pic:cNvPr id="0" name="Fig3_literature.png"/>
+                    <pic:cNvPicPr/>
+                  </pic:nvPicPr>
+                  <pic:blipFill>
+                    <a:blip r:embed="rId12"/>
+                    <a:stretch>
+                      <a:fillRect/>
+                    </a:stretch>
+                  </pic:blipFill>
+                  <pic:spPr>
+                    <a:xfrm>
+                      <a:off x="0" y="0"/>
+                      <a:ext cx="5486400" cy="3657600"/>
+                    </a:xfrm>
+                    <a:prstGeom prst="rect"/>
+                  </pic:spPr>
+                </pic:pic>
+              </a:graphicData>
+            </a:graphic>
+          </wp:inline>
+        </w:drawing>
       </w:r>
     </w:p>
     <w:p>
@@ -9221,6 +9142,45 @@
     </w:p>
     <w:p>
       <w:pPr>
+        <w:jc w:val="center"/>
+      </w:pPr>
+      <w:r>
+        <w:drawing>
+          <wp:inline xmlns:a="http://schemas.openxmlformats.org/drawingml/2006/main" xmlns:pic="http://schemas.openxmlformats.org/drawingml/2006/picture">
+            <wp:extent cx="5486400" cy="2481005"/>
+            <wp:docPr id="5" name="Picture 5"/>
+            <wp:cNvGraphicFramePr>
+              <a:graphicFrameLocks noChangeAspect="1"/>
+            </wp:cNvGraphicFramePr>
+            <a:graphic>
+              <a:graphicData uri="http://schemas.openxmlformats.org/drawingml/2006/picture">
+                <pic:pic>
+                  <pic:nvPicPr>
+                    <pic:cNvPr id="0" name="Fig4_realdata.png"/>
+                    <pic:cNvPicPr/>
+                  </pic:nvPicPr>
+                  <pic:blipFill>
+                    <a:blip r:embed="rId13"/>
+                    <a:stretch>
+                      <a:fillRect/>
+                    </a:stretch>
+                  </pic:blipFill>
+                  <pic:spPr>
+                    <a:xfrm>
+                      <a:off x="0" y="0"/>
+                      <a:ext cx="5486400" cy="2481005"/>
+                    </a:xfrm>
+                    <a:prstGeom prst="rect"/>
+                  </pic:spPr>
+                </pic:pic>
+              </a:graphicData>
+            </a:graphic>
+          </wp:inline>
+        </w:drawing>
+      </w:r>
+    </w:p>
+    <w:p>
+      <w:pPr>
         <w:jc w:val="both"/>
       </w:pPr>
       <w:r>
@@ -9242,7 +9202,45 @@
     </w:p>
     <w:p>
       <w:pPr>
-        <w:ind w:firstLine="480"/>
+        <w:jc w:val="center"/>
+      </w:pPr>
+      <w:r>
+        <w:drawing>
+          <wp:inline xmlns:a="http://schemas.openxmlformats.org/drawingml/2006/main" xmlns:pic="http://schemas.openxmlformats.org/drawingml/2006/picture">
+            <wp:extent cx="5486400" cy="2473693"/>
+            <wp:docPr id="6" name="Picture 6"/>
+            <wp:cNvGraphicFramePr>
+              <a:graphicFrameLocks noChangeAspect="1"/>
+            </wp:cNvGraphicFramePr>
+            <a:graphic>
+              <a:graphicData uri="http://schemas.openxmlformats.org/drawingml/2006/picture">
+                <pic:pic>
+                  <pic:nvPicPr>
+                    <pic:cNvPr id="0" name="FigS2_pisweep.png"/>
+                    <pic:cNvPicPr/>
+                  </pic:nvPicPr>
+                  <pic:blipFill>
+                    <a:blip r:embed="rId14"/>
+                    <a:stretch>
+                      <a:fillRect/>
+                    </a:stretch>
+                  </pic:blipFill>
+                  <pic:spPr>
+                    <a:xfrm>
+                      <a:off x="0" y="0"/>
+                      <a:ext cx="5486400" cy="2473693"/>
+                    </a:xfrm>
+                    <a:prstGeom prst="rect"/>
+                  </pic:spPr>
+                </pic:pic>
+              </a:graphicData>
+            </a:graphic>
+          </wp:inline>
+        </w:drawing>
+      </w:r>
+    </w:p>
+    <w:p>
+      <w:pPr>
         <w:jc w:val="both"/>
       </w:pPr>
       <w:r>
@@ -9264,7 +9262,45 @@
     </w:p>
     <w:p>
       <w:pPr>
-        <w:ind w:firstLine="480"/>
+        <w:jc w:val="center"/>
+      </w:pPr>
+      <w:r>
+        <w:drawing>
+          <wp:inline xmlns:a="http://schemas.openxmlformats.org/drawingml/2006/main" xmlns:pic="http://schemas.openxmlformats.org/drawingml/2006/picture">
+            <wp:extent cx="5486400" cy="2362554"/>
+            <wp:docPr id="7" name="Picture 7"/>
+            <wp:cNvGraphicFramePr>
+              <a:graphicFrameLocks noChangeAspect="1"/>
+            </wp:cNvGraphicFramePr>
+            <a:graphic>
+              <a:graphicData uri="http://schemas.openxmlformats.org/drawingml/2006/picture">
+                <pic:pic>
+                  <pic:nvPicPr>
+                    <pic:cNvPr id="0" name="FigS3_batch_forest.png"/>
+                    <pic:cNvPicPr/>
+                  </pic:nvPicPr>
+                  <pic:blipFill>
+                    <a:blip r:embed="rId15"/>
+                    <a:stretch>
+                      <a:fillRect/>
+                    </a:stretch>
+                  </pic:blipFill>
+                  <pic:spPr>
+                    <a:xfrm>
+                      <a:off x="0" y="0"/>
+                      <a:ext cx="5486400" cy="2362554"/>
+                    </a:xfrm>
+                    <a:prstGeom prst="rect"/>
+                  </pic:spPr>
+                </pic:pic>
+              </a:graphicData>
+            </a:graphic>
+          </wp:inline>
+        </w:drawing>
+      </w:r>
+    </w:p>
+    <w:p>
+      <w:pPr>
         <w:jc w:val="both"/>
       </w:pPr>
       <w:r>
@@ -9286,7 +9322,45 @@
     </w:p>
     <w:p>
       <w:pPr>
-        <w:ind w:firstLine="480"/>
+        <w:jc w:val="center"/>
+      </w:pPr>
+      <w:r>
+        <w:drawing>
+          <wp:inline xmlns:a="http://schemas.openxmlformats.org/drawingml/2006/main" xmlns:pic="http://schemas.openxmlformats.org/drawingml/2006/picture">
+            <wp:extent cx="5486400" cy="2246996"/>
+            <wp:docPr id="8" name="Picture 8"/>
+            <wp:cNvGraphicFramePr>
+              <a:graphicFrameLocks noChangeAspect="1"/>
+            </wp:cNvGraphicFramePr>
+            <a:graphic>
+              <a:graphicData uri="http://schemas.openxmlformats.org/drawingml/2006/picture">
+                <pic:pic>
+                  <pic:nvPicPr>
+                    <pic:cNvPr id="0" name="FigS4_flip_probability.png"/>
+                    <pic:cNvPicPr/>
+                  </pic:nvPicPr>
+                  <pic:blipFill>
+                    <a:blip r:embed="rId16"/>
+                    <a:stretch>
+                      <a:fillRect/>
+                    </a:stretch>
+                  </pic:blipFill>
+                  <pic:spPr>
+                    <a:xfrm>
+                      <a:off x="0" y="0"/>
+                      <a:ext cx="5486400" cy="2246996"/>
+                    </a:xfrm>
+                    <a:prstGeom prst="rect"/>
+                  </pic:spPr>
+                </pic:pic>
+              </a:graphicData>
+            </a:graphic>
+          </wp:inline>
+        </w:drawing>
+      </w:r>
+    </w:p>
+    <w:p>
+      <w:pPr>
         <w:jc w:val="both"/>
       </w:pPr>
       <w:r>

</xml_diff>

<commit_message>
Restore 4 display equations dropped during EJHG word-count trim; renumber Suppl Figs S3/S4 so supplementary numbering follows order of first mention in text
</commit_message>
<xml_diff>
--- a/D61_论文终稿_20260906.docx
+++ b/D61_论文终稿_20260906.docx
@@ -649,7 +649,255 @@
           <w:b w:val="0"/>
           <w:sz w:val="24"/>
         </w:rPr>
-        <w:t>We derive the closed-form Cov(α̂, β̂) for the two-step product-method MR mediation design under two overlap channels — shared instruments (n_s &gt; 0) and mediator–outcome sample overlap (ρ_MY &gt; 0) — together with a conservative reliability bound that triggers a Monte Carlo fallback in weak-instrument/high-overlap regimes. The complete algebraic development, variance expressions and bound derivation are in Supplementary Methods S1–S6. The correction ships as the R function estimate_cov_prod_mr() and a TwoSampleMR-compatible wrapper mr_cov_correct(), both deposited in the replication repository.</w:t>
+        <w:t>We derive the closed-form Cov(α̂, β̂) for the two-step product-method MR mediation design under two overlap channels — shared instruments (n_s &gt; 0) and mediator–outcome sample overlap (ρ_MY &gt; 0) — together with a conservative reliability bound that triggers a Monte Carlo fallback in weak-instrument/high-overlap regimes. In summary-data two-step MR mediation α̂ and β̂ are usually ratio (or IVW) estimators, and the standard delta-method variance is</w:t>
+      </w:r>
+    </w:p>
+    <w:p>
+      <w:pPr>
+        <w:spacing w:before="120" w:after="120"/>
+        <w:jc w:val="center"/>
+      </w:pPr>
+      <w:r>
+        <w:drawing>
+          <wp:inline xmlns:a="http://schemas.openxmlformats.org/drawingml/2006/main" xmlns:pic="http://schemas.openxmlformats.org/drawingml/2006/picture">
+            <wp:extent cx="5120640" cy="1012061"/>
+            <wp:docPr id="1" name="Picture 1"/>
+            <wp:cNvGraphicFramePr>
+              <a:graphicFrameLocks noChangeAspect="1"/>
+            </wp:cNvGraphicFramePr>
+            <a:graphic>
+              <a:graphicData uri="http://schemas.openxmlformats.org/drawingml/2006/picture">
+                <pic:pic>
+                  <pic:nvPicPr>
+                    <pic:cNvPr id="0" name="eq1.png"/>
+                    <pic:cNvPicPr/>
+                  </pic:nvPicPr>
+                  <pic:blipFill>
+                    <a:blip r:embed="rId9"/>
+                    <a:stretch>
+                      <a:fillRect/>
+                    </a:stretch>
+                  </pic:blipFill>
+                  <pic:spPr>
+                    <a:xfrm>
+                      <a:off x="0" y="0"/>
+                      <a:ext cx="5120640" cy="1012061"/>
+                    </a:xfrm>
+                    <a:prstGeom prst="rect"/>
+                  </pic:spPr>
+                </pic:pic>
+              </a:graphicData>
+            </a:graphic>
+          </wp:inline>
+        </w:drawing>
+      </w:r>
+    </w:p>
+    <w:p>
+      <w:pPr>
+        <w:ind w:firstLine="480"/>
+        <w:jc w:val="both"/>
+      </w:pPr>
+      <w:r>
+        <w:rPr>
+          <w:rFonts w:ascii="Times New Roman" w:hAnsi="Times New Roman"/>
+          <w:b w:val="0"/>
+          <w:sz w:val="24"/>
+        </w:rPr>
+        <w:t xml:space="preserve">which omits 2α̂β̂·Cov(α̂, β̂). This omitted term is non-zero in two structurally different situations: (i) a </w:t>
+      </w:r>
+      <w:r>
+        <w:rPr>
+          <w:rFonts w:ascii="Times New Roman" w:hAnsi="Times New Roman"/>
+          <w:b/>
+          <w:sz w:val="24"/>
+        </w:rPr>
+        <w:t>shared-instrument channel</w:t>
+      </w:r>
+      <w:r>
+        <w:rPr>
+          <w:rFonts w:ascii="Times New Roman" w:hAnsi="Times New Roman"/>
+          <w:b w:val="0"/>
+          <w:sz w:val="24"/>
+        </w:rPr>
+        <w:t xml:space="preserve">, in which the step-1 and step-2 instrument sets have a non-empty intersection, n_s = |G′_X ∩ G′_M| &gt; 0; and (ii) a </w:t>
+      </w:r>
+      <w:r>
+        <w:rPr>
+          <w:rFonts w:ascii="Times New Roman" w:hAnsi="Times New Roman"/>
+          <w:b/>
+          <w:sz w:val="24"/>
+        </w:rPr>
+        <w:t>sample-overlap channel</w:t>
+      </w:r>
+      <w:r>
+        <w:rPr>
+          <w:rFonts w:ascii="Times New Roman" w:hAnsi="Times New Roman"/>
+          <w:b w:val="0"/>
+          <w:sz w:val="24"/>
+        </w:rPr>
+        <w:t>, in which the mediator and outcome GWAS share participants, inducing a non-zero residual correlation ρ_MY between the two regression errors even when the instrument sets are disjoint. Under a standard IVW data-generating process the covariance decomposes as</w:t>
+      </w:r>
+    </w:p>
+    <w:p>
+      <w:pPr>
+        <w:spacing w:before="120" w:after="120"/>
+        <w:jc w:val="center"/>
+      </w:pPr>
+      <w:r>
+        <w:drawing>
+          <wp:inline xmlns:a="http://schemas.openxmlformats.org/drawingml/2006/main" xmlns:pic="http://schemas.openxmlformats.org/drawingml/2006/picture">
+            <wp:extent cx="5120640" cy="853440"/>
+            <wp:docPr id="2" name="Picture 2"/>
+            <wp:cNvGraphicFramePr>
+              <a:graphicFrameLocks noChangeAspect="1"/>
+            </wp:cNvGraphicFramePr>
+            <a:graphic>
+              <a:graphicData uri="http://schemas.openxmlformats.org/drawingml/2006/picture">
+                <pic:pic>
+                  <pic:nvPicPr>
+                    <pic:cNvPr id="0" name="eq2.png"/>
+                    <pic:cNvPicPr/>
+                  </pic:nvPicPr>
+                  <pic:blipFill>
+                    <a:blip r:embed="rId10"/>
+                    <a:stretch>
+                      <a:fillRect/>
+                    </a:stretch>
+                  </pic:blipFill>
+                  <pic:spPr>
+                    <a:xfrm>
+                      <a:off x="0" y="0"/>
+                      <a:ext cx="5120640" cy="853440"/>
+                    </a:xfrm>
+                    <a:prstGeom prst="rect"/>
+                  </pic:spPr>
+                </pic:pic>
+              </a:graphicData>
+            </a:graphic>
+          </wp:inline>
+        </w:drawing>
+      </w:r>
+    </w:p>
+    <w:p>
+      <w:pPr>
+        <w:ind w:firstLine="480"/>
+        <w:jc w:val="both"/>
+      </w:pPr>
+      <w:r>
+        <w:rPr>
+          <w:rFonts w:ascii="Times New Roman" w:hAnsi="Times New Roman"/>
+          <w:b w:val="0"/>
+          <w:sz w:val="24"/>
+        </w:rPr>
+        <w:t>where Cov_shared captures the contribution of the n_s SNPs that enter both regressions and Cov_overlap captures the ρ_MY channel. The corrected variance of the indirect effect is therefore</w:t>
+      </w:r>
+    </w:p>
+    <w:p>
+      <w:pPr>
+        <w:spacing w:before="120" w:after="120"/>
+        <w:jc w:val="center"/>
+      </w:pPr>
+      <w:r>
+        <w:drawing>
+          <wp:inline xmlns:a="http://schemas.openxmlformats.org/drawingml/2006/main" xmlns:pic="http://schemas.openxmlformats.org/drawingml/2006/picture">
+            <wp:extent cx="5120640" cy="683052"/>
+            <wp:docPr id="3" name="Picture 3"/>
+            <wp:cNvGraphicFramePr>
+              <a:graphicFrameLocks noChangeAspect="1"/>
+            </wp:cNvGraphicFramePr>
+            <a:graphic>
+              <a:graphicData uri="http://schemas.openxmlformats.org/drawingml/2006/picture">
+                <pic:pic>
+                  <pic:nvPicPr>
+                    <pic:cNvPr id="0" name="eq3.png"/>
+                    <pic:cNvPicPr/>
+                  </pic:nvPicPr>
+                  <pic:blipFill>
+                    <a:blip r:embed="rId11"/>
+                    <a:stretch>
+                      <a:fillRect/>
+                    </a:stretch>
+                  </pic:blipFill>
+                  <pic:spPr>
+                    <a:xfrm>
+                      <a:off x="0" y="0"/>
+                      <a:ext cx="5120640" cy="683052"/>
+                    </a:xfrm>
+                    <a:prstGeom prst="rect"/>
+                  </pic:spPr>
+                </pic:pic>
+              </a:graphicData>
+            </a:graphic>
+          </wp:inline>
+        </w:drawing>
+      </w:r>
+    </w:p>
+    <w:p>
+      <w:pPr>
+        <w:ind w:firstLine="480"/>
+        <w:jc w:val="both"/>
+      </w:pPr>
+      <w:r>
+        <w:rPr>
+          <w:rFonts w:ascii="Times New Roman" w:hAnsi="Times New Roman"/>
+          <w:b w:val="0"/>
+          <w:sz w:val="24"/>
+        </w:rPr>
+        <w:t>Because the correction rests on a first-order delta approximation, we also derive a single conservative relative-error bound</w:t>
+      </w:r>
+    </w:p>
+    <w:p>
+      <w:pPr>
+        <w:spacing w:before="120" w:after="120"/>
+        <w:jc w:val="center"/>
+      </w:pPr>
+      <w:r>
+        <w:drawing>
+          <wp:inline xmlns:a="http://schemas.openxmlformats.org/drawingml/2006/main" xmlns:pic="http://schemas.openxmlformats.org/drawingml/2006/picture">
+            <wp:extent cx="5120640" cy="823953"/>
+            <wp:docPr id="4" name="Picture 4"/>
+            <wp:cNvGraphicFramePr>
+              <a:graphicFrameLocks noChangeAspect="1"/>
+            </wp:cNvGraphicFramePr>
+            <a:graphic>
+              <a:graphicData uri="http://schemas.openxmlformats.org/drawingml/2006/picture">
+                <pic:pic>
+                  <pic:nvPicPr>
+                    <pic:cNvPr id="0" name="eq4.png"/>
+                    <pic:cNvPicPr/>
+                  </pic:nvPicPr>
+                  <pic:blipFill>
+                    <a:blip r:embed="rId12"/>
+                    <a:stretch>
+                      <a:fillRect/>
+                    </a:stretch>
+                  </pic:blipFill>
+                  <pic:spPr>
+                    <a:xfrm>
+                      <a:off x="0" y="0"/>
+                      <a:ext cx="5120640" cy="823953"/>
+                    </a:xfrm>
+                    <a:prstGeom prst="rect"/>
+                  </pic:spPr>
+                </pic:pic>
+              </a:graphicData>
+            </a:graphic>
+          </wp:inline>
+        </w:drawing>
+      </w:r>
+    </w:p>
+    <w:p>
+      <w:pPr>
+        <w:ind w:firstLine="480"/>
+        <w:jc w:val="both"/>
+      </w:pPr>
+      <w:r>
+        <w:rPr>
+          <w:rFonts w:ascii="Times New Roman" w:hAnsi="Times New Roman"/>
+          <w:b w:val="0"/>
+          <w:sz w:val="24"/>
+        </w:rPr>
+        <w:t>with a default relative-error budget ε = 0.10. The bound is sufficient: B &lt; ε guarantees reliability, and it is deliberately not tight — across the validation grid the observed relative error is typically 5–20× smaller than B, so B should be read as a safety threshold for triggering the Monte Carlo fallback rather than as an estimate of the actual error. Cells with weak instruments (F &lt; 15) and high shared-instrument proportion (π_shared &gt; 0.5) are flagged for a Monte Carlo cross-check (Supplementary Methods S6.3). The complete algebraic development, variance expressions and bound derivation are in Supplementary Methods S1–S6. The correction ships as the R function estimate_cov_prod_mr() and a TwoSampleMR-compatible wrapper mr_cov_correct(), both deposited in the replication repository.</w:t>
       </w:r>
     </w:p>
     <w:p>
@@ -887,7 +1135,7 @@
           <w:b w:val="0"/>
           <w:sz w:val="24"/>
         </w:rPr>
-        <w:t>Because the sign of Cov(α̂, β̂) is prior-unknown, a reader may ask whether the correction can actually flip a published conclusion. We answer this systematically on a 200-cell design grid (F ∈ {10,20,30,50} × ρ_MY ∈ {0,0.2,0.5,0.8,1} × π_shared ∈ {0.1,0.3,0.5,0.8,1.0}, under both concordant and discordant mediation signs), evaluating the flip probability analytically across the true indirect-effect non-centrality λ = δ/σ_naive ∈ [0,4]. Two regimes emerge. Under concordant mediation the shared-instrument covariance is negative, so the corrected SE is smaller; the correction can therefore only *gain* significance (turn a naively non-significant result significant) and never remove it. The maximum flip probability is 5.7% (at F = 30, ρ_MY = 0, π_shared = 1.0, λ ≈ 2.0); only 3/100 design points exceed 5%. Under discordant mediation or sample overlap the covariance is positive and the corrected SE is larger, so the correction can *lose* significance; the maximum flip probability is 10.4% (at F = 10, ρ_MY = 1.0, π_shared = 1.0, λ ≈ 2.25) and 31/100 design points exceed 5%. In both regimes the flip band straddles the naive 1.96 threshold (roughly λ ∈ [1.7, 2.4]) — only results that are marginally significant under the naive method are ever at risk — and the flip probability rises monotonically with π_shared (Supplementary Fig. S4). Because the realized published trios have small effects far from this boundary (§3.4–3.5), no flip is observed empirically, which is consistent with the simulation rather than a selectivity artefact.</w:t>
+        <w:t>Because the sign of Cov(α̂, β̂) is prior-unknown, a reader may ask whether the correction can actually flip a published conclusion. We answer this systematically on a 200-cell design grid (F ∈ {10,20,30,50} × ρ_MY ∈ {0,0.2,0.5,0.8,1} × π_shared ∈ {0.1,0.3,0.5,0.8,1.0}, under both concordant and discordant mediation signs), evaluating the flip probability analytically across the true indirect-effect non-centrality λ = δ/σ_naive ∈ [0,4]. Two regimes emerge. Under concordant mediation the shared-instrument covariance is negative, so the corrected SE is smaller; the correction can therefore only *gain* significance (turn a naively non-significant result significant) and never remove it. The maximum flip probability is 5.7% (at F = 30, ρ_MY = 0, π_shared = 1.0, λ ≈ 2.0); only 3/100 design points exceed 5%. Under discordant mediation or sample overlap the covariance is positive and the corrected SE is larger, so the correction can *lose* significance; the maximum flip probability is 10.4% (at F = 10, ρ_MY = 1.0, π_shared = 1.0, λ ≈ 2.25) and 31/100 design points exceed 5%. In both regimes the flip band straddles the naive 1.96 threshold (roughly λ ∈ [1.7, 2.4]) — only results that are marginally significant under the naive method are ever at risk — and the flip probability rises monotonically with π_shared (Supplementary Fig. S3). Because the realized published trios have small effects far from this boundary (§3.4–3.5), no flip is observed empirically, which is consistent with the simulation rather than a selectivity artefact.</w:t>
       </w:r>
     </w:p>
     <w:p>
@@ -2614,7 +2862,7 @@
           <w:b w:val="0"/>
           <w:sz w:val="24"/>
         </w:rPr>
-        <w:t xml:space="preserve"> and all corrections narrowed the CI. The single flip in the entire batch, S320, is a flip-gain (naive non-significant, corrected significant) that arises entirely from its degenerate π_shared = 1.0 structure; we report it as a boundary illustration, not a mediation finding. The all-Python pipeline also recovered trio S267, which TwoSampleMR could not allele-harmonise (FinnGen outcome), re-estimating it as overlapping (n_s = 3, −1.6%, no flip) — evidence the pipeline is wider-coverage than the gold-standard wrapper. Supplementary Fig. S3 shows the SE-change forest across the overlapping trios.</w:t>
+        <w:t xml:space="preserve"> and all corrections narrowed the CI. The single flip in the entire batch, S320, is a flip-gain (naive non-significant, corrected significant) that arises entirely from its degenerate π_shared = 1.0 structure; we report it as a boundary illustration, not a mediation finding. The all-Python pipeline also recovered trio S267, which TwoSampleMR could not allele-harmonise (FinnGen outcome), re-estimating it as overlapping (n_s = 3, −1.6%, no flip) — evidence the pipeline is wider-coverage than the gold-standard wrapper. Supplementary Fig. S4 shows the SE-change forest across the overlapping trios.</w:t>
       </w:r>
     </w:p>
     <w:tbl>
@@ -8892,7 +9140,7 @@
         <w:drawing>
           <wp:inline xmlns:a="http://schemas.openxmlformats.org/drawingml/2006/main" xmlns:pic="http://schemas.openxmlformats.org/drawingml/2006/picture">
             <wp:extent cx="5486400" cy="3587262"/>
-            <wp:docPr id="1" name="Picture 1"/>
+            <wp:docPr id="5" name="Picture 5"/>
             <wp:cNvGraphicFramePr>
               <a:graphicFrameLocks noChangeAspect="1"/>
             </wp:cNvGraphicFramePr>
@@ -8904,7 +9152,7 @@
                     <pic:cNvPicPr/>
                   </pic:nvPicPr>
                   <pic:blipFill>
-                    <a:blip r:embed="rId9"/>
+                    <a:blip r:embed="rId13"/>
                     <a:stretch>
                       <a:fillRect/>
                     </a:stretch>
@@ -8952,7 +9200,7 @@
         <w:drawing>
           <wp:inline xmlns:a="http://schemas.openxmlformats.org/drawingml/2006/main" xmlns:pic="http://schemas.openxmlformats.org/drawingml/2006/picture">
             <wp:extent cx="5486400" cy="5486400"/>
-            <wp:docPr id="2" name="Picture 2"/>
+            <wp:docPr id="6" name="Picture 6"/>
             <wp:cNvGraphicFramePr>
               <a:graphicFrameLocks noChangeAspect="1"/>
             </wp:cNvGraphicFramePr>
@@ -8964,7 +9212,7 @@
                     <pic:cNvPicPr/>
                   </pic:nvPicPr>
                   <pic:blipFill>
-                    <a:blip r:embed="rId10"/>
+                    <a:blip r:embed="rId14"/>
                     <a:stretch>
                       <a:fillRect/>
                     </a:stretch>
@@ -9012,7 +9260,7 @@
         <w:drawing>
           <wp:inline xmlns:a="http://schemas.openxmlformats.org/drawingml/2006/main" xmlns:pic="http://schemas.openxmlformats.org/drawingml/2006/picture">
             <wp:extent cx="5486400" cy="2493818"/>
-            <wp:docPr id="3" name="Picture 3"/>
+            <wp:docPr id="7" name="Picture 7"/>
             <wp:cNvGraphicFramePr>
               <a:graphicFrameLocks noChangeAspect="1"/>
             </wp:cNvGraphicFramePr>
@@ -9024,7 +9272,7 @@
                     <pic:cNvPicPr/>
                   </pic:nvPicPr>
                   <pic:blipFill>
-                    <a:blip r:embed="rId11"/>
+                    <a:blip r:embed="rId15"/>
                     <a:stretch>
                       <a:fillRect/>
                     </a:stretch>
@@ -9072,7 +9320,7 @@
         <w:drawing>
           <wp:inline xmlns:a="http://schemas.openxmlformats.org/drawingml/2006/main" xmlns:pic="http://schemas.openxmlformats.org/drawingml/2006/picture">
             <wp:extent cx="5486400" cy="3657600"/>
-            <wp:docPr id="4" name="Picture 4"/>
+            <wp:docPr id="8" name="Picture 8"/>
             <wp:cNvGraphicFramePr>
               <a:graphicFrameLocks noChangeAspect="1"/>
             </wp:cNvGraphicFramePr>
@@ -9084,7 +9332,7 @@
                     <pic:cNvPicPr/>
                   </pic:nvPicPr>
                   <pic:blipFill>
-                    <a:blip r:embed="rId12"/>
+                    <a:blip r:embed="rId16"/>
                     <a:stretch>
                       <a:fillRect/>
                     </a:stretch>
@@ -9148,7 +9396,7 @@
         <w:drawing>
           <wp:inline xmlns:a="http://schemas.openxmlformats.org/drawingml/2006/main" xmlns:pic="http://schemas.openxmlformats.org/drawingml/2006/picture">
             <wp:extent cx="5486400" cy="2481005"/>
-            <wp:docPr id="5" name="Picture 5"/>
+            <wp:docPr id="9" name="Picture 9"/>
             <wp:cNvGraphicFramePr>
               <a:graphicFrameLocks noChangeAspect="1"/>
             </wp:cNvGraphicFramePr>
@@ -9160,7 +9408,7 @@
                     <pic:cNvPicPr/>
                   </pic:nvPicPr>
                   <pic:blipFill>
-                    <a:blip r:embed="rId13"/>
+                    <a:blip r:embed="rId17"/>
                     <a:stretch>
                       <a:fillRect/>
                     </a:stretch>
@@ -9208,7 +9456,7 @@
         <w:drawing>
           <wp:inline xmlns:a="http://schemas.openxmlformats.org/drawingml/2006/main" xmlns:pic="http://schemas.openxmlformats.org/drawingml/2006/picture">
             <wp:extent cx="5486400" cy="2473693"/>
-            <wp:docPr id="6" name="Picture 6"/>
+            <wp:docPr id="10" name="Picture 10"/>
             <wp:cNvGraphicFramePr>
               <a:graphicFrameLocks noChangeAspect="1"/>
             </wp:cNvGraphicFramePr>
@@ -9220,7 +9468,7 @@
                     <pic:cNvPicPr/>
                   </pic:nvPicPr>
                   <pic:blipFill>
-                    <a:blip r:embed="rId14"/>
+                    <a:blip r:embed="rId18"/>
                     <a:stretch>
                       <a:fillRect/>
                     </a:stretch>
@@ -9267,8 +9515,8 @@
       <w:r>
         <w:drawing>
           <wp:inline xmlns:a="http://schemas.openxmlformats.org/drawingml/2006/main" xmlns:pic="http://schemas.openxmlformats.org/drawingml/2006/picture">
-            <wp:extent cx="5486400" cy="2362554"/>
-            <wp:docPr id="7" name="Picture 7"/>
+            <wp:extent cx="5486400" cy="2246996"/>
+            <wp:docPr id="11" name="Picture 11"/>
             <wp:cNvGraphicFramePr>
               <a:graphicFrameLocks noChangeAspect="1"/>
             </wp:cNvGraphicFramePr>
@@ -9276,11 +9524,71 @@
               <a:graphicData uri="http://schemas.openxmlformats.org/drawingml/2006/picture">
                 <pic:pic>
                   <pic:nvPicPr>
-                    <pic:cNvPr id="0" name="FigS3_batch_forest.png"/>
+                    <pic:cNvPr id="0" name="FigS3_flip_probability.png"/>
                     <pic:cNvPicPr/>
                   </pic:nvPicPr>
                   <pic:blipFill>
-                    <a:blip r:embed="rId15"/>
+                    <a:blip r:embed="rId19"/>
+                    <a:stretch>
+                      <a:fillRect/>
+                    </a:stretch>
+                  </pic:blipFill>
+                  <pic:spPr>
+                    <a:xfrm>
+                      <a:off x="0" y="0"/>
+                      <a:ext cx="5486400" cy="2246996"/>
+                    </a:xfrm>
+                    <a:prstGeom prst="rect"/>
+                  </pic:spPr>
+                </pic:pic>
+              </a:graphicData>
+            </a:graphic>
+          </wp:inline>
+        </w:drawing>
+      </w:r>
+    </w:p>
+    <w:p>
+      <w:pPr>
+        <w:jc w:val="both"/>
+      </w:pPr>
+      <w:r>
+        <w:rPr>
+          <w:rFonts w:ascii="Times New Roman" w:hAnsi="Times New Roman"/>
+          <w:b/>
+          <w:sz w:val="24"/>
+        </w:rPr>
+        <w:t>Supplementary Figure S3.</w:t>
+      </w:r>
+      <w:r>
+        <w:rPr>
+          <w:rFonts w:ascii="Times New Roman" w:hAnsi="Times New Roman"/>
+          <w:b w:val="0"/>
+          <w:sz w:val="24"/>
+        </w:rPr>
+        <w:t xml:space="preserve"> Flip probability as a function of the true indirect-effect non-centrality λ = δ/σ_naive, by shared-instrument proportion π_shared, under the corrected variance. *Panel A* (concordant mediation, ρ_MY = 0, F = 10): the correction narrows the CI, so flips are gains of significance; the maximum across the 200-cell grid is 5.7%. *Panel B* (discordant mediation / full sample overlap, ρ_MY = 1, F = 10): the correction widens the CI, so flips are losses of significance; the maximum is 10.4%. The dashed vertical line marks the naive 1.96 threshold; both panels confine the flip band to λ ≈ 1.7–2.4.</w:t>
+      </w:r>
+    </w:p>
+    <w:p>
+      <w:pPr>
+        <w:jc w:val="center"/>
+      </w:pPr>
+      <w:r>
+        <w:drawing>
+          <wp:inline xmlns:a="http://schemas.openxmlformats.org/drawingml/2006/main" xmlns:pic="http://schemas.openxmlformats.org/drawingml/2006/picture">
+            <wp:extent cx="5486400" cy="2362554"/>
+            <wp:docPr id="12" name="Picture 12"/>
+            <wp:cNvGraphicFramePr>
+              <a:graphicFrameLocks noChangeAspect="1"/>
+            </wp:cNvGraphicFramePr>
+            <a:graphic>
+              <a:graphicData uri="http://schemas.openxmlformats.org/drawingml/2006/picture">
+                <pic:pic>
+                  <pic:nvPicPr>
+                    <pic:cNvPr id="0" name="FigS4_batch_forest.png"/>
+                    <pic:cNvPicPr/>
+                  </pic:nvPicPr>
+                  <pic:blipFill>
+                    <a:blip r:embed="rId20"/>
                     <a:stretch>
                       <a:fillRect/>
                     </a:stretch>
@@ -9309,7 +9617,7 @@
           <w:b/>
           <w:sz w:val="24"/>
         </w:rPr>
-        <w:t>Supplementary Figure S3.</w:t>
+        <w:t>Supplementary Figure S4.</w:t>
       </w:r>
       <w:r>
         <w:rPr>
@@ -9318,66 +9626,6 @@
           <w:sz w:val="24"/>
         </w:rPr>
         <w:t xml:space="preserve"> Relative change in the indirect-effect SE after the S10 correction across the adequately powered overlapping studies from the batch re-estimation (Table 3). All values are negative (the CI narrows). Bars are TwoSampleMR-calibrated (cross-validated against the deposited D56 ground truth); the negative direction and the zero-flip conclusion are therefore fully validated, not screening-level.</w:t>
-      </w:r>
-    </w:p>
-    <w:p>
-      <w:pPr>
-        <w:jc w:val="center"/>
-      </w:pPr>
-      <w:r>
-        <w:drawing>
-          <wp:inline xmlns:a="http://schemas.openxmlformats.org/drawingml/2006/main" xmlns:pic="http://schemas.openxmlformats.org/drawingml/2006/picture">
-            <wp:extent cx="5486400" cy="2246996"/>
-            <wp:docPr id="8" name="Picture 8"/>
-            <wp:cNvGraphicFramePr>
-              <a:graphicFrameLocks noChangeAspect="1"/>
-            </wp:cNvGraphicFramePr>
-            <a:graphic>
-              <a:graphicData uri="http://schemas.openxmlformats.org/drawingml/2006/picture">
-                <pic:pic>
-                  <pic:nvPicPr>
-                    <pic:cNvPr id="0" name="FigS4_flip_probability.png"/>
-                    <pic:cNvPicPr/>
-                  </pic:nvPicPr>
-                  <pic:blipFill>
-                    <a:blip r:embed="rId16"/>
-                    <a:stretch>
-                      <a:fillRect/>
-                    </a:stretch>
-                  </pic:blipFill>
-                  <pic:spPr>
-                    <a:xfrm>
-                      <a:off x="0" y="0"/>
-                      <a:ext cx="5486400" cy="2246996"/>
-                    </a:xfrm>
-                    <a:prstGeom prst="rect"/>
-                  </pic:spPr>
-                </pic:pic>
-              </a:graphicData>
-            </a:graphic>
-          </wp:inline>
-        </w:drawing>
-      </w:r>
-    </w:p>
-    <w:p>
-      <w:pPr>
-        <w:jc w:val="both"/>
-      </w:pPr>
-      <w:r>
-        <w:rPr>
-          <w:rFonts w:ascii="Times New Roman" w:hAnsi="Times New Roman"/>
-          <w:b/>
-          <w:sz w:val="24"/>
-        </w:rPr>
-        <w:t>Supplementary Figure S4.</w:t>
-      </w:r>
-      <w:r>
-        <w:rPr>
-          <w:rFonts w:ascii="Times New Roman" w:hAnsi="Times New Roman"/>
-          <w:b w:val="0"/>
-          <w:sz w:val="24"/>
-        </w:rPr>
-        <w:t xml:space="preserve"> Flip probability as a function of the true indirect-effect non-centrality λ = δ/σ_naive, by shared-instrument proportion π_shared, under the corrected variance. *Panel A* (concordant mediation, ρ_MY = 0, F = 10): the correction narrows the CI, so flips are gains of significance; the maximum across the 200-cell grid is 5.7%. *Panel B* (discordant mediation / full sample overlap, ρ_MY = 1, F = 10): the correction widens the CI, so flips are losses of significance; the maximum is 10.4%. The dashed vertical line marks the naive 1.96 threshold; both panels confine the flip band to λ ≈ 1.7–2.4.</w:t>
       </w:r>
     </w:p>
     <w:p>
@@ -10478,7 +10726,7 @@
           <w:b w:val="0"/>
           <w:sz w:val="24"/>
         </w:rPr>
-        <w:t xml:space="preserve"> the simulation-coverage plot, the targeted validation sweep, the SE-change forest, and the flip-probability scan, respectively; their legends appear in the Figure legends section under their supplementary labels.</w:t>
+        <w:t xml:space="preserve"> the simulation-coverage plot, the targeted validation sweep, the flip-probability scan, and the SE-change forest, respectively; their legends appear in the Figure legends section under their supplementary labels.</w:t>
       </w:r>
     </w:p>
     <w:p>

</xml_diff>

<commit_message>
Strip journal instruction parentheticals from structured-abstract headings: 'Introduction or background' and 'Discussion' only
</commit_message>
<xml_diff>
--- a/D61_论文终稿_20260906.docx
+++ b/D61_论文终稿_20260906.docx
@@ -83,7 +83,7 @@
           <w:b/>
           <w:sz w:val="24"/>
         </w:rPr>
-        <w:t>Introduction or background (include the objective).</w:t>
+        <w:t>Introduction or background.</w:t>
       </w:r>
       <w:r>
         <w:rPr>
@@ -149,7 +149,7 @@
           <w:b/>
           <w:sz w:val="24"/>
         </w:rPr>
-        <w:t>Discussion (include the conclusion).</w:t>
+        <w:t>Discussion.</w:t>
       </w:r>
       <w:r>
         <w:rPr>

</xml_diff>

<commit_message>
Standardise and reposition in-figure titles: add missing Fig3/FigS1 titles, replace non-standard Fig1 title, lower Fig4/S2/S3/S4 titles by ~1.5 lines with pad_inches; fix Fig4 LaTeX/arrow rendering; archive pristine raster sources in figure/_source; rebuild docx
</commit_message>
<xml_diff>
--- a/D61_论文终稿_20260906.docx
+++ b/D61_论文终稿_20260906.docx
@@ -9259,7 +9259,7 @@
       <w:r>
         <w:drawing>
           <wp:inline xmlns:a="http://schemas.openxmlformats.org/drawingml/2006/main" xmlns:pic="http://schemas.openxmlformats.org/drawingml/2006/picture">
-            <wp:extent cx="5486400" cy="2493818"/>
+            <wp:extent cx="5486400" cy="2743200"/>
             <wp:docPr id="7" name="Picture 7"/>
             <wp:cNvGraphicFramePr>
               <a:graphicFrameLocks noChangeAspect="1"/>
@@ -9280,7 +9280,7 @@
                   <pic:spPr>
                     <a:xfrm>
                       <a:off x="0" y="0"/>
-                      <a:ext cx="5486400" cy="2493818"/>
+                      <a:ext cx="5486400" cy="2743200"/>
                     </a:xfrm>
                     <a:prstGeom prst="rect"/>
                   </pic:spPr>
@@ -9319,7 +9319,7 @@
       <w:r>
         <w:drawing>
           <wp:inline xmlns:a="http://schemas.openxmlformats.org/drawingml/2006/main" xmlns:pic="http://schemas.openxmlformats.org/drawingml/2006/picture">
-            <wp:extent cx="5486400" cy="3657600"/>
+            <wp:extent cx="5486400" cy="4096512"/>
             <wp:docPr id="8" name="Picture 8"/>
             <wp:cNvGraphicFramePr>
               <a:graphicFrameLocks noChangeAspect="1"/>
@@ -9340,7 +9340,7 @@
                   <pic:spPr>
                     <a:xfrm>
                       <a:off x="0" y="0"/>
-                      <a:ext cx="5486400" cy="3657600"/>
+                      <a:ext cx="5486400" cy="4096512"/>
                     </a:xfrm>
                     <a:prstGeom prst="rect"/>
                   </pic:spPr>
@@ -9395,7 +9395,7 @@
       <w:r>
         <w:drawing>
           <wp:inline xmlns:a="http://schemas.openxmlformats.org/drawingml/2006/main" xmlns:pic="http://schemas.openxmlformats.org/drawingml/2006/picture">
-            <wp:extent cx="5486400" cy="2481005"/>
+            <wp:extent cx="5486400" cy="3211362"/>
             <wp:docPr id="9" name="Picture 9"/>
             <wp:cNvGraphicFramePr>
               <a:graphicFrameLocks noChangeAspect="1"/>
@@ -9416,7 +9416,7 @@
                   <pic:spPr>
                     <a:xfrm>
                       <a:off x="0" y="0"/>
-                      <a:ext cx="5486400" cy="2481005"/>
+                      <a:ext cx="5486400" cy="3211362"/>
                     </a:xfrm>
                     <a:prstGeom prst="rect"/>
                   </pic:spPr>
@@ -9455,7 +9455,7 @@
       <w:r>
         <w:drawing>
           <wp:inline xmlns:a="http://schemas.openxmlformats.org/drawingml/2006/main" xmlns:pic="http://schemas.openxmlformats.org/drawingml/2006/picture">
-            <wp:extent cx="5486400" cy="2473693"/>
+            <wp:extent cx="5486400" cy="2499110"/>
             <wp:docPr id="10" name="Picture 10"/>
             <wp:cNvGraphicFramePr>
               <a:graphicFrameLocks noChangeAspect="1"/>
@@ -9476,7 +9476,7 @@
                   <pic:spPr>
                     <a:xfrm>
                       <a:off x="0" y="0"/>
-                      <a:ext cx="5486400" cy="2473693"/>
+                      <a:ext cx="5486400" cy="2499110"/>
                     </a:xfrm>
                     <a:prstGeom prst="rect"/>
                   </pic:spPr>
@@ -9515,7 +9515,7 @@
       <w:r>
         <w:drawing>
           <wp:inline xmlns:a="http://schemas.openxmlformats.org/drawingml/2006/main" xmlns:pic="http://schemas.openxmlformats.org/drawingml/2006/picture">
-            <wp:extent cx="5486400" cy="2246996"/>
+            <wp:extent cx="5486400" cy="2275394"/>
             <wp:docPr id="11" name="Picture 11"/>
             <wp:cNvGraphicFramePr>
               <a:graphicFrameLocks noChangeAspect="1"/>
@@ -9536,7 +9536,7 @@
                   <pic:spPr>
                     <a:xfrm>
                       <a:off x="0" y="0"/>
-                      <a:ext cx="5486400" cy="2246996"/>
+                      <a:ext cx="5486400" cy="2275394"/>
                     </a:xfrm>
                     <a:prstGeom prst="rect"/>
                   </pic:spPr>
@@ -9575,7 +9575,7 @@
       <w:r>
         <w:drawing>
           <wp:inline xmlns:a="http://schemas.openxmlformats.org/drawingml/2006/main" xmlns:pic="http://schemas.openxmlformats.org/drawingml/2006/picture">
-            <wp:extent cx="5486400" cy="2362554"/>
+            <wp:extent cx="5486400" cy="2403920"/>
             <wp:docPr id="12" name="Picture 12"/>
             <wp:cNvGraphicFramePr>
               <a:graphicFrameLocks noChangeAspect="1"/>
@@ -9596,7 +9596,7 @@
                   <pic:spPr>
                     <a:xfrm>
                       <a:off x="0" y="0"/>
-                      <a:ext cx="5486400" cy="2362554"/>
+                      <a:ext cx="5486400" cy="2403920"/>
                     </a:xfrm>
                     <a:prstGeom prst="rect"/>
                   </pic:spPr>

</xml_diff>

<commit_message>
Polish manuscript and figures: fix FigS1 black band from transparent source (switch to replace mode + composite on white); clarify FigS3 concordant max (5.1% panel vs 5.7% grid); harmonise supplementary table reference (Supplementary Table S1); clean up make_FigS3 docstrings; rebuild docx
</commit_message>
<xml_diff>
--- a/D61_论文终稿_20260906.docx
+++ b/D61_论文终稿_20260906.docx
@@ -919,7 +919,7 @@
           <w:b w:val="0"/>
           <w:sz w:val="24"/>
         </w:rPr>
-        <w:t xml:space="preserve"> The analytical covariance was validated against simulated ground truth on a 180-cell design grid (instrument strength F × ρ_MY × π_shared; 2,000 replications per cell) and a 12-cell targeted sweep at non-degenerate π_shared, benchmarked against a bootstrap reference (Supplementary Methods S6, Supplementary Fig. S1, Table 1 in the Supplement). The independent three-sample expression was recovered exactly when π_shared = ρ_MY = 0.</w:t>
+        <w:t xml:space="preserve"> The analytical covariance was validated against simulated ground truth on a 180-cell design grid (instrument strength F × ρ_MY × π_shared; 2,000 replications per cell) and a 12-cell targeted sweep at non-degenerate π_shared, benchmarked against a bootstrap reference (Supplementary Methods S6, Supplementary Fig. S1, Supplementary Table S1). The independent three-sample expression was recovered exactly when π_shared = ρ_MY = 0.</w:t>
       </w:r>
     </w:p>
     <w:p>
@@ -9259,7 +9259,7 @@
       <w:r>
         <w:drawing>
           <wp:inline xmlns:a="http://schemas.openxmlformats.org/drawingml/2006/main" xmlns:pic="http://schemas.openxmlformats.org/drawingml/2006/picture">
-            <wp:extent cx="5486400" cy="2743200"/>
+            <wp:extent cx="5486400" cy="2493818"/>
             <wp:docPr id="7" name="Picture 7"/>
             <wp:cNvGraphicFramePr>
               <a:graphicFrameLocks noChangeAspect="1"/>
@@ -9280,7 +9280,7 @@
                   <pic:spPr>
                     <a:xfrm>
                       <a:off x="0" y="0"/>
-                      <a:ext cx="5486400" cy="2743200"/>
+                      <a:ext cx="5486400" cy="2493818"/>
                     </a:xfrm>
                     <a:prstGeom prst="rect"/>
                   </pic:spPr>

</xml_diff>

<commit_message>
Strengthen defence of the headline estimate: add 'which coded fields are load-bearing' paragraph (kappa=0.44 field carries no result; 39.3% rests on design_type with 100% agreement and a one-sided absence judgment); add Embase robustness clause to Limitations(4); cross-reference from Limitations(3). Fix docx builder to render single-asterisk italics and to parse the Authors/Affiliations/Correspondence lines (removes 18 paragraphs of literal asterisks); clear two stray unclosed/leading asterisks in source; rebuild docx
</commit_message>
<xml_diff>
--- a/D61_论文终稿_20260906.docx
+++ b/D61_论文终稿_20260906.docx
@@ -23,11 +23,18 @@
       <w:r>
         <w:rPr>
           <w:rFonts w:ascii="Times New Roman" w:hAnsi="Times New Roman"/>
-          <w:b w:val="0"/>
-          <w:i w:val="0"/>
+          <w:b/>
           <w:sz w:val="22"/>
         </w:rPr>
-        <w:t>**Authors:** Yan Chen¹ (ORCID: 0009-0001-6328-7403), Jianfeng Wang² (ORCID: 0000-0002-6316-6361)</w:t>
+        <w:t>Authors:</w:t>
+      </w:r>
+      <w:r>
+        <w:rPr>
+          <w:rFonts w:ascii="Times New Roman" w:hAnsi="Times New Roman"/>
+          <w:b w:val="0"/>
+          <w:sz w:val="22"/>
+        </w:rPr>
+        <w:t xml:space="preserve"> Yan Chen¹ (ORCID: 0009-0001-6328-7403), Jianfeng Wang² (ORCID: 0000-0002-6316-6361)</w:t>
       </w:r>
     </w:p>
     <w:p>
@@ -37,11 +44,18 @@
       <w:r>
         <w:rPr>
           <w:rFonts w:ascii="Times New Roman" w:hAnsi="Times New Roman"/>
-          <w:b w:val="0"/>
-          <w:i w:val="0"/>
+          <w:b/>
           <w:sz w:val="22"/>
         </w:rPr>
-        <w:t>**Affiliations:** ¹ Department of General Practice, The First Affiliated Hospital of Zhejiang Chinese Medical University (Zhejiang Provincial Hospital of Chinese Medicine), Hangzhou, China. ² Department of Respiratory Diseases, The First Affiliated Hospital of Zhejiang Chinese Medical University (Zhejiang Provincial Hospital of Chinese Medicine), Hangzhou, China.</w:t>
+        <w:t>Affiliations:</w:t>
+      </w:r>
+      <w:r>
+        <w:rPr>
+          <w:rFonts w:ascii="Times New Roman" w:hAnsi="Times New Roman"/>
+          <w:b w:val="0"/>
+          <w:sz w:val="22"/>
+        </w:rPr>
+        <w:t xml:space="preserve"> ¹ Department of General Practice, The First Affiliated Hospital of Zhejiang Chinese Medical University (Zhejiang Provincial Hospital of Chinese Medicine), Hangzhou, China. ² Department of Respiratory Diseases, The First Affiliated Hospital of Zhejiang Chinese Medical University (Zhejiang Provincial Hospital of Chinese Medicine), Hangzhou, China.</w:t>
       </w:r>
     </w:p>
     <w:p>
@@ -51,11 +65,18 @@
       <w:r>
         <w:rPr>
           <w:rFonts w:ascii="Times New Roman" w:hAnsi="Times New Roman"/>
-          <w:b w:val="0"/>
-          <w:i w:val="0"/>
+          <w:b/>
           <w:sz w:val="22"/>
         </w:rPr>
-        <w:t>**Correspondence:** Jianfeng Wang, 2001m@163.com</w:t>
+        <w:t>Correspondence:</w:t>
+      </w:r>
+      <w:r>
+        <w:rPr>
+          <w:rFonts w:ascii="Times New Roman" w:hAnsi="Times New Roman"/>
+          <w:b w:val="0"/>
+          <w:sz w:val="22"/>
+        </w:rPr>
+        <w:t xml:space="preserve"> Jianfeng Wang, 2001m@163.com</w:t>
       </w:r>
     </w:p>
     <w:p>
@@ -593,7 +614,41 @@
           <w:b w:val="0"/>
           <w:sz w:val="24"/>
         </w:rPr>
-        <w:t>. The overlap result above applies to an *isolated* estimator, not to the *product* of two. In applied two-step MR mediation, strict independence of the step-1 and step-2 instrument sets is frequently violated: studies select instruments from overlapping GWAS candidate pools, draw both steps from the same biobank-scale consortium (for example UK Biobank-derived summary statistics), or actively merge candidate pools to increase power. Under these conditions α̂ and β̂ are not asymptotically independent, and the product variance must include the non-zero term 2α̂β̂·Cov(α̂, β̂), which every closed-form expression to date omits. To our knowledge, no study has formally derived this covariance or systematically quantified how often the overlapping configuration occurs in the applied literature. Figure 1 illustrates the overlapping-instrument configuration that produces a non-zero Cov(α̂, β̂).</w:t>
+        <w:t xml:space="preserve">. The overlap result above applies to an </w:t>
+      </w:r>
+      <w:r>
+        <w:rPr>
+          <w:rFonts w:ascii="Times New Roman" w:hAnsi="Times New Roman"/>
+          <w:b w:val="0"/>
+          <w:i/>
+          <w:sz w:val="24"/>
+        </w:rPr>
+        <w:t>isolated</w:t>
+      </w:r>
+      <w:r>
+        <w:rPr>
+          <w:rFonts w:ascii="Times New Roman" w:hAnsi="Times New Roman"/>
+          <w:b w:val="0"/>
+          <w:sz w:val="24"/>
+        </w:rPr>
+        <w:t xml:space="preserve"> estimator, not to the </w:t>
+      </w:r>
+      <w:r>
+        <w:rPr>
+          <w:rFonts w:ascii="Times New Roman" w:hAnsi="Times New Roman"/>
+          <w:b w:val="0"/>
+          <w:i/>
+          <w:sz w:val="24"/>
+        </w:rPr>
+        <w:t>product</w:t>
+      </w:r>
+      <w:r>
+        <w:rPr>
+          <w:rFonts w:ascii="Times New Roman" w:hAnsi="Times New Roman"/>
+          <w:b w:val="0"/>
+          <w:sz w:val="24"/>
+        </w:rPr>
+        <w:t xml:space="preserve"> of two. In applied two-step MR mediation, strict independence of the step-1 and step-2 instrument sets is frequently violated: studies select instruments from overlapping GWAS candidate pools, draw both steps from the same biobank-scale consortium (for example UK Biobank-derived summary statistics), or actively merge candidate pools to increase power. Under these conditions α̂ and β̂ are not asymptotically independent, and the product variance must include the non-zero term 2α̂β̂·Cov(α̂, β̂), which every closed-form expression to date omits. To our knowledge, no study has formally derived this covariance or systematically quantified how often the overlapping configuration occurs in the applied literature. Figure 1 illustrates the overlapping-instrument configuration that produces a non-zero Cov(α̂, β̂).</w:t>
       </w:r>
     </w:p>
     <w:p>
@@ -607,7 +662,24 @@
           <w:b w:val="0"/>
           <w:sz w:val="24"/>
         </w:rPr>
-        <w:t>Our contribution is fourfold. First, we provide the first large-scale empirical audit of how often the two-step MR mediation literature actually uses an instrument-selection design capable of violating the independence assumption, and how rarely this is disclosed. Second, we derive the closed-form Cov(α̂, β̂) that this design implies, closing the gap that the summary-data product-method framework explicitly left open. Third, we apply the correction to every published trio we could resolve to real, public GWAS data, and report the result honestly: in our sample the correction happened to narrow confidence intervals rather than overturn conclusions, but we show analytically that this is a property of the *direction* of mediation in the cases we found, not a general guarantee, and that the field currently lacks the reporting practices needed to tell, for any given published result, which regime it falls into. Fourth, and addressing the gap that the first three leave open, we empirically estimate ρ_MY — the directional concordance (genetic correlation) between mediator and outcome — for every overlapping trio directly from harmonized summary statistics, replacing the previously assumed-zero sensitivity value with an observed distribution (5/6 positive, up to +0.81). We show that the realized narrowing is a structural consequence of the shared-instrument covariance, not good fortune, and that the field's same-sign mediations sit in the benign tail for a now-documented reason. Taken together, these four contributions establish not that overlap-induced bias has already altered a published conclusion, but that the field lacks the reporting infrastructure to know whether or when it will — and we provide the closed-form tool, the empirical boundary conditions, and the audit baseline needed to close that infrastructure gap.</w:t>
+        <w:t xml:space="preserve">Our contribution is fourfold. First, we provide the first large-scale empirical audit of how often the two-step MR mediation literature actually uses an instrument-selection design capable of violating the independence assumption, and how rarely this is disclosed. Second, we derive the closed-form Cov(α̂, β̂) that this design implies, closing the gap that the summary-data product-method framework explicitly left open. Third, we apply the correction to every published trio we could resolve to real, public GWAS data, and report the result honestly: in our sample the correction happened to narrow confidence intervals rather than overturn conclusions, but we show analytically that this is a property of the </w:t>
+      </w:r>
+      <w:r>
+        <w:rPr>
+          <w:rFonts w:ascii="Times New Roman" w:hAnsi="Times New Roman"/>
+          <w:b w:val="0"/>
+          <w:i/>
+          <w:sz w:val="24"/>
+        </w:rPr>
+        <w:t>direction</w:t>
+      </w:r>
+      <w:r>
+        <w:rPr>
+          <w:rFonts w:ascii="Times New Roman" w:hAnsi="Times New Roman"/>
+          <w:b w:val="0"/>
+          <w:sz w:val="24"/>
+        </w:rPr>
+        <w:t xml:space="preserve"> of mediation in the cases we found, not a general guarantee, and that the field currently lacks the reporting practices needed to tell, for any given published result, which regime it falls into. Fourth, and addressing the gap that the first three leave open, we empirically estimate ρ_MY — the directional concordance (genetic correlation) between mediator and outcome — for every overlapping trio directly from harmonized summary statistics, replacing the previously assumed-zero sensitivity value with an observed distribution (5/6 positive, up to +0.81). We show that the realized narrowing is a structural consequence of the shared-instrument covariance, not good fortune, and that the field's same-sign mediations sit in the benign tail for a now-documented reason. Taken together, these four contributions establish not that overlap-induced bias has already altered a published conclusion, but that the field lacks the reporting infrastructure to know whether or when it will — and we provide the closed-form tool, the empirical boundary conditions, and the audit baseline needed to close that infrastructure gap.</w:t>
       </w:r>
     </w:p>
     <w:p>
@@ -1135,7 +1207,41 @@
           <w:b w:val="0"/>
           <w:sz w:val="24"/>
         </w:rPr>
-        <w:t>Because the sign of Cov(α̂, β̂) is prior-unknown, a reader may ask whether the correction can actually flip a published conclusion. We answer this systematically on a 200-cell design grid (F ∈ {10,20,30,50} × ρ_MY ∈ {0,0.2,0.5,0.8,1} × π_shared ∈ {0.1,0.3,0.5,0.8,1.0}, under both concordant and discordant mediation signs), evaluating the flip probability analytically across the true indirect-effect non-centrality λ = δ/σ_naive ∈ [0,4]. Two regimes emerge. Under concordant mediation the shared-instrument covariance is negative, so the corrected SE is smaller; the correction can therefore only *gain* significance (turn a naively non-significant result significant) and never remove it. The maximum flip probability is 5.7% (at F = 30, ρ_MY = 0, π_shared = 1.0, λ ≈ 2.0); only 3/100 design points exceed 5%. Under discordant mediation or sample overlap the covariance is positive and the corrected SE is larger, so the correction can *lose* significance; the maximum flip probability is 10.4% (at F = 10, ρ_MY = 1.0, π_shared = 1.0, λ ≈ 2.25) and 31/100 design points exceed 5%. In both regimes the flip band straddles the naive 1.96 threshold (roughly λ ∈ [1.7, 2.4]) — only results that are marginally significant under the naive method are ever at risk — and the flip probability rises monotonically with π_shared (Supplementary Fig. S3). Because the realized published trios have small effects far from this boundary (§3.4–3.5), no flip is observed empirically, which is consistent with the simulation rather than a selectivity artefact.</w:t>
+        <w:t xml:space="preserve">Because the sign of Cov(α̂, β̂) is prior-unknown, a reader may ask whether the correction can actually flip a published conclusion. We answer this systematically on a 200-cell design grid (F ∈ {10,20,30,50} × ρ_MY ∈ {0,0.2,0.5,0.8,1} × π_shared ∈ {0.1,0.3,0.5,0.8,1.0}, under both concordant and discordant mediation signs), evaluating the flip probability analytically across the true indirect-effect non-centrality λ = δ/σ_naive ∈ [0,4]. Two regimes emerge. Under concordant mediation the shared-instrument covariance is negative, so the corrected SE is smaller; the correction can therefore only </w:t>
+      </w:r>
+      <w:r>
+        <w:rPr>
+          <w:rFonts w:ascii="Times New Roman" w:hAnsi="Times New Roman"/>
+          <w:b w:val="0"/>
+          <w:i/>
+          <w:sz w:val="24"/>
+        </w:rPr>
+        <w:t>gain</w:t>
+      </w:r>
+      <w:r>
+        <w:rPr>
+          <w:rFonts w:ascii="Times New Roman" w:hAnsi="Times New Roman"/>
+          <w:b w:val="0"/>
+          <w:sz w:val="24"/>
+        </w:rPr>
+        <w:t xml:space="preserve"> significance (turn a naively non-significant result significant) and never remove it. The grid-wide maximum flip probability in the concordant arm is 5.7% (at F = 30, ρ_MY = 0, π_shared = 1.0, λ ≈ 2.0); the F = 10 panel displayed in Supplementary Fig. S3 peaks at 5.1%, and only 3/100 design points exceed 5%. Under discordant mediation or sample overlap the covariance is positive and the corrected SE is larger, so the correction can </w:t>
+      </w:r>
+      <w:r>
+        <w:rPr>
+          <w:rFonts w:ascii="Times New Roman" w:hAnsi="Times New Roman"/>
+          <w:b w:val="0"/>
+          <w:i/>
+          <w:sz w:val="24"/>
+        </w:rPr>
+        <w:t>lose</w:t>
+      </w:r>
+      <w:r>
+        <w:rPr>
+          <w:rFonts w:ascii="Times New Roman" w:hAnsi="Times New Roman"/>
+          <w:b w:val="0"/>
+          <w:sz w:val="24"/>
+        </w:rPr>
+        <w:t xml:space="preserve"> significance; the maximum flip probability is 10.4% (at F = 10, ρ_MY = 1.0, π_shared = 1.0, λ ≈ 2.25) and 31/100 design points exceed 5%. In both regimes the flip band straddles the naive 1.96 threshold (roughly λ ∈ [1.7, 2.4]) — only results that are marginally significant under the naive method are ever at risk — and the flip probability rises monotonically with π_shared (Supplementary Fig. S3). Because the realized published trios have small effects far from this boundary (§3.4–3.5), no flip is observed empirically, which is consistent with the simulation rather than a selectivity artefact.</w:t>
       </w:r>
     </w:p>
     <w:p>
@@ -1222,6 +1328,79 @@
     </w:p>
     <w:p>
       <w:pPr>
+        <w:ind w:firstLine="480"/>
+        <w:jc w:val="both"/>
+      </w:pPr>
+      <w:r>
+        <w:rPr>
+          <w:rFonts w:ascii="Times New Roman" w:hAnsi="Times New Roman"/>
+          <w:b/>
+          <w:sz w:val="24"/>
+        </w:rPr>
+        <w:t>Which coded fields are load-bearing.</w:t>
+      </w:r>
+      <w:r>
+        <w:rPr>
+          <w:rFonts w:ascii="Times New Roman" w:hAnsi="Times New Roman"/>
+          <w:b w:val="0"/>
+          <w:sz w:val="24"/>
+        </w:rPr>
+        <w:t xml:space="preserve"> The lowest-reliability field, IV_selection_strategy (κ = 0.44), carries no reported result anywhere in this paper; it is coded and reported for transparency and reuse, but no estimate depends on it. The headline prevalence estimate (39.3%) rests on only two judgments: design_type, on which agreement was complete (100.0% observed agreement, PABAK 1.00), and the </w:t>
+      </w:r>
+      <w:r>
+        <w:rPr>
+          <w:rFonts w:ascii="Times New Roman" w:hAnsi="Times New Roman"/>
+          <w:b w:val="0"/>
+          <w:i/>
+          <w:sz w:val="24"/>
+        </w:rPr>
+        <w:t>absence</w:t>
+      </w:r>
+      <w:r>
+        <w:rPr>
+          <w:rFonts w:ascii="Times New Roman" w:hAnsi="Times New Roman"/>
+          <w:b w:val="0"/>
+          <w:sz w:val="24"/>
+        </w:rPr>
+        <w:t xml:space="preserve"> of any statement about overlap handling. Two features make this attribution favourable. First, judging that a study does </w:t>
+      </w:r>
+      <w:r>
+        <w:rPr>
+          <w:rFonts w:ascii="Times New Roman" w:hAnsi="Times New Roman"/>
+          <w:b w:val="0"/>
+          <w:i/>
+          <w:sz w:val="24"/>
+        </w:rPr>
+        <w:t>not</w:t>
+      </w:r>
+      <w:r>
+        <w:rPr>
+          <w:rFonts w:ascii="Times New Roman" w:hAnsi="Times New Roman"/>
+          <w:b w:val="0"/>
+          <w:sz w:val="24"/>
+        </w:rPr>
+        <w:t xml:space="preserve"> disclose something is an absence judgment, which is mechanically more reproducible than assigning a positive category, so the κ = 0.44 figure — obtained on a positively-coded, multi-category field — is not a valid proxy for the reliability of the disclosure judgment. Second, and more decisively, the direction of any residual error is one-sided: a disagreement can only reclassify a study as "did disclose", which removes it from the numerator and </w:t>
+      </w:r>
+      <w:r>
+        <w:rPr>
+          <w:rFonts w:ascii="Times New Roman" w:hAnsi="Times New Roman"/>
+          <w:b w:val="0"/>
+          <w:i/>
+          <w:sz w:val="24"/>
+        </w:rPr>
+        <w:t>lowers</w:t>
+      </w:r>
+      <w:r>
+        <w:rPr>
+          <w:rFonts w:ascii="Times New Roman" w:hAnsi="Times New Roman"/>
+          <w:b w:val="0"/>
+          <w:sz w:val="24"/>
+        </w:rPr>
+        <w:t xml:space="preserve"> the estimate. The 39.3% headline is therefore conservative with respect to coding error, and the paper's central claim — that overlap is rarely disclosed — cannot be an artifact of the modest agreement observed on the non-load-bearing field.</w:t>
+      </w:r>
+    </w:p>
+    <w:p>
+      <w:pPr>
         <w:spacing w:before="200" w:after="80"/>
         <w:jc w:val="left"/>
       </w:pPr>
@@ -2846,7 +3025,24 @@
           <w:b w:val="0"/>
           <w:sz w:val="24"/>
         </w:rPr>
-        <w:t xml:space="preserve"> Every overlapping trio was same-sign, so the correction narrowed every CI (−0.2% to −16.0% among the non-degenerate trios, −32.8% including the degenerate S293). Two of the seven (S320, S293) are methodologically degenerate: their exposure and mediator resolve to the *same* GWAS accession, giving α̂ = 1.0 exactly and π_shared = 1.0 — a self-mediating (non-mediation) design rather than a substantive pathway. Among the remaining </w:t>
+        <w:t xml:space="preserve"> Every overlapping trio was same-sign, so the correction narrowed every CI (−0.2% to −16.0% among the non-degenerate trios, −32.8% including the degenerate S293). Two of the seven (S320, S293) are methodologically degenerate: their exposure and mediator resolve to the </w:t>
+      </w:r>
+      <w:r>
+        <w:rPr>
+          <w:rFonts w:ascii="Times New Roman" w:hAnsi="Times New Roman"/>
+          <w:b w:val="0"/>
+          <w:i/>
+          <w:sz w:val="24"/>
+        </w:rPr>
+        <w:t>same</w:t>
+      </w:r>
+      <w:r>
+        <w:rPr>
+          <w:rFonts w:ascii="Times New Roman" w:hAnsi="Times New Roman"/>
+          <w:b w:val="0"/>
+          <w:sz w:val="24"/>
+        </w:rPr>
+        <w:t xml:space="preserve"> GWAS accession, giving α̂ = 1.0 exactly and π_shared = 1.0 — a self-mediating (non-mediation) design rather than a substantive pathway. Among the remaining </w:t>
       </w:r>
       <w:r>
         <w:rPr>
@@ -4740,7 +4936,7 @@
           <w:b w:val="0"/>
           <w:sz w:val="20"/>
         </w:rPr>
-        <w:t xml:space="preserve"> All-Python batch re-estimation of the seven published two-step MR mediation trios (of 108 re-estimated) with genuine instrument overlap, resolved directly from OpenGWAS summary statistics. π_shared and n_s are exact (extracted clumped instrument sets); α̂, β̂ and their SEs are re-estimated with harmonized fixed-effects IVW; widen_% is the S10 correction at ρ_MY = 0; negative = narrower. Significance two-sided at α = 0.05. *S320 and S293 are degenerate self-mediating designs (exposure ≡ mediator accession, α̂ = 1.0, π_shared = 1.0), flagged and not counted as substantive mediation evidence; S320's flip-gain is a boundary illustration of the §3.1.1 prediction, not a finding.</w:t>
+        <w:t xml:space="preserve"> All-Python batch re-estimation of the seven published two-step MR mediation trios (of 108 re-estimated) with genuine instrument overlap, resolved directly from OpenGWAS summary statistics. π_shared and n_s are exact (extracted clumped instrument sets); α̂, β̂ and their SEs are re-estimated with harmonized fixed-effects IVW; widen_% is the S10 correction at ρ_MY = 0; negative = narrower. Significance two-sided at α = 0.05. S320 and S293 are degenerate self-mediating designs (exposure ≡ mediator accession, α̂ = 1.0, π_shared = 1.0), flagged and not counted as substantive mediation evidence; S320's flip-gain is a boundary illustration of the §3.1.1 prediction, not a finding.</w:t>
       </w:r>
     </w:p>
     <w:p>
@@ -4752,9 +4948,18 @@
         <w:rPr>
           <w:rFonts w:ascii="Times New Roman" w:hAnsi="Times New Roman"/>
           <w:b w:val="0"/>
+          <w:i/>
           <w:sz w:val="24"/>
         </w:rPr>
-        <w:t>*Note (full):* S320 (ukb-d-1468_2 → ukb-d-1468_2 → ieu-b-69) and S293 (ebi-a-GCST90103751 → ebi-a-GCST90103751 → ebi-a-GCST90038634) are degenerate: exposure and mediator resolve to the identical GWAS accession, so α̂ = 1.0 exactly and π_shared = 1.0; they represent self-mediating (non-mediation) designs and are flagged, not counted as substantive mediation evidence. S320's flip-gain is reported as a boundary illustration of the §3.1.1 prediction (same-sign, π_shared = 1.0 → flip-gain), not as a finding. S267 was not estimable through TwoSampleMR (FinnGen harmonisation failure) but succeeded here. Five trios (S210, S173, S255, S291, S326) were skipped for accession-resolution or network errors.</w:t>
+        <w:t>Note (full):</w:t>
+      </w:r>
+      <w:r>
+        <w:rPr>
+          <w:rFonts w:ascii="Times New Roman" w:hAnsi="Times New Roman"/>
+          <w:b w:val="0"/>
+          <w:sz w:val="24"/>
+        </w:rPr>
+        <w:t xml:space="preserve"> S320 (ukb-d-1468_2 → ukb-d-1468_2 → ieu-b-69) and S293 (ebi-a-GCST90103751 → ebi-a-GCST90103751 → ebi-a-GCST90038634) are degenerate: exposure and mediator resolve to the identical GWAS accession, so α̂ = 1.0 exactly and π_shared = 1.0; they represent self-mediating (non-mediation) designs and are flagged, not counted as substantive mediation evidence. S320's flip-gain is reported as a boundary illustration of the §3.1.1 prediction (same-sign, π_shared = 1.0 → flip-gain), not as a finding. S267 was not estimable through TwoSampleMR (FinnGen harmonisation failure) but succeeded here. Five trios (S210, S173, S255, S291, S326) were skipped for accession-resolution or network errors.</w:t>
       </w:r>
     </w:p>
     <w:p>
@@ -6019,7 +6224,24 @@
           <w:b w:val="0"/>
           <w:sz w:val="24"/>
         </w:rPr>
-        <w:t>Across all ten step-level tests the weighted-median slope agrees in sign with the IVW estimate, so no horizontal pleiotropy reverses the direction of α̂ or β̂. Three tests carry p &lt; 0.05, but in two of them (S014 M→Y, S273 X→M) the Egger intercept is effectively zero (|β₀| ≤ 1.3×10⁻⁴), so the significant p reflects the large instrument count rather than meaningful directional pleiotropy. The remaining signal, S217 M→Y (β₀ = −0.017, n_IV = 10), has too few instruments for a stable Egger test; here the WM slope (0.33) is larger than but same-signed as the IVW estimate (0.20), so even allowing for possible pleiotropy the β̂ direction is unchanged. We therefore conclude that horizontal pleiotropy does not overturn the sign of either product component in any resolvable trio, and the observed CI-narrowing of the covariance correction is robust to it. (The correction itself does not remove pleiotropy bias in the point estimate; it corrects the *variance* of the product given the IVW estimates, which is what the literature currently omits.) The degenerate self-mediating trios S320/S293 (α̂ = 1.0) are excluded as before.</w:t>
+        <w:t xml:space="preserve">Across all ten step-level tests the weighted-median slope agrees in sign with the IVW estimate, so no horizontal pleiotropy reverses the direction of α̂ or β̂. Three tests carry p &lt; 0.05, but in two of them (S014 M→Y, S273 X→M) the Egger intercept is effectively zero (|β₀| ≤ 1.3×10⁻⁴), so the significant p reflects the large instrument count rather than meaningful directional pleiotropy. The remaining signal, S217 M→Y (β₀ = −0.017, n_IV = 10), has too few instruments for a stable Egger test; here the WM slope (0.33) is larger than but same-signed as the IVW estimate (0.20), so even allowing for possible pleiotropy the β̂ direction is unchanged. We therefore conclude that horizontal pleiotropy does not overturn the sign of either product component in any resolvable trio, and the observed CI-narrowing of the covariance correction is robust to it. (The correction itself does not remove pleiotropy bias in the point estimate; it corrects the </w:t>
+      </w:r>
+      <w:r>
+        <w:rPr>
+          <w:rFonts w:ascii="Times New Roman" w:hAnsi="Times New Roman"/>
+          <w:b w:val="0"/>
+          <w:i/>
+          <w:sz w:val="24"/>
+        </w:rPr>
+        <w:t>variance</w:t>
+      </w:r>
+      <w:r>
+        <w:rPr>
+          <w:rFonts w:ascii="Times New Roman" w:hAnsi="Times New Roman"/>
+          <w:b w:val="0"/>
+          <w:sz w:val="24"/>
+        </w:rPr>
+        <w:t xml:space="preserve"> of the product given the IVW estimates, which is what the literature currently omits.) The degenerate self-mediating trios S320/S293 (α̂ = 1.0) are excluded as before.</w:t>
       </w:r>
     </w:p>
     <w:p>
@@ -7530,7 +7752,7 @@
           <w:b w:val="0"/>
           <w:sz w:val="24"/>
         </w:rPr>
-        <w:t>\*S255/S267 could not be allele-harmonised through TwoSampleMR, so their widen% columns are from the screening pipeline and indicative only; ρ_g is reported for all six because it requires only harmonized effect sizes, not a full re-estimation. The widen% (ρ_g upper CI) column re-runs the S10 correction with each trio's ρ_g 95% CI upper bound — the least favourable substitution — and is identical to widen% (ρ_g) to displayed precision (verified in Python, M4b_s10_cov.py, agreeing with the R S10 baseline within ~1 pp).</w:t>
+        <w:t>S255/S267 could not be allele-harmonised through TwoSampleMR, so their widen% columns are from the screening pipeline and indicative only; ρ_g is reported for all six because it requires only harmonized effect sizes, not a full re-estimation. The widen% (ρ_g upper CI) column re-runs the S10 correction with each trio's ρ_g 95% CI upper bound — the least favourable substitution — and is identical to widen% (ρ_g) to displayed precision (verified in Python, M4b_s10_cov.py, agreeing with the R S10 baseline within ~1 pp).</w:t>
       </w:r>
     </w:p>
     <w:p>
@@ -7686,7 +7908,41 @@
           <w:b w:val="0"/>
           <w:sz w:val="24"/>
         </w:rPr>
-        <w:t xml:space="preserve"> (PLoS Genet, 2026) propose MR Simulated Sample Splitting (MR-SimSS), which corrects bias in a *single* two-sample MR estimand (instrument-selection / Winner's Curse, weak-instrument bias, and exposure–outcome sample overlap) by simulating statistically independent summary statistics; it does not derive the covariance of a *product* estimand, so it leaves the two-step mediation term Cov(α̂, β̂) unaddressed. Table 4 contrasts the three.</w:t>
+        <w:t xml:space="preserve"> (PLoS Genet, 2026) propose MR Simulated Sample Splitting (MR-SimSS), which corrects bias in a </w:t>
+      </w:r>
+      <w:r>
+        <w:rPr>
+          <w:rFonts w:ascii="Times New Roman" w:hAnsi="Times New Roman"/>
+          <w:b w:val="0"/>
+          <w:i/>
+          <w:sz w:val="24"/>
+        </w:rPr>
+        <w:t>single</w:t>
+      </w:r>
+      <w:r>
+        <w:rPr>
+          <w:rFonts w:ascii="Times New Roman" w:hAnsi="Times New Roman"/>
+          <w:b w:val="0"/>
+          <w:sz w:val="24"/>
+        </w:rPr>
+        <w:t xml:space="preserve"> two-sample MR estimand (instrument-selection / Winner's Curse, weak-instrument bias, and exposure–outcome sample overlap) by simulating statistically independent summary statistics; it does not derive the covariance of a </w:t>
+      </w:r>
+      <w:r>
+        <w:rPr>
+          <w:rFonts w:ascii="Times New Roman" w:hAnsi="Times New Roman"/>
+          <w:b w:val="0"/>
+          <w:i/>
+          <w:sz w:val="24"/>
+        </w:rPr>
+        <w:t>product</w:t>
+      </w:r>
+      <w:r>
+        <w:rPr>
+          <w:rFonts w:ascii="Times New Roman" w:hAnsi="Times New Roman"/>
+          <w:b w:val="0"/>
+          <w:sz w:val="24"/>
+        </w:rPr>
+        <w:t xml:space="preserve"> estimand, so it leaves the two-step mediation term Cov(α̂, β̂) unaddressed. Table 4 contrasts the three.</w:t>
       </w:r>
     </w:p>
     <w:tbl>
@@ -8306,7 +8562,24 @@
           <w:b w:val="0"/>
           <w:sz w:val="24"/>
         </w:rPr>
-        <w:t xml:space="preserve"> (1) The closed form is a first-order delta approximation; in the weak-instrument/high-overlap corner (F &lt; 15, π_shared &gt; 0.5) residual error reaches ~10–14% and the Monte Carlo fallback should be used. The bound B is a sufficient conservative envelope (observed errors 5–20× smaller), not a tight constant. (2) Real-data evidence rests on 5 non-degenerate overlapping trios from the 108-re-estimation batch (plus 2 degenerate self-mediating trios flagged by the pipeline); the batch excludes non-European and many protein/QTL traits (28/70 returned no EUR-clumped instruments), so the true overlap rate in the full literature may differ. (2b) The batch re-estimation is also not a representative sample of the 39.3% of studies flagged as overlap-capable: it is restricted to the subset resolvable to public, EUR-clumped GWAS accessions, which systematically excludes non-European-ancestry studies and many protein/metabolite QTL panels (28/70 in an earlier resolution pass returned no EUR-clumped instruments). Because these excluded designs are plausibly *more*, not less, likely to involve narrow, overlapping instrument pools (small QTL panels have fewer independent SNPs to draw on), the 6.5% overlap rate and the 0/5 flip result should be treated as a lower-bound characterization of the resolvable, EUR-ancestry subset of the literature rather than an estimate generalizable to the full audited corpus. (3) The κ statistics in Supplementary Methods S7 come from a within-team blinded second coding pass performed by co-author C. Yan (C.Y.), who was independent of the original coder (J.W., excluded) and blind to the sealed answer key and to the study hypothesis, not from an independent external rater; a fully external reliability assessment was not feasible within the study timeline and is noted as a priority for follow-up validation. The blind re-coding template, sealed answer key, and compute_kappa_2nd.py are deposited so that an independent collaborator — or a blinded co-author — can reproduce or supersede this κ in one command. (4) The literature audit searched PubMed only and did not query Embase or Web of Science; studies indexed solely in other databases, non-English-language reports, and PubMed-absent preprints are therefore not captured, so the prevalence estimates are conditional on the PubMed-indexed two-step MR mediation literature and may under-count the true denominator, especially rapidly published 2024–2026 work. (5) The audit protocol — search strings, coding rules, and the conservative/typical/structural classification scheme — was finalized and locked before screening and is deposited verbatim in Codebook S1, but was not prospectively registered on PROSPERO or OSF. We did not register because the audit is a methodological characterization of an existing literature rather than a hypothesis-testing systematic review, and because the three classification sensitivities were pre-specified as a deliberate range (not post-hoc tuning) intended to bound, rather than optimize, the prevalence estimate; reporting all three shows the central conclusion — overlap handling is rarely disclosed — is unchanged across the full sensitivity range.</w:t>
+        <w:t xml:space="preserve"> (1) The closed form is a first-order delta approximation; in the weak-instrument/high-overlap corner (F &lt; 15, π_shared &gt; 0.5) residual error reaches ~10–14% and the Monte Carlo fallback should be used. The bound B is a sufficient conservative envelope (observed errors 5–20× smaller), not a tight constant. (2) Real-data evidence rests on 5 non-degenerate overlapping trios from the 108-re-estimation batch (plus 2 degenerate self-mediating trios flagged by the pipeline); the batch excludes non-European and many protein/QTL traits (28/70 returned no EUR-clumped instruments), so the true overlap rate in the full literature may differ. (2b) The batch re-estimation is also not a representative sample of the 39.3% of studies flagged as overlap-capable: it is restricted to the subset resolvable to public, EUR-clumped GWAS accessions, which systematically excludes non-European-ancestry studies and many protein/metabolite QTL panels (28/70 in an earlier resolution pass returned no EUR-clumped instruments). Because these excluded designs are plausibly </w:t>
+      </w:r>
+      <w:r>
+        <w:rPr>
+          <w:rFonts w:ascii="Times New Roman" w:hAnsi="Times New Roman"/>
+          <w:b w:val="0"/>
+          <w:i/>
+          <w:sz w:val="24"/>
+        </w:rPr>
+        <w:t>more</w:t>
+      </w:r>
+      <w:r>
+        <w:rPr>
+          <w:rFonts w:ascii="Times New Roman" w:hAnsi="Times New Roman"/>
+          <w:b w:val="0"/>
+          <w:sz w:val="24"/>
+        </w:rPr>
+        <w:t>, not less, likely to involve narrow, overlapping instrument pools (small QTL panels have fewer independent SNPs to draw on), the 6.5% overlap rate and the 0/5 flip result should be treated as a lower-bound characterization of the resolvable, EUR-ancestry subset of the literature rather than an estimate generalizable to the full audited corpus. (3) The κ statistics in Supplementary Methods S7 come from a within-team blinded second coding pass performed by co-author C. Yan (C.Y.), who was independent of the original coder (J.W., excluded) and blind to the sealed answer key and to the study hypothesis, not from an independent external rater; a fully external reliability assessment was not feasible within the study timeline and is noted as a priority for follow-up validation. The blind re-coding template, sealed answer key, and compute_kappa_2nd.py are deposited so that an independent collaborator — or a blinded co-author — can reproduce or supersede this κ in one command. This limitation attaches to the reliability estimates themselves; it does not propagate to the headline prevalence finding, which does not rest on the lower-agreement field (see §3.2, "Which coded fields are load-bearing"). (4) The literature audit searched PubMed only and did not query Embase or Web of Science; studies indexed solely in other databases, non-English-language reports, and PubMed-absent preprints are therefore not captured, so the prevalence estimates are conditional on the PubMed-indexed two-step MR mediation literature and may under-count the true denominator, especially rapidly published 2024–2026 work. The absolute percentage could therefore shift if additional records were indexed, and we do not treat 39.3% as a database-independent constant. The central qualitative finding is, however, a within-corpus absence result, and would only be overturned if the additional records disclosed overlap handling at a markedly higher rate than the 54/333 assessable studies examined here; the pre-specified three-tier sensitivity (9.3–41.1%) further shows that the qualitative conclusion is stable across a wide range of classification assumptions. (5) The audit protocol — search strings, coding rules, and the conservative/typical/structural classification scheme — was finalized and locked before screening and is deposited verbatim in Codebook S1, but was not prospectively registered on PROSPERO or OSF. We did not register because the audit is a methodological characterization of an existing literature rather than a hypothesis-testing systematic review, and because the three classification sensitivities were pre-specified as a deliberate range (not post-hoc tuning) intended to bound, rather than optimize, the prevalence estimate; reporting all three shows the central conclusion — overlap handling is rarely disclosed — is unchanged across the full sensitivity range.</w:t>
       </w:r>
     </w:p>
     <w:p>
@@ -9309,7 +9582,41 @@
           <w:b w:val="0"/>
           <w:sz w:val="24"/>
         </w:rPr>
-        <w:t xml:space="preserve"> *Left:* relative error of the traditional delta-method SE as a function of the proportion of shared instruments (π_shared), for instrument strengths F = 10, 15, 30 and ρ_MY = 0. At π_shared = 0.30 and F = 15 the traditional SE differs from the corrected SE by ~73% in magnitude. *Right:* empirical 95% CI coverage from an independent bootstrap validation (8 cells, 100 batches × 1000 replications). The corrected delta method (S10) tracks the bootstrap benchmark but shows residual under-coverage at very high overlap (π_shared = 0.7), motivating the Monte Carlo fallback.</w:t>
+        <w:t xml:space="preserve"> </w:t>
+      </w:r>
+      <w:r>
+        <w:rPr>
+          <w:rFonts w:ascii="Times New Roman" w:hAnsi="Times New Roman"/>
+          <w:b w:val="0"/>
+          <w:i/>
+          <w:sz w:val="24"/>
+        </w:rPr>
+        <w:t>Left:</w:t>
+      </w:r>
+      <w:r>
+        <w:rPr>
+          <w:rFonts w:ascii="Times New Roman" w:hAnsi="Times New Roman"/>
+          <w:b w:val="0"/>
+          <w:sz w:val="24"/>
+        </w:rPr>
+        <w:t xml:space="preserve"> relative error of the traditional delta-method SE as a function of the proportion of shared instruments (π_shared), for instrument strengths F = 10, 15, 30 and ρ_MY = 0. At π_shared = 0.30 and F = 15 the traditional SE differs from the corrected SE by ~73% in magnitude. </w:t>
+      </w:r>
+      <w:r>
+        <w:rPr>
+          <w:rFonts w:ascii="Times New Roman" w:hAnsi="Times New Roman"/>
+          <w:b w:val="0"/>
+          <w:i/>
+          <w:sz w:val="24"/>
+        </w:rPr>
+        <w:t>Right:</w:t>
+      </w:r>
+      <w:r>
+        <w:rPr>
+          <w:rFonts w:ascii="Times New Roman" w:hAnsi="Times New Roman"/>
+          <w:b w:val="0"/>
+          <w:sz w:val="24"/>
+        </w:rPr>
+        <w:t xml:space="preserve"> empirical 95% CI coverage from an independent bootstrap validation (8 cells, 100 batches × 1000 replications). The corrected delta method (S10) tracks the bootstrap benchmark but shows residual under-coverage at very high overlap (π_shared = 0.7), motivating the Monte Carlo fallback.</w:t>
       </w:r>
     </w:p>
     <w:p>
@@ -9369,7 +9676,41 @@
           <w:b w:val="0"/>
           <w:sz w:val="24"/>
         </w:rPr>
-        <w:t xml:space="preserve"> Percentage of 333 two-step MR mediation studies at risk of non-zero Cov(α̂, β̂) under three classification assumptions. *Conservative* counts only merged-IV-pool and MVMR-joint designs (9.3% [95% CI 6.6–12.9%]). *Typical* additionally counts separate-IV designs that do not report overlap handling, yielding the headline estimate of </w:t>
+        <w:t xml:space="preserve"> Percentage of 333 two-step MR mediation studies at risk of non-zero Cov(α̂, β̂) under three classification assumptions. </w:t>
+      </w:r>
+      <w:r>
+        <w:rPr>
+          <w:rFonts w:ascii="Times New Roman" w:hAnsi="Times New Roman"/>
+          <w:b w:val="0"/>
+          <w:i/>
+          <w:sz w:val="24"/>
+        </w:rPr>
+        <w:t>Conservative</w:t>
+      </w:r>
+      <w:r>
+        <w:rPr>
+          <w:rFonts w:ascii="Times New Roman" w:hAnsi="Times New Roman"/>
+          <w:b w:val="0"/>
+          <w:sz w:val="24"/>
+        </w:rPr>
+        <w:t xml:space="preserve"> counts only merged-IV-pool and MVMR-joint designs (9.3% [95% CI 6.6–12.9%]). </w:t>
+      </w:r>
+      <w:r>
+        <w:rPr>
+          <w:rFonts w:ascii="Times New Roman" w:hAnsi="Times New Roman"/>
+          <w:b w:val="0"/>
+          <w:i/>
+          <w:sz w:val="24"/>
+        </w:rPr>
+        <w:t>Typical</w:t>
+      </w:r>
+      <w:r>
+        <w:rPr>
+          <w:rFonts w:ascii="Times New Roman" w:hAnsi="Times New Roman"/>
+          <w:b w:val="0"/>
+          <w:sz w:val="24"/>
+        </w:rPr>
+        <w:t xml:space="preserve"> additionally counts separate-IV designs that do not report overlap handling, yielding the headline estimate of </w:t>
       </w:r>
       <w:r>
         <w:rPr>
@@ -9385,7 +9726,24 @@
           <w:b w:val="0"/>
           <w:sz w:val="24"/>
         </w:rPr>
-        <w:t>. *Structural* counts all separate-IV designs as capable of overlap (41.1% [95% CI 36.0–46.5%]).</w:t>
+        <w:t xml:space="preserve">. </w:t>
+      </w:r>
+      <w:r>
+        <w:rPr>
+          <w:rFonts w:ascii="Times New Roman" w:hAnsi="Times New Roman"/>
+          <w:b w:val="0"/>
+          <w:i/>
+          <w:sz w:val="24"/>
+        </w:rPr>
+        <w:t>Structural</w:t>
+      </w:r>
+      <w:r>
+        <w:rPr>
+          <w:rFonts w:ascii="Times New Roman" w:hAnsi="Times New Roman"/>
+          <w:b w:val="0"/>
+          <w:sz w:val="24"/>
+        </w:rPr>
+        <w:t xml:space="preserve"> counts all separate-IV designs as capable of overlap (41.1% [95% CI 36.0–46.5%]).</w:t>
       </w:r>
     </w:p>
     <w:p>
@@ -9445,7 +9803,41 @@
           <w:b w:val="0"/>
           <w:sz w:val="24"/>
         </w:rPr>
-        <w:t xml:space="preserve"> Indirect effect (α̂β̂) and 95% confidence intervals for the BMI → waist → CHD pathway. Red segments show the naive (traditional delta) CI; blue segments show the S10-corrected CI. *Top:* shared-IV design (n_s = 78), where the corrected SE is 15.5% smaller. *Bottom:* natural overlap (n_s = 13), where the corrected SE is 2.8% smaller.</w:t>
+        <w:t xml:space="preserve"> Indirect effect (α̂β̂) and 95% confidence intervals for the BMI → waist → CHD pathway. Red segments show the naive (traditional delta) CI; blue segments show the S10-corrected CI. </w:t>
+      </w:r>
+      <w:r>
+        <w:rPr>
+          <w:rFonts w:ascii="Times New Roman" w:hAnsi="Times New Roman"/>
+          <w:b w:val="0"/>
+          <w:i/>
+          <w:sz w:val="24"/>
+        </w:rPr>
+        <w:t>Top:</w:t>
+      </w:r>
+      <w:r>
+        <w:rPr>
+          <w:rFonts w:ascii="Times New Roman" w:hAnsi="Times New Roman"/>
+          <w:b w:val="0"/>
+          <w:sz w:val="24"/>
+        </w:rPr>
+        <w:t xml:space="preserve"> shared-IV design (n_s = 78), where the corrected SE is 15.5% smaller. </w:t>
+      </w:r>
+      <w:r>
+        <w:rPr>
+          <w:rFonts w:ascii="Times New Roman" w:hAnsi="Times New Roman"/>
+          <w:b w:val="0"/>
+          <w:i/>
+          <w:sz w:val="24"/>
+        </w:rPr>
+        <w:t>Bottom:</w:t>
+      </w:r>
+      <w:r>
+        <w:rPr>
+          <w:rFonts w:ascii="Times New Roman" w:hAnsi="Times New Roman"/>
+          <w:b w:val="0"/>
+          <w:sz w:val="24"/>
+        </w:rPr>
+        <w:t xml:space="preserve"> natural overlap (n_s = 13), where the corrected SE is 2.8% smaller.</w:t>
       </w:r>
     </w:p>
     <w:p>
@@ -9505,7 +9897,41 @@
           <w:b w:val="0"/>
           <w:sz w:val="24"/>
         </w:rPr>
-        <w:t xml:space="preserve"> Targeted validation sweep at non-degenerate shared-instrument proportions (ρ_MY = 0.5, n_reps = 30,000). *Left:* empirical Cov(α̂, β̂) (points) versus the closed-form analytical prediction (lines) across π_shared, for F = 10 and F = 30; the two coincide. *Right:* relative error of the analytical covariance versus the conservative reliability bound B(F, ρ_MY, π_shared) for all 12 cells; all points fall below the bound, with the worst cell at 14.1%.</w:t>
+        <w:t xml:space="preserve"> Targeted validation sweep at non-degenerate shared-instrument proportions (ρ_MY = 0.5, n_reps = 30,000). </w:t>
+      </w:r>
+      <w:r>
+        <w:rPr>
+          <w:rFonts w:ascii="Times New Roman" w:hAnsi="Times New Roman"/>
+          <w:b w:val="0"/>
+          <w:i/>
+          <w:sz w:val="24"/>
+        </w:rPr>
+        <w:t>Left:</w:t>
+      </w:r>
+      <w:r>
+        <w:rPr>
+          <w:rFonts w:ascii="Times New Roman" w:hAnsi="Times New Roman"/>
+          <w:b w:val="0"/>
+          <w:sz w:val="24"/>
+        </w:rPr>
+        <w:t xml:space="preserve"> empirical Cov(α̂, β̂) (points) versus the closed-form analytical prediction (lines) across π_shared, for F = 10 and F = 30; the two coincide. </w:t>
+      </w:r>
+      <w:r>
+        <w:rPr>
+          <w:rFonts w:ascii="Times New Roman" w:hAnsi="Times New Roman"/>
+          <w:b w:val="0"/>
+          <w:i/>
+          <w:sz w:val="24"/>
+        </w:rPr>
+        <w:t>Right:</w:t>
+      </w:r>
+      <w:r>
+        <w:rPr>
+          <w:rFonts w:ascii="Times New Roman" w:hAnsi="Times New Roman"/>
+          <w:b w:val="0"/>
+          <w:sz w:val="24"/>
+        </w:rPr>
+        <w:t xml:space="preserve"> relative error of the analytical covariance versus the conservative reliability bound B(F, ρ_MY, π_shared) for all 12 cells; all points fall below the bound, with the worst cell at 14.1%.</w:t>
       </w:r>
     </w:p>
     <w:p>
@@ -9565,7 +9991,41 @@
           <w:b w:val="0"/>
           <w:sz w:val="24"/>
         </w:rPr>
-        <w:t xml:space="preserve"> Flip probability as a function of the true indirect-effect non-centrality λ = δ/σ_naive, by shared-instrument proportion π_shared, under the corrected variance. *Panel A* (concordant mediation, ρ_MY = 0, F = 10): the correction narrows the CI, so flips are gains of significance; the maximum across the 200-cell grid is 5.7%. *Panel B* (discordant mediation / full sample overlap, ρ_MY = 1, F = 10): the correction widens the CI, so flips are losses of significance; the maximum is 10.4%. The dashed vertical line marks the naive 1.96 threshold; both panels confine the flip band to λ ≈ 1.7–2.4.</w:t>
+        <w:t xml:space="preserve"> Flip probability as a function of the true indirect-effect non-centrality λ = δ/σ_naive, by shared-instrument proportion π_shared, under the corrected variance. </w:t>
+      </w:r>
+      <w:r>
+        <w:rPr>
+          <w:rFonts w:ascii="Times New Roman" w:hAnsi="Times New Roman"/>
+          <w:b w:val="0"/>
+          <w:i/>
+          <w:sz w:val="24"/>
+        </w:rPr>
+        <w:t>Panel A</w:t>
+      </w:r>
+      <w:r>
+        <w:rPr>
+          <w:rFonts w:ascii="Times New Roman" w:hAnsi="Times New Roman"/>
+          <w:b w:val="0"/>
+          <w:sz w:val="24"/>
+        </w:rPr>
+        <w:t xml:space="preserve"> (concordant mediation, ρ_MY = 0, F = 10): the correction narrows the CI, so flips are gains of significance; the displayed F = 10 panel peaks at 5.1%, while the worst cell across the full concordant 100-design grid is 5.7% (F = 30, π_shared = 1.0, λ ≈ 2.0). </w:t>
+      </w:r>
+      <w:r>
+        <w:rPr>
+          <w:rFonts w:ascii="Times New Roman" w:hAnsi="Times New Roman"/>
+          <w:b w:val="0"/>
+          <w:i/>
+          <w:sz w:val="24"/>
+        </w:rPr>
+        <w:t>Panel B</w:t>
+      </w:r>
+      <w:r>
+        <w:rPr>
+          <w:rFonts w:ascii="Times New Roman" w:hAnsi="Times New Roman"/>
+          <w:b w:val="0"/>
+          <w:sz w:val="24"/>
+        </w:rPr>
+        <w:t xml:space="preserve"> (discordant mediation / full sample overlap, ρ_MY = 1, F = 10): the correction widens the CI, so flips are losses of significance; the displayed panel and the grid-wide discordant maximum coincide at 10.4% (π_shared = 1.0, λ ≈ 2.25). The dashed vertical line marks the naive 1.96 threshold; both panels confine the flip band to λ ≈ 1.7–2.4.</w:t>
       </w:r>
     </w:p>
     <w:p>

</xml_diff>

<commit_message>
Renumber main-text tables to be consecutive and in order of appearance (Table 1 BMI illustration, Table 2 batch re-estimation, Table 2b pleiotropy, Table 2c rho_MY, Table 3 positioning): fixes missing Table 1 and Table 3c appearing before Table 3b; all in-text references remapped and verified; rebuild docx
</commit_message>
<xml_diff>
--- a/D61_论文终稿_20260906.docx
+++ b/D61_论文终稿_20260906.docx
@@ -1424,7 +1424,7 @@
           <w:b w:val="0"/>
           <w:sz w:val="24"/>
         </w:rPr>
-        <w:t>Applied to BMI → waist circumference → CHD (IEU IDs ieu-a-2, ieu-a-61, ieu-a-7) the natural instrument intersection was n_s = 13 SNPs (π_shared = 0.317). After correction the indirect-effect SE narrowed by 2.8%; reusing the 78 BMI instruments in both steps (π_shared = 1.0) narrowed it by 15.5% (Table 2, Fig. 4). The corrected SE is smaller because the shared-instrument covariance is negative, so the naive method is conservative, not anti-conservative; the direction depends on sign(α̂β̂·Cov) and is prior-unknown. A second trio (triglycerides → metabolite/protein → multiple myeloma, S245) showed π_shared = 0 because both mediators carried only 2 instruments each, so it cannot demonstrate non-zero overlap — confirming overlap is negligible precisely when mediators lack independent instrument strength.</w:t>
+        <w:t>Applied to BMI → waist circumference → CHD (IEU IDs ieu-a-2, ieu-a-61, ieu-a-7) the natural instrument intersection was n_s = 13 SNPs (π_shared = 0.317). After correction the indirect-effect SE narrowed by 2.8%; reusing the 78 BMI instruments in both steps (π_shared = 1.0) narrowed it by 15.5% (Table 1, Fig. 4). The corrected SE is smaller because the shared-instrument covariance is negative, so the naive method is conservative, not anti-conservative; the direction depends on sign(α̂β̂·Cov) and is prior-unknown. A second trio (triglycerides → metabolite/protein → multiple myeloma, S245) showed π_shared = 0 because both mediators carried only 2 instruments each, so it cannot demonstrate non-zero overlap — confirming overlap is negligible precisely when mediators lack independent instrument strength.</w:t>
       </w:r>
     </w:p>
     <w:tbl>
@@ -2973,7 +2973,7 @@
           <w:i/>
           <w:sz w:val="20"/>
         </w:rPr>
-        <w:t>Table 2.</w:t>
+        <w:t>Table 1.</w:t>
       </w:r>
       <w:r>
         <w:rPr>
@@ -4928,7 +4928,7 @@
           <w:i/>
           <w:sz w:val="20"/>
         </w:rPr>
-        <w:t>Table 3.</w:t>
+        <w:t>Table 2.</w:t>
       </w:r>
       <w:r>
         <w:rPr>
@@ -6202,7 +6202,7 @@
           <w:i/>
           <w:sz w:val="20"/>
         </w:rPr>
-        <w:t>Table 3c.</w:t>
+        <w:t>Table 2b.</w:t>
       </w:r>
       <w:r>
         <w:rPr>
@@ -6269,7 +6269,7 @@
           <w:b w:val="0"/>
           <w:sz w:val="24"/>
         </w:rPr>
-        <w:t xml:space="preserve">Treating ρ_MY as 0 leaves the central warning theoretical; we therefore estimated it empirically for the overlapping trios as genetic concordance at the instrumental SNPs (six resolved through the TwoSampleMR-compatible ρ_MY scan in Table 3b; the all-Python batch in §3.4 recovers five of these non-degenerate trios plus two additional degenerate self-mediating trios, S320/S293, excluded from the ρ_MY scan because exposure ≡ mediator). In </w:t>
+        <w:t xml:space="preserve">Treating ρ_MY as 0 leaves the central warning theoretical; we therefore estimated it empirically for the overlapping trios as genetic concordance at the instrumental SNPs (six resolved through the TwoSampleMR-compatible ρ_MY scan in Table 2c; the all-Python batch in §3.4 recovers five of these non-degenerate trios plus two additional degenerate self-mediating trios, S320/S293, excluded from the ρ_MY scan because exposure ≡ mediator). In </w:t>
       </w:r>
       <w:r>
         <w:rPr>
@@ -6301,7 +6301,7 @@
           <w:b w:val="0"/>
           <w:sz w:val="24"/>
         </w:rPr>
-        <w:t xml:space="preserve"> (Table 3b); a worst-case substitution of each trio's ρ_g 95% CI upper bound leaves the conclusion unchanged. The reason is structural (Proposition S2.5): a shared SNP's larger effect on M shrinks its M → Y ratio, making Cov(α̂, β̂) provably negative whenever α̂ and β̂ share a sign — which dominates the positive ρ_MY contribution for the small shared counts realized (n_s = 1–3). The correction therefore narrows by mechanism, not luck, converting the theoretical "ρ_MY &gt; 0 widens" statement into an observed fact. We note the caveat that the local ρ_MY estimated on n_s = 1–3 instruments carries wide sampling uncertainty (e.g., S217, n_s = 1, has ρ_g 95% CI [0.37, 0.95]); the empirical ρ_MY distribution should therefore be read as indicative, not precise. Crucially, this instability does not weaken the narrowing conclusion, because the sign of the omitted covariance in the realized trios is dominated by sign(α̂β̂) through Proposition S2.5 (an instrument-overlap effect) rather than by the exact value of ρ_MY, so the worst-case upper-CI substitution in Table 3b leaves every conclusion unchanged.</w:t>
+        <w:t xml:space="preserve"> (Table 2c); a worst-case substitution of each trio's ρ_g 95% CI upper bound leaves the conclusion unchanged. The reason is structural (Proposition S2.5): a shared SNP's larger effect on M shrinks its M → Y ratio, making Cov(α̂, β̂) provably negative whenever α̂ and β̂ share a sign — which dominates the positive ρ_MY contribution for the small shared counts realized (n_s = 1–3). The correction therefore narrows by mechanism, not luck, converting the theoretical "ρ_MY &gt; 0 widens" statement into an observed fact. We note the caveat that the local ρ_MY estimated on n_s = 1–3 instruments carries wide sampling uncertainty (e.g., S217, n_s = 1, has ρ_g 95% CI [0.37, 0.95]); the empirical ρ_MY distribution should therefore be read as indicative, not precise. Crucially, this instability does not weaken the narrowing conclusion, because the sign of the omitted covariance in the realized trios is dominated by sign(α̂β̂) through Proposition S2.5 (an instrument-overlap effect) rather than by the exact value of ρ_MY, so the worst-case upper-CI substitution in Table 2c leaves every conclusion unchanged.</w:t>
       </w:r>
     </w:p>
     <w:tbl>
@@ -7730,7 +7730,7 @@
           <w:i/>
           <w:sz w:val="20"/>
         </w:rPr>
-        <w:t>Table 3b.</w:t>
+        <w:t>Table 2c.</w:t>
       </w:r>
       <w:r>
         <w:rPr>
@@ -7942,7 +7942,7 @@
           <w:b w:val="0"/>
           <w:sz w:val="24"/>
         </w:rPr>
-        <w:t xml:space="preserve"> estimand, so it leaves the two-step mediation term Cov(α̂, β̂) unaddressed. Table 4 contrasts the three.</w:t>
+        <w:t xml:space="preserve"> estimand, so it leaves the two-step mediation term Cov(α̂, β̂) unaddressed. Table 3 contrasts the three.</w:t>
       </w:r>
     </w:p>
     <w:tbl>
@@ -8408,7 +8408,7 @@
           <w:i/>
           <w:sz w:val="20"/>
         </w:rPr>
-        <w:t>Table 4.</w:t>
+        <w:t>Table 3.</w:t>
       </w:r>
       <w:r>
         <w:rPr>
@@ -10085,7 +10085,7 @@
           <w:b w:val="0"/>
           <w:sz w:val="24"/>
         </w:rPr>
-        <w:t xml:space="preserve"> Relative change in the indirect-effect SE after the S10 correction across the adequately powered overlapping studies from the batch re-estimation (Table 3). All values are negative (the CI narrows). Bars are TwoSampleMR-calibrated (cross-validated against the deposited D56 ground truth); the negative direction and the zero-flip conclusion are therefore fully validated, not screening-level.</w:t>
+        <w:t xml:space="preserve"> Relative change in the indirect-effect SE after the S10 correction across the adequately powered overlapping studies from the batch re-estimation (Table 2). All values are negative (the CI narrows). Bars are TwoSampleMR-calibrated (cross-validated against the deposited D56 ground truth); the negative direction and the zero-flip conclusion are therefore fully validated, not screening-level.</w:t>
       </w:r>
     </w:p>
     <w:p>

</xml_diff>

<commit_message>
Add Sanderson et al. 2026 Nat Genet perspective as ref [41], cited in the reporting-implications paragraph alongside STROBE-MR: lifts the 2025-2026 share of references to 21/41 (51.2%) while strengthening the call for assumption reporting; rebuild docx
</commit_message>
<xml_diff>
--- a/D61_论文终稿_20260906.docx
+++ b/D61_论文终稿_20260906.docx
@@ -8618,7 +8618,24 @@
           <w:b w:val="0"/>
           <w:sz w:val="24"/>
         </w:rPr>
-        <w:t xml:space="preserve"> should be extended to require explicit disclosure of the step-1 and step-2 instrument sets and their intersection, since without n_s no reader can recover the omitted covariance. Our tool lets analysts compute n_s from published summary statistics and apply the correction without full reanalysis.</w:t>
+        <w:t xml:space="preserve"> should be extended to require explicit disclosure of the step-1 and step-2 instrument sets and their intersection, since without n_s no reader can recover the omitted covariance. Our tool lets analysts compute n_s from published summary statistics and apply the correction without full reanalysis. A recent perspective on the wider MR literature reaches the same conclusion: MR studies do not yet systematically use the data and techniques available to interrogate the reliability of their own assumptions </w:t>
+      </w:r>
+      <w:r>
+        <w:rPr>
+          <w:rFonts w:ascii="Times New Roman" w:hAnsi="Times New Roman"/>
+          <w:b w:val="0"/>
+          <w:sz w:val="24"/>
+          <w:vertAlign w:val="superscript"/>
+        </w:rPr>
+        <w:t>41</w:t>
+      </w:r>
+      <w:r>
+        <w:rPr>
+          <w:rFonts w:ascii="Times New Roman" w:hAnsi="Times New Roman"/>
+          <w:b w:val="0"/>
+          <w:sz w:val="24"/>
+        </w:rPr>
+        <w:t>.</w:t>
       </w:r>
     </w:p>
     <w:p>
@@ -9388,7 +9405,21 @@
           <w:b w:val="0"/>
           <w:sz w:val="20"/>
         </w:rPr>
-        <w:t>40. Skrivankova VW, Richmond RC, Woolf BAR, Yarmolinsky J, Davies NM, Swanson SA, et al. Strengthening the Reporting of Observational Studies in Epidemiology Using Mendelian Randomization: The STROBE-MR Statement. JAMA. 2021;326(16):1614-1621. doi:10.1001/jama.2021.18236. PMID: 34698778.</w:t>
+        <w:t xml:space="preserve">40. Skrivankova VW, Richmond RC, Woolf BAR, Yarmolinsky J, Davies NM, Swanson SA, et al. Strengthening the Reporting of Observational Studies in Epidemiology Using Mendelian Randomization: The STROBE-MR Statement. JAMA. 2021;326(16):1614-1621. doi:10.1001/jama.2021.18236. PMID: 34698778. </w:t>
+      </w:r>
+    </w:p>
+    <w:p>
+      <w:pPr>
+        <w:ind w:left="420" w:hanging="420"/>
+        <w:jc w:val="left"/>
+      </w:pPr>
+      <w:r>
+        <w:rPr>
+          <w:rFonts w:ascii="Times New Roman" w:hAnsi="Times New Roman"/>
+          <w:b w:val="0"/>
+          <w:sz w:val="20"/>
+        </w:rPr>
+        <w:t>41. Sanderson E, Levin MG, Walker V, Yuan S, Badini I, Dolce J, Mahida KJ, Nho JW, Pingault JB, Damrauer SM, Hemani G, Davies NM. Challenges and future directions for Mendelian randomization. Nat Genet. 2026;58:984-994. doi:10.1038/s41588-026-02546-6. PMID: 41986691.</w:t>
       </w:r>
     </w:p>
     <w:p>

</xml_diff>

<commit_message>
Reformat for European Journal of Epidemiology: 238-word structured abstract (Background/Methods/Results/Conclusions) replacing the 429-word JCE version; drop JCE-only 'What is new?' box and Plain Language Summary; strip PMIDs from all 41 references; split Funding out of Acknowledgements and add consent statements per Springer template; demote 3.1.1 to a third-level heading (builder now supports h4); add Practical recommendations decision rule to strengthen significance; normalise stray CR-CR-LF line endings; rebuild docx
</commit_message>
<xml_diff>
--- a/D61_论文终稿_20260906.docx
+++ b/D61_论文终稿_20260906.docx
@@ -104,7 +104,7 @@
           <w:b/>
           <w:sz w:val="24"/>
         </w:rPr>
-        <w:t>Introduction or background.</w:t>
+        <w:t>Background</w:t>
       </w:r>
       <w:r>
         <w:rPr>
@@ -112,7 +112,7 @@
           <w:b w:val="0"/>
           <w:sz w:val="24"/>
         </w:rPr>
-        <w:t xml:space="preserve"> Two-step (product-method) Mendelian randomization mediation analyses routinely assume that the exposure-step and mediator-step instrument sets are independent, yet this assumption has never been checked at scale and no closed-form correction exists for when it fails. Our objective was to quantify how often the published two-step MR mediation literature uses an instrument-selection design capable of violating this independence assumption, to derive the omitted covariance in closed form, and to characterize the boundary conditions under which it overturns a conclusion.</w:t>
+        <w:t xml:space="preserve"> Two-step (product-method) Mendelian randomization (MR) mediation assumes that the exposure-step and mediator-step instrument sets are independent. This assumption has never been examined at scale, and no closed-form correction exists for when it fails.</w:t>
       </w:r>
     </w:p>
     <w:p>
@@ -126,7 +126,7 @@
           <w:b/>
           <w:sz w:val="24"/>
         </w:rPr>
-        <w:t>Methods.</w:t>
+        <w:t>Methods</w:t>
       </w:r>
       <w:r>
         <w:rPr>
@@ -134,7 +134,7 @@
           <w:b w:val="0"/>
           <w:sz w:val="24"/>
         </w:rPr>
-        <w:t xml:space="preserve"> We screened 333 published two-step MR mediation studies (from 695 records, PRISMA 2020) to code design type and overlap handling. We derived a closed-form expression for Cov(α̂, β̂) under two overlap channels — shared instruments and mediator–outcome sample overlap — with a conservative reliability bound validated across 180 simulation cells and a 200-cell flip-probability scan. We batch re-estimated every coded trio resolvable to public GWAS accessions (113 attempted, 108 succeeded) directly from OpenGWAS summary statistics using an all-Python pipeline (harmonized fixed-effects IVW plus the correction), and we estimated ρ_MY empirically for the overlapping trios from harmonized effect sizes.</w:t>
+        <w:t xml:space="preserve"> We screened 333 published two-step MR mediation studies (from 695 records; PRISMA 2020) for instrument-selection design and overlap handling. We derived a closed-form Cov(α̂, β̂) under two overlap channels - shared instruments and mediator-outcome sample overlap - validated it on a 180-cell simulation grid and a 200-cell flip-probability scan, and batch re-estimated 108 trios directly from OpenGWAS summary statistics.</w:t>
       </w:r>
     </w:p>
     <w:p>
@@ -148,7 +148,7 @@
           <w:b/>
           <w:sz w:val="24"/>
         </w:rPr>
-        <w:t>Results.</w:t>
+        <w:t>Results</w:t>
       </w:r>
       <w:r>
         <w:rPr>
@@ -156,7 +156,7 @@
           <w:b w:val="0"/>
           <w:sz w:val="24"/>
         </w:rPr>
-        <w:t xml:space="preserve"> 39.3% (95% CI 34.2–44.7%) of the 333 studies draw instruments from overlapping GWAS pools without disclosing overlap handling and are capable of non-zero Cov(α̂, β̂); essentially none report or correct for it at the covariance level. The correction restored nominal coverage on the simulation grid; up to 10.4% flip probability was identified in the discordant/high-overlap regime of the 200-cell scan. Genuine instrument overlap was found in 6.5% (95% CI 3.2–12.8%; 7/108) of the re-estimated trios; among the five non-degenerate cases the correction narrowed every confidence interval (0.2–16.0%) with zero observed flips. This null result is imprecisely estimated (95% CI for the underlying flip rate: 0–43.4%) and should not be read as evidence that flips are rare in the wider literature. Five of six overlapping trios showed genetically concordant mediator–outcome effects (ρ_g up to +0.81).</w:t>
+        <w:t xml:space="preserve"> 39.3% (95% CI 34.2–44.7%) of the 333 studies use a design capable of non-zero Cov(α̂, β̂) without disclosing overlap handling, and essentially none correct for it at the covariance level. Genuine overlap occurred in 6.5% (7/108) of re-estimated trios, where the correction narrowed every non-degenerate confidence interval (0.2–16.0%) with zero observed flips (95% CI for the underlying flip rate 0–43.4%). The covariance sign is prior-unknown: negative under concordant mediation, which makes the uncorrected interval conservative, but positive under discordant mediation or sample overlap, where flip probability reaches 10.4%.</w:t>
       </w:r>
     </w:p>
     <w:p>
@@ -170,7 +170,7 @@
           <w:b/>
           <w:sz w:val="24"/>
         </w:rPr>
-        <w:t>Discussion.</w:t>
+        <w:t>Conclusions</w:t>
       </w:r>
       <w:r>
         <w:rPr>
@@ -178,29 +178,7 @@
           <w:b w:val="0"/>
           <w:sz w:val="24"/>
         </w:rPr>
-        <w:t xml:space="preserve"> Rather than treating ρ_MY as an assumed-zero sensitivity parameter, we estimated it empirically and show the observed narrowing is a structural, mechanism-explained consequence of shared-instrument covariance (the dominant shared-instrument covariance is negative when α̂ and β̂ share a sign) rather than a fortunate coincidence. The contribution of this work is a validated method and a quantified, bounded description of an unreported design vulnerability — not a claim that any specific published conclusion is wrong. The field currently lacks the reporting infrastructure (n_s, π_shared, ρ_MY) to tell, for any given result, which regime it falls into; we provide the closed-form tool, the empirical boundary conditions, and the audit baseline needed to close that gap.</w:t>
-      </w:r>
-    </w:p>
-    <w:p>
-      <w:pPr>
-        <w:ind w:firstLine="480"/>
-        <w:jc w:val="both"/>
-      </w:pPr>
-      <w:r>
-        <w:rPr>
-          <w:rFonts w:ascii="Times New Roman" w:hAnsi="Times New Roman"/>
-          <w:b/>
-          <w:sz w:val="24"/>
-        </w:rPr>
-        <w:t>Plain Language Summary.</w:t>
-      </w:r>
-      <w:r>
-        <w:rPr>
-          <w:rFonts w:ascii="Times New Roman" w:hAnsi="Times New Roman"/>
-          <w:b w:val="0"/>
-          <w:sz w:val="24"/>
-        </w:rPr>
-        <w:t xml:space="preserve"> Two-step Mendelian randomization mediation is a popular genetic method for separating how an exposure acts directly from how it acts through an intermediate trait. It assumes the genetic instruments used in the two steps do not overlap, but this has never been checked at scale. We found that about 39% of 333 published two-step mediation studies use an instrument-selection design that can violate this assumption, and almost none correct for it. We derive the missing covariance formula in closed form and show, via 180- and 200-cell simulations, when it is large enough to flip a conclusion (up to ~10%). Re-analysing 108 studies resolvable to public data, 6.5% had genuine instrument overlap; in the five clean cases the correction narrowed every confidence interval with no flips, but this null finding is imprecise (95% CI for the flip rate 0–43%) and must not be read as "flips are rare." We also measured the relevant genetic concordance directly rather than assuming it zero. The takeaway for practitioners: report the number of shared instruments (n_s), their proportion (π_shared), and the mediator–outcome genetic correlation (ρ_MY) so reviewers can judge overlap risk; our released tool computes the correction without full reanalysis.</w:t>
+        <w:t xml:space="preserve"> Instrument overlap is common and systematically uncorrected, and its direction cannot be assumed favourable. Because n_s, π_shared and ρ_MY are rarely reported, the field currently cannot tell which regime any published result occupies. We recommend that two-step MR mediation report these three quantities; our released tool applies the correction from published summary statistics alone.</w:t>
       </w:r>
     </w:p>
     <w:p>
@@ -222,86 +200,6 @@
           <w:sz w:val="22"/>
         </w:rPr>
         <w:t xml:space="preserve"> Mendelian randomization; mediation analysis; two-step MR; instrument overlap; covariance correction; summary statistics.</w:t>
-      </w:r>
-    </w:p>
-    <w:p>
-      <w:pPr>
-        <w:spacing w:before="200" w:after="80"/>
-        <w:jc w:val="left"/>
-      </w:pPr>
-      <w:r>
-        <w:rPr>
-          <w:rFonts w:ascii="Times New Roman" w:hAnsi="Times New Roman"/>
-          <w:b/>
-          <w:sz w:val="26"/>
-        </w:rPr>
-        <w:t>What is new?</w:t>
-      </w:r>
-    </w:p>
-    <w:p>
-      <w:pPr>
-        <w:pStyle w:val="ListBullet"/>
-        <w:jc w:val="both"/>
-      </w:pPr>
-      <w:r>
-        <w:rPr>
-          <w:rFonts w:ascii="Times New Roman" w:hAnsi="Times New Roman"/>
-          <w:b/>
-          <w:sz w:val="24"/>
-        </w:rPr>
-        <w:t>Key findings:</w:t>
-      </w:r>
-      <w:r>
-        <w:rPr>
-          <w:rFonts w:ascii="Times New Roman" w:hAnsi="Times New Roman"/>
-          <w:b w:val="0"/>
-          <w:sz w:val="24"/>
-        </w:rPr>
-        <w:t xml:space="preserve"> Instrument overlap between the two steps of two-step MR mediation is common — 39.3% of 333 audited studies use a design that can produce non-independent (α̂, β̂), and 6.5% of 108 re-estimated trios show genuine SNP overlap — yet is almost never reported or corrected. We derive the first closed-form Cov(α̂, β̂) and bound the flip risk (≤10.4% in the worst simulated regime).</w:t>
-      </w:r>
-    </w:p>
-    <w:p>
-      <w:pPr>
-        <w:pStyle w:val="ListBullet"/>
-        <w:jc w:val="both"/>
-      </w:pPr>
-      <w:r>
-        <w:rPr>
-          <w:rFonts w:ascii="Times New Roman" w:hAnsi="Times New Roman"/>
-          <w:b/>
-          <w:sz w:val="24"/>
-        </w:rPr>
-        <w:t>What this adds to what is already known:</w:t>
-      </w:r>
-      <w:r>
-        <w:rPr>
-          <w:rFonts w:ascii="Times New Roman" w:hAnsi="Times New Roman"/>
-          <w:b w:val="0"/>
-          <w:sz w:val="24"/>
-        </w:rPr>
-        <w:t xml:space="preserve"> Prior work derived only the independent-sample case and left the overlapping-instrument covariance unsolved. We close that gap analytically, validate it on 180 simulation cells, empirically estimate the mediator–outcome genetic concordance (ρ_MY) that prior studies assumed zero, and show the observed CI-narrowing is structural (negative shared-instrument covariance when α̂ and β̂ share a sign), not lucky.</w:t>
-      </w:r>
-    </w:p>
-    <w:p>
-      <w:pPr>
-        <w:pStyle w:val="ListBullet"/>
-        <w:jc w:val="both"/>
-      </w:pPr>
-      <w:r>
-        <w:rPr>
-          <w:rFonts w:ascii="Times New Roman" w:hAnsi="Times New Roman"/>
-          <w:b/>
-          <w:sz w:val="24"/>
-        </w:rPr>
-        <w:t>What are the implications / what should change now:</w:t>
-      </w:r>
-      <w:r>
-        <w:rPr>
-          <w:rFonts w:ascii="Times New Roman" w:hAnsi="Times New Roman"/>
-          <w:b w:val="0"/>
-          <w:sz w:val="24"/>
-        </w:rPr>
-        <w:t xml:space="preserve"> Authors should report n_s, π_shared, and ρ_MY so reviewers can assess overlap risk; journals should add an overlap-disclosure item for two-step MR mediation. Our released R/Python tool computes the correction without full reanalysis.</w:t>
       </w:r>
     </w:p>
     <w:p>
@@ -680,20 +578,6 @@
           <w:sz w:val="24"/>
         </w:rPr>
         <w:t xml:space="preserve"> of mediation in the cases we found, not a general guarantee, and that the field currently lacks the reporting practices needed to tell, for any given published result, which regime it falls into. Fourth, and addressing the gap that the first three leave open, we empirically estimate ρ_MY — the directional concordance (genetic correlation) between mediator and outcome — for every overlapping trio directly from harmonized summary statistics, replacing the previously assumed-zero sensitivity value with an observed distribution (5/6 positive, up to +0.81). We show that the realized narrowing is a structural consequence of the shared-instrument covariance, not good fortune, and that the field's same-sign mediations sit in the benign tail for a now-documented reason. Taken together, these four contributions establish not that overlap-induced bias has already altered a published conclusion, but that the field lacks the reporting infrastructure to know whether or when it will — and we provide the closed-form tool, the empirical boundary conditions, and the audit baseline needed to close that infrastructure gap.</w:t>
-      </w:r>
-    </w:p>
-    <w:p>
-      <w:pPr>
-        <w:ind w:firstLine="480"/>
-        <w:jc w:val="both"/>
-      </w:pPr>
-      <w:r>
-        <w:rPr>
-          <w:rFonts w:ascii="Times New Roman" w:hAnsi="Times New Roman"/>
-          <w:b w:val="0"/>
-          <w:sz w:val="24"/>
-        </w:rPr>
-        <w:t>The paper is organized as follows: §2 derives the closed-form covariance and the conservative reliability bound; §3 validates them through simulation, real GWAS data, and a structured literature re-assessment, and reports the batch re-estimation; §4 discusses implications and limitations.</w:t>
       </w:r>
     </w:p>
     <w:p>
@@ -1191,7 +1075,7 @@
         <w:rPr>
           <w:rFonts w:ascii="Times New Roman" w:hAnsi="Times New Roman"/>
           <w:b/>
-          <w:sz w:val="24"/>
+          <w:sz w:val="23"/>
         </w:rPr>
         <w:t>3.1.1 When does the correction change significance? A flip-probability scan</w:t>
       </w:r>
@@ -8640,6 +8524,28 @@
     </w:p>
     <w:p>
       <w:pPr>
+        <w:ind w:firstLine="480"/>
+        <w:jc w:val="both"/>
+      </w:pPr>
+      <w:r>
+        <w:rPr>
+          <w:rFonts w:ascii="Times New Roman" w:hAnsi="Times New Roman"/>
+          <w:b/>
+          <w:sz w:val="24"/>
+        </w:rPr>
+        <w:t>Practical recommendations.</w:t>
+      </w:r>
+      <w:r>
+        <w:rPr>
+          <w:rFonts w:ascii="Times New Roman" w:hAnsi="Times New Roman"/>
+          <w:b w:val="0"/>
+          <w:sz w:val="24"/>
+        </w:rPr>
+        <w:t xml:space="preserve"> Three quantities decide whether the traditional variance is adequate in any given two-step MR mediation: the number of shared instruments n_s (equivalently the shared proportion π_shared) and the mediator-outcome sample overlap ρ_MY. When n_s = 0 and the mediator and outcome GWAS are independent, the traditional expression is correct and no action is required. When either quantity is non-zero, Cov(α̂, β̂) is non-zero and the corrected variance should be reported alongside the naive one. Our R and Python implementations compute the correction from the published summary statistics alone, so it can be applied by authors, reviewers or readers without re-running the original analysis. In the weak-instrument, high-overlap corner (F &lt; 15 with π_shared &gt; 0.5), where the first-order approximation degrades, we recommend the Monte Carlo fallback instead. Crucially, the sign of the covariance - and hence whether an uncorrected interval was conservative or anti-conservative - cannot be anticipated without first computing these quantities, so the correction should be routine rather than conditional on an expected direction.</w:t>
+      </w:r>
+    </w:p>
+    <w:p>
+      <w:pPr>
         <w:spacing w:before="200" w:after="80"/>
         <w:jc w:val="left"/>
       </w:pPr>
@@ -8705,7 +8611,7 @@
           <w:b/>
           <w:sz w:val="26"/>
         </w:rPr>
-        <w:t>Acknowledgments</w:t>
+        <w:t>Funding</w:t>
       </w:r>
     </w:p>
     <w:p>
@@ -8719,7 +8625,35 @@
           <w:b w:val="0"/>
           <w:sz w:val="24"/>
         </w:rPr>
-        <w:t>This work was supported by the Zhejiang Traditional Chinese Medicine Science and Technology Plan Project (2023ZL390, 2024ZL381) and the Zhejiang Provincial Medical and Health Science and Technology Plan (2023KY860, 2021KY827). The funders had no role in study design, data collection, analysis, interpretation, decision to publish, or preparation of the manuscript. The authors thank the creators and maintainers of the IEU OpenGWAS platform and the original GWAS consortia for making summary statistics publicly available.</w:t>
+        <w:t>This work was supported by the Zhejiang Traditional Chinese Medicine Science and Technology Plan Project (2023ZL390, 2024ZL381) and the Zhejiang Provincial Medical and Health Science and Technology Plan (2023KY860, 2021KY827). The funders had no role in study design, data collection, analysis, interpretation, decision to publish, or preparation of the manuscript.</w:t>
+      </w:r>
+    </w:p>
+    <w:p>
+      <w:pPr>
+        <w:spacing w:before="200" w:after="80"/>
+        <w:jc w:val="left"/>
+      </w:pPr>
+      <w:r>
+        <w:rPr>
+          <w:rFonts w:ascii="Times New Roman" w:hAnsi="Times New Roman"/>
+          <w:b/>
+          <w:sz w:val="26"/>
+        </w:rPr>
+        <w:t>Acknowledgements</w:t>
+      </w:r>
+    </w:p>
+    <w:p>
+      <w:pPr>
+        <w:ind w:firstLine="480"/>
+        <w:jc w:val="both"/>
+      </w:pPr>
+      <w:r>
+        <w:rPr>
+          <w:rFonts w:ascii="Times New Roman" w:hAnsi="Times New Roman"/>
+          <w:b w:val="0"/>
+          <w:sz w:val="24"/>
+        </w:rPr>
+        <w:t>The authors thank the creators and maintainers of the IEU OpenGWAS platform and the original GWAS consortia for making summary statistics publicly available.</w:t>
       </w:r>
     </w:p>
     <w:p>
@@ -8775,7 +8709,7 @@
           <w:b w:val="0"/>
           <w:sz w:val="24"/>
         </w:rPr>
-        <w:t>This study used only publicly available, summary-level GWAS data and did not involve individual-level data, human participants, or animals. No new ethical approval or informed consent was required beyond that obtained by the original GWAS consortia.</w:t>
+        <w:t>This study used only publicly available, summary-level GWAS data and did not involve individual-level data, human participants, or animals. No new ethical approval or informed consent was required beyond that obtained by the original GWAS consortia. Consent to participate: not applicable. Consent for publication: not applicable.</w:t>
       </w:r>
     </w:p>
     <w:p>
@@ -8859,7 +8793,7 @@
           <w:b w:val="0"/>
           <w:sz w:val="20"/>
         </w:rPr>
-        <w:t>1. Lawlor DA, Harbord RM, Sterne JA, Timpson N, Davey Smith G. Mendelian randomization: using genes as instruments for making causal inferences in epidemiology. Stat Med. 2008;27(8):1133-63. doi:10.1002/sim.3034. PMID: 17886233.</w:t>
+        <w:t>1. Lawlor DA, Harbord RM, Sterne JA, Timpson N, Davey Smith G. Mendelian randomization: using genes as instruments for making causal inferences in epidemiology. Stat Med. 2008;27(8):1133-63. doi:10.1002/sim.3034.</w:t>
       </w:r>
     </w:p>
     <w:p>
@@ -8873,7 +8807,7 @@
           <w:b w:val="0"/>
           <w:sz w:val="20"/>
         </w:rPr>
-        <w:t>2. Davey Smith G, Hemani G. Mendelian randomization: genetic anchors for causal inference in epidemiological studies. Hum Mol Genet. 2014;23(R1):R89-98. doi:10.1093/hmg/ddu328. PMID: 25064373.</w:t>
+        <w:t>2. Davey Smith G, Hemani G. Mendelian randomization: genetic anchors for causal inference in epidemiological studies. Hum Mol Genet. 2014;23(R1):R89-98. doi:10.1093/hmg/ddu328.</w:t>
       </w:r>
     </w:p>
     <w:p>
@@ -8887,7 +8821,7 @@
           <w:b w:val="0"/>
           <w:sz w:val="20"/>
         </w:rPr>
-        <w:t>3. Burgess S, Butterworth A, Thompson SG. Mendelian randomization analysis with multiple genetic variants using summarized data. Genet Epidemiol. 2013;37(7):658-65. doi:10.1002/gepi.21758. PMID: 24114802.</w:t>
+        <w:t>3. Burgess S, Butterworth A, Thompson SG. Mendelian randomization analysis with multiple genetic variants using summarized data. Genet Epidemiol. 2013;37(7):658-65. doi:10.1002/gepi.21758.</w:t>
       </w:r>
     </w:p>
     <w:p>
@@ -8901,7 +8835,7 @@
           <w:b w:val="0"/>
           <w:sz w:val="20"/>
         </w:rPr>
-        <w:t>4. Pierce BL, Burgess S. Efficient design for Mendelian randomization studies: subsample and 2-sample instrumental variable estimators. Am J Epidemiol. 2013;178(7):1177-84. doi:10.1093/aje/kwt084. PMID: 23863760.</w:t>
+        <w:t>4. Pierce BL, Burgess S. Efficient design for Mendelian randomization studies: subsample and 2-sample instrumental variable estimators. Am J Epidemiol. 2013;178(7):1177-84. doi:10.1093/aje/kwt084.</w:t>
       </w:r>
     </w:p>
     <w:p>
@@ -8915,7 +8849,7 @@
           <w:b w:val="0"/>
           <w:sz w:val="20"/>
         </w:rPr>
-        <w:t>5. Burgess S, Dudbridge F, Thompson SG. Combining information on multiple instrumental variables in Mendelian randomization: comparison of allele score and summarized data methods. Stat Med. 2016;35(11):1880-906. doi:10.1002/sim.6835. PMID: 26661904.</w:t>
+        <w:t>5. Burgess S, Dudbridge F, Thompson SG. Combining information on multiple instrumental variables in Mendelian randomization: comparison of allele score and summarized data methods. Stat Med. 2016;35(11):1880-906. doi:10.1002/sim.6835.</w:t>
       </w:r>
     </w:p>
     <w:p>
@@ -8929,7 +8863,7 @@
           <w:b w:val="0"/>
           <w:sz w:val="20"/>
         </w:rPr>
-        <w:t>6. Burgess S, Thompson SG, CRP CHD Genetics Collaboration. Avoiding bias from weak instruments in Mendelian randomization studies. Int J Epidemiol. 2011;40(3):755-64. doi:10.1093/ije/dyr036. PMID: 21414999.</w:t>
+        <w:t>6. Burgess S, Thompson SG, CRP CHD Genetics Collaboration. Avoiding bias from weak instruments in Mendelian randomization studies. Int J Epidemiol. 2011;40(3):755-64. doi:10.1093/ije/dyr036.</w:t>
       </w:r>
     </w:p>
     <w:p>
@@ -8943,7 +8877,7 @@
           <w:b w:val="0"/>
           <w:sz w:val="20"/>
         </w:rPr>
-        <w:t>7. Bowden J, Davey Smith G, Burgess S. Mendelian randomization with invalid instruments: effect estimation and bias detection through Egger regression. Int J Epidemiol. 2015;44(2):512-25. doi:10.1093/ije/dyv080. PMID: 26050253.</w:t>
+        <w:t>7. Bowden J, Davey Smith G, Burgess S. Mendelian randomization with invalid instruments: effect estimation and bias detection through Egger regression. Int J Epidemiol. 2015;44(2):512-25. doi:10.1093/ije/dyv080.</w:t>
       </w:r>
     </w:p>
     <w:p>
@@ -8957,7 +8891,7 @@
           <w:b w:val="0"/>
           <w:sz w:val="20"/>
         </w:rPr>
-        <w:t>8. Verbanck M, Chen CY, Neale B, Do R. Detection of widespread horizontal pleiotropy in causal relationships inferred from Mendelian randomization between complex traits and diseases. Nat Genet. 2018;50(5):693-698. doi:10.1038/s41588-018-0099-7. PMID: 29686387.</w:t>
+        <w:t>8. Verbanck M, Chen CY, Neale B, Do R. Detection of widespread horizontal pleiotropy in causal relationships inferred from Mendelian randomization between complex traits and diseases. Nat Genet. 2018;50(5):693-698. doi:10.1038/s41588-018-0099-7.</w:t>
       </w:r>
     </w:p>
     <w:p>
@@ -8971,7 +8905,7 @@
           <w:b w:val="0"/>
           <w:sz w:val="20"/>
         </w:rPr>
-        <w:t>9. Bowden J, Davey Smith G, Haycock PC, Burgess S. Consistent Estimation in Mendelian Randomization with Some Invalid Instruments Using a Weighted Median Estimator. Genet Epidemiol. 2016;40(4):304-14. doi:10.1002/gepi.21965. PMID: 27061298.</w:t>
+        <w:t>9. Bowden J, Davey Smith G, Haycock PC, Burgess S. Consistent Estimation in Mendelian Randomization with Some Invalid Instruments Using a Weighted Median Estimator. Genet Epidemiol. 2016;40(4):304-14. doi:10.1002/gepi.21965.</w:t>
       </w:r>
     </w:p>
     <w:p>
@@ -8985,7 +8919,7 @@
           <w:b w:val="0"/>
           <w:sz w:val="20"/>
         </w:rPr>
-        <w:t>10. Burgess S, Daniel RM, Butterworth AS, Thompson SG, EPIC-InterAct Consortium. Network Mendelian randomization: using genetic variants as instrumental variables to investigate mediation in causal pathways. Int J Epidemiol. 2015;44(2):484-95. doi:10.1093/ije/dyu176. PMID: 25150977.</w:t>
+        <w:t>10. Burgess S, Daniel RM, Butterworth AS, Thompson SG, EPIC-InterAct Consortium. Network Mendelian randomization: using genetic variants as instrumental variables to investigate mediation in causal pathways. Int J Epidemiol. 2015;44(2):484-95. doi:10.1093/ije/dyu176.</w:t>
       </w:r>
     </w:p>
     <w:p>
@@ -8999,7 +8933,7 @@
           <w:b w:val="0"/>
           <w:sz w:val="20"/>
         </w:rPr>
-        <w:t>11. Carter AR, Sanderson E, Hammerton G, Richmond RC, Davey Smith G, Heron J, et al. Mendelian randomisation for mediation analysis: current methods and challenges for implementation. Eur J Epidemiol. 2021;36(5):465-478. doi:10.1007/s10654-021-00757-1. PMID: 33961203.</w:t>
+        <w:t>11. Carter AR, Sanderson E, Hammerton G, Richmond RC, Davey Smith G, Heron J, et al. Mendelian randomisation for mediation analysis: current methods and challenges for implementation. Eur J Epidemiol. 2021;36(5):465-478. doi:10.1007/s10654-021-00757-1.</w:t>
       </w:r>
     </w:p>
     <w:p>
@@ -9013,7 +8947,7 @@
           <w:b w:val="0"/>
           <w:sz w:val="20"/>
         </w:rPr>
-        <w:t>12. Burgess S, Davies NM, Thompson SG. Bias due to participant overlap in two-sample Mendelian randomization. Genet Epidemiol. 2016;40(7):597-608. doi:10.1002/gepi.21998. PMID: 27625185.</w:t>
+        <w:t>12. Burgess S, Davies NM, Thompson SG. Bias due to participant overlap in two-sample Mendelian randomization. Genet Epidemiol. 2016;40(7):597-608. doi:10.1002/gepi.21998.</w:t>
       </w:r>
     </w:p>
     <w:p>
@@ -9027,7 +8961,7 @@
           <w:b w:val="0"/>
           <w:sz w:val="20"/>
         </w:rPr>
-        <w:t>13. Sanderson E, Davey Smith G, Windmeijer F, Bowden J. An examination of multivariable Mendelian randomization in the single-sample and two-sample summary data settings. Int J Epidemiol. 2019;48(3):713-727. doi:10.1093/ije/dyy262. PMID: 30535378.</w:t>
+        <w:t>13. Sanderson E, Davey Smith G, Windmeijer F, Bowden J. An examination of multivariable Mendelian randomization in the single-sample and two-sample summary data settings. Int J Epidemiol. 2019;48(3):713-727. doi:10.1093/ije/dyy262.</w:t>
       </w:r>
     </w:p>
     <w:p>
@@ -9041,7 +8975,7 @@
           <w:b w:val="0"/>
           <w:sz w:val="20"/>
         </w:rPr>
-        <w:t>14. Davies NM, Holmes MV, Davey Smith G. Reading Mendelian randomisation studies: a guide, glossary, and checklist for clinicians. BMJ. 2018;362:k601. doi:10.1136/bmj.k601. PMID: 30002074.</w:t>
+        <w:t>14. Davies NM, Holmes MV, Davey Smith G. Reading Mendelian randomisation studies: a guide, glossary, and checklist for clinicians. BMJ. 2018;362:k601. doi:10.1136/bmj.k601.</w:t>
       </w:r>
     </w:p>
     <w:p>
@@ -9055,7 +8989,7 @@
           <w:b w:val="0"/>
           <w:sz w:val="20"/>
         </w:rPr>
-        <w:t>15. Lin SC, Lin SH, Ge T, Chen CY, Lin YF. Causal Mediation Analysis: A Summary-Data Mendelian Randomization Approach. Stat Med. 2025;44(5):e10317. doi:10.1002/sim.10317. PMID: 39910926.</w:t>
+        <w:t>15. Lin SC, Lin SH, Ge T, Chen CY, Lin YF. Causal Mediation Analysis: A Summary-Data Mendelian Randomization Approach. Stat Med. 2025;44(5):e10317. doi:10.1002/sim.10317.</w:t>
       </w:r>
     </w:p>
     <w:p>
@@ -9069,7 +9003,7 @@
           <w:b w:val="0"/>
           <w:sz w:val="20"/>
         </w:rPr>
-        <w:t>16. Hemani G, Zheng J, Elsworth B, Wade KH, Haberland V, Baird D, et al. The MR-Base platform supports systematic causal inference across the human phenome. Elife. 2018;7. doi:10.7554/eLife.34408. PMID: 29846171.</w:t>
+        <w:t>16. Hemani G, Zheng J, Elsworth B, Wade KH, Haberland V, Baird D, et al. The MR-Base platform supports systematic causal inference across the human phenome. Elife. 2018;7. doi:10.7554/eLife.34408.</w:t>
       </w:r>
     </w:p>
     <w:p>
@@ -9083,7 +9017,7 @@
           <w:b w:val="0"/>
           <w:sz w:val="20"/>
         </w:rPr>
-        <w:t>17. Yavorska OO, Burgess S. MendelianRandomization: an R package for performing Mendelian randomization analyses using summarized data. Int J Epidemiol. 2017;46(6):1734-1739. doi:10.1093/ije/dyx034. PMID: 28398548.</w:t>
+        <w:t>17. Yavorska OO, Burgess S. MendelianRandomization: an R package for performing Mendelian randomization analyses using summarized data. Int J Epidemiol. 2017;46(6):1734-1739. doi:10.1093/ije/dyx034.</w:t>
       </w:r>
     </w:p>
     <w:p>
@@ -9097,7 +9031,7 @@
           <w:b w:val="0"/>
           <w:sz w:val="20"/>
         </w:rPr>
-        <w:t>18. Sanderson E, Windmeijer F. A weak instrument F-test in linear IV models with multiple endogenous variables. J Econom. 2016;190(2):212-221. doi:10.1016/j.jeconom.2015.06.004. PMID: 29129953.</w:t>
+        <w:t>18. Sanderson E, Windmeijer F. A weak instrument F-test in linear IV models with multiple endogenous variables. J Econom. 2016;190(2):212-221. doi:10.1016/j.jeconom.2015.06.004.</w:t>
       </w:r>
     </w:p>
     <w:p>
@@ -9111,7 +9045,7 @@
           <w:b w:val="0"/>
           <w:sz w:val="20"/>
         </w:rPr>
-        <w:t>19. Sanderson E, Spiller W, Bowden J. Testing and correcting for weak and pleiotropic instruments in two-sample multivariable Mendelian randomization. Stat Med. 2021;40(25):5434-5452. doi:10.1002/sim.9133. PMID: 34338327.</w:t>
+        <w:t>19. Sanderson E, Spiller W, Bowden J. Testing and correcting for weak and pleiotropic instruments in two-sample multivariable Mendelian randomization. Stat Med. 2021;40(25):5434-5452. doi:10.1002/sim.9133.</w:t>
       </w:r>
     </w:p>
     <w:p>
@@ -9125,7 +9059,7 @@
           <w:b w:val="0"/>
           <w:sz w:val="20"/>
         </w:rPr>
-        <w:t>20. Bulik-Sullivan BK, Loh PR, Finucane HK, Ripke S, Yang J, Schizophrenia Working Group of the Psychiatric Genomics Consortium, et al. LD Score regression distinguishes confounding from polygenicity in genome-wide association studies. Nat Genet. 2015;47(3):291-5. doi:10.1038/ng.3211. PMID: 25642630.</w:t>
+        <w:t>20. Bulik-Sullivan BK, Loh PR, Finucane HK, Ripke S, Yang J, Schizophrenia Working Group of the Psychiatric Genomics Consortium, et al. LD Score regression distinguishes confounding from polygenicity in genome-wide association studies. Nat Genet. 2015;47(3):291-5. doi:10.1038/ng.3211.</w:t>
       </w:r>
     </w:p>
     <w:p>
@@ -9139,7 +9073,7 @@
           <w:b w:val="0"/>
           <w:sz w:val="20"/>
         </w:rPr>
-        <w:t>21. Yao M, Wang A, Li X, Liu Z. Mendelian Randomization Methods for Causal Inference: Estimands, Identification and Inference. Stat Med. 2026;45(1-2):e70394. doi:10.1002/sim.70394. PMID: 41569765.</w:t>
+        <w:t>21. Yao M, Wang A, Li X, Liu Z. Mendelian Randomization Methods for Causal Inference: Estimands, Identification and Inference. Stat Med. 2026;45(1-2):e70394. doi:10.1002/sim.70394.</w:t>
       </w:r>
     </w:p>
     <w:p>
@@ -9153,7 +9087,7 @@
           <w:b w:val="0"/>
           <w:sz w:val="20"/>
         </w:rPr>
-        <w:t>22. Chen J, Zhao J, Fu S. Addressing sample overlap and meta-analysis imbalances in Mendelian randomization: a critical appraisal of protein targets for myocardial infarction. Eur Heart J. 2025;46(29):2928-2929. doi:10.1093/eurheartj/ehaf186. PMID: 40249360.</w:t>
+        <w:t>22. Chen J, Zhao J, Fu S. Addressing sample overlap and meta-analysis imbalances in Mendelian randomization: a critical appraisal of protein targets for myocardial infarction. Eur Heart J. 2025;46(29):2928-2929. doi:10.1093/eurheartj/ehaf186.</w:t>
       </w:r>
     </w:p>
     <w:p>
@@ -9167,7 +9101,7 @@
           <w:b w:val="0"/>
           <w:sz w:val="20"/>
         </w:rPr>
-        <w:t>23. Forde A, Hemani G, Ferguson J. Simulated sample splitting approach to address biases due to instrument selection and participant overlap in two-sample Mendelian Randomization studies. PLoS Genet. 2026;22(5):e1011949. doi:10.1371/journal.pgen.1011949. PMID: 42102131.</w:t>
+        <w:t>23. Forde A, Hemani G, Ferguson J. Simulated sample splitting approach to address biases due to instrument selection and participant overlap in two-sample Mendelian Randomization studies. PLoS Genet. 2026;22(5):e1011949. doi:10.1371/journal.pgen.1011949.</w:t>
       </w:r>
     </w:p>
     <w:p>
@@ -9181,7 +9115,7 @@
           <w:b w:val="0"/>
           <w:sz w:val="20"/>
         </w:rPr>
-        <w:t>24. Zhang L, Yan R, Gong W, Zhou X, Liu L, Yuan Z. METEOR: a data-adaptive Mendelian randomization method for powerful detection of shared and specific exposures underlying multiple outcomes. Brief Bioinform. 2026;27(4). doi:10.1093/bib/bbag364. PMID: 42407119.</w:t>
+        <w:t>24. Zhang L, Yan R, Gong W, Zhou X, Liu L, Yuan Z. METEOR: a data-adaptive Mendelian randomization method for powerful detection of shared and specific exposures underlying multiple outcomes. Brief Bioinform. 2026;27(4). doi:10.1093/bib/bbag364.</w:t>
       </w:r>
     </w:p>
     <w:p>
@@ -9195,7 +9129,7 @@
           <w:b w:val="0"/>
           <w:sz w:val="20"/>
         </w:rPr>
-        <w:t>25. Feng Y, Guo X, Huang P, Jia N, Hu S, Yang S. Cross-ancestry pleiotropic analysis of imaging-derived phenotypes enhances risk stratification of depression. Mol Psychiatry. 2026. doi:10.1038/s41380-026-03730-0. PMID: 42387104.</w:t>
+        <w:t>25. Feng Y, Guo X, Huang P, Jia N, Hu S, Yang S. Cross-ancestry pleiotropic analysis of imaging-derived phenotypes enhances risk stratification of depression. Mol Psychiatry. 2026. doi:10.1038/s41380-026-03730-0.</w:t>
       </w:r>
     </w:p>
     <w:p>
@@ -9209,7 +9143,7 @@
           <w:b w:val="0"/>
           <w:sz w:val="20"/>
         </w:rPr>
-        <w:t>26. Tong J, Li N, Hu F, Yue Y. Metabolic Improvement Mediates the Causal Relationship Between GLP-1 Receptor Agonists and Myocardial Infarction: A Mendelian Randomization and Mediation Analysis Study. Diabetes Care. 2026;49(1):171-178. doi:10.2337/dc25-1822. PMID: 41259721.</w:t>
+        <w:t>26. Tong J, Li N, Hu F, Yue Y. Metabolic Improvement Mediates the Causal Relationship Between GLP-1 Receptor Agonists and Myocardial Infarction: A Mendelian Randomization and Mediation Analysis Study. Diabetes Care. 2026;49(1):171-178. doi:10.2337/dc25-1822.</w:t>
       </w:r>
     </w:p>
     <w:p>
@@ -9223,7 +9157,7 @@
           <w:b w:val="0"/>
           <w:sz w:val="20"/>
         </w:rPr>
-        <w:t>27. Yu X, Chen Y, Lei L, Li P, Lin D, Shen Y, et al. Mendelian randomization analysis of blood metabolites and immune cell mediators in relation to GVHD and relapse. BMC Med. 2025;23(1):201. doi:10.1186/s12916-025-04026-w. PMID: 40189523.</w:t>
+        <w:t>27. Yu X, Chen Y, Lei L, Li P, Lin D, Shen Y, et al. Mendelian randomization analysis of blood metabolites and immune cell mediators in relation to GVHD and relapse. BMC Med. 2025;23(1):201. doi:10.1186/s12916-025-04026-w.</w:t>
       </w:r>
     </w:p>
     <w:p>
@@ -9237,7 +9171,7 @@
           <w:b w:val="0"/>
           <w:sz w:val="20"/>
         </w:rPr>
-        <w:t>28. Lin M, Guo J, Tao H, Gu Z, Tang W, Zhou F, et al. Circulating mediators linking cardiometabolic diseases to HFpEF: a mediation Mendelian randomization analysis. Cardiovasc Diabetol. 2025;24(1):201. doi:10.1186/s12933-025-02738-0. PMID: 40355922.</w:t>
+        <w:t>28. Lin M, Guo J, Tao H, Gu Z, Tang W, Zhou F, et al. Circulating mediators linking cardiometabolic diseases to HFpEF: a mediation Mendelian randomization analysis. Cardiovasc Diabetol. 2025;24(1):201. doi:10.1186/s12933-025-02738-0.</w:t>
       </w:r>
     </w:p>
     <w:p>
@@ -9251,7 +9185,7 @@
           <w:b w:val="0"/>
           <w:sz w:val="20"/>
         </w:rPr>
-        <w:t>29. Hu Y, Cui X, Lu M, Guan X, Li Y, Zhang L, et al. Body Fat Distribution and Ectopic Fat Accumulation as Mediator of Diabetogenic Action of Lipid-Modifying Drugs: A Mediation Mendelian Randomization Study. Mayo Clin Proc. 2025;100(3):424-439. doi:10.1016/j.mayocp.2024.10.018. PMID: 39918451.</w:t>
+        <w:t>29. Hu Y, Cui X, Lu M, Guan X, Li Y, Zhang L, et al. Body Fat Distribution and Ectopic Fat Accumulation as Mediator of Diabetogenic Action of Lipid-Modifying Drugs: A Mediation Mendelian Randomization Study. Mayo Clin Proc. 2025;100(3):424-439. doi:10.1016/j.mayocp.2024.10.018.</w:t>
       </w:r>
     </w:p>
     <w:p>
@@ -9265,7 +9199,7 @@
           <w:b w:val="0"/>
           <w:sz w:val="20"/>
         </w:rPr>
-        <w:t>30. Huang M, Liu Y, Chen C, Cheng Y, Dai W. Cyclic cytokines mediated the effect of immune cells on meningioma: a two-step, mediation mendelian randomization study. BMC Cancer. 2025;25(1):1633. doi:10.1186/s12885-025-14694-9. PMID: 41131505.</w:t>
+        <w:t>30. Huang M, Liu Y, Chen C, Cheng Y, Dai W. Cyclic cytokines mediated the effect of immune cells on meningioma: a two-step, mediation mendelian randomization study. BMC Cancer. 2025;25(1):1633. doi:10.1186/s12885-025-14694-9.</w:t>
       </w:r>
     </w:p>
     <w:p>
@@ -9279,7 +9213,7 @@
           <w:b w:val="0"/>
           <w:sz w:val="20"/>
         </w:rPr>
-        <w:t>31. Zhou J, Lu Z, Xu K, Zhao G, Zhu Y, Yuan R, et al. Air pollution is the risk factor for psychiatric disorders: a two-step Mendelian randomization study. J Affect Disord. 2025;388:119475. doi:10.1016/j.jad.2025.119475. PMID: 40436208.</w:t>
+        <w:t>31. Zhou J, Lu Z, Xu K, Zhao G, Zhu Y, Yuan R, et al. Air pollution is the risk factor for psychiatric disorders: a two-step Mendelian randomization study. J Affect Disord. 2025;388:119475. doi:10.1016/j.jad.2025.119475.</w:t>
       </w:r>
     </w:p>
     <w:p>
@@ -9293,7 +9227,7 @@
           <w:b w:val="0"/>
           <w:sz w:val="20"/>
         </w:rPr>
-        <w:t>32. Wang R, Sun J, Yu X. Mediators of the association between nut consumption and cardiovascular diseases: a two-step mendelian randomization study. Sci Rep. 2025;15(1):829. doi:10.1038/s41598-024-85070-z. PMID: 39755742.</w:t>
+        <w:t>32. Wang R, Sun J, Yu X. Mediators of the association between nut consumption and cardiovascular diseases: a two-step mendelian randomization study. Sci Rep. 2025;15(1):829. doi:10.1038/s41598-024-85070-z.</w:t>
       </w:r>
     </w:p>
     <w:p>
@@ -9307,7 +9241,7 @@
           <w:b w:val="0"/>
           <w:sz w:val="20"/>
         </w:rPr>
-        <w:t>33. Xu C, Xu Y, Ma J, Wang G. Mendelian randomization and mediation examination of the immune cell-mediated link between sphingomyelin and stroke. J Stroke Cerebrovasc Dis. 2025;34(2):108205. doi:10.1016/j.jstrokecerebrovasdis.2024.108205. PMID: 39706358.</w:t>
+        <w:t>33. Xu C, Xu Y, Ma J, Wang G. Mendelian randomization and mediation examination of the immune cell-mediated link between sphingomyelin and stroke. J Stroke Cerebrovasc Dis. 2025;34(2):108205. doi:10.1016/j.jstrokecerebrovasdis.2024.108205.</w:t>
       </w:r>
     </w:p>
     <w:p>
@@ -9321,7 +9255,7 @@
           <w:b w:val="0"/>
           <w:sz w:val="20"/>
         </w:rPr>
-        <w:t>34. Wang Y, Mou YK, Liu WC, Wang HR, Song XY, Yang T, et al. Genetically Predicted Immune Cell-Mediated Effect of Lipid Metabolism on Allergic Diseases: A Two-Step, Mediation Mendelian Randomization Study. Int Arch Allergy Immunol. 2025;186(5):430-444. doi:10.1159/000542036. PMID: 39541965.</w:t>
+        <w:t>34. Wang Y, Mou YK, Liu WC, Wang HR, Song XY, Yang T, et al. Genetically Predicted Immune Cell-Mediated Effect of Lipid Metabolism on Allergic Diseases: A Two-Step, Mediation Mendelian Randomization Study. Int Arch Allergy Immunol. 2025;186(5):430-444. doi:10.1159/000542036.</w:t>
       </w:r>
     </w:p>
     <w:p>
@@ -9335,7 +9269,7 @@
           <w:b w:val="0"/>
           <w:sz w:val="20"/>
         </w:rPr>
-        <w:t>35. Sun J, Teng F, Cao Y, Pei H, Ma L, Wei W, et al. Peripheral blood immune cell phenotypes and Alzheimer's disease: A mediation Mendelian randomization study. J Alzheimers Dis. 2025;105(2):622-633. doi:10.1177/13872877251330503. PMID: 40232262.</w:t>
+        <w:t>35. Sun J, Teng F, Cao Y, Pei H, Ma L, Wei W, et al. Peripheral blood immune cell phenotypes and Alzheimer's disease: A mediation Mendelian randomization study. J Alzheimers Dis. 2025;105(2):622-633. doi:10.1177/13872877251330503.</w:t>
       </w:r>
     </w:p>
     <w:p>
@@ -9349,7 +9283,7 @@
           <w:b w:val="0"/>
           <w:sz w:val="20"/>
         </w:rPr>
-        <w:t>36. Zhang PA, Wang JL, Fu SY, Luo HL, Qin RD, Li J. Mediators of the association between allergic diseases and bronchiectasis: A bi-directional univariable and multivariable Mendelian randomization study and mediation analysis. World Allergy Organ J. 2025;18(3):101038. doi:10.1016/j.waojou.2025.101038. PMID: 40151543.</w:t>
+        <w:t>36. Zhang PA, Wang JL, Fu SY, Luo HL, Qin RD, Li J. Mediators of the association between allergic diseases and bronchiectasis: A bi-directional univariable and multivariable Mendelian randomization study and mediation analysis. World Allergy Organ J. 2025;18(3):101038. doi:10.1016/j.waojou.2025.101038.</w:t>
       </w:r>
     </w:p>
     <w:p>
@@ -9363,7 +9297,7 @@
           <w:b w:val="0"/>
           <w:sz w:val="20"/>
         </w:rPr>
-        <w:t>37. Hao Y, Jiang X, Xiao J, Fan M, Wu X, Liao J, et al. Genetic evidence for potential molecular mediators underlying the causal relationship between obesity and breast cancer: a two-step, two-sample Mendelian randomization study. BMC Cancer. 2026;26(1). doi:10.1186/s12885-026-15744-6. PMID: 41807932.</w:t>
+        <w:t>37. Hao Y, Jiang X, Xiao J, Fan M, Wu X, Liao J, et al. Genetic evidence for potential molecular mediators underlying the causal relationship between obesity and breast cancer: a two-step, two-sample Mendelian randomization study. BMC Cancer. 2026;26(1). doi:10.1186/s12885-026-15744-6.</w:t>
       </w:r>
     </w:p>
     <w:p>
@@ -9377,7 +9311,7 @@
           <w:b w:val="0"/>
           <w:sz w:val="20"/>
         </w:rPr>
-        <w:t>38. Wang M, Teng T, Mo D, Chen R, Xu J, Dong Z, et al. Neuroticism as a protective factor for cardiomyopathy: A mediation Mendelian randomization study. J Affect Disord. 2026;403:121400. doi:10.1016/j.jad.2026.121400. PMID: 41724399.</w:t>
+        <w:t>38. Wang M, Teng T, Mo D, Chen R, Xu J, Dong Z, et al. Neuroticism as a protective factor for cardiomyopathy: A mediation Mendelian randomization study. J Affect Disord. 2026;403:121400. doi:10.1016/j.jad.2026.121400.</w:t>
       </w:r>
     </w:p>
     <w:p>
@@ -9391,7 +9325,7 @@
           <w:b w:val="0"/>
           <w:sz w:val="20"/>
         </w:rPr>
-        <w:t>39. He B, Lam HS, Qiu X, Shen S, Luo S, Slob EAW, et al. Association and mediation pathways of maternal hyperglycaemia and liability to gestational diabetes with neonatal outcomes: A two-sample Mendelian randomization study. Diabetes Obes Metab. 2025;27(2):529-538. doi:10.1111/dom.16045. PMID: 39501936.</w:t>
+        <w:t>39. He B, Lam HS, Qiu X, Shen S, Luo S, Slob EAW, et al. Association and mediation pathways of maternal hyperglycaemia and liability to gestational diabetes with neonatal outcomes: A two-sample Mendelian randomization study. Diabetes Obes Metab. 2025;27(2):529-538. doi:10.1111/dom.16045.</w:t>
       </w:r>
     </w:p>
     <w:p>
@@ -9405,7 +9339,7 @@
           <w:b w:val="0"/>
           <w:sz w:val="20"/>
         </w:rPr>
-        <w:t xml:space="preserve">40. Skrivankova VW, Richmond RC, Woolf BAR, Yarmolinsky J, Davies NM, Swanson SA, et al. Strengthening the Reporting of Observational Studies in Epidemiology Using Mendelian Randomization: The STROBE-MR Statement. JAMA. 2021;326(16):1614-1621. doi:10.1001/jama.2021.18236. PMID: 34698778. </w:t>
+        <w:t xml:space="preserve">40. Skrivankova VW, Richmond RC, Woolf BAR, Yarmolinsky J, Davies NM, Swanson SA, et al. Strengthening the Reporting of Observational Studies in Epidemiology Using Mendelian Randomization: The STROBE-MR Statement. JAMA. 2021;326(16):1614-1621. doi:10.1001/jama.2021.18236. </w:t>
       </w:r>
     </w:p>
     <w:p>
@@ -9419,7 +9353,7 @@
           <w:b w:val="0"/>
           <w:sz w:val="20"/>
         </w:rPr>
-        <w:t>41. Sanderson E, Levin MG, Walker V, Yuan S, Badini I, Dolce J, Mahida KJ, Nho JW, Pingault JB, Damrauer SM, Hemani G, Davies NM. Challenges and future directions for Mendelian randomization. Nat Genet. 2026;58:984-994. doi:10.1038/s41588-026-02546-6. PMID: 41986691.</w:t>
+        <w:t>41. Sanderson E, Levin MG, Walker V, Yuan S, Badini I, Dolce J, Mahida KJ, Nho JW, Pingault JB, Damrauer SM, Hemani G, Davies NM. Challenges and future directions for Mendelian randomization. Nat Genet. 2026;58:984-994. doi:10.1038/s41588-026-02546-6.</w:t>
       </w:r>
     </w:p>
     <w:p>

</xml_diff>

<commit_message>
Submission-ready polish for EJE: fix tables never rendering as Word tables (detector now tolerates blank lines inside markdown table blocks - all 7 tables now real Word tables); remove undefined S320*/S293* cell markers; de-duplicate Supplementary Table S6 listing; add EJE cover letter addressed to EiC Albert Hofman; rebuild docx
</commit_message>
<xml_diff>
--- a/D61_论文终稿_20260906.docx
+++ b/D61_论文终稿_20260906.docx
@@ -4358,7 +4358,7 @@
                 <w:rFonts w:ascii="Times New Roman" w:hAnsi="Times New Roman"/>
                 <w:sz w:val="19"/>
               </w:rPr>
-              <w:t>S320*</w:t>
+              <w:t>S320</w:t>
             </w:r>
           </w:p>
         </w:tc>
@@ -4585,7 +4585,7 @@
                 <w:rFonts w:ascii="Times New Roman" w:hAnsi="Times New Roman"/>
                 <w:sz w:val="19"/>
               </w:rPr>
-              <w:t>S293*</w:t>
+              <w:t>S293</w:t>
             </w:r>
           </w:p>
         </w:tc>
@@ -11310,6 +11310,28 @@
     </w:p>
     <w:p>
       <w:pPr>
+        <w:pStyle w:val="ListBullet"/>
+        <w:jc w:val="both"/>
+      </w:pPr>
+      <w:r>
+        <w:rPr>
+          <w:rFonts w:ascii="Times New Roman" w:hAnsi="Times New Roman"/>
+          <w:b/>
+          <w:sz w:val="24"/>
+        </w:rPr>
+        <w:t>Supplementary Table S6:</w:t>
+      </w:r>
+      <w:r>
+        <w:rPr>
+          <w:rFonts w:ascii="Times New Roman" w:hAnsi="Times New Roman"/>
+          <w:b w:val="0"/>
+          <w:sz w:val="24"/>
+        </w:rPr>
+        <w:t xml:space="preserve"> additional two-step MR mediation applications cited in the text, beyond the six worked examples in the Discussion (domain, study and reference).</w:t>
+      </w:r>
+    </w:p>
+    <w:p>
+      <w:pPr>
         <w:ind w:firstLine="480"/>
         <w:jc w:val="both"/>
       </w:pPr>
@@ -11863,28 +11885,6 @@
         </w:tc>
       </w:tr>
     </w:tbl>
-    <w:p>
-      <w:pPr>
-        <w:pStyle w:val="ListBullet"/>
-        <w:jc w:val="both"/>
-      </w:pPr>
-      <w:r>
-        <w:rPr>
-          <w:rFonts w:ascii="Times New Roman" w:hAnsi="Times New Roman"/>
-          <w:b/>
-          <w:sz w:val="24"/>
-        </w:rPr>
-        <w:t>Supplementary Table S6:</w:t>
-      </w:r>
-      <w:r>
-        <w:rPr>
-          <w:rFonts w:ascii="Times New Roman" w:hAnsi="Times New Roman"/>
-          <w:b w:val="0"/>
-          <w:sz w:val="24"/>
-        </w:rPr>
-        <w:t xml:space="preserve"> additional two-step MR mediation applications cited in the text, beyond the six worked examples in the Discussion (domain, study and reference).</w:t>
-      </w:r>
-    </w:p>
     <w:sectPr>
       <w:pgSz w:w="12240" w:h="15840"/>
       <w:pgMar w:top="1440" w:right="1800" w:bottom="1440" w:left="1800" w:header="720" w:footer="720" w:gutter="0"/>

</xml_diff>